<commit_message>
Add modified final report document
</commit_message>
<xml_diff>
--- a/docs/Rustamov Temur C00280204 Final Report.docx
+++ b/docs/Rustamov Temur C00280204 Final Report.docx
@@ -477,7 +477,7 @@
           <w:r>
             <w:fldChar w:fldCharType="separate"/>
           </w:r>
-          <w:hyperlink w:anchor="_Toc223388854" w:history="1">
+          <w:hyperlink w:anchor="_Toc223459336" w:history="1">
             <w:r>
               <w:rPr>
                 <w:rStyle w:val="Hyperlink"/>
@@ -526,7 +526,7 @@
                 <w:noProof/>
                 <w:webHidden/>
               </w:rPr>
-              <w:instrText xml:space="preserve"> PAGEREF _Toc223388854 \h </w:instrText>
+              <w:instrText xml:space="preserve"> PAGEREF _Toc223459336 \h </w:instrText>
             </w:r>
             <w:r>
               <w:rPr>
@@ -575,7 +575,7 @@
               <w14:ligatures w14:val="standardContextual"/>
             </w:rPr>
           </w:pPr>
-          <w:hyperlink w:anchor="_Toc223388855" w:history="1">
+          <w:hyperlink w:anchor="_Toc223459337" w:history="1">
             <w:r>
               <w:rPr>
                 <w:rStyle w:val="Hyperlink"/>
@@ -624,7 +624,7 @@
                 <w:noProof/>
                 <w:webHidden/>
               </w:rPr>
-              <w:instrText xml:space="preserve"> PAGEREF _Toc223388855 \h </w:instrText>
+              <w:instrText xml:space="preserve"> PAGEREF _Toc223459337 \h </w:instrText>
             </w:r>
             <w:r>
               <w:rPr>
@@ -645,6 +645,840 @@
                 <w:webHidden/>
               </w:rPr>
               <w:t>3</w:t>
+            </w:r>
+            <w:r>
+              <w:rPr>
+                <w:noProof/>
+                <w:webHidden/>
+              </w:rPr>
+              <w:fldChar w:fldCharType="end"/>
+            </w:r>
+          </w:hyperlink>
+        </w:p>
+        <w:p>
+          <w:pPr>
+            <w:pStyle w:val="TOC1"/>
+            <w:tabs>
+              <w:tab w:val="left" w:pos="480"/>
+              <w:tab w:val="right" w:leader="dot" w:pos="9350"/>
+            </w:tabs>
+            <w:rPr>
+              <w:rFonts w:eastAsiaTheme="minorEastAsia" w:cstheme="minorBidi"/>
+              <w:b w:val="0"/>
+              <w:bCs w:val="0"/>
+              <w:i w:val="0"/>
+              <w:iCs w:val="0"/>
+              <w:noProof/>
+              <w:kern w:val="2"/>
+              <w14:ligatures w14:val="standardContextual"/>
+            </w:rPr>
+          </w:pPr>
+          <w:hyperlink w:anchor="_Toc223459338" w:history="1">
+            <w:r>
+              <w:rPr>
+                <w:rStyle w:val="Hyperlink"/>
+                <w:rFonts w:ascii="Times New Roman" w:hAnsi="Times New Roman"/>
+                <w:noProof/>
+              </w:rPr>
+              <w:t>3.</w:t>
+            </w:r>
+            <w:r>
+              <w:rPr>
+                <w:rFonts w:eastAsiaTheme="minorEastAsia" w:cstheme="minorBidi"/>
+                <w:b w:val="0"/>
+                <w:bCs w:val="0"/>
+                <w:i w:val="0"/>
+                <w:iCs w:val="0"/>
+                <w:noProof/>
+                <w:kern w:val="2"/>
+                <w14:ligatures w14:val="standardContextual"/>
+              </w:rPr>
+              <w:tab/>
+            </w:r>
+            <w:r>
+              <w:rPr>
+                <w:rStyle w:val="Hyperlink"/>
+                <w:rFonts w:ascii="Times New Roman" w:hAnsi="Times New Roman"/>
+                <w:noProof/>
+              </w:rPr>
+              <w:t>Final System Overview</w:t>
+            </w:r>
+            <w:r>
+              <w:rPr>
+                <w:noProof/>
+                <w:webHidden/>
+              </w:rPr>
+              <w:tab/>
+            </w:r>
+            <w:r>
+              <w:rPr>
+                <w:noProof/>
+                <w:webHidden/>
+              </w:rPr>
+              <w:fldChar w:fldCharType="begin"/>
+            </w:r>
+            <w:r>
+              <w:rPr>
+                <w:noProof/>
+                <w:webHidden/>
+              </w:rPr>
+              <w:instrText xml:space="preserve"> PAGEREF _Toc223459338 \h </w:instrText>
+            </w:r>
+            <w:r>
+              <w:rPr>
+                <w:noProof/>
+                <w:webHidden/>
+              </w:rPr>
+            </w:r>
+            <w:r>
+              <w:rPr>
+                <w:noProof/>
+                <w:webHidden/>
+              </w:rPr>
+              <w:fldChar w:fldCharType="separate"/>
+            </w:r>
+            <w:r>
+              <w:rPr>
+                <w:noProof/>
+                <w:webHidden/>
+              </w:rPr>
+              <w:t>4</w:t>
+            </w:r>
+            <w:r>
+              <w:rPr>
+                <w:noProof/>
+                <w:webHidden/>
+              </w:rPr>
+              <w:fldChar w:fldCharType="end"/>
+            </w:r>
+          </w:hyperlink>
+        </w:p>
+        <w:p>
+          <w:pPr>
+            <w:pStyle w:val="TOC2"/>
+            <w:tabs>
+              <w:tab w:val="left" w:pos="960"/>
+              <w:tab w:val="right" w:leader="dot" w:pos="9350"/>
+            </w:tabs>
+            <w:rPr>
+              <w:rFonts w:asciiTheme="minorHAnsi" w:eastAsiaTheme="minorEastAsia" w:hAnsiTheme="minorHAnsi" w:cstheme="minorBidi"/>
+              <w:noProof/>
+              <w:kern w:val="2"/>
+              <w14:ligatures w14:val="standardContextual"/>
+            </w:rPr>
+          </w:pPr>
+          <w:hyperlink w:anchor="_Toc223459339" w:history="1">
+            <w:r>
+              <w:rPr>
+                <w:rStyle w:val="Hyperlink"/>
+                <w:b/>
+                <w:bCs/>
+                <w:noProof/>
+              </w:rPr>
+              <w:t>3.1</w:t>
+            </w:r>
+            <w:r>
+              <w:rPr>
+                <w:rFonts w:asciiTheme="minorHAnsi" w:eastAsiaTheme="minorEastAsia" w:hAnsiTheme="minorHAnsi" w:cstheme="minorBidi"/>
+                <w:noProof/>
+                <w:kern w:val="2"/>
+                <w14:ligatures w14:val="standardContextual"/>
+              </w:rPr>
+              <w:tab/>
+            </w:r>
+            <w:r>
+              <w:rPr>
+                <w:rStyle w:val="Hyperlink"/>
+                <w:b/>
+                <w:bCs/>
+                <w:noProof/>
+              </w:rPr>
+              <w:t>System Architecture</w:t>
+            </w:r>
+            <w:r>
+              <w:rPr>
+                <w:noProof/>
+                <w:webHidden/>
+              </w:rPr>
+              <w:tab/>
+            </w:r>
+            <w:r>
+              <w:rPr>
+                <w:noProof/>
+                <w:webHidden/>
+              </w:rPr>
+              <w:fldChar w:fldCharType="begin"/>
+            </w:r>
+            <w:r>
+              <w:rPr>
+                <w:noProof/>
+                <w:webHidden/>
+              </w:rPr>
+              <w:instrText xml:space="preserve"> PAGEREF _Toc223459339 \h </w:instrText>
+            </w:r>
+            <w:r>
+              <w:rPr>
+                <w:noProof/>
+                <w:webHidden/>
+              </w:rPr>
+            </w:r>
+            <w:r>
+              <w:rPr>
+                <w:noProof/>
+                <w:webHidden/>
+              </w:rPr>
+              <w:fldChar w:fldCharType="separate"/>
+            </w:r>
+            <w:r>
+              <w:rPr>
+                <w:noProof/>
+                <w:webHidden/>
+              </w:rPr>
+              <w:t>4</w:t>
+            </w:r>
+            <w:r>
+              <w:rPr>
+                <w:noProof/>
+                <w:webHidden/>
+              </w:rPr>
+              <w:fldChar w:fldCharType="end"/>
+            </w:r>
+          </w:hyperlink>
+        </w:p>
+        <w:p>
+          <w:pPr>
+            <w:pStyle w:val="TOC2"/>
+            <w:tabs>
+              <w:tab w:val="left" w:pos="960"/>
+              <w:tab w:val="right" w:leader="dot" w:pos="9350"/>
+            </w:tabs>
+            <w:rPr>
+              <w:rFonts w:asciiTheme="minorHAnsi" w:eastAsiaTheme="minorEastAsia" w:hAnsiTheme="minorHAnsi" w:cstheme="minorBidi"/>
+              <w:noProof/>
+              <w:kern w:val="2"/>
+              <w14:ligatures w14:val="standardContextual"/>
+            </w:rPr>
+          </w:pPr>
+          <w:hyperlink w:anchor="_Toc223459340" w:history="1">
+            <w:r>
+              <w:rPr>
+                <w:rStyle w:val="Hyperlink"/>
+                <w:b/>
+                <w:bCs/>
+                <w:noProof/>
+              </w:rPr>
+              <w:t>3.2</w:t>
+            </w:r>
+            <w:r>
+              <w:rPr>
+                <w:rFonts w:asciiTheme="minorHAnsi" w:eastAsiaTheme="minorEastAsia" w:hAnsiTheme="minorHAnsi" w:cstheme="minorBidi"/>
+                <w:noProof/>
+                <w:kern w:val="2"/>
+                <w14:ligatures w14:val="standardContextual"/>
+              </w:rPr>
+              <w:tab/>
+            </w:r>
+            <w:r>
+              <w:rPr>
+                <w:rStyle w:val="Hyperlink"/>
+                <w:b/>
+                <w:bCs/>
+                <w:noProof/>
+              </w:rPr>
+              <w:t>Core Functional Components</w:t>
+            </w:r>
+            <w:r>
+              <w:rPr>
+                <w:noProof/>
+                <w:webHidden/>
+              </w:rPr>
+              <w:tab/>
+            </w:r>
+            <w:r>
+              <w:rPr>
+                <w:noProof/>
+                <w:webHidden/>
+              </w:rPr>
+              <w:fldChar w:fldCharType="begin"/>
+            </w:r>
+            <w:r>
+              <w:rPr>
+                <w:noProof/>
+                <w:webHidden/>
+              </w:rPr>
+              <w:instrText xml:space="preserve"> PAGEREF _Toc223459340 \h </w:instrText>
+            </w:r>
+            <w:r>
+              <w:rPr>
+                <w:noProof/>
+                <w:webHidden/>
+              </w:rPr>
+            </w:r>
+            <w:r>
+              <w:rPr>
+                <w:noProof/>
+                <w:webHidden/>
+              </w:rPr>
+              <w:fldChar w:fldCharType="separate"/>
+            </w:r>
+            <w:r>
+              <w:rPr>
+                <w:noProof/>
+                <w:webHidden/>
+              </w:rPr>
+              <w:t>4</w:t>
+            </w:r>
+            <w:r>
+              <w:rPr>
+                <w:noProof/>
+                <w:webHidden/>
+              </w:rPr>
+              <w:fldChar w:fldCharType="end"/>
+            </w:r>
+          </w:hyperlink>
+        </w:p>
+        <w:p>
+          <w:pPr>
+            <w:pStyle w:val="TOC2"/>
+            <w:tabs>
+              <w:tab w:val="left" w:pos="1200"/>
+              <w:tab w:val="right" w:leader="dot" w:pos="9350"/>
+            </w:tabs>
+            <w:rPr>
+              <w:rFonts w:asciiTheme="minorHAnsi" w:eastAsiaTheme="minorEastAsia" w:hAnsiTheme="minorHAnsi" w:cstheme="minorBidi"/>
+              <w:noProof/>
+              <w:kern w:val="2"/>
+              <w14:ligatures w14:val="standardContextual"/>
+            </w:rPr>
+          </w:pPr>
+          <w:hyperlink w:anchor="_Toc223459341" w:history="1">
+            <w:r>
+              <w:rPr>
+                <w:rStyle w:val="Hyperlink"/>
+                <w:b/>
+                <w:bCs/>
+                <w:noProof/>
+              </w:rPr>
+              <w:t>3.2.1</w:t>
+            </w:r>
+            <w:r>
+              <w:rPr>
+                <w:rFonts w:asciiTheme="minorHAnsi" w:eastAsiaTheme="minorEastAsia" w:hAnsiTheme="minorHAnsi" w:cstheme="minorBidi"/>
+                <w:noProof/>
+                <w:kern w:val="2"/>
+                <w14:ligatures w14:val="standardContextual"/>
+              </w:rPr>
+              <w:tab/>
+            </w:r>
+            <w:r>
+              <w:rPr>
+                <w:rStyle w:val="Hyperlink"/>
+                <w:b/>
+                <w:bCs/>
+                <w:noProof/>
+              </w:rPr>
+              <w:t>Authentication and User Management</w:t>
+            </w:r>
+            <w:r>
+              <w:rPr>
+                <w:noProof/>
+                <w:webHidden/>
+              </w:rPr>
+              <w:tab/>
+            </w:r>
+            <w:r>
+              <w:rPr>
+                <w:noProof/>
+                <w:webHidden/>
+              </w:rPr>
+              <w:fldChar w:fldCharType="begin"/>
+            </w:r>
+            <w:r>
+              <w:rPr>
+                <w:noProof/>
+                <w:webHidden/>
+              </w:rPr>
+              <w:instrText xml:space="preserve"> PAGEREF _Toc223459341 \h </w:instrText>
+            </w:r>
+            <w:r>
+              <w:rPr>
+                <w:noProof/>
+                <w:webHidden/>
+              </w:rPr>
+            </w:r>
+            <w:r>
+              <w:rPr>
+                <w:noProof/>
+                <w:webHidden/>
+              </w:rPr>
+              <w:fldChar w:fldCharType="separate"/>
+            </w:r>
+            <w:r>
+              <w:rPr>
+                <w:noProof/>
+                <w:webHidden/>
+              </w:rPr>
+              <w:t>4</w:t>
+            </w:r>
+            <w:r>
+              <w:rPr>
+                <w:noProof/>
+                <w:webHidden/>
+              </w:rPr>
+              <w:fldChar w:fldCharType="end"/>
+            </w:r>
+          </w:hyperlink>
+        </w:p>
+        <w:p>
+          <w:pPr>
+            <w:pStyle w:val="TOC2"/>
+            <w:tabs>
+              <w:tab w:val="left" w:pos="1200"/>
+              <w:tab w:val="right" w:leader="dot" w:pos="9350"/>
+            </w:tabs>
+            <w:rPr>
+              <w:rFonts w:asciiTheme="minorHAnsi" w:eastAsiaTheme="minorEastAsia" w:hAnsiTheme="minorHAnsi" w:cstheme="minorBidi"/>
+              <w:noProof/>
+              <w:kern w:val="2"/>
+              <w14:ligatures w14:val="standardContextual"/>
+            </w:rPr>
+          </w:pPr>
+          <w:hyperlink w:anchor="_Toc223459342" w:history="1">
+            <w:r>
+              <w:rPr>
+                <w:rStyle w:val="Hyperlink"/>
+                <w:b/>
+                <w:bCs/>
+                <w:noProof/>
+              </w:rPr>
+              <w:t>3.2.3</w:t>
+            </w:r>
+            <w:r>
+              <w:rPr>
+                <w:rFonts w:asciiTheme="minorHAnsi" w:eastAsiaTheme="minorEastAsia" w:hAnsiTheme="minorHAnsi" w:cstheme="minorBidi"/>
+                <w:noProof/>
+                <w:kern w:val="2"/>
+                <w14:ligatures w14:val="standardContextual"/>
+              </w:rPr>
+              <w:tab/>
+            </w:r>
+            <w:r>
+              <w:rPr>
+                <w:rStyle w:val="Hyperlink"/>
+                <w:b/>
+                <w:bCs/>
+                <w:noProof/>
+              </w:rPr>
+              <w:t>Messaging System</w:t>
+            </w:r>
+            <w:r>
+              <w:rPr>
+                <w:noProof/>
+                <w:webHidden/>
+              </w:rPr>
+              <w:tab/>
+            </w:r>
+            <w:r>
+              <w:rPr>
+                <w:noProof/>
+                <w:webHidden/>
+              </w:rPr>
+              <w:fldChar w:fldCharType="begin"/>
+            </w:r>
+            <w:r>
+              <w:rPr>
+                <w:noProof/>
+                <w:webHidden/>
+              </w:rPr>
+              <w:instrText xml:space="preserve"> PAGEREF _Toc223459342 \h </w:instrText>
+            </w:r>
+            <w:r>
+              <w:rPr>
+                <w:noProof/>
+                <w:webHidden/>
+              </w:rPr>
+            </w:r>
+            <w:r>
+              <w:rPr>
+                <w:noProof/>
+                <w:webHidden/>
+              </w:rPr>
+              <w:fldChar w:fldCharType="separate"/>
+            </w:r>
+            <w:r>
+              <w:rPr>
+                <w:noProof/>
+                <w:webHidden/>
+              </w:rPr>
+              <w:t>5</w:t>
+            </w:r>
+            <w:r>
+              <w:rPr>
+                <w:noProof/>
+                <w:webHidden/>
+              </w:rPr>
+              <w:fldChar w:fldCharType="end"/>
+            </w:r>
+          </w:hyperlink>
+        </w:p>
+        <w:p>
+          <w:pPr>
+            <w:pStyle w:val="TOC2"/>
+            <w:tabs>
+              <w:tab w:val="left" w:pos="1200"/>
+              <w:tab w:val="right" w:leader="dot" w:pos="9350"/>
+            </w:tabs>
+            <w:rPr>
+              <w:rFonts w:asciiTheme="minorHAnsi" w:eastAsiaTheme="minorEastAsia" w:hAnsiTheme="minorHAnsi" w:cstheme="minorBidi"/>
+              <w:noProof/>
+              <w:kern w:val="2"/>
+              <w14:ligatures w14:val="standardContextual"/>
+            </w:rPr>
+          </w:pPr>
+          <w:hyperlink w:anchor="_Toc223459343" w:history="1">
+            <w:r>
+              <w:rPr>
+                <w:rStyle w:val="Hyperlink"/>
+                <w:b/>
+                <w:bCs/>
+                <w:noProof/>
+              </w:rPr>
+              <w:t>3.2.4</w:t>
+            </w:r>
+            <w:r>
+              <w:rPr>
+                <w:rFonts w:asciiTheme="minorHAnsi" w:eastAsiaTheme="minorEastAsia" w:hAnsiTheme="minorHAnsi" w:cstheme="minorBidi"/>
+                <w:noProof/>
+                <w:kern w:val="2"/>
+                <w14:ligatures w14:val="standardContextual"/>
+              </w:rPr>
+              <w:tab/>
+            </w:r>
+            <w:r>
+              <w:rPr>
+                <w:rStyle w:val="Hyperlink"/>
+                <w:b/>
+                <w:bCs/>
+                <w:noProof/>
+              </w:rPr>
+              <w:t>Scheduling and Meetings</w:t>
+            </w:r>
+            <w:r>
+              <w:rPr>
+                <w:noProof/>
+                <w:webHidden/>
+              </w:rPr>
+              <w:tab/>
+            </w:r>
+            <w:r>
+              <w:rPr>
+                <w:noProof/>
+                <w:webHidden/>
+              </w:rPr>
+              <w:fldChar w:fldCharType="begin"/>
+            </w:r>
+            <w:r>
+              <w:rPr>
+                <w:noProof/>
+                <w:webHidden/>
+              </w:rPr>
+              <w:instrText xml:space="preserve"> PAGEREF _Toc223459343 \h </w:instrText>
+            </w:r>
+            <w:r>
+              <w:rPr>
+                <w:noProof/>
+                <w:webHidden/>
+              </w:rPr>
+            </w:r>
+            <w:r>
+              <w:rPr>
+                <w:noProof/>
+                <w:webHidden/>
+              </w:rPr>
+              <w:fldChar w:fldCharType="separate"/>
+            </w:r>
+            <w:r>
+              <w:rPr>
+                <w:noProof/>
+                <w:webHidden/>
+              </w:rPr>
+              <w:t>5</w:t>
+            </w:r>
+            <w:r>
+              <w:rPr>
+                <w:noProof/>
+                <w:webHidden/>
+              </w:rPr>
+              <w:fldChar w:fldCharType="end"/>
+            </w:r>
+          </w:hyperlink>
+        </w:p>
+        <w:p>
+          <w:pPr>
+            <w:pStyle w:val="TOC2"/>
+            <w:tabs>
+              <w:tab w:val="left" w:pos="1200"/>
+              <w:tab w:val="right" w:leader="dot" w:pos="9350"/>
+            </w:tabs>
+            <w:rPr>
+              <w:rFonts w:asciiTheme="minorHAnsi" w:eastAsiaTheme="minorEastAsia" w:hAnsiTheme="minorHAnsi" w:cstheme="minorBidi"/>
+              <w:noProof/>
+              <w:kern w:val="2"/>
+              <w14:ligatures w14:val="standardContextual"/>
+            </w:rPr>
+          </w:pPr>
+          <w:hyperlink w:anchor="_Toc223459344" w:history="1">
+            <w:r>
+              <w:rPr>
+                <w:rStyle w:val="Hyperlink"/>
+                <w:b/>
+                <w:bCs/>
+                <w:noProof/>
+              </w:rPr>
+              <w:t>3.2.5</w:t>
+            </w:r>
+            <w:r>
+              <w:rPr>
+                <w:rFonts w:asciiTheme="minorHAnsi" w:eastAsiaTheme="minorEastAsia" w:hAnsiTheme="minorHAnsi" w:cstheme="minorBidi"/>
+                <w:noProof/>
+                <w:kern w:val="2"/>
+                <w14:ligatures w14:val="standardContextual"/>
+              </w:rPr>
+              <w:tab/>
+            </w:r>
+            <w:r>
+              <w:rPr>
+                <w:rStyle w:val="Hyperlink"/>
+                <w:b/>
+                <w:bCs/>
+                <w:noProof/>
+              </w:rPr>
+              <w:t>Rating and Gamification</w:t>
+            </w:r>
+            <w:r>
+              <w:rPr>
+                <w:noProof/>
+                <w:webHidden/>
+              </w:rPr>
+              <w:tab/>
+            </w:r>
+            <w:r>
+              <w:rPr>
+                <w:noProof/>
+                <w:webHidden/>
+              </w:rPr>
+              <w:fldChar w:fldCharType="begin"/>
+            </w:r>
+            <w:r>
+              <w:rPr>
+                <w:noProof/>
+                <w:webHidden/>
+              </w:rPr>
+              <w:instrText xml:space="preserve"> PAGEREF _Toc223459344 \h </w:instrText>
+            </w:r>
+            <w:r>
+              <w:rPr>
+                <w:noProof/>
+                <w:webHidden/>
+              </w:rPr>
+            </w:r>
+            <w:r>
+              <w:rPr>
+                <w:noProof/>
+                <w:webHidden/>
+              </w:rPr>
+              <w:fldChar w:fldCharType="separate"/>
+            </w:r>
+            <w:r>
+              <w:rPr>
+                <w:noProof/>
+                <w:webHidden/>
+              </w:rPr>
+              <w:t>5</w:t>
+            </w:r>
+            <w:r>
+              <w:rPr>
+                <w:noProof/>
+                <w:webHidden/>
+              </w:rPr>
+              <w:fldChar w:fldCharType="end"/>
+            </w:r>
+          </w:hyperlink>
+        </w:p>
+        <w:p>
+          <w:pPr>
+            <w:pStyle w:val="TOC2"/>
+            <w:tabs>
+              <w:tab w:val="left" w:pos="1200"/>
+              <w:tab w:val="right" w:leader="dot" w:pos="9350"/>
+            </w:tabs>
+            <w:rPr>
+              <w:rFonts w:asciiTheme="minorHAnsi" w:eastAsiaTheme="minorEastAsia" w:hAnsiTheme="minorHAnsi" w:cstheme="minorBidi"/>
+              <w:noProof/>
+              <w:kern w:val="2"/>
+              <w14:ligatures w14:val="standardContextual"/>
+            </w:rPr>
+          </w:pPr>
+          <w:hyperlink w:anchor="_Toc223459345" w:history="1">
+            <w:r>
+              <w:rPr>
+                <w:rStyle w:val="Hyperlink"/>
+                <w:b/>
+                <w:bCs/>
+                <w:noProof/>
+              </w:rPr>
+              <w:t>3.2.6</w:t>
+            </w:r>
+            <w:r>
+              <w:rPr>
+                <w:rFonts w:asciiTheme="minorHAnsi" w:eastAsiaTheme="minorEastAsia" w:hAnsiTheme="minorHAnsi" w:cstheme="minorBidi"/>
+                <w:noProof/>
+                <w:kern w:val="2"/>
+                <w14:ligatures w14:val="standardContextual"/>
+              </w:rPr>
+              <w:tab/>
+            </w:r>
+            <w:r>
+              <w:rPr>
+                <w:rStyle w:val="Hyperlink"/>
+                <w:b/>
+                <w:bCs/>
+                <w:noProof/>
+              </w:rPr>
+              <w:t>Administration</w:t>
+            </w:r>
+            <w:r>
+              <w:rPr>
+                <w:noProof/>
+                <w:webHidden/>
+              </w:rPr>
+              <w:tab/>
+            </w:r>
+            <w:r>
+              <w:rPr>
+                <w:noProof/>
+                <w:webHidden/>
+              </w:rPr>
+              <w:fldChar w:fldCharType="begin"/>
+            </w:r>
+            <w:r>
+              <w:rPr>
+                <w:noProof/>
+                <w:webHidden/>
+              </w:rPr>
+              <w:instrText xml:space="preserve"> PAGEREF _Toc223459345 \h </w:instrText>
+            </w:r>
+            <w:r>
+              <w:rPr>
+                <w:noProof/>
+                <w:webHidden/>
+              </w:rPr>
+            </w:r>
+            <w:r>
+              <w:rPr>
+                <w:noProof/>
+                <w:webHidden/>
+              </w:rPr>
+              <w:fldChar w:fldCharType="separate"/>
+            </w:r>
+            <w:r>
+              <w:rPr>
+                <w:noProof/>
+                <w:webHidden/>
+              </w:rPr>
+              <w:t>5</w:t>
+            </w:r>
+            <w:r>
+              <w:rPr>
+                <w:noProof/>
+                <w:webHidden/>
+              </w:rPr>
+              <w:fldChar w:fldCharType="end"/>
+            </w:r>
+          </w:hyperlink>
+        </w:p>
+        <w:p>
+          <w:pPr>
+            <w:pStyle w:val="TOC2"/>
+            <w:tabs>
+              <w:tab w:val="left" w:pos="960"/>
+              <w:tab w:val="right" w:leader="dot" w:pos="9350"/>
+            </w:tabs>
+            <w:rPr>
+              <w:rFonts w:asciiTheme="minorHAnsi" w:eastAsiaTheme="minorEastAsia" w:hAnsiTheme="minorHAnsi" w:cstheme="minorBidi"/>
+              <w:noProof/>
+              <w:kern w:val="2"/>
+              <w14:ligatures w14:val="standardContextual"/>
+            </w:rPr>
+          </w:pPr>
+          <w:hyperlink w:anchor="_Toc223459346" w:history="1">
+            <w:r>
+              <w:rPr>
+                <w:rStyle w:val="Hyperlink"/>
+                <w:b/>
+                <w:bCs/>
+                <w:noProof/>
+              </w:rPr>
+              <w:t>3.3</w:t>
+            </w:r>
+            <w:r>
+              <w:rPr>
+                <w:rFonts w:asciiTheme="minorHAnsi" w:eastAsiaTheme="minorEastAsia" w:hAnsiTheme="minorHAnsi" w:cstheme="minorBidi"/>
+                <w:noProof/>
+                <w:kern w:val="2"/>
+                <w14:ligatures w14:val="standardContextual"/>
+              </w:rPr>
+              <w:tab/>
+            </w:r>
+            <w:r>
+              <w:rPr>
+                <w:rStyle w:val="Hyperlink"/>
+                <w:b/>
+                <w:bCs/>
+                <w:noProof/>
+              </w:rPr>
+              <w:t>System Deployment Overview</w:t>
+            </w:r>
+            <w:r>
+              <w:rPr>
+                <w:noProof/>
+                <w:webHidden/>
+              </w:rPr>
+              <w:tab/>
+            </w:r>
+            <w:r>
+              <w:rPr>
+                <w:noProof/>
+                <w:webHidden/>
+              </w:rPr>
+              <w:fldChar w:fldCharType="begin"/>
+            </w:r>
+            <w:r>
+              <w:rPr>
+                <w:noProof/>
+                <w:webHidden/>
+              </w:rPr>
+              <w:instrText xml:space="preserve"> PAGEREF _Toc223459346 \h </w:instrText>
+            </w:r>
+            <w:r>
+              <w:rPr>
+                <w:noProof/>
+                <w:webHidden/>
+              </w:rPr>
+            </w:r>
+            <w:r>
+              <w:rPr>
+                <w:noProof/>
+                <w:webHidden/>
+              </w:rPr>
+              <w:fldChar w:fldCharType="separate"/>
+            </w:r>
+            <w:r>
+              <w:rPr>
+                <w:noProof/>
+                <w:webHidden/>
+              </w:rPr>
+              <w:t>5</w:t>
             </w:r>
             <w:r>
               <w:rPr>
@@ -672,7 +1506,7 @@
               <w14:ligatures w14:val="standardContextual"/>
             </w:rPr>
           </w:pPr>
-          <w:hyperlink w:anchor="_Toc223388856" w:history="1">
+          <w:hyperlink w:anchor="_Toc223459347" w:history="1">
             <w:r>
               <w:rPr>
                 <w:rStyle w:val="Hyperlink"/>
@@ -700,7 +1534,7 @@
                 <w:noProof/>
                 <w:webHidden/>
               </w:rPr>
-              <w:instrText xml:space="preserve"> PAGEREF _Toc223388856 \h </w:instrText>
+              <w:instrText xml:space="preserve"> PAGEREF _Toc223459347 \h </w:instrText>
             </w:r>
             <w:r>
               <w:rPr>
@@ -720,7 +1554,7 @@
                 <w:noProof/>
                 <w:webHidden/>
               </w:rPr>
-              <w:t>4</w:t>
+              <w:t>5</w:t>
             </w:r>
             <w:r>
               <w:rPr>
@@ -748,7 +1582,7 @@
               <w14:ligatures w14:val="standardContextual"/>
             </w:rPr>
           </w:pPr>
-          <w:hyperlink w:anchor="_Toc223388857" w:history="1">
+          <w:hyperlink w:anchor="_Toc223459348" w:history="1">
             <w:r>
               <w:rPr>
                 <w:rStyle w:val="Hyperlink"/>
@@ -776,7 +1610,7 @@
                 <w:noProof/>
                 <w:webHidden/>
               </w:rPr>
-              <w:instrText xml:space="preserve"> PAGEREF _Toc223388857 \h </w:instrText>
+              <w:instrText xml:space="preserve"> PAGEREF _Toc223459348 \h </w:instrText>
             </w:r>
             <w:r>
               <w:rPr>
@@ -796,7 +1630,7 @@
                 <w:noProof/>
                 <w:webHidden/>
               </w:rPr>
-              <w:t>6</w:t>
+              <w:t>7</w:t>
             </w:r>
             <w:r>
               <w:rPr>
@@ -875,7 +1709,7 @@
           <w:szCs w:val="32"/>
         </w:rPr>
       </w:pPr>
-      <w:bookmarkStart w:id="0" w:name="_Toc223388854"/>
+      <w:bookmarkStart w:id="0" w:name="_Toc223459336"/>
       <w:r>
         <w:rPr>
           <w:rFonts w:ascii="Times New Roman" w:hAnsi="Times New Roman" w:cs="Times New Roman"/>
@@ -930,7 +1764,7 @@
           <w:szCs w:val="32"/>
         </w:rPr>
       </w:pPr>
-      <w:bookmarkStart w:id="1" w:name="_Toc223388855"/>
+      <w:bookmarkStart w:id="1" w:name="_Toc223459337"/>
       <w:r>
         <w:rPr>
           <w:rFonts w:ascii="Times New Roman" w:hAnsi="Times New Roman" w:cs="Times New Roman"/>
@@ -1055,12 +1889,13 @@
     <w:p/>
     <w:p>
       <w:pPr>
-        <w:pStyle w:val="ListParagraph"/>
+        <w:pStyle w:val="Heading1"/>
         <w:numPr>
           <w:ilvl w:val="0"/>
           <w:numId w:val="48"/>
         </w:numPr>
         <w:rPr>
+          <w:rFonts w:ascii="Times New Roman" w:hAnsi="Times New Roman" w:cs="Times New Roman"/>
           <w:b/>
           <w:bCs/>
           <w:color w:val="000000" w:themeColor="text1"/>
@@ -1068,8 +1903,10 @@
           <w:szCs w:val="32"/>
         </w:rPr>
       </w:pPr>
+      <w:bookmarkStart w:id="2" w:name="_Toc223459338"/>
       <w:r>
         <w:rPr>
+          <w:rFonts w:ascii="Times New Roman" w:hAnsi="Times New Roman" w:cs="Times New Roman"/>
           <w:b/>
           <w:bCs/>
           <w:color w:val="000000" w:themeColor="text1"/>
@@ -1079,12 +1916,524 @@
         <w:lastRenderedPageBreak/>
         <w:t>Final System Overview</w:t>
       </w:r>
+      <w:bookmarkEnd w:id="2"/>
     </w:p>
     <w:p>
       <w:pPr>
-        <w:pStyle w:val="Heading1"/>
+        <w:rPr>
+          <w:b/>
+          <w:bCs/>
+          <w:color w:val="000000" w:themeColor="text1"/>
+          <w:sz w:val="32"/>
+          <w:szCs w:val="32"/>
+        </w:rPr>
       </w:pPr>
     </w:p>
+    <w:p>
+      <w:pPr>
+        <w:jc w:val="both"/>
+        <w:rPr>
+          <w:color w:val="000000" w:themeColor="text1"/>
+        </w:rPr>
+      </w:pPr>
+      <w:r>
+        <w:rPr>
+          <w:color w:val="000000" w:themeColor="text1"/>
+        </w:rPr>
+        <w:t>This section outlines an overview of the final implemented system. It outlines the architectural structure, core functional components, deployment configuration of Peer Tutoring Platform. The purpose of this section is to describe the system at a high level before going into details of implementation decisions in the further technical sections.</w:t>
+      </w:r>
+    </w:p>
+    <w:p>
+      <w:pPr>
+        <w:rPr>
+          <w:color w:val="000000" w:themeColor="text1"/>
+        </w:rPr>
+      </w:pPr>
+    </w:p>
+    <w:p>
+      <w:pPr>
+        <w:pStyle w:val="Heading2"/>
+        <w:numPr>
+          <w:ilvl w:val="1"/>
+          <w:numId w:val="48"/>
+        </w:numPr>
+        <w:rPr>
+          <w:rFonts w:ascii="Times New Roman" w:hAnsi="Times New Roman" w:cs="Times New Roman"/>
+          <w:b/>
+          <w:bCs/>
+          <w:color w:val="000000" w:themeColor="text1"/>
+        </w:rPr>
+      </w:pPr>
+      <w:bookmarkStart w:id="3" w:name="_Toc223459339"/>
+      <w:r>
+        <w:rPr>
+          <w:rFonts w:ascii="Times New Roman" w:hAnsi="Times New Roman" w:cs="Times New Roman"/>
+          <w:b/>
+          <w:bCs/>
+          <w:color w:val="000000" w:themeColor="text1"/>
+        </w:rPr>
+        <w:t>System Architecture</w:t>
+      </w:r>
+      <w:bookmarkEnd w:id="3"/>
+      <w:r>
+        <w:rPr>
+          <w:rFonts w:ascii="Times New Roman" w:hAnsi="Times New Roman" w:cs="Times New Roman"/>
+          <w:b/>
+          <w:bCs/>
+          <w:color w:val="000000" w:themeColor="text1"/>
+        </w:rPr>
+        <w:t xml:space="preserve"> </w:t>
+      </w:r>
+    </w:p>
+    <w:p/>
+    <w:p>
+      <w:pPr>
+        <w:jc w:val="both"/>
+      </w:pPr>
+      <w:r>
+        <w:t xml:space="preserve">There has been an implemented into Peer Tutoring Platform a client server architecture based on </w:t>
+      </w:r>
+      <w:r>
+        <w:rPr>
+          <w:highlight w:val="yellow"/>
+        </w:rPr>
+        <w:t>MERN</w:t>
+      </w:r>
+      <w:r>
+        <w:t xml:space="preserve"> stack. The system consists of four core layers such as:</w:t>
+      </w:r>
+    </w:p>
+    <w:p>
+      <w:pPr>
+        <w:pStyle w:val="ListParagraph"/>
+        <w:numPr>
+          <w:ilvl w:val="0"/>
+          <w:numId w:val="50"/>
+        </w:numPr>
+        <w:jc w:val="both"/>
+      </w:pPr>
+      <w:r>
+        <w:t xml:space="preserve">Frontend (Client Layer) </w:t>
+      </w:r>
+      <w:r>
+        <w:t>– React.js</w:t>
+      </w:r>
+    </w:p>
+    <w:p>
+      <w:pPr>
+        <w:pStyle w:val="ListParagraph"/>
+        <w:numPr>
+          <w:ilvl w:val="0"/>
+          <w:numId w:val="50"/>
+        </w:numPr>
+        <w:jc w:val="both"/>
+      </w:pPr>
+      <w:r>
+        <w:t xml:space="preserve">Backend API (Application Layer) </w:t>
+      </w:r>
+      <w:r>
+        <w:t xml:space="preserve">– </w:t>
+      </w:r>
+      <w:r>
+        <w:t>Node.js with Express.js</w:t>
+      </w:r>
+    </w:p>
+    <w:p>
+      <w:pPr>
+        <w:pStyle w:val="ListParagraph"/>
+        <w:numPr>
+          <w:ilvl w:val="0"/>
+          <w:numId w:val="50"/>
+        </w:numPr>
+        <w:jc w:val="both"/>
+      </w:pPr>
+      <w:r>
+        <w:t xml:space="preserve">Database Layer </w:t>
+      </w:r>
+      <w:r>
+        <w:t>–</w:t>
+      </w:r>
+      <w:r>
+        <w:t xml:space="preserve"> MongoDB</w:t>
+      </w:r>
+    </w:p>
+    <w:p>
+      <w:pPr>
+        <w:pStyle w:val="ListParagraph"/>
+        <w:numPr>
+          <w:ilvl w:val="0"/>
+          <w:numId w:val="50"/>
+        </w:numPr>
+        <w:jc w:val="both"/>
+      </w:pPr>
+      <w:r>
+        <w:t xml:space="preserve">Communication Layer </w:t>
+      </w:r>
+      <w:r>
+        <w:t>–</w:t>
+      </w:r>
+      <w:r>
+        <w:t xml:space="preserve"> WebSocket</w:t>
+      </w:r>
+    </w:p>
+    <w:p>
+      <w:pPr>
+        <w:jc w:val="both"/>
+      </w:pPr>
+      <w:r>
+        <w:t xml:space="preserve">The client communicates with Express REST API through HTTP requests for </w:t>
+      </w:r>
+      <w:r>
+        <w:t>operations such as user registration, post creation, meeting scheduling. Real time communication, messaging and notification updates are handled with the help of WebSocket connections established through Socket.io.</w:t>
+      </w:r>
+    </w:p>
+    <w:p>
+      <w:pPr>
+        <w:jc w:val="both"/>
+      </w:pPr>
+      <w:r>
+        <w:t>Authentication is implemented using JSON Web Tokens. Upon only successful login a token is issued by the server and stored on the client. All protected routes are validated using middleware that verifies token authenticity before granting access to resources.</w:t>
+      </w:r>
+    </w:p>
+    <w:p>
+      <w:pPr>
+        <w:jc w:val="both"/>
+      </w:pPr>
+      <w:r>
+        <w:t xml:space="preserve">The described approach for layering </w:t>
+      </w:r>
+      <w:r>
+        <w:t>these architectures</w:t>
+      </w:r>
+      <w:r>
+        <w:t xml:space="preserve"> provides clear separation of concerns, secure communication and support for concurrent real time users.</w:t>
+      </w:r>
+    </w:p>
+    <w:p/>
+    <w:p>
+      <w:pPr>
+        <w:pStyle w:val="Heading2"/>
+        <w:numPr>
+          <w:ilvl w:val="1"/>
+          <w:numId w:val="48"/>
+        </w:numPr>
+        <w:rPr>
+          <w:rFonts w:ascii="Times New Roman" w:hAnsi="Times New Roman" w:cs="Times New Roman"/>
+          <w:b/>
+          <w:bCs/>
+          <w:color w:val="000000" w:themeColor="text1"/>
+        </w:rPr>
+      </w:pPr>
+      <w:bookmarkStart w:id="4" w:name="_Toc223459340"/>
+      <w:r>
+        <w:rPr>
+          <w:rFonts w:ascii="Times New Roman" w:hAnsi="Times New Roman" w:cs="Times New Roman"/>
+          <w:b/>
+          <w:bCs/>
+          <w:color w:val="000000" w:themeColor="text1"/>
+        </w:rPr>
+        <w:t>Core Functional Components</w:t>
+      </w:r>
+      <w:bookmarkEnd w:id="4"/>
+    </w:p>
+    <w:p/>
+    <w:p>
+      <w:r>
+        <w:t>The final system consists of the following core modules:</w:t>
+      </w:r>
+    </w:p>
+    <w:p/>
+    <w:p>
+      <w:pPr>
+        <w:pStyle w:val="Heading2"/>
+        <w:numPr>
+          <w:ilvl w:val="2"/>
+          <w:numId w:val="48"/>
+        </w:numPr>
+        <w:rPr>
+          <w:rFonts w:ascii="Times New Roman" w:hAnsi="Times New Roman" w:cs="Times New Roman"/>
+          <w:b/>
+          <w:bCs/>
+          <w:color w:val="000000" w:themeColor="text1"/>
+        </w:rPr>
+      </w:pPr>
+      <w:bookmarkStart w:id="5" w:name="_Toc223459341"/>
+      <w:r>
+        <w:rPr>
+          <w:rFonts w:ascii="Times New Roman" w:hAnsi="Times New Roman" w:cs="Times New Roman"/>
+          <w:b/>
+          <w:bCs/>
+          <w:color w:val="000000" w:themeColor="text1"/>
+        </w:rPr>
+        <w:t>Authentication and User Management</w:t>
+      </w:r>
+      <w:bookmarkEnd w:id="5"/>
+      <w:r>
+        <w:rPr>
+          <w:rFonts w:ascii="Times New Roman" w:hAnsi="Times New Roman" w:cs="Times New Roman"/>
+          <w:b/>
+          <w:bCs/>
+          <w:color w:val="000000" w:themeColor="text1"/>
+        </w:rPr>
+        <w:t xml:space="preserve"> </w:t>
+      </w:r>
+    </w:p>
+    <w:p>
+      <w:pPr>
+        <w:jc w:val="both"/>
+      </w:pPr>
+      <w:r>
+        <w:t xml:space="preserve">Users can register and log in using email and password credentials. JSON Web Token authentication ensures protected access to system resources. The following fields are stored in user profiles: academic interests, information, accumulated points. </w:t>
+      </w:r>
+    </w:p>
+    <w:p/>
+    <w:p>
+      <w:pPr>
+        <w:pStyle w:val="ListParagraph"/>
+        <w:numPr>
+          <w:ilvl w:val="2"/>
+          <w:numId w:val="48"/>
+        </w:numPr>
+        <w:rPr>
+          <w:b/>
+          <w:bCs/>
+          <w:sz w:val="32"/>
+          <w:szCs w:val="32"/>
+        </w:rPr>
+      </w:pPr>
+      <w:r>
+        <w:rPr>
+          <w:b/>
+          <w:bCs/>
+          <w:sz w:val="32"/>
+          <w:szCs w:val="32"/>
+        </w:rPr>
+        <w:t xml:space="preserve">Post and Collaboration Module  </w:t>
+      </w:r>
+    </w:p>
+    <w:p>
+      <w:pPr>
+        <w:jc w:val="both"/>
+      </w:pPr>
+      <w:r>
+        <w:t>Users can create tutoring related posts. Each post contains description, Author reference, comment section. Other users can interact with posts through likes. This module forms one of the core academic interaction layers of the platform.</w:t>
+      </w:r>
+    </w:p>
+    <w:p/>
+    <w:p>
+      <w:pPr>
+        <w:pStyle w:val="Heading2"/>
+        <w:numPr>
+          <w:ilvl w:val="2"/>
+          <w:numId w:val="48"/>
+        </w:numPr>
+        <w:rPr>
+          <w:rFonts w:ascii="Times New Roman" w:hAnsi="Times New Roman" w:cs="Times New Roman"/>
+          <w:b/>
+          <w:bCs/>
+          <w:color w:val="000000" w:themeColor="text1"/>
+        </w:rPr>
+      </w:pPr>
+      <w:bookmarkStart w:id="6" w:name="_Toc223459342"/>
+      <w:r>
+        <w:rPr>
+          <w:rFonts w:ascii="Times New Roman" w:hAnsi="Times New Roman" w:cs="Times New Roman"/>
+          <w:b/>
+          <w:bCs/>
+          <w:color w:val="000000" w:themeColor="text1"/>
+        </w:rPr>
+        <w:lastRenderedPageBreak/>
+        <w:t>Messaging System</w:t>
+      </w:r>
+      <w:bookmarkEnd w:id="6"/>
+    </w:p>
+    <w:p>
+      <w:pPr>
+        <w:jc w:val="both"/>
+      </w:pPr>
+      <w:r>
+        <w:t>The system includes a real time messaging feature that provides a communication layer for users. Messages are sent through WebSocket connections. The messaging module supports chat creation, real time delivery, loading of historical conversations.</w:t>
+      </w:r>
+    </w:p>
+    <w:p/>
+    <w:p>
+      <w:pPr>
+        <w:pStyle w:val="Heading2"/>
+        <w:numPr>
+          <w:ilvl w:val="2"/>
+          <w:numId w:val="48"/>
+        </w:numPr>
+        <w:rPr>
+          <w:rFonts w:ascii="Times New Roman" w:hAnsi="Times New Roman" w:cs="Times New Roman"/>
+          <w:b/>
+          <w:bCs/>
+          <w:color w:val="000000" w:themeColor="text1"/>
+        </w:rPr>
+      </w:pPr>
+      <w:bookmarkStart w:id="7" w:name="_Toc223459343"/>
+      <w:r>
+        <w:rPr>
+          <w:rFonts w:ascii="Times New Roman" w:hAnsi="Times New Roman" w:cs="Times New Roman"/>
+          <w:b/>
+          <w:bCs/>
+          <w:color w:val="000000" w:themeColor="text1"/>
+        </w:rPr>
+        <w:t>Scheduling and Meetings</w:t>
+      </w:r>
+      <w:bookmarkEnd w:id="7"/>
+    </w:p>
+    <w:p>
+      <w:pPr>
+        <w:jc w:val="both"/>
+      </w:pPr>
+      <w:r>
+        <w:t>Users can propose tutoring sessions by selecting date and time parameters. Meetings details are stored in the database. This module integrates notifications to remind users to rate services.</w:t>
+      </w:r>
+    </w:p>
+    <w:p/>
+    <w:p>
+      <w:pPr>
+        <w:pStyle w:val="Heading2"/>
+        <w:numPr>
+          <w:ilvl w:val="2"/>
+          <w:numId w:val="48"/>
+        </w:numPr>
+        <w:rPr>
+          <w:rFonts w:ascii="Times New Roman" w:hAnsi="Times New Roman" w:cs="Times New Roman"/>
+          <w:b/>
+          <w:bCs/>
+          <w:color w:val="000000" w:themeColor="text1"/>
+        </w:rPr>
+      </w:pPr>
+      <w:bookmarkStart w:id="8" w:name="_Toc223459344"/>
+      <w:r>
+        <w:rPr>
+          <w:rFonts w:ascii="Times New Roman" w:hAnsi="Times New Roman" w:cs="Times New Roman"/>
+          <w:b/>
+          <w:bCs/>
+          <w:color w:val="000000" w:themeColor="text1"/>
+        </w:rPr>
+        <w:t>Rating and Gamification</w:t>
+      </w:r>
+      <w:bookmarkEnd w:id="8"/>
+      <w:r>
+        <w:rPr>
+          <w:rFonts w:ascii="Times New Roman" w:hAnsi="Times New Roman" w:cs="Times New Roman"/>
+          <w:b/>
+          <w:bCs/>
+          <w:color w:val="000000" w:themeColor="text1"/>
+        </w:rPr>
+        <w:t xml:space="preserve"> </w:t>
+      </w:r>
+    </w:p>
+    <w:p>
+      <w:pPr>
+        <w:jc w:val="both"/>
+      </w:pPr>
+      <w:r>
+        <w:t xml:space="preserve">After finishing a tutoring session, users can rate meetings on a scale from zero to five. Ratings contribute to cumulative scores within the platform. The system rewards active participation and promotes user engagement. </w:t>
+      </w:r>
+    </w:p>
+    <w:p/>
+    <w:p>
+      <w:pPr>
+        <w:pStyle w:val="Heading2"/>
+        <w:numPr>
+          <w:ilvl w:val="2"/>
+          <w:numId w:val="48"/>
+        </w:numPr>
+        <w:rPr>
+          <w:rFonts w:ascii="Times New Roman" w:hAnsi="Times New Roman" w:cs="Times New Roman"/>
+          <w:b/>
+          <w:bCs/>
+          <w:color w:val="000000" w:themeColor="text1"/>
+        </w:rPr>
+      </w:pPr>
+      <w:bookmarkStart w:id="9" w:name="_Toc223459345"/>
+      <w:r>
+        <w:rPr>
+          <w:rFonts w:ascii="Times New Roman" w:hAnsi="Times New Roman" w:cs="Times New Roman"/>
+          <w:b/>
+          <w:bCs/>
+          <w:color w:val="000000" w:themeColor="text1"/>
+        </w:rPr>
+        <w:t>Administration</w:t>
+      </w:r>
+      <w:bookmarkEnd w:id="9"/>
+    </w:p>
+    <w:p>
+      <w:pPr>
+        <w:jc w:val="both"/>
+      </w:pPr>
+      <w:r>
+        <w:t xml:space="preserve">Administrators can monitor posts and user activity. Moderation tools allow removing inappropriate content to ensure compliance with university </w:t>
+      </w:r>
+      <w:r>
+        <w:t>standards</w:t>
+      </w:r>
+      <w:r>
+        <w:t>.</w:t>
+      </w:r>
+    </w:p>
+    <w:p>
+      <w:pPr>
+        <w:pStyle w:val="Heading2"/>
+      </w:pPr>
+    </w:p>
+    <w:p>
+      <w:pPr>
+        <w:pStyle w:val="Heading2"/>
+        <w:numPr>
+          <w:ilvl w:val="1"/>
+          <w:numId w:val="48"/>
+        </w:numPr>
+        <w:rPr>
+          <w:rFonts w:ascii="Times New Roman" w:hAnsi="Times New Roman" w:cs="Times New Roman"/>
+          <w:b/>
+          <w:bCs/>
+          <w:color w:val="000000" w:themeColor="text1"/>
+        </w:rPr>
+      </w:pPr>
+      <w:bookmarkStart w:id="10" w:name="_Toc223459346"/>
+      <w:r>
+        <w:rPr>
+          <w:rFonts w:ascii="Times New Roman" w:hAnsi="Times New Roman" w:cs="Times New Roman"/>
+          <w:b/>
+          <w:bCs/>
+          <w:color w:val="000000" w:themeColor="text1"/>
+        </w:rPr>
+        <w:t>System Deployment Overview</w:t>
+      </w:r>
+      <w:bookmarkEnd w:id="10"/>
+    </w:p>
+    <w:p>
+      <w:pPr>
+        <w:jc w:val="both"/>
+      </w:pPr>
+      <w:r>
+        <w:t>The application runs locally during development using a Node.js server environment</w:t>
+      </w:r>
+      <w:r>
+        <w:t xml:space="preserve">. MongoDB stores persistent data and the frontend is served via a React server that communicates with the backend through defined API endpoints. </w:t>
+      </w:r>
+    </w:p>
+    <w:p>
+      <w:pPr>
+        <w:jc w:val="both"/>
+      </w:pPr>
+      <w:r>
+        <w:t>The system supports multiple concurrent users and maintains storage of user data, posts, messages, meetings.</w:t>
+      </w:r>
+    </w:p>
+    <w:p>
+      <w:pPr>
+        <w:jc w:val="both"/>
+      </w:pPr>
+      <w:r>
+        <w:t xml:space="preserve">All communication between client and server is secured using HTTPS during deployment. </w:t>
+      </w:r>
+    </w:p>
+    <w:p/>
     <w:p>
       <w:pPr>
         <w:pStyle w:val="Heading1"/>
@@ -1092,7 +2441,7 @@
           <w:rFonts w:ascii="Times New Roman" w:hAnsi="Times New Roman" w:cs="Times New Roman"/>
         </w:rPr>
       </w:pPr>
-      <w:bookmarkStart w:id="2" w:name="_Toc223388856"/>
+      <w:bookmarkStart w:id="11" w:name="_Toc223459347"/>
       <w:r>
         <w:rPr>
           <w:rFonts w:ascii="Times New Roman" w:hAnsi="Times New Roman" w:cs="Times New Roman"/>
@@ -1117,7 +2466,7 @@
         </w:rPr>
         <w:t>Reference List</w:t>
       </w:r>
-      <w:bookmarkEnd w:id="2"/>
+      <w:bookmarkEnd w:id="11"/>
     </w:p>
     <w:p/>
     <w:p>
@@ -1184,6 +2533,7 @@
         <w:pStyle w:val="NormalWeb"/>
       </w:pPr>
       <w:r>
+        <w:lastRenderedPageBreak/>
         <w:t xml:space="preserve">Charlton, T. (1998). Peer tutoring: An introduction. </w:t>
       </w:r>
       <w:r>
@@ -1346,7 +2696,6 @@
         <w:pStyle w:val="NormalWeb"/>
       </w:pPr>
       <w:r>
-        <w:lastRenderedPageBreak/>
         <w:t xml:space="preserve">Krause, K. and Coates, H. (2008). Students’ engagement in first-year university. </w:t>
       </w:r>
       <w:r>
@@ -1466,6 +2815,7 @@
         <w:pStyle w:val="NormalWeb"/>
       </w:pPr>
       <w:r>
+        <w:lastRenderedPageBreak/>
         <w:t xml:space="preserve">Profi.ru (n.d.). </w:t>
       </w:r>
       <w:r>
@@ -1628,12 +2978,11 @@
           <w:rFonts w:ascii="Times New Roman" w:hAnsi="Times New Roman" w:cs="Times New Roman"/>
         </w:rPr>
       </w:pPr>
-      <w:bookmarkStart w:id="3" w:name="_Toc223388857"/>
+      <w:bookmarkStart w:id="12" w:name="_Toc223459348"/>
       <w:r>
         <w:rPr>
           <w:rFonts w:ascii="Times New Roman" w:hAnsi="Times New Roman" w:cs="Times New Roman"/>
         </w:rPr>
-        <w:lastRenderedPageBreak/>
         <w:t>14</w:t>
       </w:r>
       <w:r>
@@ -1648,7 +2997,7 @@
         </w:rPr>
         <w:t>Appendix</w:t>
       </w:r>
-      <w:bookmarkEnd w:id="3"/>
+      <w:bookmarkEnd w:id="12"/>
     </w:p>
     <w:sdt>
       <w:sdtPr>
@@ -2212,9 +3561,9 @@
 <w:numbering xmlns:wpc="http://schemas.microsoft.com/office/word/2010/wordprocessingCanvas" xmlns:cx="http://schemas.microsoft.com/office/drawing/2014/chartex" xmlns:cx1="http://schemas.microsoft.com/office/drawing/2015/9/8/chartex" xmlns:cx2="http://schemas.microsoft.com/office/drawing/2015/10/21/chartex" xmlns:cx3="http://schemas.microsoft.com/office/drawing/2016/5/9/chartex" xmlns:cx4="http://schemas.microsoft.com/office/drawing/2016/5/10/chartex" xmlns:cx5="http://schemas.microsoft.com/office/drawing/2016/5/11/chartex" xmlns:cx6="http://schemas.microsoft.com/office/drawing/2016/5/12/chartex" xmlns:cx7="http://schemas.microsoft.com/office/drawing/2016/5/13/chartex" xmlns:cx8="http://schemas.microsoft.com/office/drawing/2016/5/14/chartex" xmlns:mc="http://schemas.openxmlformats.org/markup-compatibility/2006" xmlns:aink="http://schemas.microsoft.com/office/drawing/2016/ink" xmlns:am3d="http://schemas.microsoft.com/office/drawing/2017/model3d" xmlns:o="urn:schemas-microsoft-com:office:office" xmlns:oel="http://schemas.microsoft.com/office/2019/extlst" xmlns:r="http://schemas.openxmlformats.org/officeDocument/2006/relationships" xmlns:m="http://schemas.openxmlformats.org/officeDocument/2006/math" xmlns:v="urn:schemas-microsoft-com:vml" xmlns:wp14="http://schemas.microsoft.com/office/word/2010/wordprocessingDrawing" xmlns:wp="http://schemas.openxmlformats.org/drawingml/2006/wordprocessingDrawing" xmlns:w10="urn:schemas-microsoft-com:office:word" xmlns:w="http://schemas.openxmlformats.org/wordprocessingml/2006/main" xmlns:w14="http://schemas.microsoft.com/office/word/2010/wordml" xmlns:w15="http://schemas.microsoft.com/office/word/2012/wordml" xmlns:w16cex="http://schemas.microsoft.com/office/word/2018/wordml/cex" xmlns:w16cid="http://schemas.microsoft.com/office/word/2016/wordml/cid" xmlns:w16="http://schemas.microsoft.com/office/word/2018/wordml" xmlns:w16du="http://schemas.microsoft.com/office/word/2023/wordml/word16du" xmlns:w16sdtdh="http://schemas.microsoft.com/office/word/2020/wordml/sdtdatahash" xmlns:w16sdtfl="http://schemas.microsoft.com/office/word/2024/wordml/sdtformatlock" xmlns:w16se="http://schemas.microsoft.com/office/word/2015/wordml/symex" xmlns:wpg="http://schemas.microsoft.com/office/word/2010/wordprocessingGroup" xmlns:wpi="http://schemas.microsoft.com/office/word/2010/wordprocessingInk" xmlns:wne="http://schemas.microsoft.com/office/word/2006/wordml" xmlns:wps="http://schemas.microsoft.com/office/word/2010/wordprocessingShape" mc:Ignorable="w14 w15 w16se w16cid w16 w16cex w16sdtdh w16sdtfl w16du wp14">
   <w:abstractNum w:abstractNumId="0" w15:restartNumberingAfterBreak="0">
     <w:nsid w:val="025F36C6"/>
-    <w:multiLevelType w:val="hybridMultilevel"/>
-    <w:tmpl w:val="6B9E2008"/>
-    <w:lvl w:ilvl="0" w:tplc="0409000F">
+    <w:multiLevelType w:val="multilevel"/>
+    <w:tmpl w:val="BBD2E56E"/>
+    <w:lvl w:ilvl="0">
       <w:start w:val="1"/>
       <w:numFmt w:val="decimal"/>
       <w:lvlText w:val="%1."/>
@@ -2226,80 +3575,225 @@
         <w:rFonts w:hint="default"/>
       </w:rPr>
     </w:lvl>
-    <w:lvl w:ilvl="1" w:tplc="04090019" w:tentative="1">
-      <w:start w:val="1"/>
-      <w:numFmt w:val="lowerLetter"/>
-      <w:lvlText w:val="%2."/>
-      <w:lvlJc w:val="left"/>
-      <w:pPr>
-        <w:ind w:left="1080" w:hanging="360"/>
-      </w:pPr>
-    </w:lvl>
-    <w:lvl w:ilvl="2" w:tplc="0409001B" w:tentative="1">
-      <w:start w:val="1"/>
-      <w:numFmt w:val="lowerRoman"/>
-      <w:lvlText w:val="%3."/>
-      <w:lvlJc w:val="right"/>
-      <w:pPr>
-        <w:ind w:left="1800" w:hanging="180"/>
-      </w:pPr>
-    </w:lvl>
-    <w:lvl w:ilvl="3" w:tplc="0409000F" w:tentative="1">
-      <w:start w:val="1"/>
-      <w:numFmt w:val="decimal"/>
-      <w:lvlText w:val="%4."/>
-      <w:lvlJc w:val="left"/>
-      <w:pPr>
-        <w:ind w:left="2520" w:hanging="360"/>
-      </w:pPr>
-    </w:lvl>
-    <w:lvl w:ilvl="4" w:tplc="04090019" w:tentative="1">
-      <w:start w:val="1"/>
-      <w:numFmt w:val="lowerLetter"/>
-      <w:lvlText w:val="%5."/>
-      <w:lvlJc w:val="left"/>
-      <w:pPr>
-        <w:ind w:left="3240" w:hanging="360"/>
-      </w:pPr>
-    </w:lvl>
-    <w:lvl w:ilvl="5" w:tplc="0409001B" w:tentative="1">
-      <w:start w:val="1"/>
-      <w:numFmt w:val="lowerRoman"/>
-      <w:lvlText w:val="%6."/>
-      <w:lvlJc w:val="right"/>
-      <w:pPr>
-        <w:ind w:left="3960" w:hanging="180"/>
-      </w:pPr>
-    </w:lvl>
-    <w:lvl w:ilvl="6" w:tplc="0409000F" w:tentative="1">
-      <w:start w:val="1"/>
-      <w:numFmt w:val="decimal"/>
-      <w:lvlText w:val="%7."/>
-      <w:lvlJc w:val="left"/>
-      <w:pPr>
-        <w:ind w:left="4680" w:hanging="360"/>
-      </w:pPr>
-    </w:lvl>
-    <w:lvl w:ilvl="7" w:tplc="04090019" w:tentative="1">
-      <w:start w:val="1"/>
-      <w:numFmt w:val="lowerLetter"/>
-      <w:lvlText w:val="%8."/>
-      <w:lvlJc w:val="left"/>
-      <w:pPr>
-        <w:ind w:left="5400" w:hanging="360"/>
-      </w:pPr>
-    </w:lvl>
-    <w:lvl w:ilvl="8" w:tplc="0409001B" w:tentative="1">
-      <w:start w:val="1"/>
-      <w:numFmt w:val="lowerRoman"/>
-      <w:lvlText w:val="%9."/>
-      <w:lvlJc w:val="right"/>
-      <w:pPr>
-        <w:ind w:left="6120" w:hanging="180"/>
-      </w:pPr>
+    <w:lvl w:ilvl="1">
+      <w:start w:val="1"/>
+      <w:numFmt w:val="decimal"/>
+      <w:isLgl/>
+      <w:lvlText w:val="%1.%2"/>
+      <w:lvlJc w:val="left"/>
+      <w:pPr>
+        <w:ind w:left="480" w:hanging="480"/>
+      </w:pPr>
+      <w:rPr>
+        <w:rFonts w:hint="default"/>
+      </w:rPr>
+    </w:lvl>
+    <w:lvl w:ilvl="2">
+      <w:start w:val="1"/>
+      <w:numFmt w:val="decimal"/>
+      <w:isLgl/>
+      <w:lvlText w:val="%1.%2.%3"/>
+      <w:lvlJc w:val="left"/>
+      <w:pPr>
+        <w:ind w:left="720" w:hanging="720"/>
+      </w:pPr>
+      <w:rPr>
+        <w:rFonts w:hint="default"/>
+      </w:rPr>
+    </w:lvl>
+    <w:lvl w:ilvl="3">
+      <w:start w:val="1"/>
+      <w:numFmt w:val="decimal"/>
+      <w:isLgl/>
+      <w:lvlText w:val="%1.%2.%3.%4"/>
+      <w:lvlJc w:val="left"/>
+      <w:pPr>
+        <w:ind w:left="720" w:hanging="720"/>
+      </w:pPr>
+      <w:rPr>
+        <w:rFonts w:hint="default"/>
+      </w:rPr>
+    </w:lvl>
+    <w:lvl w:ilvl="4">
+      <w:start w:val="1"/>
+      <w:numFmt w:val="decimal"/>
+      <w:isLgl/>
+      <w:lvlText w:val="%1.%2.%3.%4.%5"/>
+      <w:lvlJc w:val="left"/>
+      <w:pPr>
+        <w:ind w:left="1080" w:hanging="1080"/>
+      </w:pPr>
+      <w:rPr>
+        <w:rFonts w:hint="default"/>
+      </w:rPr>
+    </w:lvl>
+    <w:lvl w:ilvl="5">
+      <w:start w:val="1"/>
+      <w:numFmt w:val="decimal"/>
+      <w:isLgl/>
+      <w:lvlText w:val="%1.%2.%3.%4.%5.%6"/>
+      <w:lvlJc w:val="left"/>
+      <w:pPr>
+        <w:ind w:left="1080" w:hanging="1080"/>
+      </w:pPr>
+      <w:rPr>
+        <w:rFonts w:hint="default"/>
+      </w:rPr>
+    </w:lvl>
+    <w:lvl w:ilvl="6">
+      <w:start w:val="1"/>
+      <w:numFmt w:val="decimal"/>
+      <w:isLgl/>
+      <w:lvlText w:val="%1.%2.%3.%4.%5.%6.%7"/>
+      <w:lvlJc w:val="left"/>
+      <w:pPr>
+        <w:ind w:left="1440" w:hanging="1440"/>
+      </w:pPr>
+      <w:rPr>
+        <w:rFonts w:hint="default"/>
+      </w:rPr>
+    </w:lvl>
+    <w:lvl w:ilvl="7">
+      <w:start w:val="1"/>
+      <w:numFmt w:val="decimal"/>
+      <w:isLgl/>
+      <w:lvlText w:val="%1.%2.%3.%4.%5.%6.%7.%8"/>
+      <w:lvlJc w:val="left"/>
+      <w:pPr>
+        <w:ind w:left="1440" w:hanging="1440"/>
+      </w:pPr>
+      <w:rPr>
+        <w:rFonts w:hint="default"/>
+      </w:rPr>
+    </w:lvl>
+    <w:lvl w:ilvl="8">
+      <w:start w:val="1"/>
+      <w:numFmt w:val="decimal"/>
+      <w:isLgl/>
+      <w:lvlText w:val="%1.%2.%3.%4.%5.%6.%7.%8.%9"/>
+      <w:lvlJc w:val="left"/>
+      <w:pPr>
+        <w:ind w:left="1800" w:hanging="1800"/>
+      </w:pPr>
+      <w:rPr>
+        <w:rFonts w:hint="default"/>
+      </w:rPr>
     </w:lvl>
   </w:abstractNum>
   <w:abstractNum w:abstractNumId="1" w15:restartNumberingAfterBreak="0">
+    <w:nsid w:val="03E93E85"/>
+    <w:multiLevelType w:val="hybridMultilevel"/>
+    <w:tmpl w:val="E0C6C81C"/>
+    <w:lvl w:ilvl="0" w:tplc="9E0A892C">
+      <w:start w:val="3"/>
+      <w:numFmt w:val="bullet"/>
+      <w:lvlText w:val="-"/>
+      <w:lvlJc w:val="left"/>
+      <w:pPr>
+        <w:ind w:left="720" w:hanging="360"/>
+      </w:pPr>
+      <w:rPr>
+        <w:rFonts w:ascii="Times New Roman" w:eastAsia="Times New Roman" w:hAnsi="Times New Roman" w:cs="Times New Roman" w:hint="default"/>
+      </w:rPr>
+    </w:lvl>
+    <w:lvl w:ilvl="1" w:tplc="04090003" w:tentative="1">
+      <w:start w:val="1"/>
+      <w:numFmt w:val="bullet"/>
+      <w:lvlText w:val="o"/>
+      <w:lvlJc w:val="left"/>
+      <w:pPr>
+        <w:ind w:left="1440" w:hanging="360"/>
+      </w:pPr>
+      <w:rPr>
+        <w:rFonts w:ascii="Courier New" w:hAnsi="Courier New" w:cs="Courier New" w:hint="default"/>
+      </w:rPr>
+    </w:lvl>
+    <w:lvl w:ilvl="2" w:tplc="04090005" w:tentative="1">
+      <w:start w:val="1"/>
+      <w:numFmt w:val="bullet"/>
+      <w:lvlText w:val=""/>
+      <w:lvlJc w:val="left"/>
+      <w:pPr>
+        <w:ind w:left="2160" w:hanging="360"/>
+      </w:pPr>
+      <w:rPr>
+        <w:rFonts w:ascii="Wingdings" w:hAnsi="Wingdings" w:hint="default"/>
+      </w:rPr>
+    </w:lvl>
+    <w:lvl w:ilvl="3" w:tplc="04090001" w:tentative="1">
+      <w:start w:val="1"/>
+      <w:numFmt w:val="bullet"/>
+      <w:lvlText w:val=""/>
+      <w:lvlJc w:val="left"/>
+      <w:pPr>
+        <w:ind w:left="2880" w:hanging="360"/>
+      </w:pPr>
+      <w:rPr>
+        <w:rFonts w:ascii="Symbol" w:hAnsi="Symbol" w:hint="default"/>
+      </w:rPr>
+    </w:lvl>
+    <w:lvl w:ilvl="4" w:tplc="04090003" w:tentative="1">
+      <w:start w:val="1"/>
+      <w:numFmt w:val="bullet"/>
+      <w:lvlText w:val="o"/>
+      <w:lvlJc w:val="left"/>
+      <w:pPr>
+        <w:ind w:left="3600" w:hanging="360"/>
+      </w:pPr>
+      <w:rPr>
+        <w:rFonts w:ascii="Courier New" w:hAnsi="Courier New" w:cs="Courier New" w:hint="default"/>
+      </w:rPr>
+    </w:lvl>
+    <w:lvl w:ilvl="5" w:tplc="04090005" w:tentative="1">
+      <w:start w:val="1"/>
+      <w:numFmt w:val="bullet"/>
+      <w:lvlText w:val=""/>
+      <w:lvlJc w:val="left"/>
+      <w:pPr>
+        <w:ind w:left="4320" w:hanging="360"/>
+      </w:pPr>
+      <w:rPr>
+        <w:rFonts w:ascii="Wingdings" w:hAnsi="Wingdings" w:hint="default"/>
+      </w:rPr>
+    </w:lvl>
+    <w:lvl w:ilvl="6" w:tplc="04090001" w:tentative="1">
+      <w:start w:val="1"/>
+      <w:numFmt w:val="bullet"/>
+      <w:lvlText w:val=""/>
+      <w:lvlJc w:val="left"/>
+      <w:pPr>
+        <w:ind w:left="5040" w:hanging="360"/>
+      </w:pPr>
+      <w:rPr>
+        <w:rFonts w:ascii="Symbol" w:hAnsi="Symbol" w:hint="default"/>
+      </w:rPr>
+    </w:lvl>
+    <w:lvl w:ilvl="7" w:tplc="04090003" w:tentative="1">
+      <w:start w:val="1"/>
+      <w:numFmt w:val="bullet"/>
+      <w:lvlText w:val="o"/>
+      <w:lvlJc w:val="left"/>
+      <w:pPr>
+        <w:ind w:left="5760" w:hanging="360"/>
+      </w:pPr>
+      <w:rPr>
+        <w:rFonts w:ascii="Courier New" w:hAnsi="Courier New" w:cs="Courier New" w:hint="default"/>
+      </w:rPr>
+    </w:lvl>
+    <w:lvl w:ilvl="8" w:tplc="04090005" w:tentative="1">
+      <w:start w:val="1"/>
+      <w:numFmt w:val="bullet"/>
+      <w:lvlText w:val=""/>
+      <w:lvlJc w:val="left"/>
+      <w:pPr>
+        <w:ind w:left="6480" w:hanging="360"/>
+      </w:pPr>
+      <w:rPr>
+        <w:rFonts w:ascii="Wingdings" w:hAnsi="Wingdings" w:hint="default"/>
+      </w:rPr>
+    </w:lvl>
+  </w:abstractNum>
+  <w:abstractNum w:abstractNumId="2" w15:restartNumberingAfterBreak="0">
     <w:nsid w:val="03EB6EEA"/>
     <w:multiLevelType w:val="hybridMultilevel"/>
     <w:tmpl w:val="F30810B6"/>
@@ -2385,7 +3879,7 @@
       </w:pPr>
     </w:lvl>
   </w:abstractNum>
-  <w:abstractNum w:abstractNumId="2" w15:restartNumberingAfterBreak="0">
+  <w:abstractNum w:abstractNumId="3" w15:restartNumberingAfterBreak="0">
     <w:nsid w:val="048F0E8C"/>
     <w:multiLevelType w:val="multilevel"/>
     <w:tmpl w:val="C5FCD898"/>
@@ -2506,7 +4000,7 @@
       </w:rPr>
     </w:lvl>
   </w:abstractNum>
-  <w:abstractNum w:abstractNumId="3" w15:restartNumberingAfterBreak="0">
+  <w:abstractNum w:abstractNumId="4" w15:restartNumberingAfterBreak="0">
     <w:nsid w:val="06A40270"/>
     <w:multiLevelType w:val="hybridMultilevel"/>
     <w:tmpl w:val="6B1A2180"/>
@@ -2619,7 +4113,7 @@
       </w:rPr>
     </w:lvl>
   </w:abstractNum>
-  <w:abstractNum w:abstractNumId="4" w15:restartNumberingAfterBreak="0">
+  <w:abstractNum w:abstractNumId="5" w15:restartNumberingAfterBreak="0">
     <w:nsid w:val="099E2010"/>
     <w:multiLevelType w:val="multilevel"/>
     <w:tmpl w:val="8A4C243E"/>
@@ -2768,7 +4262,7 @@
       </w:rPr>
     </w:lvl>
   </w:abstractNum>
-  <w:abstractNum w:abstractNumId="5" w15:restartNumberingAfterBreak="0">
+  <w:abstractNum w:abstractNumId="6" w15:restartNumberingAfterBreak="0">
     <w:nsid w:val="0BF73012"/>
     <w:multiLevelType w:val="multilevel"/>
     <w:tmpl w:val="A6EAE344"/>
@@ -2917,7 +4411,7 @@
       </w:rPr>
     </w:lvl>
   </w:abstractNum>
-  <w:abstractNum w:abstractNumId="6" w15:restartNumberingAfterBreak="0">
+  <w:abstractNum w:abstractNumId="7" w15:restartNumberingAfterBreak="0">
     <w:nsid w:val="0CE56F79"/>
     <w:multiLevelType w:val="hybridMultilevel"/>
     <w:tmpl w:val="A50C6C3A"/>
@@ -3003,7 +4497,7 @@
       </w:pPr>
     </w:lvl>
   </w:abstractNum>
-  <w:abstractNum w:abstractNumId="7" w15:restartNumberingAfterBreak="0">
+  <w:abstractNum w:abstractNumId="8" w15:restartNumberingAfterBreak="0">
     <w:nsid w:val="106A6B25"/>
     <w:multiLevelType w:val="multilevel"/>
     <w:tmpl w:val="91200778"/>
@@ -3152,7 +4646,93 @@
       </w:rPr>
     </w:lvl>
   </w:abstractNum>
-  <w:abstractNum w:abstractNumId="8" w15:restartNumberingAfterBreak="0">
+  <w:abstractNum w:abstractNumId="9" w15:restartNumberingAfterBreak="0">
+    <w:nsid w:val="11E10CE0"/>
+    <w:multiLevelType w:val="hybridMultilevel"/>
+    <w:tmpl w:val="2AC0733C"/>
+    <w:lvl w:ilvl="0" w:tplc="0409000F">
+      <w:start w:val="1"/>
+      <w:numFmt w:val="decimal"/>
+      <w:lvlText w:val="%1."/>
+      <w:lvlJc w:val="left"/>
+      <w:pPr>
+        <w:ind w:left="720" w:hanging="360"/>
+      </w:pPr>
+    </w:lvl>
+    <w:lvl w:ilvl="1" w:tplc="04090019" w:tentative="1">
+      <w:start w:val="1"/>
+      <w:numFmt w:val="lowerLetter"/>
+      <w:lvlText w:val="%2."/>
+      <w:lvlJc w:val="left"/>
+      <w:pPr>
+        <w:ind w:left="1440" w:hanging="360"/>
+      </w:pPr>
+    </w:lvl>
+    <w:lvl w:ilvl="2" w:tplc="0409001B" w:tentative="1">
+      <w:start w:val="1"/>
+      <w:numFmt w:val="lowerRoman"/>
+      <w:lvlText w:val="%3."/>
+      <w:lvlJc w:val="right"/>
+      <w:pPr>
+        <w:ind w:left="2160" w:hanging="180"/>
+      </w:pPr>
+    </w:lvl>
+    <w:lvl w:ilvl="3" w:tplc="0409000F" w:tentative="1">
+      <w:start w:val="1"/>
+      <w:numFmt w:val="decimal"/>
+      <w:lvlText w:val="%4."/>
+      <w:lvlJc w:val="left"/>
+      <w:pPr>
+        <w:ind w:left="2880" w:hanging="360"/>
+      </w:pPr>
+    </w:lvl>
+    <w:lvl w:ilvl="4" w:tplc="04090019" w:tentative="1">
+      <w:start w:val="1"/>
+      <w:numFmt w:val="lowerLetter"/>
+      <w:lvlText w:val="%5."/>
+      <w:lvlJc w:val="left"/>
+      <w:pPr>
+        <w:ind w:left="3600" w:hanging="360"/>
+      </w:pPr>
+    </w:lvl>
+    <w:lvl w:ilvl="5" w:tplc="0409001B" w:tentative="1">
+      <w:start w:val="1"/>
+      <w:numFmt w:val="lowerRoman"/>
+      <w:lvlText w:val="%6."/>
+      <w:lvlJc w:val="right"/>
+      <w:pPr>
+        <w:ind w:left="4320" w:hanging="180"/>
+      </w:pPr>
+    </w:lvl>
+    <w:lvl w:ilvl="6" w:tplc="0409000F" w:tentative="1">
+      <w:start w:val="1"/>
+      <w:numFmt w:val="decimal"/>
+      <w:lvlText w:val="%7."/>
+      <w:lvlJc w:val="left"/>
+      <w:pPr>
+        <w:ind w:left="5040" w:hanging="360"/>
+      </w:pPr>
+    </w:lvl>
+    <w:lvl w:ilvl="7" w:tplc="04090019" w:tentative="1">
+      <w:start w:val="1"/>
+      <w:numFmt w:val="lowerLetter"/>
+      <w:lvlText w:val="%8."/>
+      <w:lvlJc w:val="left"/>
+      <w:pPr>
+        <w:ind w:left="5760" w:hanging="360"/>
+      </w:pPr>
+    </w:lvl>
+    <w:lvl w:ilvl="8" w:tplc="0409001B" w:tentative="1">
+      <w:start w:val="1"/>
+      <w:numFmt w:val="lowerRoman"/>
+      <w:lvlText w:val="%9."/>
+      <w:lvlJc w:val="right"/>
+      <w:pPr>
+        <w:ind w:left="6480" w:hanging="180"/>
+      </w:pPr>
+    </w:lvl>
+  </w:abstractNum>
+  <w:abstractNum w:abstractNumId="10" w15:restartNumberingAfterBreak="0">
     <w:nsid w:val="13C118DC"/>
     <w:multiLevelType w:val="multilevel"/>
     <w:tmpl w:val="FDFC4E2E"/>
@@ -3298,7 +4878,7 @@
       </w:rPr>
     </w:lvl>
   </w:abstractNum>
-  <w:abstractNum w:abstractNumId="9" w15:restartNumberingAfterBreak="0">
+  <w:abstractNum w:abstractNumId="11" w15:restartNumberingAfterBreak="0">
     <w:nsid w:val="15F6309F"/>
     <w:multiLevelType w:val="hybridMultilevel"/>
     <w:tmpl w:val="DFFC7D5A"/>
@@ -3384,7 +4964,7 @@
       </w:pPr>
     </w:lvl>
   </w:abstractNum>
-  <w:abstractNum w:abstractNumId="10" w15:restartNumberingAfterBreak="0">
+  <w:abstractNum w:abstractNumId="12" w15:restartNumberingAfterBreak="0">
     <w:nsid w:val="16C70515"/>
     <w:multiLevelType w:val="multilevel"/>
     <w:tmpl w:val="1CE860BA"/>
@@ -3497,7 +5077,7 @@
       </w:rPr>
     </w:lvl>
   </w:abstractNum>
-  <w:abstractNum w:abstractNumId="11" w15:restartNumberingAfterBreak="0">
+  <w:abstractNum w:abstractNumId="13" w15:restartNumberingAfterBreak="0">
     <w:nsid w:val="1B2644E6"/>
     <w:multiLevelType w:val="multilevel"/>
     <w:tmpl w:val="DF6A7F3C"/>
@@ -3643,7 +5223,7 @@
       </w:rPr>
     </w:lvl>
   </w:abstractNum>
-  <w:abstractNum w:abstractNumId="12" w15:restartNumberingAfterBreak="0">
+  <w:abstractNum w:abstractNumId="14" w15:restartNumberingAfterBreak="0">
     <w:nsid w:val="1C937CA4"/>
     <w:multiLevelType w:val="multilevel"/>
     <w:tmpl w:val="E1C49F44"/>
@@ -3756,7 +5336,93 @@
       </w:rPr>
     </w:lvl>
   </w:abstractNum>
-  <w:abstractNum w:abstractNumId="13" w15:restartNumberingAfterBreak="0">
+  <w:abstractNum w:abstractNumId="15" w15:restartNumberingAfterBreak="0">
+    <w:nsid w:val="1FB64C99"/>
+    <w:multiLevelType w:val="hybridMultilevel"/>
+    <w:tmpl w:val="8A7AD79A"/>
+    <w:lvl w:ilvl="0" w:tplc="0409000F">
+      <w:start w:val="1"/>
+      <w:numFmt w:val="decimal"/>
+      <w:lvlText w:val="%1."/>
+      <w:lvlJc w:val="left"/>
+      <w:pPr>
+        <w:ind w:left="720" w:hanging="360"/>
+      </w:pPr>
+    </w:lvl>
+    <w:lvl w:ilvl="1" w:tplc="04090019" w:tentative="1">
+      <w:start w:val="1"/>
+      <w:numFmt w:val="lowerLetter"/>
+      <w:lvlText w:val="%2."/>
+      <w:lvlJc w:val="left"/>
+      <w:pPr>
+        <w:ind w:left="1440" w:hanging="360"/>
+      </w:pPr>
+    </w:lvl>
+    <w:lvl w:ilvl="2" w:tplc="0409001B">
+      <w:start w:val="1"/>
+      <w:numFmt w:val="lowerRoman"/>
+      <w:lvlText w:val="%3."/>
+      <w:lvlJc w:val="right"/>
+      <w:pPr>
+        <w:ind w:left="2160" w:hanging="180"/>
+      </w:pPr>
+    </w:lvl>
+    <w:lvl w:ilvl="3" w:tplc="0409000F">
+      <w:start w:val="1"/>
+      <w:numFmt w:val="decimal"/>
+      <w:lvlText w:val="%4."/>
+      <w:lvlJc w:val="left"/>
+      <w:pPr>
+        <w:ind w:left="2880" w:hanging="360"/>
+      </w:pPr>
+    </w:lvl>
+    <w:lvl w:ilvl="4" w:tplc="04090019">
+      <w:start w:val="1"/>
+      <w:numFmt w:val="lowerLetter"/>
+      <w:lvlText w:val="%5."/>
+      <w:lvlJc w:val="left"/>
+      <w:pPr>
+        <w:ind w:left="3600" w:hanging="360"/>
+      </w:pPr>
+    </w:lvl>
+    <w:lvl w:ilvl="5" w:tplc="0409001B">
+      <w:start w:val="1"/>
+      <w:numFmt w:val="lowerRoman"/>
+      <w:lvlText w:val="%6."/>
+      <w:lvlJc w:val="right"/>
+      <w:pPr>
+        <w:ind w:left="4320" w:hanging="180"/>
+      </w:pPr>
+    </w:lvl>
+    <w:lvl w:ilvl="6" w:tplc="0409000F">
+      <w:start w:val="1"/>
+      <w:numFmt w:val="decimal"/>
+      <w:lvlText w:val="%7."/>
+      <w:lvlJc w:val="left"/>
+      <w:pPr>
+        <w:ind w:left="5040" w:hanging="360"/>
+      </w:pPr>
+    </w:lvl>
+    <w:lvl w:ilvl="7" w:tplc="04090019" w:tentative="1">
+      <w:start w:val="1"/>
+      <w:numFmt w:val="lowerLetter"/>
+      <w:lvlText w:val="%8."/>
+      <w:lvlJc w:val="left"/>
+      <w:pPr>
+        <w:ind w:left="5760" w:hanging="360"/>
+      </w:pPr>
+    </w:lvl>
+    <w:lvl w:ilvl="8" w:tplc="0409001B" w:tentative="1">
+      <w:start w:val="1"/>
+      <w:numFmt w:val="lowerRoman"/>
+      <w:lvlText w:val="%9."/>
+      <w:lvlJc w:val="right"/>
+      <w:pPr>
+        <w:ind w:left="6480" w:hanging="180"/>
+      </w:pPr>
+    </w:lvl>
+  </w:abstractNum>
+  <w:abstractNum w:abstractNumId="16" w15:restartNumberingAfterBreak="0">
     <w:nsid w:val="20BB618F"/>
     <w:multiLevelType w:val="multilevel"/>
     <w:tmpl w:val="DFE02C5E"/>
@@ -3869,7 +5535,7 @@
       </w:rPr>
     </w:lvl>
   </w:abstractNum>
-  <w:abstractNum w:abstractNumId="14" w15:restartNumberingAfterBreak="0">
+  <w:abstractNum w:abstractNumId="17" w15:restartNumberingAfterBreak="0">
     <w:nsid w:val="20C14890"/>
     <w:multiLevelType w:val="hybridMultilevel"/>
     <w:tmpl w:val="1DDAB038"/>
@@ -3958,7 +5624,7 @@
       </w:pPr>
     </w:lvl>
   </w:abstractNum>
-  <w:abstractNum w:abstractNumId="15" w15:restartNumberingAfterBreak="0">
+  <w:abstractNum w:abstractNumId="18" w15:restartNumberingAfterBreak="0">
     <w:nsid w:val="221A7341"/>
     <w:multiLevelType w:val="multilevel"/>
     <w:tmpl w:val="D04A62BC"/>
@@ -4107,7 +5773,7 @@
       </w:rPr>
     </w:lvl>
   </w:abstractNum>
-  <w:abstractNum w:abstractNumId="16" w15:restartNumberingAfterBreak="0">
+  <w:abstractNum w:abstractNumId="19" w15:restartNumberingAfterBreak="0">
     <w:nsid w:val="29EF6A03"/>
     <w:multiLevelType w:val="multilevel"/>
     <w:tmpl w:val="7D488EEA"/>
@@ -4256,7 +5922,7 @@
       </w:rPr>
     </w:lvl>
   </w:abstractNum>
-  <w:abstractNum w:abstractNumId="17" w15:restartNumberingAfterBreak="0">
+  <w:abstractNum w:abstractNumId="20" w15:restartNumberingAfterBreak="0">
     <w:nsid w:val="2E687AE0"/>
     <w:multiLevelType w:val="multilevel"/>
     <w:tmpl w:val="DF6A7F3C"/>
@@ -4402,7 +6068,7 @@
       </w:rPr>
     </w:lvl>
   </w:abstractNum>
-  <w:abstractNum w:abstractNumId="18" w15:restartNumberingAfterBreak="0">
+  <w:abstractNum w:abstractNumId="21" w15:restartNumberingAfterBreak="0">
     <w:nsid w:val="2F38432F"/>
     <w:multiLevelType w:val="multilevel"/>
     <w:tmpl w:val="FDFC4E2E"/>
@@ -4548,7 +6214,7 @@
       </w:rPr>
     </w:lvl>
   </w:abstractNum>
-  <w:abstractNum w:abstractNumId="19" w15:restartNumberingAfterBreak="0">
+  <w:abstractNum w:abstractNumId="22" w15:restartNumberingAfterBreak="0">
     <w:nsid w:val="2F825433"/>
     <w:multiLevelType w:val="multilevel"/>
     <w:tmpl w:val="F2B8FC54"/>
@@ -4697,7 +6363,93 @@
       </w:rPr>
     </w:lvl>
   </w:abstractNum>
-  <w:abstractNum w:abstractNumId="20" w15:restartNumberingAfterBreak="0">
+  <w:abstractNum w:abstractNumId="23" w15:restartNumberingAfterBreak="0">
+    <w:nsid w:val="308A52A8"/>
+    <w:multiLevelType w:val="hybridMultilevel"/>
+    <w:tmpl w:val="5E4606CE"/>
+    <w:lvl w:ilvl="0" w:tplc="0409000F">
+      <w:start w:val="1"/>
+      <w:numFmt w:val="decimal"/>
+      <w:lvlText w:val="%1."/>
+      <w:lvlJc w:val="left"/>
+      <w:pPr>
+        <w:ind w:left="720" w:hanging="360"/>
+      </w:pPr>
+    </w:lvl>
+    <w:lvl w:ilvl="1" w:tplc="04090019" w:tentative="1">
+      <w:start w:val="1"/>
+      <w:numFmt w:val="lowerLetter"/>
+      <w:lvlText w:val="%2."/>
+      <w:lvlJc w:val="left"/>
+      <w:pPr>
+        <w:ind w:left="1440" w:hanging="360"/>
+      </w:pPr>
+    </w:lvl>
+    <w:lvl w:ilvl="2" w:tplc="0409001B" w:tentative="1">
+      <w:start w:val="1"/>
+      <w:numFmt w:val="lowerRoman"/>
+      <w:lvlText w:val="%3."/>
+      <w:lvlJc w:val="right"/>
+      <w:pPr>
+        <w:ind w:left="2160" w:hanging="180"/>
+      </w:pPr>
+    </w:lvl>
+    <w:lvl w:ilvl="3" w:tplc="0409000F" w:tentative="1">
+      <w:start w:val="1"/>
+      <w:numFmt w:val="decimal"/>
+      <w:lvlText w:val="%4."/>
+      <w:lvlJc w:val="left"/>
+      <w:pPr>
+        <w:ind w:left="2880" w:hanging="360"/>
+      </w:pPr>
+    </w:lvl>
+    <w:lvl w:ilvl="4" w:tplc="04090019" w:tentative="1">
+      <w:start w:val="1"/>
+      <w:numFmt w:val="lowerLetter"/>
+      <w:lvlText w:val="%5."/>
+      <w:lvlJc w:val="left"/>
+      <w:pPr>
+        <w:ind w:left="3600" w:hanging="360"/>
+      </w:pPr>
+    </w:lvl>
+    <w:lvl w:ilvl="5" w:tplc="0409001B" w:tentative="1">
+      <w:start w:val="1"/>
+      <w:numFmt w:val="lowerRoman"/>
+      <w:lvlText w:val="%6."/>
+      <w:lvlJc w:val="right"/>
+      <w:pPr>
+        <w:ind w:left="4320" w:hanging="180"/>
+      </w:pPr>
+    </w:lvl>
+    <w:lvl w:ilvl="6" w:tplc="0409000F" w:tentative="1">
+      <w:start w:val="1"/>
+      <w:numFmt w:val="decimal"/>
+      <w:lvlText w:val="%7."/>
+      <w:lvlJc w:val="left"/>
+      <w:pPr>
+        <w:ind w:left="5040" w:hanging="360"/>
+      </w:pPr>
+    </w:lvl>
+    <w:lvl w:ilvl="7" w:tplc="04090019" w:tentative="1">
+      <w:start w:val="1"/>
+      <w:numFmt w:val="lowerLetter"/>
+      <w:lvlText w:val="%8."/>
+      <w:lvlJc w:val="left"/>
+      <w:pPr>
+        <w:ind w:left="5760" w:hanging="360"/>
+      </w:pPr>
+    </w:lvl>
+    <w:lvl w:ilvl="8" w:tplc="0409001B" w:tentative="1">
+      <w:start w:val="1"/>
+      <w:numFmt w:val="lowerRoman"/>
+      <w:lvlText w:val="%9."/>
+      <w:lvlJc w:val="right"/>
+      <w:pPr>
+        <w:ind w:left="6480" w:hanging="180"/>
+      </w:pPr>
+    </w:lvl>
+  </w:abstractNum>
+  <w:abstractNum w:abstractNumId="24" w15:restartNumberingAfterBreak="0">
     <w:nsid w:val="30E1757C"/>
     <w:multiLevelType w:val="multilevel"/>
     <w:tmpl w:val="DF6A7F3C"/>
@@ -4843,7 +6595,7 @@
       </w:rPr>
     </w:lvl>
   </w:abstractNum>
-  <w:abstractNum w:abstractNumId="21" w15:restartNumberingAfterBreak="0">
+  <w:abstractNum w:abstractNumId="25" w15:restartNumberingAfterBreak="0">
     <w:nsid w:val="33921B89"/>
     <w:multiLevelType w:val="hybridMultilevel"/>
     <w:tmpl w:val="F30810B6"/>
@@ -4929,7 +6681,7 @@
       </w:pPr>
     </w:lvl>
   </w:abstractNum>
-  <w:abstractNum w:abstractNumId="22" w15:restartNumberingAfterBreak="0">
+  <w:abstractNum w:abstractNumId="26" w15:restartNumberingAfterBreak="0">
     <w:nsid w:val="35664F58"/>
     <w:multiLevelType w:val="hybridMultilevel"/>
     <w:tmpl w:val="6FF6886E"/>
@@ -5042,7 +6794,7 @@
       </w:rPr>
     </w:lvl>
   </w:abstractNum>
-  <w:abstractNum w:abstractNumId="23" w15:restartNumberingAfterBreak="0">
+  <w:abstractNum w:abstractNumId="27" w15:restartNumberingAfterBreak="0">
     <w:nsid w:val="36DA7BF5"/>
     <w:multiLevelType w:val="multilevel"/>
     <w:tmpl w:val="57CA5176"/>
@@ -5155,7 +6907,7 @@
       </w:rPr>
     </w:lvl>
   </w:abstractNum>
-  <w:abstractNum w:abstractNumId="24" w15:restartNumberingAfterBreak="0">
+  <w:abstractNum w:abstractNumId="28" w15:restartNumberingAfterBreak="0">
     <w:nsid w:val="37211FC9"/>
     <w:multiLevelType w:val="multilevel"/>
     <w:tmpl w:val="DF6A7F3C"/>
@@ -5301,7 +7053,7 @@
       </w:rPr>
     </w:lvl>
   </w:abstractNum>
-  <w:abstractNum w:abstractNumId="25" w15:restartNumberingAfterBreak="0">
+  <w:abstractNum w:abstractNumId="29" w15:restartNumberingAfterBreak="0">
     <w:nsid w:val="38641764"/>
     <w:multiLevelType w:val="multilevel"/>
     <w:tmpl w:val="68842356"/>
@@ -5447,7 +7199,7 @@
       </w:rPr>
     </w:lvl>
   </w:abstractNum>
-  <w:abstractNum w:abstractNumId="26" w15:restartNumberingAfterBreak="0">
+  <w:abstractNum w:abstractNumId="30" w15:restartNumberingAfterBreak="0">
     <w:nsid w:val="44A236C0"/>
     <w:multiLevelType w:val="multilevel"/>
     <w:tmpl w:val="1CE860BA"/>
@@ -5560,7 +7312,7 @@
       </w:rPr>
     </w:lvl>
   </w:abstractNum>
-  <w:abstractNum w:abstractNumId="27" w15:restartNumberingAfterBreak="0">
+  <w:abstractNum w:abstractNumId="31" w15:restartNumberingAfterBreak="0">
     <w:nsid w:val="477F143E"/>
     <w:multiLevelType w:val="multilevel"/>
     <w:tmpl w:val="68842356"/>
@@ -5706,7 +7458,7 @@
       </w:rPr>
     </w:lvl>
   </w:abstractNum>
-  <w:abstractNum w:abstractNumId="28" w15:restartNumberingAfterBreak="0">
+  <w:abstractNum w:abstractNumId="32" w15:restartNumberingAfterBreak="0">
     <w:nsid w:val="4A253C16"/>
     <w:multiLevelType w:val="multilevel"/>
     <w:tmpl w:val="FDFC4E2E"/>
@@ -5852,7 +7604,7 @@
       </w:rPr>
     </w:lvl>
   </w:abstractNum>
-  <w:abstractNum w:abstractNumId="29" w15:restartNumberingAfterBreak="0">
+  <w:abstractNum w:abstractNumId="33" w15:restartNumberingAfterBreak="0">
     <w:nsid w:val="4AAB458E"/>
     <w:multiLevelType w:val="multilevel"/>
     <w:tmpl w:val="68842356"/>
@@ -5998,7 +7750,7 @@
       </w:rPr>
     </w:lvl>
   </w:abstractNum>
-  <w:abstractNum w:abstractNumId="30" w15:restartNumberingAfterBreak="0">
+  <w:abstractNum w:abstractNumId="34" w15:restartNumberingAfterBreak="0">
     <w:nsid w:val="4E886D8A"/>
     <w:multiLevelType w:val="multilevel"/>
     <w:tmpl w:val="FDFC4E2E"/>
@@ -6144,7 +7896,7 @@
       </w:rPr>
     </w:lvl>
   </w:abstractNum>
-  <w:abstractNum w:abstractNumId="31" w15:restartNumberingAfterBreak="0">
+  <w:abstractNum w:abstractNumId="35" w15:restartNumberingAfterBreak="0">
     <w:nsid w:val="521A65CD"/>
     <w:multiLevelType w:val="multilevel"/>
     <w:tmpl w:val="6E2CEAE0"/>
@@ -6293,7 +8045,7 @@
       </w:rPr>
     </w:lvl>
   </w:abstractNum>
-  <w:abstractNum w:abstractNumId="32" w15:restartNumberingAfterBreak="0">
+  <w:abstractNum w:abstractNumId="36" w15:restartNumberingAfterBreak="0">
     <w:nsid w:val="545915D6"/>
     <w:multiLevelType w:val="multilevel"/>
     <w:tmpl w:val="DF6A7F3C"/>
@@ -6439,7 +8191,93 @@
       </w:rPr>
     </w:lvl>
   </w:abstractNum>
-  <w:abstractNum w:abstractNumId="33" w15:restartNumberingAfterBreak="0">
+  <w:abstractNum w:abstractNumId="37" w15:restartNumberingAfterBreak="0">
+    <w:nsid w:val="55BD0436"/>
+    <w:multiLevelType w:val="hybridMultilevel"/>
+    <w:tmpl w:val="7C3A328C"/>
+    <w:lvl w:ilvl="0" w:tplc="0409000F">
+      <w:start w:val="1"/>
+      <w:numFmt w:val="decimal"/>
+      <w:lvlText w:val="%1."/>
+      <w:lvlJc w:val="left"/>
+      <w:pPr>
+        <w:ind w:left="720" w:hanging="360"/>
+      </w:pPr>
+    </w:lvl>
+    <w:lvl w:ilvl="1" w:tplc="04090019" w:tentative="1">
+      <w:start w:val="1"/>
+      <w:numFmt w:val="lowerLetter"/>
+      <w:lvlText w:val="%2."/>
+      <w:lvlJc w:val="left"/>
+      <w:pPr>
+        <w:ind w:left="1440" w:hanging="360"/>
+      </w:pPr>
+    </w:lvl>
+    <w:lvl w:ilvl="2" w:tplc="0409001B" w:tentative="1">
+      <w:start w:val="1"/>
+      <w:numFmt w:val="lowerRoman"/>
+      <w:lvlText w:val="%3."/>
+      <w:lvlJc w:val="right"/>
+      <w:pPr>
+        <w:ind w:left="2160" w:hanging="180"/>
+      </w:pPr>
+    </w:lvl>
+    <w:lvl w:ilvl="3" w:tplc="0409000F" w:tentative="1">
+      <w:start w:val="1"/>
+      <w:numFmt w:val="decimal"/>
+      <w:lvlText w:val="%4."/>
+      <w:lvlJc w:val="left"/>
+      <w:pPr>
+        <w:ind w:left="2880" w:hanging="360"/>
+      </w:pPr>
+    </w:lvl>
+    <w:lvl w:ilvl="4" w:tplc="04090019" w:tentative="1">
+      <w:start w:val="1"/>
+      <w:numFmt w:val="lowerLetter"/>
+      <w:lvlText w:val="%5."/>
+      <w:lvlJc w:val="left"/>
+      <w:pPr>
+        <w:ind w:left="3600" w:hanging="360"/>
+      </w:pPr>
+    </w:lvl>
+    <w:lvl w:ilvl="5" w:tplc="0409001B" w:tentative="1">
+      <w:start w:val="1"/>
+      <w:numFmt w:val="lowerRoman"/>
+      <w:lvlText w:val="%6."/>
+      <w:lvlJc w:val="right"/>
+      <w:pPr>
+        <w:ind w:left="4320" w:hanging="180"/>
+      </w:pPr>
+    </w:lvl>
+    <w:lvl w:ilvl="6" w:tplc="0409000F" w:tentative="1">
+      <w:start w:val="1"/>
+      <w:numFmt w:val="decimal"/>
+      <w:lvlText w:val="%7."/>
+      <w:lvlJc w:val="left"/>
+      <w:pPr>
+        <w:ind w:left="5040" w:hanging="360"/>
+      </w:pPr>
+    </w:lvl>
+    <w:lvl w:ilvl="7" w:tplc="04090019" w:tentative="1">
+      <w:start w:val="1"/>
+      <w:numFmt w:val="lowerLetter"/>
+      <w:lvlText w:val="%8."/>
+      <w:lvlJc w:val="left"/>
+      <w:pPr>
+        <w:ind w:left="5760" w:hanging="360"/>
+      </w:pPr>
+    </w:lvl>
+    <w:lvl w:ilvl="8" w:tplc="0409001B" w:tentative="1">
+      <w:start w:val="1"/>
+      <w:numFmt w:val="lowerRoman"/>
+      <w:lvlText w:val="%9."/>
+      <w:lvlJc w:val="right"/>
+      <w:pPr>
+        <w:ind w:left="6480" w:hanging="180"/>
+      </w:pPr>
+    </w:lvl>
+  </w:abstractNum>
+  <w:abstractNum w:abstractNumId="38" w15:restartNumberingAfterBreak="0">
     <w:nsid w:val="56280CC0"/>
     <w:multiLevelType w:val="hybridMultilevel"/>
     <w:tmpl w:val="C2FEFEDC"/>
@@ -6525,7 +8363,7 @@
       </w:pPr>
     </w:lvl>
   </w:abstractNum>
-  <w:abstractNum w:abstractNumId="34" w15:restartNumberingAfterBreak="0">
+  <w:abstractNum w:abstractNumId="39" w15:restartNumberingAfterBreak="0">
     <w:nsid w:val="572A2A2D"/>
     <w:multiLevelType w:val="multilevel"/>
     <w:tmpl w:val="9BC685AA"/>
@@ -6638,7 +8476,7 @@
       </w:rPr>
     </w:lvl>
   </w:abstractNum>
-  <w:abstractNum w:abstractNumId="35" w15:restartNumberingAfterBreak="0">
+  <w:abstractNum w:abstractNumId="40" w15:restartNumberingAfterBreak="0">
     <w:nsid w:val="5A7B6B30"/>
     <w:multiLevelType w:val="multilevel"/>
     <w:tmpl w:val="DF7AD022"/>
@@ -6787,7 +8625,7 @@
       </w:rPr>
     </w:lvl>
   </w:abstractNum>
-  <w:abstractNum w:abstractNumId="36" w15:restartNumberingAfterBreak="0">
+  <w:abstractNum w:abstractNumId="41" w15:restartNumberingAfterBreak="0">
     <w:nsid w:val="5C015D54"/>
     <w:multiLevelType w:val="multilevel"/>
     <w:tmpl w:val="66D208DC"/>
@@ -6900,7 +8738,7 @@
       </w:pPr>
     </w:lvl>
   </w:abstractNum>
-  <w:abstractNum w:abstractNumId="37" w15:restartNumberingAfterBreak="0">
+  <w:abstractNum w:abstractNumId="42" w15:restartNumberingAfterBreak="0">
     <w:nsid w:val="5C5454BC"/>
     <w:multiLevelType w:val="multilevel"/>
     <w:tmpl w:val="68842356"/>
@@ -7046,7 +8884,7 @@
       </w:rPr>
     </w:lvl>
   </w:abstractNum>
-  <w:abstractNum w:abstractNumId="38" w15:restartNumberingAfterBreak="0">
+  <w:abstractNum w:abstractNumId="43" w15:restartNumberingAfterBreak="0">
     <w:nsid w:val="606D7492"/>
     <w:multiLevelType w:val="multilevel"/>
     <w:tmpl w:val="FDFC4E2E"/>
@@ -7192,7 +9030,7 @@
       </w:rPr>
     </w:lvl>
   </w:abstractNum>
-  <w:abstractNum w:abstractNumId="39" w15:restartNumberingAfterBreak="0">
+  <w:abstractNum w:abstractNumId="44" w15:restartNumberingAfterBreak="0">
     <w:nsid w:val="62465259"/>
     <w:multiLevelType w:val="multilevel"/>
     <w:tmpl w:val="FDFC4E2E"/>
@@ -7338,7 +9176,7 @@
       </w:rPr>
     </w:lvl>
   </w:abstractNum>
-  <w:abstractNum w:abstractNumId="40" w15:restartNumberingAfterBreak="0">
+  <w:abstractNum w:abstractNumId="45" w15:restartNumberingAfterBreak="0">
     <w:nsid w:val="64A96324"/>
     <w:multiLevelType w:val="multilevel"/>
     <w:tmpl w:val="68842356"/>
@@ -7484,7 +9322,7 @@
       </w:rPr>
     </w:lvl>
   </w:abstractNum>
-  <w:abstractNum w:abstractNumId="41" w15:restartNumberingAfterBreak="0">
+  <w:abstractNum w:abstractNumId="46" w15:restartNumberingAfterBreak="0">
     <w:nsid w:val="699D7F53"/>
     <w:multiLevelType w:val="multilevel"/>
     <w:tmpl w:val="DF6A7F3C"/>
@@ -7630,7 +9468,120 @@
       </w:rPr>
     </w:lvl>
   </w:abstractNum>
-  <w:abstractNum w:abstractNumId="42" w15:restartNumberingAfterBreak="0">
+  <w:abstractNum w:abstractNumId="47" w15:restartNumberingAfterBreak="0">
+    <w:nsid w:val="6B07430E"/>
+    <w:multiLevelType w:val="hybridMultilevel"/>
+    <w:tmpl w:val="6F9C41D6"/>
+    <w:lvl w:ilvl="0" w:tplc="9E0A892C">
+      <w:start w:val="3"/>
+      <w:numFmt w:val="bullet"/>
+      <w:lvlText w:val="-"/>
+      <w:lvlJc w:val="left"/>
+      <w:pPr>
+        <w:ind w:left="720" w:hanging="360"/>
+      </w:pPr>
+      <w:rPr>
+        <w:rFonts w:ascii="Times New Roman" w:eastAsia="Times New Roman" w:hAnsi="Times New Roman" w:cs="Times New Roman" w:hint="default"/>
+      </w:rPr>
+    </w:lvl>
+    <w:lvl w:ilvl="1" w:tplc="04090003" w:tentative="1">
+      <w:start w:val="1"/>
+      <w:numFmt w:val="bullet"/>
+      <w:lvlText w:val="o"/>
+      <w:lvlJc w:val="left"/>
+      <w:pPr>
+        <w:ind w:left="1440" w:hanging="360"/>
+      </w:pPr>
+      <w:rPr>
+        <w:rFonts w:ascii="Courier New" w:hAnsi="Courier New" w:cs="Courier New" w:hint="default"/>
+      </w:rPr>
+    </w:lvl>
+    <w:lvl w:ilvl="2" w:tplc="04090005" w:tentative="1">
+      <w:start w:val="1"/>
+      <w:numFmt w:val="bullet"/>
+      <w:lvlText w:val=""/>
+      <w:lvlJc w:val="left"/>
+      <w:pPr>
+        <w:ind w:left="2160" w:hanging="360"/>
+      </w:pPr>
+      <w:rPr>
+        <w:rFonts w:ascii="Wingdings" w:hAnsi="Wingdings" w:hint="default"/>
+      </w:rPr>
+    </w:lvl>
+    <w:lvl w:ilvl="3" w:tplc="04090001" w:tentative="1">
+      <w:start w:val="1"/>
+      <w:numFmt w:val="bullet"/>
+      <w:lvlText w:val=""/>
+      <w:lvlJc w:val="left"/>
+      <w:pPr>
+        <w:ind w:left="2880" w:hanging="360"/>
+      </w:pPr>
+      <w:rPr>
+        <w:rFonts w:ascii="Symbol" w:hAnsi="Symbol" w:hint="default"/>
+      </w:rPr>
+    </w:lvl>
+    <w:lvl w:ilvl="4" w:tplc="04090003" w:tentative="1">
+      <w:start w:val="1"/>
+      <w:numFmt w:val="bullet"/>
+      <w:lvlText w:val="o"/>
+      <w:lvlJc w:val="left"/>
+      <w:pPr>
+        <w:ind w:left="3600" w:hanging="360"/>
+      </w:pPr>
+      <w:rPr>
+        <w:rFonts w:ascii="Courier New" w:hAnsi="Courier New" w:cs="Courier New" w:hint="default"/>
+      </w:rPr>
+    </w:lvl>
+    <w:lvl w:ilvl="5" w:tplc="04090005" w:tentative="1">
+      <w:start w:val="1"/>
+      <w:numFmt w:val="bullet"/>
+      <w:lvlText w:val=""/>
+      <w:lvlJc w:val="left"/>
+      <w:pPr>
+        <w:ind w:left="4320" w:hanging="360"/>
+      </w:pPr>
+      <w:rPr>
+        <w:rFonts w:ascii="Wingdings" w:hAnsi="Wingdings" w:hint="default"/>
+      </w:rPr>
+    </w:lvl>
+    <w:lvl w:ilvl="6" w:tplc="04090001" w:tentative="1">
+      <w:start w:val="1"/>
+      <w:numFmt w:val="bullet"/>
+      <w:lvlText w:val=""/>
+      <w:lvlJc w:val="left"/>
+      <w:pPr>
+        <w:ind w:left="5040" w:hanging="360"/>
+      </w:pPr>
+      <w:rPr>
+        <w:rFonts w:ascii="Symbol" w:hAnsi="Symbol" w:hint="default"/>
+      </w:rPr>
+    </w:lvl>
+    <w:lvl w:ilvl="7" w:tplc="04090003" w:tentative="1">
+      <w:start w:val="1"/>
+      <w:numFmt w:val="bullet"/>
+      <w:lvlText w:val="o"/>
+      <w:lvlJc w:val="left"/>
+      <w:pPr>
+        <w:ind w:left="5760" w:hanging="360"/>
+      </w:pPr>
+      <w:rPr>
+        <w:rFonts w:ascii="Courier New" w:hAnsi="Courier New" w:cs="Courier New" w:hint="default"/>
+      </w:rPr>
+    </w:lvl>
+    <w:lvl w:ilvl="8" w:tplc="04090005" w:tentative="1">
+      <w:start w:val="1"/>
+      <w:numFmt w:val="bullet"/>
+      <w:lvlText w:val=""/>
+      <w:lvlJc w:val="left"/>
+      <w:pPr>
+        <w:ind w:left="6480" w:hanging="360"/>
+      </w:pPr>
+      <w:rPr>
+        <w:rFonts w:ascii="Wingdings" w:hAnsi="Wingdings" w:hint="default"/>
+      </w:rPr>
+    </w:lvl>
+  </w:abstractNum>
+  <w:abstractNum w:abstractNumId="48" w15:restartNumberingAfterBreak="0">
     <w:nsid w:val="6D0364A0"/>
     <w:multiLevelType w:val="multilevel"/>
     <w:tmpl w:val="68842356"/>
@@ -7776,7 +9727,7 @@
       </w:rPr>
     </w:lvl>
   </w:abstractNum>
-  <w:abstractNum w:abstractNumId="43" w15:restartNumberingAfterBreak="0">
+  <w:abstractNum w:abstractNumId="49" w15:restartNumberingAfterBreak="0">
     <w:nsid w:val="6D7273D8"/>
     <w:multiLevelType w:val="multilevel"/>
     <w:tmpl w:val="DC706630"/>
@@ -7925,7 +9876,7 @@
       </w:rPr>
     </w:lvl>
   </w:abstractNum>
-  <w:abstractNum w:abstractNumId="44" w15:restartNumberingAfterBreak="0">
+  <w:abstractNum w:abstractNumId="50" w15:restartNumberingAfterBreak="0">
     <w:nsid w:val="783E2CBC"/>
     <w:multiLevelType w:val="multilevel"/>
     <w:tmpl w:val="E94A3B26"/>
@@ -8038,7 +9989,7 @@
       </w:pPr>
     </w:lvl>
   </w:abstractNum>
-  <w:abstractNum w:abstractNumId="45" w15:restartNumberingAfterBreak="0">
+  <w:abstractNum w:abstractNumId="51" w15:restartNumberingAfterBreak="0">
     <w:nsid w:val="789F4CE1"/>
     <w:multiLevelType w:val="multilevel"/>
     <w:tmpl w:val="1CE860BA"/>
@@ -8151,7 +10102,7 @@
       </w:rPr>
     </w:lvl>
   </w:abstractNum>
-  <w:abstractNum w:abstractNumId="46" w15:restartNumberingAfterBreak="0">
+  <w:abstractNum w:abstractNumId="52" w15:restartNumberingAfterBreak="0">
     <w:nsid w:val="79730313"/>
     <w:multiLevelType w:val="multilevel"/>
     <w:tmpl w:val="68842356"/>
@@ -8297,7 +10248,7 @@
       </w:rPr>
     </w:lvl>
   </w:abstractNum>
-  <w:abstractNum w:abstractNumId="47" w15:restartNumberingAfterBreak="0">
+  <w:abstractNum w:abstractNumId="53" w15:restartNumberingAfterBreak="0">
     <w:nsid w:val="7AEC76B6"/>
     <w:multiLevelType w:val="multilevel"/>
     <w:tmpl w:val="FDFC4E2E"/>
@@ -8444,148 +10395,166 @@
     </w:lvl>
   </w:abstractNum>
   <w:num w:numId="1" w16cid:durableId="687026918">
+    <w:abstractNumId w:val="3"/>
+  </w:num>
+  <w:num w:numId="2" w16cid:durableId="1521433076">
+    <w:abstractNumId w:val="27"/>
+  </w:num>
+  <w:num w:numId="3" w16cid:durableId="1169172737">
+    <w:abstractNumId w:val="16"/>
+  </w:num>
+  <w:num w:numId="4" w16cid:durableId="1095663320">
+    <w:abstractNumId w:val="14"/>
+  </w:num>
+  <w:num w:numId="5" w16cid:durableId="320277980">
+    <w:abstractNumId w:val="51"/>
+  </w:num>
+  <w:num w:numId="6" w16cid:durableId="480125140">
+    <w:abstractNumId w:val="35"/>
+  </w:num>
+  <w:num w:numId="7" w16cid:durableId="1312128570">
+    <w:abstractNumId w:val="50"/>
+  </w:num>
+  <w:num w:numId="8" w16cid:durableId="721293094">
+    <w:abstractNumId w:val="41"/>
+  </w:num>
+  <w:num w:numId="9" w16cid:durableId="623655124">
+    <w:abstractNumId w:val="42"/>
+  </w:num>
+  <w:num w:numId="10" w16cid:durableId="433673490">
+    <w:abstractNumId w:val="33"/>
+  </w:num>
+  <w:num w:numId="11" w16cid:durableId="666246274">
+    <w:abstractNumId w:val="48"/>
+  </w:num>
+  <w:num w:numId="12" w16cid:durableId="1583947328">
+    <w:abstractNumId w:val="45"/>
+  </w:num>
+  <w:num w:numId="13" w16cid:durableId="1561015977">
+    <w:abstractNumId w:val="31"/>
+  </w:num>
+  <w:num w:numId="14" w16cid:durableId="1813788044">
+    <w:abstractNumId w:val="29"/>
+  </w:num>
+  <w:num w:numId="15" w16cid:durableId="1516311903">
+    <w:abstractNumId w:val="52"/>
+  </w:num>
+  <w:num w:numId="16" w16cid:durableId="700788812">
+    <w:abstractNumId w:val="18"/>
+  </w:num>
+  <w:num w:numId="17" w16cid:durableId="738552033">
+    <w:abstractNumId w:val="12"/>
+  </w:num>
+  <w:num w:numId="18" w16cid:durableId="506284840">
+    <w:abstractNumId w:val="30"/>
+  </w:num>
+  <w:num w:numId="19" w16cid:durableId="281688829">
+    <w:abstractNumId w:val="19"/>
+  </w:num>
+  <w:num w:numId="20" w16cid:durableId="1440640888">
+    <w:abstractNumId w:val="22"/>
+  </w:num>
+  <w:num w:numId="21" w16cid:durableId="908731130">
+    <w:abstractNumId w:val="6"/>
+  </w:num>
+  <w:num w:numId="22" w16cid:durableId="1803890039">
+    <w:abstractNumId w:val="5"/>
+  </w:num>
+  <w:num w:numId="23" w16cid:durableId="1576740101">
+    <w:abstractNumId w:val="49"/>
+  </w:num>
+  <w:num w:numId="24" w16cid:durableId="524516724">
+    <w:abstractNumId w:val="40"/>
+  </w:num>
+  <w:num w:numId="25" w16cid:durableId="1680624365">
+    <w:abstractNumId w:val="8"/>
+  </w:num>
+  <w:num w:numId="26" w16cid:durableId="16082667">
+    <w:abstractNumId w:val="34"/>
+  </w:num>
+  <w:num w:numId="27" w16cid:durableId="691566847">
+    <w:abstractNumId w:val="21"/>
+  </w:num>
+  <w:num w:numId="28" w16cid:durableId="2094620173">
+    <w:abstractNumId w:val="43"/>
+  </w:num>
+  <w:num w:numId="29" w16cid:durableId="906111721">
+    <w:abstractNumId w:val="10"/>
+  </w:num>
+  <w:num w:numId="30" w16cid:durableId="508177387">
+    <w:abstractNumId w:val="32"/>
+  </w:num>
+  <w:num w:numId="31" w16cid:durableId="913011401">
+    <w:abstractNumId w:val="53"/>
+  </w:num>
+  <w:num w:numId="32" w16cid:durableId="1644390964">
+    <w:abstractNumId w:val="44"/>
+  </w:num>
+  <w:num w:numId="33" w16cid:durableId="778261706">
+    <w:abstractNumId w:val="4"/>
+  </w:num>
+  <w:num w:numId="34" w16cid:durableId="243729491">
+    <w:abstractNumId w:val="7"/>
+  </w:num>
+  <w:num w:numId="35" w16cid:durableId="531498289">
+    <w:abstractNumId w:val="38"/>
+  </w:num>
+  <w:num w:numId="36" w16cid:durableId="1777824409">
+    <w:abstractNumId w:val="25"/>
+  </w:num>
+  <w:num w:numId="37" w16cid:durableId="1510942739">
     <w:abstractNumId w:val="2"/>
   </w:num>
-  <w:num w:numId="2" w16cid:durableId="1521433076">
-    <w:abstractNumId w:val="23"/>
+  <w:num w:numId="38" w16cid:durableId="873925459">
+    <w:abstractNumId w:val="11"/>
   </w:num>
-  <w:num w:numId="3" w16cid:durableId="1169172737">
+  <w:num w:numId="39" w16cid:durableId="579490765">
+    <w:abstractNumId w:val="26"/>
+  </w:num>
+  <w:num w:numId="40" w16cid:durableId="160776597">
+    <w:abstractNumId w:val="46"/>
+  </w:num>
+  <w:num w:numId="41" w16cid:durableId="1975864769">
+    <w:abstractNumId w:val="24"/>
+  </w:num>
+  <w:num w:numId="42" w16cid:durableId="2089038878">
+    <w:abstractNumId w:val="28"/>
+  </w:num>
+  <w:num w:numId="43" w16cid:durableId="1084838402">
+    <w:abstractNumId w:val="20"/>
+  </w:num>
+  <w:num w:numId="44" w16cid:durableId="2133208309">
+    <w:abstractNumId w:val="36"/>
+  </w:num>
+  <w:num w:numId="45" w16cid:durableId="1696272327">
     <w:abstractNumId w:val="13"/>
   </w:num>
-  <w:num w:numId="4" w16cid:durableId="1095663320">
-    <w:abstractNumId w:val="12"/>
-  </w:num>
-  <w:num w:numId="5" w16cid:durableId="320277980">
-    <w:abstractNumId w:val="45"/>
-  </w:num>
-  <w:num w:numId="6" w16cid:durableId="480125140">
-    <w:abstractNumId w:val="31"/>
-  </w:num>
-  <w:num w:numId="7" w16cid:durableId="1312128570">
-    <w:abstractNumId w:val="44"/>
-  </w:num>
-  <w:num w:numId="8" w16cid:durableId="721293094">
-    <w:abstractNumId w:val="36"/>
-  </w:num>
-  <w:num w:numId="9" w16cid:durableId="623655124">
-    <w:abstractNumId w:val="37"/>
-  </w:num>
-  <w:num w:numId="10" w16cid:durableId="433673490">
-    <w:abstractNumId w:val="29"/>
-  </w:num>
-  <w:num w:numId="11" w16cid:durableId="666246274">
-    <w:abstractNumId w:val="42"/>
-  </w:num>
-  <w:num w:numId="12" w16cid:durableId="1583947328">
-    <w:abstractNumId w:val="40"/>
-  </w:num>
-  <w:num w:numId="13" w16cid:durableId="1561015977">
-    <w:abstractNumId w:val="27"/>
-  </w:num>
-  <w:num w:numId="14" w16cid:durableId="1813788044">
-    <w:abstractNumId w:val="25"/>
-  </w:num>
-  <w:num w:numId="15" w16cid:durableId="1516311903">
-    <w:abstractNumId w:val="46"/>
-  </w:num>
-  <w:num w:numId="16" w16cid:durableId="700788812">
-    <w:abstractNumId w:val="15"/>
-  </w:num>
-  <w:num w:numId="17" w16cid:durableId="738552033">
-    <w:abstractNumId w:val="10"/>
-  </w:num>
-  <w:num w:numId="18" w16cid:durableId="506284840">
-    <w:abstractNumId w:val="26"/>
-  </w:num>
-  <w:num w:numId="19" w16cid:durableId="281688829">
-    <w:abstractNumId w:val="16"/>
-  </w:num>
-  <w:num w:numId="20" w16cid:durableId="1440640888">
-    <w:abstractNumId w:val="19"/>
-  </w:num>
-  <w:num w:numId="21" w16cid:durableId="908731130">
-    <w:abstractNumId w:val="5"/>
-  </w:num>
-  <w:num w:numId="22" w16cid:durableId="1803890039">
-    <w:abstractNumId w:val="4"/>
-  </w:num>
-  <w:num w:numId="23" w16cid:durableId="1576740101">
-    <w:abstractNumId w:val="43"/>
-  </w:num>
-  <w:num w:numId="24" w16cid:durableId="524516724">
-    <w:abstractNumId w:val="35"/>
-  </w:num>
-  <w:num w:numId="25" w16cid:durableId="1680624365">
-    <w:abstractNumId w:val="7"/>
-  </w:num>
-  <w:num w:numId="26" w16cid:durableId="16082667">
-    <w:abstractNumId w:val="30"/>
-  </w:num>
-  <w:num w:numId="27" w16cid:durableId="691566847">
-    <w:abstractNumId w:val="18"/>
-  </w:num>
-  <w:num w:numId="28" w16cid:durableId="2094620173">
-    <w:abstractNumId w:val="38"/>
-  </w:num>
-  <w:num w:numId="29" w16cid:durableId="906111721">
-    <w:abstractNumId w:val="8"/>
-  </w:num>
-  <w:num w:numId="30" w16cid:durableId="508177387">
-    <w:abstractNumId w:val="28"/>
-  </w:num>
-  <w:num w:numId="31" w16cid:durableId="913011401">
-    <w:abstractNumId w:val="47"/>
-  </w:num>
-  <w:num w:numId="32" w16cid:durableId="1644390964">
+  <w:num w:numId="46" w16cid:durableId="952831626">
     <w:abstractNumId w:val="39"/>
   </w:num>
-  <w:num w:numId="33" w16cid:durableId="778261706">
-    <w:abstractNumId w:val="3"/>
-  </w:num>
-  <w:num w:numId="34" w16cid:durableId="243729491">
-    <w:abstractNumId w:val="6"/>
-  </w:num>
-  <w:num w:numId="35" w16cid:durableId="531498289">
-    <w:abstractNumId w:val="33"/>
-  </w:num>
-  <w:num w:numId="36" w16cid:durableId="1777824409">
-    <w:abstractNumId w:val="21"/>
-  </w:num>
-  <w:num w:numId="37" w16cid:durableId="1510942739">
-    <w:abstractNumId w:val="1"/>
-  </w:num>
-  <w:num w:numId="38" w16cid:durableId="873925459">
-    <w:abstractNumId w:val="9"/>
-  </w:num>
-  <w:num w:numId="39" w16cid:durableId="579490765">
-    <w:abstractNumId w:val="22"/>
-  </w:num>
-  <w:num w:numId="40" w16cid:durableId="160776597">
-    <w:abstractNumId w:val="41"/>
-  </w:num>
-  <w:num w:numId="41" w16cid:durableId="1975864769">
-    <w:abstractNumId w:val="20"/>
-  </w:num>
-  <w:num w:numId="42" w16cid:durableId="2089038878">
-    <w:abstractNumId w:val="24"/>
-  </w:num>
-  <w:num w:numId="43" w16cid:durableId="1084838402">
+  <w:num w:numId="47" w16cid:durableId="506284221">
     <w:abstractNumId w:val="17"/>
-  </w:num>
-  <w:num w:numId="44" w16cid:durableId="2133208309">
-    <w:abstractNumId w:val="32"/>
-  </w:num>
-  <w:num w:numId="45" w16cid:durableId="1696272327">
-    <w:abstractNumId w:val="11"/>
-  </w:num>
-  <w:num w:numId="46" w16cid:durableId="952831626">
-    <w:abstractNumId w:val="34"/>
-  </w:num>
-  <w:num w:numId="47" w16cid:durableId="506284221">
-    <w:abstractNumId w:val="14"/>
   </w:num>
   <w:num w:numId="48" w16cid:durableId="1452162523">
     <w:abstractNumId w:val="0"/>
+  </w:num>
+  <w:num w:numId="49" w16cid:durableId="1141921806">
+    <w:abstractNumId w:val="1"/>
+  </w:num>
+  <w:num w:numId="50" w16cid:durableId="1155948849">
+    <w:abstractNumId w:val="47"/>
+  </w:num>
+  <w:num w:numId="51" w16cid:durableId="1018897390">
+    <w:abstractNumId w:val="15"/>
+  </w:num>
+  <w:num w:numId="52" w16cid:durableId="576984722">
+    <w:abstractNumId w:val="9"/>
+  </w:num>
+  <w:num w:numId="53" w16cid:durableId="209266241">
+    <w:abstractNumId w:val="37"/>
+  </w:num>
+  <w:num w:numId="54" w16cid:durableId="1107307833">
+    <w:abstractNumId w:val="23"/>
   </w:num>
 </w:numbering>
 </file>
@@ -9049,7 +11018,6 @@
     <w:next w:val="Normal"/>
     <w:link w:val="Heading3Char"/>
     <w:uiPriority w:val="9"/>
-    <w:semiHidden/>
     <w:unhideWhenUsed/>
     <w:qFormat/>
     <w:rsid w:val="008018BE"/>
@@ -9253,7 +11221,6 @@
     <w:basedOn w:val="DefaultParagraphFont"/>
     <w:link w:val="Heading3"/>
     <w:uiPriority w:val="9"/>
-    <w:semiHidden/>
     <w:rsid w:val="008018BE"/>
     <w:rPr>
       <w:rFonts w:eastAsiaTheme="majorEastAsia" w:cstheme="majorBidi"/>

</xml_diff>

<commit_message>
Add updated documents Final Report and Research
</commit_message>
<xml_diff>
--- a/docs/Rustamov Temur C00280204 Final Report.docx
+++ b/docs/Rustamov Temur C00280204 Final Report.docx
@@ -2433,6 +2433,261 @@
         <w:t xml:space="preserve">All communication between client and server is secured using HTTPS during deployment. </w:t>
       </w:r>
     </w:p>
+    <w:p>
+      <w:pPr>
+        <w:jc w:val="both"/>
+      </w:pPr>
+    </w:p>
+    <w:p>
+      <w:pPr>
+        <w:pStyle w:val="Heading1"/>
+        <w:numPr>
+          <w:ilvl w:val="0"/>
+          <w:numId w:val="48"/>
+        </w:numPr>
+        <w:rPr>
+          <w:rFonts w:ascii="Times New Roman" w:hAnsi="Times New Roman" w:cs="Times New Roman"/>
+          <w:b/>
+          <w:bCs/>
+          <w:color w:val="000000" w:themeColor="text1"/>
+          <w:sz w:val="32"/>
+          <w:szCs w:val="32"/>
+        </w:rPr>
+      </w:pPr>
+      <w:r>
+        <w:rPr>
+          <w:rFonts w:ascii="Times New Roman" w:hAnsi="Times New Roman" w:cs="Times New Roman"/>
+          <w:b/>
+          <w:bCs/>
+          <w:color w:val="000000" w:themeColor="text1"/>
+          <w:sz w:val="32"/>
+          <w:szCs w:val="32"/>
+        </w:rPr>
+        <w:t>Technical Implementation</w:t>
+      </w:r>
+    </w:p>
+    <w:p>
+      <w:pPr>
+        <w:jc w:val="both"/>
+      </w:pPr>
+      <w:r>
+        <w:t xml:space="preserve">This section describes the technical implementation of the Peer Tutoring Platform. It explains the key architectural decisions, module implementations, data structures, supporting technologies used to develop the system. The purpose of this section is to demonstrate how the system was implemented and how the chosen technologies support the functional requirements in the project specification. </w:t>
+      </w:r>
+    </w:p>
+    <w:p/>
+    <w:p>
+      <w:pPr>
+        <w:pStyle w:val="Heading2"/>
+        <w:numPr>
+          <w:ilvl w:val="1"/>
+          <w:numId w:val="48"/>
+        </w:numPr>
+        <w:rPr>
+          <w:rFonts w:ascii="Times New Roman" w:hAnsi="Times New Roman" w:cs="Times New Roman"/>
+          <w:b/>
+          <w:bCs/>
+          <w:color w:val="000000" w:themeColor="text1"/>
+        </w:rPr>
+      </w:pPr>
+      <w:r>
+        <w:rPr>
+          <w:rFonts w:ascii="Times New Roman" w:hAnsi="Times New Roman" w:cs="Times New Roman"/>
+          <w:b/>
+          <w:bCs/>
+          <w:color w:val="000000" w:themeColor="text1"/>
+        </w:rPr>
+        <w:t>Architecture and Design Decisions</w:t>
+      </w:r>
+    </w:p>
+    <w:p>
+      <w:pPr>
+        <w:pStyle w:val="NormalWeb"/>
+        <w:spacing w:line="276" w:lineRule="auto"/>
+        <w:jc w:val="both"/>
+      </w:pPr>
+      <w:r>
+        <w:t xml:space="preserve">The Peer Tutoring Platform was implemented using the MERN stack, which consists of MongoDB, Express.js, React.js, Node.js. This architectural choice enables the use of JavaScript </w:t>
+      </w:r>
+      <w:r>
+        <w:lastRenderedPageBreak/>
+        <w:t xml:space="preserve">across the entire application stack improving </w:t>
+      </w:r>
+      <w:r>
+        <w:t xml:space="preserve">significantly </w:t>
+      </w:r>
+      <w:r>
+        <w:t>maintainability</w:t>
+      </w:r>
+      <w:r>
+        <w:t xml:space="preserve">. </w:t>
+      </w:r>
+      <w:r>
+        <w:t xml:space="preserve">React.js was selected for the frontend due to its </w:t>
+      </w:r>
+      <w:proofErr w:type="gramStart"/>
+      <w:r>
+        <w:t>component</w:t>
+      </w:r>
+      <w:r>
+        <w:t xml:space="preserve"> </w:t>
+      </w:r>
+      <w:r>
+        <w:t>based</w:t>
+      </w:r>
+      <w:proofErr w:type="gramEnd"/>
+      <w:r>
+        <w:t xml:space="preserve"> architecture and efficient state management capabilities.</w:t>
+      </w:r>
+      <w:r>
+        <w:t xml:space="preserve"> The technology’s features</w:t>
+      </w:r>
+      <w:r>
+        <w:t xml:space="preserve"> improve rendering efficiency, which is essential for </w:t>
+      </w:r>
+      <w:r>
+        <w:t>statistics</w:t>
+      </w:r>
+      <w:r>
+        <w:t xml:space="preserve"> such as live notifications and message updates</w:t>
+      </w:r>
+      <w:r>
+        <w:t>, while its structure speeds up the development work in frontend</w:t>
+      </w:r>
+      <w:r>
+        <w:t>.</w:t>
+      </w:r>
+      <w:r>
+        <w:t xml:space="preserve"> </w:t>
+      </w:r>
+      <w:r>
+        <w:t xml:space="preserve">Node.js was selected for the backend due to its runtime model. This architecture is particularly suitable for </w:t>
+      </w:r>
+      <w:r>
+        <w:t>this project, since it</w:t>
+      </w:r>
+      <w:r>
+        <w:t xml:space="preserve"> requir</w:t>
+      </w:r>
+      <w:r>
+        <w:t>es</w:t>
+      </w:r>
+      <w:r>
+        <w:t xml:space="preserve"> multiple concurrent users. Express.js was used as a framework for defining RESTful API endpoints, </w:t>
+      </w:r>
+      <w:r>
+        <w:t xml:space="preserve">that </w:t>
+      </w:r>
+      <w:r>
+        <w:t>handl</w:t>
+      </w:r>
+      <w:r>
+        <w:t>es</w:t>
+      </w:r>
+      <w:r>
+        <w:t xml:space="preserve"> routing logic</w:t>
+      </w:r>
+      <w:r>
+        <w:t xml:space="preserve"> </w:t>
+      </w:r>
+      <w:r>
+        <w:t>and implement</w:t>
+      </w:r>
+      <w:r>
+        <w:t xml:space="preserve">s </w:t>
+      </w:r>
+      <w:r>
+        <w:t>middleware for authentication and request validation.</w:t>
+      </w:r>
+      <w:r>
+        <w:t xml:space="preserve"> </w:t>
+      </w:r>
+      <w:r>
+        <w:t xml:space="preserve">MongoDB was selected as the database solution because of its </w:t>
+      </w:r>
+      <w:proofErr w:type="gramStart"/>
+      <w:r>
+        <w:t>document</w:t>
+      </w:r>
+      <w:r>
+        <w:t xml:space="preserve"> </w:t>
+      </w:r>
+      <w:r>
+        <w:t>oriented</w:t>
+      </w:r>
+      <w:proofErr w:type="gramEnd"/>
+      <w:r>
+        <w:t xml:space="preserve"> structure, which aligns naturally with the platform’s data model</w:t>
+      </w:r>
+      <w:r>
+        <w:t xml:space="preserve">. This </w:t>
+      </w:r>
+      <w:r>
+        <w:t xml:space="preserve">accommodates future feature expansion without relational </w:t>
+      </w:r>
+      <w:proofErr w:type="spellStart"/>
+      <w:proofErr w:type="gramStart"/>
+      <w:r>
+        <w:t>constraints.Real</w:t>
+      </w:r>
+      <w:proofErr w:type="spellEnd"/>
+      <w:proofErr w:type="gramEnd"/>
+      <w:r>
+        <w:t xml:space="preserve"> </w:t>
+      </w:r>
+      <w:r>
+        <w:t xml:space="preserve">time communication was implemented using </w:t>
+      </w:r>
+      <w:proofErr w:type="spellStart"/>
+      <w:r>
+        <w:t>WebSockets</w:t>
+      </w:r>
+      <w:proofErr w:type="spellEnd"/>
+      <w:r>
+        <w:t xml:space="preserve"> via the Socket.io library.</w:t>
+      </w:r>
+      <w:r>
+        <w:t xml:space="preserve"> </w:t>
+      </w:r>
+      <w:r>
+        <w:t>Th</w:t>
+      </w:r>
+      <w:r>
+        <w:t>e technology</w:t>
+      </w:r>
+      <w:r>
+        <w:t xml:space="preserve"> allows instant message delivery and live notification updates without repeated polling, significantly improving user experience and reducing network </w:t>
+      </w:r>
+    </w:p>
+    <w:p/>
+    <w:p>
+      <w:pPr>
+        <w:pStyle w:val="Heading2"/>
+        <w:numPr>
+          <w:ilvl w:val="1"/>
+          <w:numId w:val="48"/>
+        </w:numPr>
+        <w:rPr>
+          <w:rFonts w:ascii="Times New Roman" w:hAnsi="Times New Roman" w:cs="Times New Roman"/>
+          <w:b/>
+          <w:bCs/>
+          <w:color w:val="000000" w:themeColor="text1"/>
+        </w:rPr>
+      </w:pPr>
+      <w:r>
+        <w:rPr>
+          <w:rFonts w:ascii="Times New Roman" w:hAnsi="Times New Roman" w:cs="Times New Roman"/>
+          <w:b/>
+          <w:bCs/>
+          <w:color w:val="000000" w:themeColor="text1"/>
+        </w:rPr>
+        <w:t xml:space="preserve">Module Implementation </w:t>
+      </w:r>
+    </w:p>
+    <w:p>
+      <w:pPr>
+        <w:jc w:val="both"/>
+      </w:pPr>
+    </w:p>
     <w:p/>
     <w:p>
       <w:pPr>
@@ -2533,7 +2788,6 @@
         <w:pStyle w:val="NormalWeb"/>
       </w:pPr>
       <w:r>
-        <w:lastRenderedPageBreak/>
         <w:t xml:space="preserve">Charlton, T. (1998). Peer tutoring: An introduction. </w:t>
       </w:r>
       <w:r>
@@ -2589,6 +2843,7 @@
       </w:pPr>
       <w:proofErr w:type="spellStart"/>
       <w:r>
+        <w:lastRenderedPageBreak/>
         <w:t>Goodlad</w:t>
       </w:r>
       <w:proofErr w:type="spellEnd"/>
@@ -2815,7 +3070,6 @@
         <w:pStyle w:val="NormalWeb"/>
       </w:pPr>
       <w:r>
-        <w:lastRenderedPageBreak/>
         <w:t xml:space="preserve">Profi.ru (n.d.). </w:t>
       </w:r>
       <w:r>
@@ -2881,6 +3135,7 @@
         <w:pStyle w:val="NormalWeb"/>
       </w:pPr>
       <w:r>
+        <w:lastRenderedPageBreak/>
         <w:t xml:space="preserve">Tinto, V. (2014). Reflective practice: Tinto’s South Africa lectures. </w:t>
       </w:r>
       <w:r>
@@ -7200,6 +7455,92 @@
     </w:lvl>
   </w:abstractNum>
   <w:abstractNum w:abstractNumId="30" w15:restartNumberingAfterBreak="0">
+    <w:nsid w:val="3A231A58"/>
+    <w:multiLevelType w:val="hybridMultilevel"/>
+    <w:tmpl w:val="BF721A8E"/>
+    <w:lvl w:ilvl="0" w:tplc="0409000F">
+      <w:start w:val="1"/>
+      <w:numFmt w:val="decimal"/>
+      <w:lvlText w:val="%1."/>
+      <w:lvlJc w:val="left"/>
+      <w:pPr>
+        <w:ind w:left="720" w:hanging="360"/>
+      </w:pPr>
+    </w:lvl>
+    <w:lvl w:ilvl="1" w:tplc="04090019" w:tentative="1">
+      <w:start w:val="1"/>
+      <w:numFmt w:val="lowerLetter"/>
+      <w:lvlText w:val="%2."/>
+      <w:lvlJc w:val="left"/>
+      <w:pPr>
+        <w:ind w:left="1440" w:hanging="360"/>
+      </w:pPr>
+    </w:lvl>
+    <w:lvl w:ilvl="2" w:tplc="0409001B" w:tentative="1">
+      <w:start w:val="1"/>
+      <w:numFmt w:val="lowerRoman"/>
+      <w:lvlText w:val="%3."/>
+      <w:lvlJc w:val="right"/>
+      <w:pPr>
+        <w:ind w:left="2160" w:hanging="180"/>
+      </w:pPr>
+    </w:lvl>
+    <w:lvl w:ilvl="3" w:tplc="0409000F" w:tentative="1">
+      <w:start w:val="1"/>
+      <w:numFmt w:val="decimal"/>
+      <w:lvlText w:val="%4."/>
+      <w:lvlJc w:val="left"/>
+      <w:pPr>
+        <w:ind w:left="2880" w:hanging="360"/>
+      </w:pPr>
+    </w:lvl>
+    <w:lvl w:ilvl="4" w:tplc="04090019" w:tentative="1">
+      <w:start w:val="1"/>
+      <w:numFmt w:val="lowerLetter"/>
+      <w:lvlText w:val="%5."/>
+      <w:lvlJc w:val="left"/>
+      <w:pPr>
+        <w:ind w:left="3600" w:hanging="360"/>
+      </w:pPr>
+    </w:lvl>
+    <w:lvl w:ilvl="5" w:tplc="0409001B" w:tentative="1">
+      <w:start w:val="1"/>
+      <w:numFmt w:val="lowerRoman"/>
+      <w:lvlText w:val="%6."/>
+      <w:lvlJc w:val="right"/>
+      <w:pPr>
+        <w:ind w:left="4320" w:hanging="180"/>
+      </w:pPr>
+    </w:lvl>
+    <w:lvl w:ilvl="6" w:tplc="0409000F" w:tentative="1">
+      <w:start w:val="1"/>
+      <w:numFmt w:val="decimal"/>
+      <w:lvlText w:val="%7."/>
+      <w:lvlJc w:val="left"/>
+      <w:pPr>
+        <w:ind w:left="5040" w:hanging="360"/>
+      </w:pPr>
+    </w:lvl>
+    <w:lvl w:ilvl="7" w:tplc="04090019" w:tentative="1">
+      <w:start w:val="1"/>
+      <w:numFmt w:val="lowerLetter"/>
+      <w:lvlText w:val="%8."/>
+      <w:lvlJc w:val="left"/>
+      <w:pPr>
+        <w:ind w:left="5760" w:hanging="360"/>
+      </w:pPr>
+    </w:lvl>
+    <w:lvl w:ilvl="8" w:tplc="0409001B" w:tentative="1">
+      <w:start w:val="1"/>
+      <w:numFmt w:val="lowerRoman"/>
+      <w:lvlText w:val="%9."/>
+      <w:lvlJc w:val="right"/>
+      <w:pPr>
+        <w:ind w:left="6480" w:hanging="180"/>
+      </w:pPr>
+    </w:lvl>
+  </w:abstractNum>
+  <w:abstractNum w:abstractNumId="31" w15:restartNumberingAfterBreak="0">
     <w:nsid w:val="44A236C0"/>
     <w:multiLevelType w:val="multilevel"/>
     <w:tmpl w:val="1CE860BA"/>
@@ -7312,7 +7653,7 @@
       </w:rPr>
     </w:lvl>
   </w:abstractNum>
-  <w:abstractNum w:abstractNumId="31" w15:restartNumberingAfterBreak="0">
+  <w:abstractNum w:abstractNumId="32" w15:restartNumberingAfterBreak="0">
     <w:nsid w:val="477F143E"/>
     <w:multiLevelType w:val="multilevel"/>
     <w:tmpl w:val="68842356"/>
@@ -7458,7 +7799,7 @@
       </w:rPr>
     </w:lvl>
   </w:abstractNum>
-  <w:abstractNum w:abstractNumId="32" w15:restartNumberingAfterBreak="0">
+  <w:abstractNum w:abstractNumId="33" w15:restartNumberingAfterBreak="0">
     <w:nsid w:val="4A253C16"/>
     <w:multiLevelType w:val="multilevel"/>
     <w:tmpl w:val="FDFC4E2E"/>
@@ -7604,7 +7945,7 @@
       </w:rPr>
     </w:lvl>
   </w:abstractNum>
-  <w:abstractNum w:abstractNumId="33" w15:restartNumberingAfterBreak="0">
+  <w:abstractNum w:abstractNumId="34" w15:restartNumberingAfterBreak="0">
     <w:nsid w:val="4AAB458E"/>
     <w:multiLevelType w:val="multilevel"/>
     <w:tmpl w:val="68842356"/>
@@ -7750,7 +8091,7 @@
       </w:rPr>
     </w:lvl>
   </w:abstractNum>
-  <w:abstractNum w:abstractNumId="34" w15:restartNumberingAfterBreak="0">
+  <w:abstractNum w:abstractNumId="35" w15:restartNumberingAfterBreak="0">
     <w:nsid w:val="4E886D8A"/>
     <w:multiLevelType w:val="multilevel"/>
     <w:tmpl w:val="FDFC4E2E"/>
@@ -7896,7 +8237,7 @@
       </w:rPr>
     </w:lvl>
   </w:abstractNum>
-  <w:abstractNum w:abstractNumId="35" w15:restartNumberingAfterBreak="0">
+  <w:abstractNum w:abstractNumId="36" w15:restartNumberingAfterBreak="0">
     <w:nsid w:val="521A65CD"/>
     <w:multiLevelType w:val="multilevel"/>
     <w:tmpl w:val="6E2CEAE0"/>
@@ -8045,7 +8386,7 @@
       </w:rPr>
     </w:lvl>
   </w:abstractNum>
-  <w:abstractNum w:abstractNumId="36" w15:restartNumberingAfterBreak="0">
+  <w:abstractNum w:abstractNumId="37" w15:restartNumberingAfterBreak="0">
     <w:nsid w:val="545915D6"/>
     <w:multiLevelType w:val="multilevel"/>
     <w:tmpl w:val="DF6A7F3C"/>
@@ -8191,7 +8532,7 @@
       </w:rPr>
     </w:lvl>
   </w:abstractNum>
-  <w:abstractNum w:abstractNumId="37" w15:restartNumberingAfterBreak="0">
+  <w:abstractNum w:abstractNumId="38" w15:restartNumberingAfterBreak="0">
     <w:nsid w:val="55BD0436"/>
     <w:multiLevelType w:val="hybridMultilevel"/>
     <w:tmpl w:val="7C3A328C"/>
@@ -8277,7 +8618,7 @@
       </w:pPr>
     </w:lvl>
   </w:abstractNum>
-  <w:abstractNum w:abstractNumId="38" w15:restartNumberingAfterBreak="0">
+  <w:abstractNum w:abstractNumId="39" w15:restartNumberingAfterBreak="0">
     <w:nsid w:val="56280CC0"/>
     <w:multiLevelType w:val="hybridMultilevel"/>
     <w:tmpl w:val="C2FEFEDC"/>
@@ -8363,7 +8704,7 @@
       </w:pPr>
     </w:lvl>
   </w:abstractNum>
-  <w:abstractNum w:abstractNumId="39" w15:restartNumberingAfterBreak="0">
+  <w:abstractNum w:abstractNumId="40" w15:restartNumberingAfterBreak="0">
     <w:nsid w:val="572A2A2D"/>
     <w:multiLevelType w:val="multilevel"/>
     <w:tmpl w:val="9BC685AA"/>
@@ -8476,7 +8817,7 @@
       </w:rPr>
     </w:lvl>
   </w:abstractNum>
-  <w:abstractNum w:abstractNumId="40" w15:restartNumberingAfterBreak="0">
+  <w:abstractNum w:abstractNumId="41" w15:restartNumberingAfterBreak="0">
     <w:nsid w:val="5A7B6B30"/>
     <w:multiLevelType w:val="multilevel"/>
     <w:tmpl w:val="DF7AD022"/>
@@ -8625,7 +8966,7 @@
       </w:rPr>
     </w:lvl>
   </w:abstractNum>
-  <w:abstractNum w:abstractNumId="41" w15:restartNumberingAfterBreak="0">
+  <w:abstractNum w:abstractNumId="42" w15:restartNumberingAfterBreak="0">
     <w:nsid w:val="5C015D54"/>
     <w:multiLevelType w:val="multilevel"/>
     <w:tmpl w:val="66D208DC"/>
@@ -8738,7 +9079,7 @@
       </w:pPr>
     </w:lvl>
   </w:abstractNum>
-  <w:abstractNum w:abstractNumId="42" w15:restartNumberingAfterBreak="0">
+  <w:abstractNum w:abstractNumId="43" w15:restartNumberingAfterBreak="0">
     <w:nsid w:val="5C5454BC"/>
     <w:multiLevelType w:val="multilevel"/>
     <w:tmpl w:val="68842356"/>
@@ -8884,7 +9225,7 @@
       </w:rPr>
     </w:lvl>
   </w:abstractNum>
-  <w:abstractNum w:abstractNumId="43" w15:restartNumberingAfterBreak="0">
+  <w:abstractNum w:abstractNumId="44" w15:restartNumberingAfterBreak="0">
     <w:nsid w:val="606D7492"/>
     <w:multiLevelType w:val="multilevel"/>
     <w:tmpl w:val="FDFC4E2E"/>
@@ -9030,7 +9371,93 @@
       </w:rPr>
     </w:lvl>
   </w:abstractNum>
-  <w:abstractNum w:abstractNumId="44" w15:restartNumberingAfterBreak="0">
+  <w:abstractNum w:abstractNumId="45" w15:restartNumberingAfterBreak="0">
+    <w:nsid w:val="611E1155"/>
+    <w:multiLevelType w:val="hybridMultilevel"/>
+    <w:tmpl w:val="459CDAFE"/>
+    <w:lvl w:ilvl="0" w:tplc="0409000F">
+      <w:start w:val="1"/>
+      <w:numFmt w:val="decimal"/>
+      <w:lvlText w:val="%1."/>
+      <w:lvlJc w:val="left"/>
+      <w:pPr>
+        <w:ind w:left="720" w:hanging="360"/>
+      </w:pPr>
+    </w:lvl>
+    <w:lvl w:ilvl="1" w:tplc="04090019" w:tentative="1">
+      <w:start w:val="1"/>
+      <w:numFmt w:val="lowerLetter"/>
+      <w:lvlText w:val="%2."/>
+      <w:lvlJc w:val="left"/>
+      <w:pPr>
+        <w:ind w:left="1440" w:hanging="360"/>
+      </w:pPr>
+    </w:lvl>
+    <w:lvl w:ilvl="2" w:tplc="0409001B" w:tentative="1">
+      <w:start w:val="1"/>
+      <w:numFmt w:val="lowerRoman"/>
+      <w:lvlText w:val="%3."/>
+      <w:lvlJc w:val="right"/>
+      <w:pPr>
+        <w:ind w:left="2160" w:hanging="180"/>
+      </w:pPr>
+    </w:lvl>
+    <w:lvl w:ilvl="3" w:tplc="0409000F" w:tentative="1">
+      <w:start w:val="1"/>
+      <w:numFmt w:val="decimal"/>
+      <w:lvlText w:val="%4."/>
+      <w:lvlJc w:val="left"/>
+      <w:pPr>
+        <w:ind w:left="2880" w:hanging="360"/>
+      </w:pPr>
+    </w:lvl>
+    <w:lvl w:ilvl="4" w:tplc="04090019" w:tentative="1">
+      <w:start w:val="1"/>
+      <w:numFmt w:val="lowerLetter"/>
+      <w:lvlText w:val="%5."/>
+      <w:lvlJc w:val="left"/>
+      <w:pPr>
+        <w:ind w:left="3600" w:hanging="360"/>
+      </w:pPr>
+    </w:lvl>
+    <w:lvl w:ilvl="5" w:tplc="0409001B" w:tentative="1">
+      <w:start w:val="1"/>
+      <w:numFmt w:val="lowerRoman"/>
+      <w:lvlText w:val="%6."/>
+      <w:lvlJc w:val="right"/>
+      <w:pPr>
+        <w:ind w:left="4320" w:hanging="180"/>
+      </w:pPr>
+    </w:lvl>
+    <w:lvl w:ilvl="6" w:tplc="0409000F" w:tentative="1">
+      <w:start w:val="1"/>
+      <w:numFmt w:val="decimal"/>
+      <w:lvlText w:val="%7."/>
+      <w:lvlJc w:val="left"/>
+      <w:pPr>
+        <w:ind w:left="5040" w:hanging="360"/>
+      </w:pPr>
+    </w:lvl>
+    <w:lvl w:ilvl="7" w:tplc="04090019" w:tentative="1">
+      <w:start w:val="1"/>
+      <w:numFmt w:val="lowerLetter"/>
+      <w:lvlText w:val="%8."/>
+      <w:lvlJc w:val="left"/>
+      <w:pPr>
+        <w:ind w:left="5760" w:hanging="360"/>
+      </w:pPr>
+    </w:lvl>
+    <w:lvl w:ilvl="8" w:tplc="0409001B" w:tentative="1">
+      <w:start w:val="1"/>
+      <w:numFmt w:val="lowerRoman"/>
+      <w:lvlText w:val="%9."/>
+      <w:lvlJc w:val="right"/>
+      <w:pPr>
+        <w:ind w:left="6480" w:hanging="180"/>
+      </w:pPr>
+    </w:lvl>
+  </w:abstractNum>
+  <w:abstractNum w:abstractNumId="46" w15:restartNumberingAfterBreak="0">
     <w:nsid w:val="62465259"/>
     <w:multiLevelType w:val="multilevel"/>
     <w:tmpl w:val="FDFC4E2E"/>
@@ -9176,7 +9603,7 @@
       </w:rPr>
     </w:lvl>
   </w:abstractNum>
-  <w:abstractNum w:abstractNumId="45" w15:restartNumberingAfterBreak="0">
+  <w:abstractNum w:abstractNumId="47" w15:restartNumberingAfterBreak="0">
     <w:nsid w:val="64A96324"/>
     <w:multiLevelType w:val="multilevel"/>
     <w:tmpl w:val="68842356"/>
@@ -9322,7 +9749,7 @@
       </w:rPr>
     </w:lvl>
   </w:abstractNum>
-  <w:abstractNum w:abstractNumId="46" w15:restartNumberingAfterBreak="0">
+  <w:abstractNum w:abstractNumId="48" w15:restartNumberingAfterBreak="0">
     <w:nsid w:val="699D7F53"/>
     <w:multiLevelType w:val="multilevel"/>
     <w:tmpl w:val="DF6A7F3C"/>
@@ -9468,7 +9895,7 @@
       </w:rPr>
     </w:lvl>
   </w:abstractNum>
-  <w:abstractNum w:abstractNumId="47" w15:restartNumberingAfterBreak="0">
+  <w:abstractNum w:abstractNumId="49" w15:restartNumberingAfterBreak="0">
     <w:nsid w:val="6B07430E"/>
     <w:multiLevelType w:val="hybridMultilevel"/>
     <w:tmpl w:val="6F9C41D6"/>
@@ -9581,7 +10008,7 @@
       </w:rPr>
     </w:lvl>
   </w:abstractNum>
-  <w:abstractNum w:abstractNumId="48" w15:restartNumberingAfterBreak="0">
+  <w:abstractNum w:abstractNumId="50" w15:restartNumberingAfterBreak="0">
     <w:nsid w:val="6D0364A0"/>
     <w:multiLevelType w:val="multilevel"/>
     <w:tmpl w:val="68842356"/>
@@ -9727,7 +10154,7 @@
       </w:rPr>
     </w:lvl>
   </w:abstractNum>
-  <w:abstractNum w:abstractNumId="49" w15:restartNumberingAfterBreak="0">
+  <w:abstractNum w:abstractNumId="51" w15:restartNumberingAfterBreak="0">
     <w:nsid w:val="6D7273D8"/>
     <w:multiLevelType w:val="multilevel"/>
     <w:tmpl w:val="DC706630"/>
@@ -9876,7 +10303,7 @@
       </w:rPr>
     </w:lvl>
   </w:abstractNum>
-  <w:abstractNum w:abstractNumId="50" w15:restartNumberingAfterBreak="0">
+  <w:abstractNum w:abstractNumId="52" w15:restartNumberingAfterBreak="0">
     <w:nsid w:val="783E2CBC"/>
     <w:multiLevelType w:val="multilevel"/>
     <w:tmpl w:val="E94A3B26"/>
@@ -9989,7 +10416,7 @@
       </w:pPr>
     </w:lvl>
   </w:abstractNum>
-  <w:abstractNum w:abstractNumId="51" w15:restartNumberingAfterBreak="0">
+  <w:abstractNum w:abstractNumId="53" w15:restartNumberingAfterBreak="0">
     <w:nsid w:val="789F4CE1"/>
     <w:multiLevelType w:val="multilevel"/>
     <w:tmpl w:val="1CE860BA"/>
@@ -10102,7 +10529,7 @@
       </w:rPr>
     </w:lvl>
   </w:abstractNum>
-  <w:abstractNum w:abstractNumId="52" w15:restartNumberingAfterBreak="0">
+  <w:abstractNum w:abstractNumId="54" w15:restartNumberingAfterBreak="0">
     <w:nsid w:val="79730313"/>
     <w:multiLevelType w:val="multilevel"/>
     <w:tmpl w:val="68842356"/>
@@ -10248,7 +10675,7 @@
       </w:rPr>
     </w:lvl>
   </w:abstractNum>
-  <w:abstractNum w:abstractNumId="53" w15:restartNumberingAfterBreak="0">
+  <w:abstractNum w:abstractNumId="55" w15:restartNumberingAfterBreak="0">
     <w:nsid w:val="7AEC76B6"/>
     <w:multiLevelType w:val="multilevel"/>
     <w:tmpl w:val="FDFC4E2E"/>
@@ -10392,6 +10819,92 @@
         <w:rFonts w:ascii="Wingdings" w:hAnsi="Wingdings" w:hint="default"/>
         <w:sz w:val="20"/>
       </w:rPr>
+    </w:lvl>
+  </w:abstractNum>
+  <w:abstractNum w:abstractNumId="56" w15:restartNumberingAfterBreak="0">
+    <w:nsid w:val="7C2A1A77"/>
+    <w:multiLevelType w:val="hybridMultilevel"/>
+    <w:tmpl w:val="1CFEC05E"/>
+    <w:lvl w:ilvl="0" w:tplc="0409000F">
+      <w:start w:val="1"/>
+      <w:numFmt w:val="decimal"/>
+      <w:lvlText w:val="%1."/>
+      <w:lvlJc w:val="left"/>
+      <w:pPr>
+        <w:ind w:left="720" w:hanging="360"/>
+      </w:pPr>
+    </w:lvl>
+    <w:lvl w:ilvl="1" w:tplc="04090019" w:tentative="1">
+      <w:start w:val="1"/>
+      <w:numFmt w:val="lowerLetter"/>
+      <w:lvlText w:val="%2."/>
+      <w:lvlJc w:val="left"/>
+      <w:pPr>
+        <w:ind w:left="1440" w:hanging="360"/>
+      </w:pPr>
+    </w:lvl>
+    <w:lvl w:ilvl="2" w:tplc="0409001B" w:tentative="1">
+      <w:start w:val="1"/>
+      <w:numFmt w:val="lowerRoman"/>
+      <w:lvlText w:val="%3."/>
+      <w:lvlJc w:val="right"/>
+      <w:pPr>
+        <w:ind w:left="2160" w:hanging="180"/>
+      </w:pPr>
+    </w:lvl>
+    <w:lvl w:ilvl="3" w:tplc="0409000F" w:tentative="1">
+      <w:start w:val="1"/>
+      <w:numFmt w:val="decimal"/>
+      <w:lvlText w:val="%4."/>
+      <w:lvlJc w:val="left"/>
+      <w:pPr>
+        <w:ind w:left="2880" w:hanging="360"/>
+      </w:pPr>
+    </w:lvl>
+    <w:lvl w:ilvl="4" w:tplc="04090019" w:tentative="1">
+      <w:start w:val="1"/>
+      <w:numFmt w:val="lowerLetter"/>
+      <w:lvlText w:val="%5."/>
+      <w:lvlJc w:val="left"/>
+      <w:pPr>
+        <w:ind w:left="3600" w:hanging="360"/>
+      </w:pPr>
+    </w:lvl>
+    <w:lvl w:ilvl="5" w:tplc="0409001B" w:tentative="1">
+      <w:start w:val="1"/>
+      <w:numFmt w:val="lowerRoman"/>
+      <w:lvlText w:val="%6."/>
+      <w:lvlJc w:val="right"/>
+      <w:pPr>
+        <w:ind w:left="4320" w:hanging="180"/>
+      </w:pPr>
+    </w:lvl>
+    <w:lvl w:ilvl="6" w:tplc="0409000F" w:tentative="1">
+      <w:start w:val="1"/>
+      <w:numFmt w:val="decimal"/>
+      <w:lvlText w:val="%7."/>
+      <w:lvlJc w:val="left"/>
+      <w:pPr>
+        <w:ind w:left="5040" w:hanging="360"/>
+      </w:pPr>
+    </w:lvl>
+    <w:lvl w:ilvl="7" w:tplc="04090019" w:tentative="1">
+      <w:start w:val="1"/>
+      <w:numFmt w:val="lowerLetter"/>
+      <w:lvlText w:val="%8."/>
+      <w:lvlJc w:val="left"/>
+      <w:pPr>
+        <w:ind w:left="5760" w:hanging="360"/>
+      </w:pPr>
+    </w:lvl>
+    <w:lvl w:ilvl="8" w:tplc="0409001B" w:tentative="1">
+      <w:start w:val="1"/>
+      <w:numFmt w:val="lowerRoman"/>
+      <w:lvlText w:val="%9."/>
+      <w:lvlJc w:val="right"/>
+      <w:pPr>
+        <w:ind w:left="6480" w:hanging="180"/>
+      </w:pPr>
     </w:lvl>
   </w:abstractNum>
   <w:num w:numId="1" w16cid:durableId="687026918">
@@ -10407,37 +10920,37 @@
     <w:abstractNumId w:val="14"/>
   </w:num>
   <w:num w:numId="5" w16cid:durableId="320277980">
-    <w:abstractNumId w:val="51"/>
+    <w:abstractNumId w:val="53"/>
   </w:num>
   <w:num w:numId="6" w16cid:durableId="480125140">
-    <w:abstractNumId w:val="35"/>
+    <w:abstractNumId w:val="36"/>
   </w:num>
   <w:num w:numId="7" w16cid:durableId="1312128570">
+    <w:abstractNumId w:val="52"/>
+  </w:num>
+  <w:num w:numId="8" w16cid:durableId="721293094">
+    <w:abstractNumId w:val="42"/>
+  </w:num>
+  <w:num w:numId="9" w16cid:durableId="623655124">
+    <w:abstractNumId w:val="43"/>
+  </w:num>
+  <w:num w:numId="10" w16cid:durableId="433673490">
+    <w:abstractNumId w:val="34"/>
+  </w:num>
+  <w:num w:numId="11" w16cid:durableId="666246274">
     <w:abstractNumId w:val="50"/>
   </w:num>
-  <w:num w:numId="8" w16cid:durableId="721293094">
-    <w:abstractNumId w:val="41"/>
-  </w:num>
-  <w:num w:numId="9" w16cid:durableId="623655124">
-    <w:abstractNumId w:val="42"/>
-  </w:num>
-  <w:num w:numId="10" w16cid:durableId="433673490">
-    <w:abstractNumId w:val="33"/>
-  </w:num>
-  <w:num w:numId="11" w16cid:durableId="666246274">
-    <w:abstractNumId w:val="48"/>
-  </w:num>
   <w:num w:numId="12" w16cid:durableId="1583947328">
-    <w:abstractNumId w:val="45"/>
+    <w:abstractNumId w:val="47"/>
   </w:num>
   <w:num w:numId="13" w16cid:durableId="1561015977">
-    <w:abstractNumId w:val="31"/>
+    <w:abstractNumId w:val="32"/>
   </w:num>
   <w:num w:numId="14" w16cid:durableId="1813788044">
     <w:abstractNumId w:val="29"/>
   </w:num>
   <w:num w:numId="15" w16cid:durableId="1516311903">
-    <w:abstractNumId w:val="52"/>
+    <w:abstractNumId w:val="54"/>
   </w:num>
   <w:num w:numId="16" w16cid:durableId="700788812">
     <w:abstractNumId w:val="18"/>
@@ -10446,7 +10959,7 @@
     <w:abstractNumId w:val="12"/>
   </w:num>
   <w:num w:numId="18" w16cid:durableId="506284840">
-    <w:abstractNumId w:val="30"/>
+    <w:abstractNumId w:val="31"/>
   </w:num>
   <w:num w:numId="19" w16cid:durableId="281688829">
     <w:abstractNumId w:val="19"/>
@@ -10461,34 +10974,34 @@
     <w:abstractNumId w:val="5"/>
   </w:num>
   <w:num w:numId="23" w16cid:durableId="1576740101">
-    <w:abstractNumId w:val="49"/>
+    <w:abstractNumId w:val="51"/>
   </w:num>
   <w:num w:numId="24" w16cid:durableId="524516724">
-    <w:abstractNumId w:val="40"/>
+    <w:abstractNumId w:val="41"/>
   </w:num>
   <w:num w:numId="25" w16cid:durableId="1680624365">
     <w:abstractNumId w:val="8"/>
   </w:num>
   <w:num w:numId="26" w16cid:durableId="16082667">
-    <w:abstractNumId w:val="34"/>
+    <w:abstractNumId w:val="35"/>
   </w:num>
   <w:num w:numId="27" w16cid:durableId="691566847">
     <w:abstractNumId w:val="21"/>
   </w:num>
   <w:num w:numId="28" w16cid:durableId="2094620173">
-    <w:abstractNumId w:val="43"/>
+    <w:abstractNumId w:val="44"/>
   </w:num>
   <w:num w:numId="29" w16cid:durableId="906111721">
     <w:abstractNumId w:val="10"/>
   </w:num>
   <w:num w:numId="30" w16cid:durableId="508177387">
-    <w:abstractNumId w:val="32"/>
+    <w:abstractNumId w:val="33"/>
   </w:num>
   <w:num w:numId="31" w16cid:durableId="913011401">
-    <w:abstractNumId w:val="53"/>
+    <w:abstractNumId w:val="55"/>
   </w:num>
   <w:num w:numId="32" w16cid:durableId="1644390964">
-    <w:abstractNumId w:val="44"/>
+    <w:abstractNumId w:val="46"/>
   </w:num>
   <w:num w:numId="33" w16cid:durableId="778261706">
     <w:abstractNumId w:val="4"/>
@@ -10497,7 +11010,7 @@
     <w:abstractNumId w:val="7"/>
   </w:num>
   <w:num w:numId="35" w16cid:durableId="531498289">
-    <w:abstractNumId w:val="38"/>
+    <w:abstractNumId w:val="39"/>
   </w:num>
   <w:num w:numId="36" w16cid:durableId="1777824409">
     <w:abstractNumId w:val="25"/>
@@ -10512,7 +11025,7 @@
     <w:abstractNumId w:val="26"/>
   </w:num>
   <w:num w:numId="40" w16cid:durableId="160776597">
-    <w:abstractNumId w:val="46"/>
+    <w:abstractNumId w:val="48"/>
   </w:num>
   <w:num w:numId="41" w16cid:durableId="1975864769">
     <w:abstractNumId w:val="24"/>
@@ -10524,13 +11037,13 @@
     <w:abstractNumId w:val="20"/>
   </w:num>
   <w:num w:numId="44" w16cid:durableId="2133208309">
-    <w:abstractNumId w:val="36"/>
+    <w:abstractNumId w:val="37"/>
   </w:num>
   <w:num w:numId="45" w16cid:durableId="1696272327">
     <w:abstractNumId w:val="13"/>
   </w:num>
   <w:num w:numId="46" w16cid:durableId="952831626">
-    <w:abstractNumId w:val="39"/>
+    <w:abstractNumId w:val="40"/>
   </w:num>
   <w:num w:numId="47" w16cid:durableId="506284221">
     <w:abstractNumId w:val="17"/>
@@ -10542,7 +11055,7 @@
     <w:abstractNumId w:val="1"/>
   </w:num>
   <w:num w:numId="50" w16cid:durableId="1155948849">
-    <w:abstractNumId w:val="47"/>
+    <w:abstractNumId w:val="49"/>
   </w:num>
   <w:num w:numId="51" w16cid:durableId="1018897390">
     <w:abstractNumId w:val="15"/>
@@ -10551,10 +11064,19 @@
     <w:abstractNumId w:val="9"/>
   </w:num>
   <w:num w:numId="53" w16cid:durableId="209266241">
-    <w:abstractNumId w:val="37"/>
+    <w:abstractNumId w:val="38"/>
   </w:num>
   <w:num w:numId="54" w16cid:durableId="1107307833">
     <w:abstractNumId w:val="23"/>
+  </w:num>
+  <w:num w:numId="55" w16cid:durableId="732049722">
+    <w:abstractNumId w:val="30"/>
+  </w:num>
+  <w:num w:numId="56" w16cid:durableId="620645840">
+    <w:abstractNumId w:val="56"/>
+  </w:num>
+  <w:num w:numId="57" w16cid:durableId="1037123086">
+    <w:abstractNumId w:val="45"/>
   </w:num>
 </w:numbering>
 </file>
@@ -11167,6 +11689,7 @@
   <w:style w:type="character" w:default="1" w:styleId="DefaultParagraphFont">
     <w:name w:val="Default Paragraph Font"/>
     <w:uiPriority w:val="1"/>
+    <w:semiHidden/>
     <w:unhideWhenUsed/>
   </w:style>
   <w:style w:type="table" w:default="1" w:styleId="TableNormal">

</xml_diff>

<commit_message>
Add updated final report document
</commit_message>
<xml_diff>
--- a/docs/Rustamov Temur C00280204 Final Report.docx
+++ b/docs/Rustamov Temur C00280204 Final Report.docx
@@ -477,7 +477,7 @@
           <w:r>
             <w:fldChar w:fldCharType="separate"/>
           </w:r>
-          <w:hyperlink w:anchor="_Toc223459336" w:history="1">
+          <w:hyperlink w:anchor="_Toc223546184" w:history="1">
             <w:r>
               <w:rPr>
                 <w:rStyle w:val="Hyperlink"/>
@@ -526,7 +526,7 @@
                 <w:noProof/>
                 <w:webHidden/>
               </w:rPr>
-              <w:instrText xml:space="preserve"> PAGEREF _Toc223459336 \h </w:instrText>
+              <w:instrText xml:space="preserve"> PAGEREF _Toc223546184 \h </w:instrText>
             </w:r>
             <w:r>
               <w:rPr>
@@ -575,7 +575,7 @@
               <w14:ligatures w14:val="standardContextual"/>
             </w:rPr>
           </w:pPr>
-          <w:hyperlink w:anchor="_Toc223459337" w:history="1">
+          <w:hyperlink w:anchor="_Toc223546185" w:history="1">
             <w:r>
               <w:rPr>
                 <w:rStyle w:val="Hyperlink"/>
@@ -624,7 +624,7 @@
                 <w:noProof/>
                 <w:webHidden/>
               </w:rPr>
-              <w:instrText xml:space="preserve"> PAGEREF _Toc223459337 \h </w:instrText>
+              <w:instrText xml:space="preserve"> PAGEREF _Toc223546185 \h </w:instrText>
             </w:r>
             <w:r>
               <w:rPr>
@@ -673,7 +673,7 @@
               <w14:ligatures w14:val="standardContextual"/>
             </w:rPr>
           </w:pPr>
-          <w:hyperlink w:anchor="_Toc223459338" w:history="1">
+          <w:hyperlink w:anchor="_Toc223546186" w:history="1">
             <w:r>
               <w:rPr>
                 <w:rStyle w:val="Hyperlink"/>
@@ -722,7 +722,7 @@
                 <w:noProof/>
                 <w:webHidden/>
               </w:rPr>
-              <w:instrText xml:space="preserve"> PAGEREF _Toc223459338 \h </w:instrText>
+              <w:instrText xml:space="preserve"> PAGEREF _Toc223546186 \h </w:instrText>
             </w:r>
             <w:r>
               <w:rPr>
@@ -767,7 +767,7 @@
               <w14:ligatures w14:val="standardContextual"/>
             </w:rPr>
           </w:pPr>
-          <w:hyperlink w:anchor="_Toc223459339" w:history="1">
+          <w:hyperlink w:anchor="_Toc223546187" w:history="1">
             <w:r>
               <w:rPr>
                 <w:rStyle w:val="Hyperlink"/>
@@ -814,7 +814,7 @@
                 <w:noProof/>
                 <w:webHidden/>
               </w:rPr>
-              <w:instrText xml:space="preserve"> PAGEREF _Toc223459339 \h </w:instrText>
+              <w:instrText xml:space="preserve"> PAGEREF _Toc223546187 \h </w:instrText>
             </w:r>
             <w:r>
               <w:rPr>
@@ -859,7 +859,7 @@
               <w14:ligatures w14:val="standardContextual"/>
             </w:rPr>
           </w:pPr>
-          <w:hyperlink w:anchor="_Toc223459340" w:history="1">
+          <w:hyperlink w:anchor="_Toc223546188" w:history="1">
             <w:r>
               <w:rPr>
                 <w:rStyle w:val="Hyperlink"/>
@@ -906,7 +906,7 @@
                 <w:noProof/>
                 <w:webHidden/>
               </w:rPr>
-              <w:instrText xml:space="preserve"> PAGEREF _Toc223459340 \h </w:instrText>
+              <w:instrText xml:space="preserve"> PAGEREF _Toc223546188 \h </w:instrText>
             </w:r>
             <w:r>
               <w:rPr>
@@ -951,7 +951,7 @@
               <w14:ligatures w14:val="standardContextual"/>
             </w:rPr>
           </w:pPr>
-          <w:hyperlink w:anchor="_Toc223459341" w:history="1">
+          <w:hyperlink w:anchor="_Toc223546189" w:history="1">
             <w:r>
               <w:rPr>
                 <w:rStyle w:val="Hyperlink"/>
@@ -998,7 +998,7 @@
                 <w:noProof/>
                 <w:webHidden/>
               </w:rPr>
-              <w:instrText xml:space="preserve"> PAGEREF _Toc223459341 \h </w:instrText>
+              <w:instrText xml:space="preserve"> PAGEREF _Toc223546189 \h </w:instrText>
             </w:r>
             <w:r>
               <w:rPr>
@@ -1043,7 +1043,7 @@
               <w14:ligatures w14:val="standardContextual"/>
             </w:rPr>
           </w:pPr>
-          <w:hyperlink w:anchor="_Toc223459342" w:history="1">
+          <w:hyperlink w:anchor="_Toc223546190" w:history="1">
             <w:r>
               <w:rPr>
                 <w:rStyle w:val="Hyperlink"/>
@@ -1090,7 +1090,7 @@
                 <w:noProof/>
                 <w:webHidden/>
               </w:rPr>
-              <w:instrText xml:space="preserve"> PAGEREF _Toc223459342 \h </w:instrText>
+              <w:instrText xml:space="preserve"> PAGEREF _Toc223546190 \h </w:instrText>
             </w:r>
             <w:r>
               <w:rPr>
@@ -1135,7 +1135,7 @@
               <w14:ligatures w14:val="standardContextual"/>
             </w:rPr>
           </w:pPr>
-          <w:hyperlink w:anchor="_Toc223459343" w:history="1">
+          <w:hyperlink w:anchor="_Toc223546191" w:history="1">
             <w:r>
               <w:rPr>
                 <w:rStyle w:val="Hyperlink"/>
@@ -1182,7 +1182,7 @@
                 <w:noProof/>
                 <w:webHidden/>
               </w:rPr>
-              <w:instrText xml:space="preserve"> PAGEREF _Toc223459343 \h </w:instrText>
+              <w:instrText xml:space="preserve"> PAGEREF _Toc223546191 \h </w:instrText>
             </w:r>
             <w:r>
               <w:rPr>
@@ -1227,7 +1227,7 @@
               <w14:ligatures w14:val="standardContextual"/>
             </w:rPr>
           </w:pPr>
-          <w:hyperlink w:anchor="_Toc223459344" w:history="1">
+          <w:hyperlink w:anchor="_Toc223546192" w:history="1">
             <w:r>
               <w:rPr>
                 <w:rStyle w:val="Hyperlink"/>
@@ -1274,7 +1274,7 @@
                 <w:noProof/>
                 <w:webHidden/>
               </w:rPr>
-              <w:instrText xml:space="preserve"> PAGEREF _Toc223459344 \h </w:instrText>
+              <w:instrText xml:space="preserve"> PAGEREF _Toc223546192 \h </w:instrText>
             </w:r>
             <w:r>
               <w:rPr>
@@ -1319,7 +1319,7 @@
               <w14:ligatures w14:val="standardContextual"/>
             </w:rPr>
           </w:pPr>
-          <w:hyperlink w:anchor="_Toc223459345" w:history="1">
+          <w:hyperlink w:anchor="_Toc223546193" w:history="1">
             <w:r>
               <w:rPr>
                 <w:rStyle w:val="Hyperlink"/>
@@ -1366,7 +1366,7 @@
                 <w:noProof/>
                 <w:webHidden/>
               </w:rPr>
-              <w:instrText xml:space="preserve"> PAGEREF _Toc223459345 \h </w:instrText>
+              <w:instrText xml:space="preserve"> PAGEREF _Toc223546193 \h </w:instrText>
             </w:r>
             <w:r>
               <w:rPr>
@@ -1411,7 +1411,7 @@
               <w14:ligatures w14:val="standardContextual"/>
             </w:rPr>
           </w:pPr>
-          <w:hyperlink w:anchor="_Toc223459346" w:history="1">
+          <w:hyperlink w:anchor="_Toc223546194" w:history="1">
             <w:r>
               <w:rPr>
                 <w:rStyle w:val="Hyperlink"/>
@@ -1458,7 +1458,7 @@
                 <w:noProof/>
                 <w:webHidden/>
               </w:rPr>
-              <w:instrText xml:space="preserve"> PAGEREF _Toc223459346 \h </w:instrText>
+              <w:instrText xml:space="preserve"> PAGEREF _Toc223546194 \h </w:instrText>
             </w:r>
             <w:r>
               <w:rPr>
@@ -1479,6 +1479,288 @@
                 <w:webHidden/>
               </w:rPr>
               <w:t>5</w:t>
+            </w:r>
+            <w:r>
+              <w:rPr>
+                <w:noProof/>
+                <w:webHidden/>
+              </w:rPr>
+              <w:fldChar w:fldCharType="end"/>
+            </w:r>
+          </w:hyperlink>
+        </w:p>
+        <w:p>
+          <w:pPr>
+            <w:pStyle w:val="TOC1"/>
+            <w:tabs>
+              <w:tab w:val="left" w:pos="480"/>
+              <w:tab w:val="right" w:leader="dot" w:pos="9350"/>
+            </w:tabs>
+            <w:rPr>
+              <w:rFonts w:eastAsiaTheme="minorEastAsia" w:cstheme="minorBidi"/>
+              <w:b w:val="0"/>
+              <w:bCs w:val="0"/>
+              <w:i w:val="0"/>
+              <w:iCs w:val="0"/>
+              <w:noProof/>
+              <w:kern w:val="2"/>
+              <w14:ligatures w14:val="standardContextual"/>
+            </w:rPr>
+          </w:pPr>
+          <w:hyperlink w:anchor="_Toc223546195" w:history="1">
+            <w:r>
+              <w:rPr>
+                <w:rStyle w:val="Hyperlink"/>
+                <w:rFonts w:ascii="Times New Roman" w:hAnsi="Times New Roman"/>
+                <w:noProof/>
+              </w:rPr>
+              <w:t>4.</w:t>
+            </w:r>
+            <w:r>
+              <w:rPr>
+                <w:rFonts w:eastAsiaTheme="minorEastAsia" w:cstheme="minorBidi"/>
+                <w:b w:val="0"/>
+                <w:bCs w:val="0"/>
+                <w:i w:val="0"/>
+                <w:iCs w:val="0"/>
+                <w:noProof/>
+                <w:kern w:val="2"/>
+                <w14:ligatures w14:val="standardContextual"/>
+              </w:rPr>
+              <w:tab/>
+            </w:r>
+            <w:r>
+              <w:rPr>
+                <w:rStyle w:val="Hyperlink"/>
+                <w:rFonts w:ascii="Times New Roman" w:hAnsi="Times New Roman"/>
+                <w:noProof/>
+              </w:rPr>
+              <w:t>Technical Implementation</w:t>
+            </w:r>
+            <w:r>
+              <w:rPr>
+                <w:noProof/>
+                <w:webHidden/>
+              </w:rPr>
+              <w:tab/>
+            </w:r>
+            <w:r>
+              <w:rPr>
+                <w:noProof/>
+                <w:webHidden/>
+              </w:rPr>
+              <w:fldChar w:fldCharType="begin"/>
+            </w:r>
+            <w:r>
+              <w:rPr>
+                <w:noProof/>
+                <w:webHidden/>
+              </w:rPr>
+              <w:instrText xml:space="preserve"> PAGEREF _Toc223546195 \h </w:instrText>
+            </w:r>
+            <w:r>
+              <w:rPr>
+                <w:noProof/>
+                <w:webHidden/>
+              </w:rPr>
+            </w:r>
+            <w:r>
+              <w:rPr>
+                <w:noProof/>
+                <w:webHidden/>
+              </w:rPr>
+              <w:fldChar w:fldCharType="separate"/>
+            </w:r>
+            <w:r>
+              <w:rPr>
+                <w:noProof/>
+                <w:webHidden/>
+              </w:rPr>
+              <w:t>5</w:t>
+            </w:r>
+            <w:r>
+              <w:rPr>
+                <w:noProof/>
+                <w:webHidden/>
+              </w:rPr>
+              <w:fldChar w:fldCharType="end"/>
+            </w:r>
+          </w:hyperlink>
+        </w:p>
+        <w:p>
+          <w:pPr>
+            <w:pStyle w:val="TOC2"/>
+            <w:tabs>
+              <w:tab w:val="left" w:pos="960"/>
+              <w:tab w:val="right" w:leader="dot" w:pos="9350"/>
+            </w:tabs>
+            <w:rPr>
+              <w:rFonts w:asciiTheme="minorHAnsi" w:eastAsiaTheme="minorEastAsia" w:hAnsiTheme="minorHAnsi" w:cstheme="minorBidi"/>
+              <w:noProof/>
+              <w:kern w:val="2"/>
+              <w14:ligatures w14:val="standardContextual"/>
+            </w:rPr>
+          </w:pPr>
+          <w:hyperlink w:anchor="_Toc223546196" w:history="1">
+            <w:r>
+              <w:rPr>
+                <w:rStyle w:val="Hyperlink"/>
+                <w:b/>
+                <w:bCs/>
+                <w:noProof/>
+              </w:rPr>
+              <w:t>4.1</w:t>
+            </w:r>
+            <w:r>
+              <w:rPr>
+                <w:rFonts w:asciiTheme="minorHAnsi" w:eastAsiaTheme="minorEastAsia" w:hAnsiTheme="minorHAnsi" w:cstheme="minorBidi"/>
+                <w:noProof/>
+                <w:kern w:val="2"/>
+                <w14:ligatures w14:val="standardContextual"/>
+              </w:rPr>
+              <w:tab/>
+            </w:r>
+            <w:r>
+              <w:rPr>
+                <w:rStyle w:val="Hyperlink"/>
+                <w:b/>
+                <w:bCs/>
+                <w:noProof/>
+              </w:rPr>
+              <w:t>Architecture and Design Decisions</w:t>
+            </w:r>
+            <w:r>
+              <w:rPr>
+                <w:noProof/>
+                <w:webHidden/>
+              </w:rPr>
+              <w:tab/>
+            </w:r>
+            <w:r>
+              <w:rPr>
+                <w:noProof/>
+                <w:webHidden/>
+              </w:rPr>
+              <w:fldChar w:fldCharType="begin"/>
+            </w:r>
+            <w:r>
+              <w:rPr>
+                <w:noProof/>
+                <w:webHidden/>
+              </w:rPr>
+              <w:instrText xml:space="preserve"> PAGEREF _Toc223546196 \h </w:instrText>
+            </w:r>
+            <w:r>
+              <w:rPr>
+                <w:noProof/>
+                <w:webHidden/>
+              </w:rPr>
+            </w:r>
+            <w:r>
+              <w:rPr>
+                <w:noProof/>
+                <w:webHidden/>
+              </w:rPr>
+              <w:fldChar w:fldCharType="separate"/>
+            </w:r>
+            <w:r>
+              <w:rPr>
+                <w:noProof/>
+                <w:webHidden/>
+              </w:rPr>
+              <w:t>5</w:t>
+            </w:r>
+            <w:r>
+              <w:rPr>
+                <w:noProof/>
+                <w:webHidden/>
+              </w:rPr>
+              <w:fldChar w:fldCharType="end"/>
+            </w:r>
+          </w:hyperlink>
+        </w:p>
+        <w:p>
+          <w:pPr>
+            <w:pStyle w:val="TOC2"/>
+            <w:tabs>
+              <w:tab w:val="left" w:pos="960"/>
+              <w:tab w:val="right" w:leader="dot" w:pos="9350"/>
+            </w:tabs>
+            <w:rPr>
+              <w:rFonts w:asciiTheme="minorHAnsi" w:eastAsiaTheme="minorEastAsia" w:hAnsiTheme="minorHAnsi" w:cstheme="minorBidi"/>
+              <w:noProof/>
+              <w:kern w:val="2"/>
+              <w14:ligatures w14:val="standardContextual"/>
+            </w:rPr>
+          </w:pPr>
+          <w:hyperlink w:anchor="_Toc223546197" w:history="1">
+            <w:r>
+              <w:rPr>
+                <w:rStyle w:val="Hyperlink"/>
+                <w:b/>
+                <w:bCs/>
+                <w:noProof/>
+              </w:rPr>
+              <w:t>4.2</w:t>
+            </w:r>
+            <w:r>
+              <w:rPr>
+                <w:rFonts w:asciiTheme="minorHAnsi" w:eastAsiaTheme="minorEastAsia" w:hAnsiTheme="minorHAnsi" w:cstheme="minorBidi"/>
+                <w:noProof/>
+                <w:kern w:val="2"/>
+                <w14:ligatures w14:val="standardContextual"/>
+              </w:rPr>
+              <w:tab/>
+            </w:r>
+            <w:r>
+              <w:rPr>
+                <w:rStyle w:val="Hyperlink"/>
+                <w:b/>
+                <w:bCs/>
+                <w:noProof/>
+              </w:rPr>
+              <w:t>Module Implementation</w:t>
+            </w:r>
+            <w:r>
+              <w:rPr>
+                <w:noProof/>
+                <w:webHidden/>
+              </w:rPr>
+              <w:tab/>
+            </w:r>
+            <w:r>
+              <w:rPr>
+                <w:noProof/>
+                <w:webHidden/>
+              </w:rPr>
+              <w:fldChar w:fldCharType="begin"/>
+            </w:r>
+            <w:r>
+              <w:rPr>
+                <w:noProof/>
+                <w:webHidden/>
+              </w:rPr>
+              <w:instrText xml:space="preserve"> PAGEREF _Toc223546197 \h </w:instrText>
+            </w:r>
+            <w:r>
+              <w:rPr>
+                <w:noProof/>
+                <w:webHidden/>
+              </w:rPr>
+            </w:r>
+            <w:r>
+              <w:rPr>
+                <w:noProof/>
+                <w:webHidden/>
+              </w:rPr>
+              <w:fldChar w:fldCharType="separate"/>
+            </w:r>
+            <w:r>
+              <w:rPr>
+                <w:noProof/>
+                <w:webHidden/>
+              </w:rPr>
+              <w:t>6</w:t>
             </w:r>
             <w:r>
               <w:rPr>
@@ -1506,7 +1788,7 @@
               <w14:ligatures w14:val="standardContextual"/>
             </w:rPr>
           </w:pPr>
-          <w:hyperlink w:anchor="_Toc223459347" w:history="1">
+          <w:hyperlink w:anchor="_Toc223546198" w:history="1">
             <w:r>
               <w:rPr>
                 <w:rStyle w:val="Hyperlink"/>
@@ -1534,7 +1816,7 @@
                 <w:noProof/>
                 <w:webHidden/>
               </w:rPr>
-              <w:instrText xml:space="preserve"> PAGEREF _Toc223459347 \h </w:instrText>
+              <w:instrText xml:space="preserve"> PAGEREF _Toc223546198 \h </w:instrText>
             </w:r>
             <w:r>
               <w:rPr>
@@ -1554,7 +1836,7 @@
                 <w:noProof/>
                 <w:webHidden/>
               </w:rPr>
-              <w:t>5</w:t>
+              <w:t>6</w:t>
             </w:r>
             <w:r>
               <w:rPr>
@@ -1582,7 +1864,7 @@
               <w14:ligatures w14:val="standardContextual"/>
             </w:rPr>
           </w:pPr>
-          <w:hyperlink w:anchor="_Toc223459348" w:history="1">
+          <w:hyperlink w:anchor="_Toc223546199" w:history="1">
             <w:r>
               <w:rPr>
                 <w:rStyle w:val="Hyperlink"/>
@@ -1610,7 +1892,7 @@
                 <w:noProof/>
                 <w:webHidden/>
               </w:rPr>
-              <w:instrText xml:space="preserve"> PAGEREF _Toc223459348 \h </w:instrText>
+              <w:instrText xml:space="preserve"> PAGEREF _Toc223546199 \h </w:instrText>
             </w:r>
             <w:r>
               <w:rPr>
@@ -1630,7 +1912,7 @@
                 <w:noProof/>
                 <w:webHidden/>
               </w:rPr>
-              <w:t>7</w:t>
+              <w:t>8</w:t>
             </w:r>
             <w:r>
               <w:rPr>
@@ -1709,7 +1991,7 @@
           <w:szCs w:val="32"/>
         </w:rPr>
       </w:pPr>
-      <w:bookmarkStart w:id="0" w:name="_Toc223459336"/>
+      <w:bookmarkStart w:id="0" w:name="_Toc223546184"/>
       <w:r>
         <w:rPr>
           <w:rFonts w:ascii="Times New Roman" w:hAnsi="Times New Roman" w:cs="Times New Roman"/>
@@ -1764,7 +2046,7 @@
           <w:szCs w:val="32"/>
         </w:rPr>
       </w:pPr>
-      <w:bookmarkStart w:id="1" w:name="_Toc223459337"/>
+      <w:bookmarkStart w:id="1" w:name="_Toc223546185"/>
       <w:r>
         <w:rPr>
           <w:rFonts w:ascii="Times New Roman" w:hAnsi="Times New Roman" w:cs="Times New Roman"/>
@@ -1903,7 +2185,7 @@
           <w:szCs w:val="32"/>
         </w:rPr>
       </w:pPr>
-      <w:bookmarkStart w:id="2" w:name="_Toc223459338"/>
+      <w:bookmarkStart w:id="2" w:name="_Toc223546186"/>
       <w:r>
         <w:rPr>
           <w:rFonts w:ascii="Times New Roman" w:hAnsi="Times New Roman" w:cs="Times New Roman"/>
@@ -1964,7 +2246,7 @@
           <w:color w:val="000000" w:themeColor="text1"/>
         </w:rPr>
       </w:pPr>
-      <w:bookmarkStart w:id="3" w:name="_Toc223459339"/>
+      <w:bookmarkStart w:id="3" w:name="_Toc223546187"/>
       <w:r>
         <w:rPr>
           <w:rFonts w:ascii="Times New Roman" w:hAnsi="Times New Roman" w:cs="Times New Roman"/>
@@ -2124,7 +2406,7 @@
           <w:color w:val="000000" w:themeColor="text1"/>
         </w:rPr>
       </w:pPr>
-      <w:bookmarkStart w:id="4" w:name="_Toc223459340"/>
+      <w:bookmarkStart w:id="4" w:name="_Toc223546188"/>
       <w:r>
         <w:rPr>
           <w:rFonts w:ascii="Times New Roman" w:hAnsi="Times New Roman" w:cs="Times New Roman"/>
@@ -2157,7 +2439,7 @@
           <w:color w:val="000000" w:themeColor="text1"/>
         </w:rPr>
       </w:pPr>
-      <w:bookmarkStart w:id="5" w:name="_Toc223459341"/>
+      <w:bookmarkStart w:id="5" w:name="_Toc223546189"/>
       <w:r>
         <w:rPr>
           <w:rFonts w:ascii="Times New Roman" w:hAnsi="Times New Roman" w:cs="Times New Roman"/>
@@ -2234,7 +2516,7 @@
           <w:color w:val="000000" w:themeColor="text1"/>
         </w:rPr>
       </w:pPr>
-      <w:bookmarkStart w:id="6" w:name="_Toc223459342"/>
+      <w:bookmarkStart w:id="6" w:name="_Toc223546190"/>
       <w:r>
         <w:rPr>
           <w:rFonts w:ascii="Times New Roman" w:hAnsi="Times New Roman" w:cs="Times New Roman"/>
@@ -2270,7 +2552,7 @@
           <w:color w:val="000000" w:themeColor="text1"/>
         </w:rPr>
       </w:pPr>
-      <w:bookmarkStart w:id="7" w:name="_Toc223459343"/>
+      <w:bookmarkStart w:id="7" w:name="_Toc223546191"/>
       <w:r>
         <w:rPr>
           <w:rFonts w:ascii="Times New Roman" w:hAnsi="Times New Roman" w:cs="Times New Roman"/>
@@ -2305,7 +2587,7 @@
           <w:color w:val="000000" w:themeColor="text1"/>
         </w:rPr>
       </w:pPr>
-      <w:bookmarkStart w:id="8" w:name="_Toc223459344"/>
+      <w:bookmarkStart w:id="8" w:name="_Toc223546192"/>
       <w:r>
         <w:rPr>
           <w:rFonts w:ascii="Times New Roman" w:hAnsi="Times New Roman" w:cs="Times New Roman"/>
@@ -2349,7 +2631,7 @@
           <w:color w:val="000000" w:themeColor="text1"/>
         </w:rPr>
       </w:pPr>
-      <w:bookmarkStart w:id="9" w:name="_Toc223459345"/>
+      <w:bookmarkStart w:id="9" w:name="_Toc223546193"/>
       <w:r>
         <w:rPr>
           <w:rFonts w:ascii="Times New Roman" w:hAnsi="Times New Roman" w:cs="Times New Roman"/>
@@ -2394,7 +2676,7 @@
           <w:color w:val="000000" w:themeColor="text1"/>
         </w:rPr>
       </w:pPr>
-      <w:bookmarkStart w:id="10" w:name="_Toc223459346"/>
+      <w:bookmarkStart w:id="10" w:name="_Toc223546194"/>
       <w:r>
         <w:rPr>
           <w:rFonts w:ascii="Times New Roman" w:hAnsi="Times New Roman" w:cs="Times New Roman"/>
@@ -2454,6 +2736,7 @@
           <w:szCs w:val="32"/>
         </w:rPr>
       </w:pPr>
+      <w:bookmarkStart w:id="11" w:name="_Toc223546195"/>
       <w:r>
         <w:rPr>
           <w:rFonts w:ascii="Times New Roman" w:hAnsi="Times New Roman" w:cs="Times New Roman"/>
@@ -2465,6 +2748,7 @@
         </w:rPr>
         <w:t>Technical Implementation</w:t>
       </w:r>
+      <w:bookmarkEnd w:id="11"/>
     </w:p>
     <w:p>
       <w:pPr>
@@ -2489,6 +2773,7 @@
           <w:color w:val="000000" w:themeColor="text1"/>
         </w:rPr>
       </w:pPr>
+      <w:bookmarkStart w:id="12" w:name="_Toc223546196"/>
       <w:r>
         <w:rPr>
           <w:rFonts w:ascii="Times New Roman" w:hAnsi="Times New Roman" w:cs="Times New Roman"/>
@@ -2498,6 +2783,7 @@
         </w:rPr>
         <w:t>Architecture and Design Decisions</w:t>
       </w:r>
+      <w:bookmarkEnd w:id="12"/>
     </w:p>
     <w:p>
       <w:pPr>
@@ -2524,66 +2810,76 @@
       <w:r>
         <w:t xml:space="preserve">React.js was selected for the frontend due to its </w:t>
       </w:r>
-      <w:proofErr w:type="gramStart"/>
-      <w:r>
-        <w:t>component</w:t>
+      <w:r>
+        <w:t>component-based</w:t>
+      </w:r>
+      <w:r>
+        <w:t xml:space="preserve"> architecture and efficient state management capabilities.</w:t>
+      </w:r>
+      <w:r>
+        <w:t xml:space="preserve"> The technology’s features</w:t>
+      </w:r>
+      <w:r>
+        <w:t xml:space="preserve"> improve rendering efficiency, which is essential for </w:t>
+      </w:r>
+      <w:r>
+        <w:t>statistics</w:t>
+      </w:r>
+      <w:r>
+        <w:t xml:space="preserve"> such as live notifications and message updates</w:t>
+      </w:r>
+      <w:r>
+        <w:t>, while its structure speeds up the development work in frontend</w:t>
+      </w:r>
+      <w:r>
+        <w:t>.</w:t>
       </w:r>
       <w:r>
         <w:t xml:space="preserve"> </w:t>
       </w:r>
       <w:r>
-        <w:t>based</w:t>
-      </w:r>
-      <w:proofErr w:type="gramEnd"/>
-      <w:r>
-        <w:t xml:space="preserve"> architecture and efficient state management capabilities.</w:t>
-      </w:r>
-      <w:r>
-        <w:t xml:space="preserve"> The technology’s features</w:t>
-      </w:r>
-      <w:r>
-        <w:t xml:space="preserve"> improve rendering efficiency, which is essential for </w:t>
-      </w:r>
-      <w:r>
-        <w:t>statistics</w:t>
-      </w:r>
-      <w:r>
-        <w:t xml:space="preserve"> such as live notifications and message updates</w:t>
-      </w:r>
-      <w:r>
-        <w:t>, while its structure speeds up the development work in frontend</w:t>
-      </w:r>
-      <w:r>
-        <w:t>.</w:t>
+        <w:t xml:space="preserve">Node.js was selected for the backend due to its runtime model. This architecture is particularly suitable for </w:t>
+      </w:r>
+      <w:r>
+        <w:t>this project, since it</w:t>
+      </w:r>
+      <w:r>
+        <w:t xml:space="preserve"> requir</w:t>
+      </w:r>
+      <w:r>
+        <w:t>es</w:t>
+      </w:r>
+      <w:r>
+        <w:t xml:space="preserve"> multiple concurrent users. Express.js was used as a framework for defining </w:t>
+      </w:r>
+      <w:r>
+        <w:rPr>
+          <w:highlight w:val="yellow"/>
+        </w:rPr>
+        <w:t>RESTful</w:t>
       </w:r>
       <w:r>
         <w:t xml:space="preserve"> </w:t>
       </w:r>
       <w:r>
-        <w:t xml:space="preserve">Node.js was selected for the backend due to its runtime model. This architecture is particularly suitable for </w:t>
-      </w:r>
-      <w:r>
-        <w:t>this project, since it</w:t>
-      </w:r>
-      <w:r>
-        <w:t xml:space="preserve"> requir</w:t>
+        <w:rPr>
+          <w:highlight w:val="yellow"/>
+        </w:rPr>
+        <w:t>API</w:t>
+      </w:r>
+      <w:r>
+        <w:t xml:space="preserve"> endpoints, </w:t>
+      </w:r>
+      <w:r>
+        <w:t xml:space="preserve">that </w:t>
+      </w:r>
+      <w:r>
+        <w:t>handl</w:t>
       </w:r>
       <w:r>
         <w:t>es</w:t>
       </w:r>
       <w:r>
-        <w:t xml:space="preserve"> multiple concurrent users. Express.js was used as a framework for defining RESTful API endpoints, </w:t>
-      </w:r>
-      <w:r>
-        <w:t xml:space="preserve">that </w:t>
-      </w:r>
-      <w:r>
-        <w:t>handl</w:t>
-      </w:r>
-      <w:r>
-        <w:t>es</w:t>
-      </w:r>
-      <w:r>
         <w:t xml:space="preserve"> routing logic</w:t>
       </w:r>
       <w:r>
@@ -2604,17 +2900,9 @@
       <w:r>
         <w:t xml:space="preserve">MongoDB was selected as the database solution because of its </w:t>
       </w:r>
-      <w:proofErr w:type="gramStart"/>
-      <w:r>
-        <w:t>document</w:t>
-      </w:r>
-      <w:r>
-        <w:t xml:space="preserve"> </w:t>
-      </w:r>
-      <w:r>
-        <w:t>oriented</w:t>
-      </w:r>
-      <w:proofErr w:type="gramEnd"/>
+      <w:r>
+        <w:t>document-oriented</w:t>
+      </w:r>
       <w:r>
         <w:t xml:space="preserve"> structure, which aligns naturally with the platform’s data model</w:t>
       </w:r>
@@ -2622,20 +2910,13 @@
         <w:t xml:space="preserve">. This </w:t>
       </w:r>
       <w:r>
-        <w:t xml:space="preserve">accommodates future feature expansion without relational </w:t>
-      </w:r>
-      <w:proofErr w:type="spellStart"/>
-      <w:proofErr w:type="gramStart"/>
-      <w:r>
-        <w:t>constraints.Real</w:t>
-      </w:r>
-      <w:proofErr w:type="spellEnd"/>
-      <w:proofErr w:type="gramEnd"/>
-      <w:r>
-        <w:t xml:space="preserve"> </w:t>
-      </w:r>
-      <w:r>
-        <w:t xml:space="preserve">time communication was implemented using </w:t>
+        <w:t>accommodates future feature expansion without relational constraints.</w:t>
+      </w:r>
+      <w:r>
+        <w:t xml:space="preserve"> Real-time </w:t>
+      </w:r>
+      <w:r>
+        <w:t xml:space="preserve">communication was implemented using </w:t>
       </w:r>
       <w:proofErr w:type="spellStart"/>
       <w:r>
@@ -2673,6 +2954,7 @@
           <w:color w:val="000000" w:themeColor="text1"/>
         </w:rPr>
       </w:pPr>
+      <w:bookmarkStart w:id="13" w:name="_Toc223546197"/>
       <w:r>
         <w:rPr>
           <w:rFonts w:ascii="Times New Roman" w:hAnsi="Times New Roman" w:cs="Times New Roman"/>
@@ -2680,9 +2962,132 @@
           <w:bCs/>
           <w:color w:val="000000" w:themeColor="text1"/>
         </w:rPr>
-        <w:t xml:space="preserve">Module Implementation </w:t>
+        <w:t>Module Implementation</w:t>
+      </w:r>
+      <w:bookmarkEnd w:id="13"/>
+      <w:r>
+        <w:rPr>
+          <w:rFonts w:ascii="Times New Roman" w:hAnsi="Times New Roman" w:cs="Times New Roman"/>
+          <w:b/>
+          <w:bCs/>
+          <w:color w:val="000000" w:themeColor="text1"/>
+        </w:rPr>
+        <w:t xml:space="preserve"> </w:t>
       </w:r>
     </w:p>
+    <w:p>
+      <w:r>
+        <w:t>Authentication and Authorization</w:t>
+      </w:r>
+    </w:p>
+    <w:p/>
+    <w:p>
+      <w:r>
+        <w:t>Authentication was implemented using email/password login and JSON Web Tokens. During registration, user credentials are validated server-</w:t>
+      </w:r>
+      <w:proofErr w:type="gramStart"/>
+      <w:r>
+        <w:t>side</w:t>
+      </w:r>
+      <w:proofErr w:type="gramEnd"/>
+      <w:r>
+        <w:t xml:space="preserve"> and the password is stored as a salted hash. On successful login, the backend issues a signed JSON Web Token which the client stores and includes in the corresponding header for protected requests. The middleware verifies the token on protected routes and extracts the user ID to enforce access control. Role-based checks were applied for administrator-only endpoints. This approach ensures that only authenticated users can access restricted resources such as messaging, meeting scheduling, profile updates.</w:t>
+      </w:r>
+    </w:p>
+    <w:p/>
+    <w:p>
+      <w:r>
+        <w:t>User Profiles and Points System</w:t>
+      </w:r>
+    </w:p>
+    <w:p/>
+    <w:p>
+      <w:r>
+        <w:t xml:space="preserve">User profile data is stored in the </w:t>
+      </w:r>
+      <w:r>
+        <w:t xml:space="preserve">corresponding collection and includes core identity fields such as name and email, engagement fields. Profile update endpoints validate allowed fields to prevent unintended edits. The points system updates after defined actions. Points are computed server-side to prevent client-side manipulation and all updates </w:t>
+      </w:r>
+      <w:proofErr w:type="gramStart"/>
+      <w:r>
+        <w:t>are persisted</w:t>
+      </w:r>
+      <w:proofErr w:type="gramEnd"/>
+      <w:r>
+        <w:t xml:space="preserve"> in MongoDB to maintain consistency.</w:t>
+      </w:r>
+    </w:p>
+    <w:p/>
+    <w:p>
+      <w:r>
+        <w:t>Posts, Comments, Likes</w:t>
+      </w:r>
+    </w:p>
+    <w:p/>
+    <w:p>
+      <w:r>
+        <w:t>The post module allows students to create tutoring requests or supports posts. Posts are stored in the corresponding collection with references to the author and timestamps. Users can comment on posts with comments stored as a separate collection with references to post and author. This functionality prevents duplicate likes by tracking user IDs who liked the post.</w:t>
+      </w:r>
+    </w:p>
+    <w:p/>
+    <w:p>
+      <w:r>
+        <w:t>Real-Time Messaging</w:t>
+      </w:r>
+    </w:p>
+    <w:p/>
+    <w:p>
+      <w:r>
+        <w:lastRenderedPageBreak/>
+        <w:t xml:space="preserve">Real-time messaging was implemented using Socket.io to support instant communication between peers. Conversations are represented using a corresponding collection while messages are stored in messages collection, where content and timestamp are stored. When a user sends a message, it is first validated and saved to MongoDB, then emitted to the recipient via Socket.io. </w:t>
+      </w:r>
+    </w:p>
+    <w:p/>
+    <w:p>
+      <w:r>
+        <w:t>Scheduling and Meetings</w:t>
+      </w:r>
+    </w:p>
+    <w:p/>
+    <w:p>
+      <w:r>
+        <w:t>The scheduling module allows users to create and manage tutoring sessions. Meetings are stored in a corresponding collection with fields such as time and date. The backend validates date/time inputs and prevents invalid scheduling states. When a meeting is confirmed or completed, notifications are triggered and stored, meeting completion enables rating submission. This ensures evaluation of platform usage.</w:t>
+      </w:r>
+    </w:p>
+    <w:p/>
+    <w:p>
+      <w:r>
+        <w:t>Notifications</w:t>
+      </w:r>
+    </w:p>
+    <w:p/>
+    <w:p>
+      <w:r>
+        <w:t xml:space="preserve">Notifications were implemented as a combination of persisted records and optional real-time delivery. Notification items are stored in a corresponding collection and linked to a target user. For time-sensitive events such as new messages, meeting acceptance, Socket.io emits notification updates instantly, while REST endpoints allow the user to load historical notifications and mark them as read. </w:t>
+      </w:r>
+    </w:p>
+    <w:p/>
+    <w:p>
+      <w:r>
+        <w:t xml:space="preserve">Rating </w:t>
+      </w:r>
+    </w:p>
+    <w:p/>
+    <w:p>
+      <w:r>
+        <w:t xml:space="preserve">After a tutoring session is completed, users can submit a ratting from zero to five. Ratings are stored in a collection linked to </w:t>
+      </w:r>
+      <w:proofErr w:type="spellStart"/>
+      <w:r>
+        <w:t>meetingId</w:t>
+      </w:r>
+      <w:proofErr w:type="spellEnd"/>
+      <w:r>
+        <w:t>. The backend enforces rules that only participants of a completed meeting may rate and prevents duplicate ratings for the same meeting. The system recalculates a rating to keep user profiles consistent. Such metrics support trust binding on the platform among students.</w:t>
+      </w:r>
+    </w:p>
+    <w:p/>
+    <w:p/>
     <w:p>
       <w:pPr>
         <w:jc w:val="both"/>
@@ -2696,7 +3101,8 @@
           <w:rFonts w:ascii="Times New Roman" w:hAnsi="Times New Roman" w:cs="Times New Roman"/>
         </w:rPr>
       </w:pPr>
-      <w:bookmarkStart w:id="11" w:name="_Toc223459347"/>
+      <w:bookmarkStart w:id="14" w:name="_Toc223546198"/>
+      <w:proofErr w:type="spellStart"/>
       <w:r>
         <w:rPr>
           <w:rFonts w:ascii="Times New Roman" w:hAnsi="Times New Roman" w:cs="Times New Roman"/>
@@ -2709,6 +3115,7 @@
         </w:rPr>
         <w:t>3</w:t>
       </w:r>
+      <w:proofErr w:type="spellEnd"/>
       <w:r>
         <w:rPr>
           <w:rFonts w:ascii="Times New Roman" w:hAnsi="Times New Roman" w:cs="Times New Roman"/>
@@ -2721,7 +3128,7 @@
         </w:rPr>
         <w:t>Reference List</w:t>
       </w:r>
-      <w:bookmarkEnd w:id="11"/>
+      <w:bookmarkEnd w:id="14"/>
     </w:p>
     <w:p/>
     <w:p>
@@ -2788,6 +3195,7 @@
         <w:pStyle w:val="NormalWeb"/>
       </w:pPr>
       <w:r>
+        <w:lastRenderedPageBreak/>
         <w:t xml:space="preserve">Charlton, T. (1998). Peer tutoring: An introduction. </w:t>
       </w:r>
       <w:r>
@@ -2843,7 +3251,6 @@
       </w:pPr>
       <w:proofErr w:type="spellStart"/>
       <w:r>
-        <w:lastRenderedPageBreak/>
         <w:t>Goodlad</w:t>
       </w:r>
       <w:proofErr w:type="spellEnd"/>
@@ -3070,6 +3477,7 @@
         <w:pStyle w:val="NormalWeb"/>
       </w:pPr>
       <w:r>
+        <w:lastRenderedPageBreak/>
         <w:t xml:space="preserve">Profi.ru (n.d.). </w:t>
       </w:r>
       <w:r>
@@ -3135,7 +3543,6 @@
         <w:pStyle w:val="NormalWeb"/>
       </w:pPr>
       <w:r>
-        <w:lastRenderedPageBreak/>
         <w:t xml:space="preserve">Tinto, V. (2014). Reflective practice: Tinto’s South Africa lectures. </w:t>
       </w:r>
       <w:r>
@@ -3233,7 +3640,7 @@
           <w:rFonts w:ascii="Times New Roman" w:hAnsi="Times New Roman" w:cs="Times New Roman"/>
         </w:rPr>
       </w:pPr>
-      <w:bookmarkStart w:id="12" w:name="_Toc223459348"/>
+      <w:bookmarkStart w:id="15" w:name="_Toc223546199"/>
       <w:r>
         <w:rPr>
           <w:rFonts w:ascii="Times New Roman" w:hAnsi="Times New Roman" w:cs="Times New Roman"/>
@@ -3252,7 +3659,7 @@
         </w:rPr>
         <w:t>Appendix</w:t>
       </w:r>
-      <w:bookmarkEnd w:id="12"/>
+      <w:bookmarkEnd w:id="15"/>
     </w:p>
     <w:sdt>
       <w:sdtPr>

</xml_diff>

<commit_message>
Add updated final year report and research document
</commit_message>
<xml_diff>
--- a/docs/Rustamov Temur C00280204 Final Report.docx
+++ b/docs/Rustamov Temur C00280204 Final Report.docx
@@ -5,6 +5,7 @@
     <w:p>
       <w:pPr>
         <w:pStyle w:val="FirstParagraph"/>
+        <w:spacing w:before="0" w:after="0"/>
         <w:jc w:val="center"/>
         <w:rPr>
           <w:rFonts w:ascii="Times New Roman" w:hAnsi="Times New Roman" w:cs="Times New Roman"/>
@@ -98,7 +99,7 @@
           <w:noProof/>
           <w14:ligatures w14:val="standardContextual"/>
         </w:rPr>
-        <w:pict w14:anchorId="778F3426">
+        <w:pict w14:anchorId="62351D47">
           <v:rect id="_x0000_i1026" alt="" style="width:468pt;height:.05pt;mso-width-percent:0;mso-height-percent:0;mso-width-percent:0;mso-height-percent:0" o:hralign="center" o:hrstd="t" o:hr="t"/>
         </w:pict>
       </w:r>
@@ -156,7 +157,7 @@
           <w:noProof/>
           <w14:ligatures w14:val="standardContextual"/>
         </w:rPr>
-        <w:pict w14:anchorId="1D3BC9C6">
+        <w:pict w14:anchorId="4CADAC1E">
           <v:rect id="_x0000_i1025" alt="" style="width:468pt;height:.05pt;mso-width-percent:0;mso-height-percent:0;mso-width-percent:0;mso-height-percent:0" o:hralign="center" o:hrstd="t" o:hr="t"/>
         </w:pict>
       </w:r>
@@ -164,6 +165,7 @@
     <w:p>
       <w:pPr>
         <w:pStyle w:val="FirstParagraph"/>
+        <w:spacing w:before="0" w:after="0"/>
         <w:jc w:val="center"/>
         <w:rPr>
           <w:rFonts w:ascii="Times New Roman" w:hAnsi="Times New Roman" w:cs="Times New Roman"/>
@@ -174,11 +176,13 @@
     <w:p>
       <w:pPr>
         <w:pStyle w:val="BodyText"/>
+        <w:spacing w:before="0" w:after="0"/>
       </w:pPr>
     </w:p>
     <w:p>
       <w:pPr>
         <w:pStyle w:val="BodyText"/>
+        <w:spacing w:before="0" w:after="0"/>
         <w:rPr>
           <w:rFonts w:ascii="Times New Roman" w:hAnsi="Times New Roman" w:cs="Times New Roman"/>
         </w:rPr>
@@ -187,6 +191,7 @@
     <w:p>
       <w:pPr>
         <w:pStyle w:val="FirstParagraph"/>
+        <w:spacing w:before="0" w:after="0"/>
         <w:jc w:val="center"/>
         <w:rPr>
           <w:rFonts w:ascii="Times New Roman" w:hAnsi="Times New Roman" w:cs="Times New Roman"/>
@@ -232,6 +237,7 @@
     <w:p>
       <w:pPr>
         <w:pStyle w:val="BodyText"/>
+        <w:spacing w:before="0" w:after="0"/>
         <w:jc w:val="center"/>
         <w:rPr>
           <w:rFonts w:ascii="Times New Roman" w:hAnsi="Times New Roman" w:cs="Times New Roman"/>
@@ -255,6 +261,7 @@
     <w:p>
       <w:pPr>
         <w:pStyle w:val="BodyText"/>
+        <w:spacing w:before="0" w:after="0"/>
         <w:jc w:val="center"/>
         <w:rPr>
           <w:rFonts w:ascii="Times New Roman" w:hAnsi="Times New Roman" w:cs="Times New Roman"/>
@@ -264,6 +271,7 @@
     <w:p>
       <w:pPr>
         <w:pStyle w:val="BodyText"/>
+        <w:spacing w:before="0" w:after="0"/>
         <w:jc w:val="center"/>
         <w:rPr>
           <w:rFonts w:ascii="Times New Roman" w:hAnsi="Times New Roman" w:cs="Times New Roman"/>
@@ -279,6 +287,7 @@
     <w:p>
       <w:pPr>
         <w:pStyle w:val="BodyText"/>
+        <w:spacing w:before="0" w:after="0"/>
         <w:jc w:val="center"/>
         <w:rPr>
           <w:rFonts w:ascii="Times New Roman" w:hAnsi="Times New Roman" w:cs="Times New Roman"/>
@@ -294,6 +303,7 @@
     <w:p>
       <w:pPr>
         <w:pStyle w:val="BodyText"/>
+        <w:spacing w:before="0" w:after="0"/>
         <w:jc w:val="center"/>
         <w:rPr>
           <w:rFonts w:ascii="Times New Roman" w:hAnsi="Times New Roman" w:cs="Times New Roman"/>
@@ -309,6 +319,7 @@
     <w:p>
       <w:pPr>
         <w:pStyle w:val="BodyText"/>
+        <w:spacing w:before="0" w:after="0"/>
         <w:jc w:val="center"/>
         <w:rPr>
           <w:rFonts w:ascii="Times New Roman" w:hAnsi="Times New Roman" w:cs="Times New Roman"/>
@@ -333,6 +344,7 @@
     <w:p>
       <w:pPr>
         <w:pStyle w:val="BodyText"/>
+        <w:spacing w:before="0" w:after="0"/>
         <w:jc w:val="center"/>
         <w:rPr>
           <w:rFonts w:ascii="Times New Roman" w:hAnsi="Times New Roman" w:cs="Times New Roman"/>
@@ -342,6 +354,7 @@
     <w:p>
       <w:pPr>
         <w:pStyle w:val="BodyText"/>
+        <w:spacing w:before="0" w:after="0"/>
         <w:jc w:val="center"/>
         <w:rPr>
           <w:rFonts w:ascii="Times New Roman" w:hAnsi="Times New Roman" w:cs="Times New Roman"/>
@@ -357,6 +370,7 @@
     <w:p>
       <w:pPr>
         <w:pStyle w:val="BodyText"/>
+        <w:spacing w:before="0" w:after="0"/>
         <w:jc w:val="center"/>
         <w:rPr>
           <w:rFonts w:ascii="Times New Roman" w:hAnsi="Times New Roman" w:cs="Times New Roman"/>
@@ -372,6 +386,7 @@
     <w:p>
       <w:pPr>
         <w:pStyle w:val="BodyText"/>
+        <w:spacing w:before="0" w:after="0"/>
         <w:jc w:val="center"/>
         <w:rPr>
           <w:rFonts w:ascii="Times New Roman" w:hAnsi="Times New Roman" w:cs="Times New Roman"/>
@@ -395,7 +410,7 @@
     </w:p>
     <w:p>
       <w:pPr>
-        <w:spacing w:after="160" w:line="278" w:lineRule="auto"/>
+        <w:spacing w:line="278" w:lineRule="auto"/>
         <w:jc w:val="both"/>
         <w:rPr>
           <w:rFonts w:eastAsiaTheme="minorHAnsi"/>
@@ -432,6 +447,7 @@
         <w:p>
           <w:pPr>
             <w:pStyle w:val="TOCHeading"/>
+            <w:spacing w:before="0"/>
             <w:jc w:val="both"/>
             <w:rPr>
               <w:rFonts w:ascii="Times New Roman" w:hAnsi="Times New Roman" w:cs="Times New Roman"/>
@@ -457,6 +473,7 @@
               <w:tab w:val="left" w:pos="480"/>
               <w:tab w:val="right" w:leader="dot" w:pos="9350"/>
             </w:tabs>
+            <w:spacing w:before="0" w:line="276" w:lineRule="auto"/>
             <w:rPr>
               <w:rFonts w:eastAsiaTheme="minorEastAsia" w:cstheme="minorBidi"/>
               <w:b w:val="0"/>
@@ -564,6 +581,7 @@
               <w:tab w:val="left" w:pos="480"/>
               <w:tab w:val="right" w:leader="dot" w:pos="9350"/>
             </w:tabs>
+            <w:spacing w:before="0" w:line="276" w:lineRule="auto"/>
             <w:rPr>
               <w:rFonts w:eastAsiaTheme="minorEastAsia" w:cstheme="minorBidi"/>
               <w:b w:val="0"/>
@@ -662,6 +680,7 @@
               <w:tab w:val="left" w:pos="480"/>
               <w:tab w:val="right" w:leader="dot" w:pos="9350"/>
             </w:tabs>
+            <w:spacing w:before="0" w:line="276" w:lineRule="auto"/>
             <w:rPr>
               <w:rFonts w:eastAsiaTheme="minorEastAsia" w:cstheme="minorBidi"/>
               <w:b w:val="0"/>
@@ -760,6 +779,7 @@
               <w:tab w:val="left" w:pos="960"/>
               <w:tab w:val="right" w:leader="dot" w:pos="9350"/>
             </w:tabs>
+            <w:spacing w:after="0" w:line="276" w:lineRule="auto"/>
             <w:rPr>
               <w:rFonts w:asciiTheme="minorHAnsi" w:eastAsiaTheme="minorEastAsia" w:hAnsiTheme="minorHAnsi" w:cstheme="minorBidi"/>
               <w:noProof/>
@@ -852,6 +872,7 @@
               <w:tab w:val="left" w:pos="960"/>
               <w:tab w:val="right" w:leader="dot" w:pos="9350"/>
             </w:tabs>
+            <w:spacing w:after="0" w:line="276" w:lineRule="auto"/>
             <w:rPr>
               <w:rFonts w:asciiTheme="minorHAnsi" w:eastAsiaTheme="minorEastAsia" w:hAnsiTheme="minorHAnsi" w:cstheme="minorBidi"/>
               <w:noProof/>
@@ -944,6 +965,7 @@
               <w:tab w:val="left" w:pos="1200"/>
               <w:tab w:val="right" w:leader="dot" w:pos="9350"/>
             </w:tabs>
+            <w:spacing w:after="0" w:line="276" w:lineRule="auto"/>
             <w:rPr>
               <w:rFonts w:asciiTheme="minorHAnsi" w:eastAsiaTheme="minorEastAsia" w:hAnsiTheme="minorHAnsi" w:cstheme="minorBidi"/>
               <w:noProof/>
@@ -1036,6 +1058,7 @@
               <w:tab w:val="left" w:pos="1200"/>
               <w:tab w:val="right" w:leader="dot" w:pos="9350"/>
             </w:tabs>
+            <w:spacing w:after="0" w:line="276" w:lineRule="auto"/>
             <w:rPr>
               <w:rFonts w:asciiTheme="minorHAnsi" w:eastAsiaTheme="minorEastAsia" w:hAnsiTheme="minorHAnsi" w:cstheme="minorBidi"/>
               <w:noProof/>
@@ -1128,6 +1151,7 @@
               <w:tab w:val="left" w:pos="1200"/>
               <w:tab w:val="right" w:leader="dot" w:pos="9350"/>
             </w:tabs>
+            <w:spacing w:after="0" w:line="276" w:lineRule="auto"/>
             <w:rPr>
               <w:rFonts w:asciiTheme="minorHAnsi" w:eastAsiaTheme="minorEastAsia" w:hAnsiTheme="minorHAnsi" w:cstheme="minorBidi"/>
               <w:noProof/>
@@ -1220,6 +1244,7 @@
               <w:tab w:val="left" w:pos="1200"/>
               <w:tab w:val="right" w:leader="dot" w:pos="9350"/>
             </w:tabs>
+            <w:spacing w:after="0" w:line="276" w:lineRule="auto"/>
             <w:rPr>
               <w:rFonts w:asciiTheme="minorHAnsi" w:eastAsiaTheme="minorEastAsia" w:hAnsiTheme="minorHAnsi" w:cstheme="minorBidi"/>
               <w:noProof/>
@@ -1312,6 +1337,7 @@
               <w:tab w:val="left" w:pos="1200"/>
               <w:tab w:val="right" w:leader="dot" w:pos="9350"/>
             </w:tabs>
+            <w:spacing w:after="0" w:line="276" w:lineRule="auto"/>
             <w:rPr>
               <w:rFonts w:asciiTheme="minorHAnsi" w:eastAsiaTheme="minorEastAsia" w:hAnsiTheme="minorHAnsi" w:cstheme="minorBidi"/>
               <w:noProof/>
@@ -1404,6 +1430,7 @@
               <w:tab w:val="left" w:pos="960"/>
               <w:tab w:val="right" w:leader="dot" w:pos="9350"/>
             </w:tabs>
+            <w:spacing w:after="0" w:line="276" w:lineRule="auto"/>
             <w:rPr>
               <w:rFonts w:asciiTheme="minorHAnsi" w:eastAsiaTheme="minorEastAsia" w:hAnsiTheme="minorHAnsi" w:cstheme="minorBidi"/>
               <w:noProof/>
@@ -1496,6 +1523,7 @@
               <w:tab w:val="left" w:pos="480"/>
               <w:tab w:val="right" w:leader="dot" w:pos="9350"/>
             </w:tabs>
+            <w:spacing w:before="0" w:line="276" w:lineRule="auto"/>
             <w:rPr>
               <w:rFonts w:eastAsiaTheme="minorEastAsia" w:cstheme="minorBidi"/>
               <w:b w:val="0"/>
@@ -1594,6 +1622,7 @@
               <w:tab w:val="left" w:pos="960"/>
               <w:tab w:val="right" w:leader="dot" w:pos="9350"/>
             </w:tabs>
+            <w:spacing w:after="0" w:line="276" w:lineRule="auto"/>
             <w:rPr>
               <w:rFonts w:asciiTheme="minorHAnsi" w:eastAsiaTheme="minorEastAsia" w:hAnsiTheme="minorHAnsi" w:cstheme="minorBidi"/>
               <w:noProof/>
@@ -1686,6 +1715,7 @@
               <w:tab w:val="left" w:pos="960"/>
               <w:tab w:val="right" w:leader="dot" w:pos="9350"/>
             </w:tabs>
+            <w:spacing w:after="0" w:line="276" w:lineRule="auto"/>
             <w:rPr>
               <w:rFonts w:asciiTheme="minorHAnsi" w:eastAsiaTheme="minorEastAsia" w:hAnsiTheme="minorHAnsi" w:cstheme="minorBidi"/>
               <w:noProof/>
@@ -1778,6 +1808,7 @@
               <w:tab w:val="left" w:pos="1440"/>
               <w:tab w:val="right" w:leader="dot" w:pos="9350"/>
             </w:tabs>
+            <w:spacing w:after="0" w:line="276" w:lineRule="auto"/>
             <w:rPr>
               <w:rFonts w:asciiTheme="minorHAnsi" w:eastAsiaTheme="minorEastAsia" w:hAnsiTheme="minorHAnsi" w:cstheme="minorBidi"/>
               <w:noProof/>
@@ -1870,6 +1901,7 @@
               <w:tab w:val="left" w:pos="1440"/>
               <w:tab w:val="right" w:leader="dot" w:pos="9350"/>
             </w:tabs>
+            <w:spacing w:after="0" w:line="276" w:lineRule="auto"/>
             <w:rPr>
               <w:rFonts w:asciiTheme="minorHAnsi" w:eastAsiaTheme="minorEastAsia" w:hAnsiTheme="minorHAnsi" w:cstheme="minorBidi"/>
               <w:noProof/>
@@ -1962,6 +1994,7 @@
               <w:tab w:val="left" w:pos="1440"/>
               <w:tab w:val="right" w:leader="dot" w:pos="9350"/>
             </w:tabs>
+            <w:spacing w:after="0" w:line="276" w:lineRule="auto"/>
             <w:rPr>
               <w:rFonts w:asciiTheme="minorHAnsi" w:eastAsiaTheme="minorEastAsia" w:hAnsiTheme="minorHAnsi" w:cstheme="minorBidi"/>
               <w:noProof/>
@@ -2054,6 +2087,7 @@
               <w:tab w:val="left" w:pos="1440"/>
               <w:tab w:val="right" w:leader="dot" w:pos="9350"/>
             </w:tabs>
+            <w:spacing w:after="0" w:line="276" w:lineRule="auto"/>
             <w:rPr>
               <w:rFonts w:asciiTheme="minorHAnsi" w:eastAsiaTheme="minorEastAsia" w:hAnsiTheme="minorHAnsi" w:cstheme="minorBidi"/>
               <w:noProof/>
@@ -2146,6 +2180,7 @@
               <w:tab w:val="left" w:pos="1440"/>
               <w:tab w:val="right" w:leader="dot" w:pos="9350"/>
             </w:tabs>
+            <w:spacing w:after="0" w:line="276" w:lineRule="auto"/>
             <w:rPr>
               <w:rFonts w:asciiTheme="minorHAnsi" w:eastAsiaTheme="minorEastAsia" w:hAnsiTheme="minorHAnsi" w:cstheme="minorBidi"/>
               <w:noProof/>
@@ -2238,6 +2273,7 @@
               <w:tab w:val="left" w:pos="1440"/>
               <w:tab w:val="right" w:leader="dot" w:pos="9350"/>
             </w:tabs>
+            <w:spacing w:after="0" w:line="276" w:lineRule="auto"/>
             <w:rPr>
               <w:rFonts w:asciiTheme="minorHAnsi" w:eastAsiaTheme="minorEastAsia" w:hAnsiTheme="minorHAnsi" w:cstheme="minorBidi"/>
               <w:noProof/>
@@ -2330,6 +2366,7 @@
               <w:tab w:val="left" w:pos="1440"/>
               <w:tab w:val="right" w:leader="dot" w:pos="9350"/>
             </w:tabs>
+            <w:spacing w:after="0" w:line="276" w:lineRule="auto"/>
             <w:rPr>
               <w:rFonts w:asciiTheme="minorHAnsi" w:eastAsiaTheme="minorEastAsia" w:hAnsiTheme="minorHAnsi" w:cstheme="minorBidi"/>
               <w:noProof/>
@@ -2421,6 +2458,7 @@
             <w:tabs>
               <w:tab w:val="right" w:leader="dot" w:pos="9350"/>
             </w:tabs>
+            <w:spacing w:before="0" w:line="276" w:lineRule="auto"/>
             <w:rPr>
               <w:rFonts w:eastAsiaTheme="minorEastAsia" w:cstheme="minorBidi"/>
               <w:b w:val="0"/>
@@ -2497,6 +2535,7 @@
             <w:tabs>
               <w:tab w:val="right" w:leader="dot" w:pos="9350"/>
             </w:tabs>
+            <w:spacing w:before="0" w:line="276" w:lineRule="auto"/>
             <w:rPr>
               <w:rFonts w:eastAsiaTheme="minorEastAsia" w:cstheme="minorBidi"/>
               <w:b w:val="0"/>
@@ -2603,6 +2642,7 @@
     <w:p>
       <w:pPr>
         <w:pStyle w:val="BodyText"/>
+        <w:spacing w:before="0" w:after="0"/>
         <w:jc w:val="both"/>
         <w:rPr>
           <w:rFonts w:ascii="Times New Roman" w:hAnsi="Times New Roman" w:cs="Times New Roman"/>
@@ -2611,7 +2651,7 @@
     </w:p>
     <w:p>
       <w:pPr>
-        <w:spacing w:after="160" w:line="278" w:lineRule="auto"/>
+        <w:spacing w:line="278" w:lineRule="auto"/>
         <w:jc w:val="both"/>
       </w:pPr>
       <w:r>
@@ -2625,7 +2665,7 @@
           <w:ilvl w:val="0"/>
           <w:numId w:val="48"/>
         </w:numPr>
-        <w:spacing w:line="276" w:lineRule="auto"/>
+        <w:spacing w:before="0" w:after="0" w:line="276" w:lineRule="auto"/>
         <w:rPr>
           <w:rFonts w:ascii="Times New Roman" w:hAnsi="Times New Roman" w:cs="Times New Roman"/>
           <w:b/>
@@ -2633,6 +2673,7 @@
           <w:color w:val="000000" w:themeColor="text1"/>
           <w:sz w:val="32"/>
           <w:szCs w:val="32"/>
+          <w:highlight w:val="green"/>
         </w:rPr>
       </w:pPr>
       <w:bookmarkStart w:id="0" w:name="_Toc223650196"/>
@@ -2644,6 +2685,7 @@
           <w:color w:val="000000" w:themeColor="text1"/>
           <w:sz w:val="32"/>
           <w:szCs w:val="32"/>
+          <w:highlight w:val="green"/>
         </w:rPr>
         <w:lastRenderedPageBreak/>
         <w:t>Abstract</w:t>
@@ -2652,27 +2694,83 @@
     </w:p>
     <w:p>
       <w:pPr>
-        <w:spacing w:line="276" w:lineRule="auto"/>
         <w:jc w:val="both"/>
       </w:pPr>
-      <w:r>
-        <w:t xml:space="preserve">This report presents the design, implementation, and evaluation of the Peer Tutoring Platform, a web-based peer-to-peer academic support system developed to facilitate timely academic assistance among university students. The system addresses barriers to help-seeking </w:t>
-      </w:r>
-      <w:r>
-        <w:t>behavior</w:t>
-      </w:r>
-      <w:r>
-        <w:t xml:space="preserve"> and delays in accessing academic guidance within higher education environments. The platform enables students to request and </w:t>
-      </w:r>
-      <w:r>
-        <w:t xml:space="preserve">provide </w:t>
-      </w:r>
-      <w:r>
-        <w:t>help</w:t>
-      </w:r>
-      <w:r>
-        <w:t xml:space="preserve"> through structured features including authentication, profile management, messaging, scheduling, notifications, and a points-based recognition system. The system was implemented using the MERN stack and supports real-time interaction through WebSocket communication. This report reflects on architectural decisions, development challenges, testing outcomes, and lessons learned throughout the project lifecycle.</w:t>
-      </w:r>
+      <w:bookmarkStart w:id="1" w:name="_Toc223650197"/>
+      <w:r>
+        <w:t xml:space="preserve">This report </w:t>
+      </w:r>
+      <w:r>
+        <w:t>discusses</w:t>
+      </w:r>
+      <w:r>
+        <w:t xml:space="preserve"> the design, implementation and evaluation of Peer Tutoring Platform, a web-based peer-to-peer academic support </w:t>
+      </w:r>
+      <w:r>
+        <w:t>platform</w:t>
+      </w:r>
+      <w:r>
+        <w:t xml:space="preserve"> that was designed to support timely academic </w:t>
+      </w:r>
+      <w:r>
+        <w:t xml:space="preserve">assistance among </w:t>
+      </w:r>
+      <w:r>
+        <w:t xml:space="preserve">university students. The system aims to reduce barriers to help-seeking and delays in accessing academic guidance </w:t>
+      </w:r>
+      <w:r>
+        <w:t>with</w:t>
+      </w:r>
+      <w:r>
+        <w:t xml:space="preserve"> higher education. It </w:t>
+      </w:r>
+      <w:r>
+        <w:t>enables</w:t>
+      </w:r>
+      <w:r>
+        <w:t xml:space="preserve"> students to request and </w:t>
+      </w:r>
+      <w:r>
+        <w:t>provide</w:t>
+      </w:r>
+      <w:r>
+        <w:t xml:space="preserve"> help via structured features such as authentication, profile management, messaging, scheduling, notification and a points-based recognition system. The platform </w:t>
+      </w:r>
+      <w:r>
+        <w:t>was</w:t>
+      </w:r>
+      <w:r>
+        <w:t xml:space="preserve"> built using the </w:t>
+      </w:r>
+      <w:r>
+        <w:rPr>
+          <w:highlight w:val="yellow"/>
+        </w:rPr>
+        <w:t>MERN</w:t>
+      </w:r>
+      <w:r>
+        <w:t xml:space="preserve"> stack and supports real-time interaction with the use of WebSocket. </w:t>
+      </w:r>
+      <w:r>
+        <w:t>This report discusses the architectural decisions, development challenges, testing outcomes</w:t>
+      </w:r>
+      <w:r>
+        <w:t xml:space="preserve"> </w:t>
+      </w:r>
+      <w:r>
+        <w:t>and</w:t>
+      </w:r>
+      <w:r>
+        <w:t>, most importantly,</w:t>
+      </w:r>
+      <w:r>
+        <w:t xml:space="preserve"> lessons learned throughout the project lifecycle.</w:t>
+      </w:r>
+    </w:p>
+    <w:p>
+      <w:pPr>
+        <w:jc w:val="both"/>
+      </w:pPr>
     </w:p>
     <w:p>
       <w:pPr>
@@ -2681,6 +2779,7 @@
           <w:ilvl w:val="0"/>
           <w:numId w:val="48"/>
         </w:numPr>
+        <w:spacing w:before="0" w:after="0" w:line="276" w:lineRule="auto"/>
         <w:rPr>
           <w:rFonts w:ascii="Times New Roman" w:hAnsi="Times New Roman" w:cs="Times New Roman"/>
           <w:b/>
@@ -2688,9 +2787,9 @@
           <w:color w:val="000000" w:themeColor="text1"/>
           <w:sz w:val="32"/>
           <w:szCs w:val="32"/>
-        </w:rPr>
-      </w:pPr>
-      <w:bookmarkStart w:id="1" w:name="_Toc223650197"/>
+          <w:highlight w:val="green"/>
+        </w:rPr>
+      </w:pPr>
       <w:r>
         <w:rPr>
           <w:rFonts w:ascii="Times New Roman" w:hAnsi="Times New Roman" w:cs="Times New Roman"/>
@@ -2699,6 +2798,7 @@
           <w:color w:val="000000" w:themeColor="text1"/>
           <w:sz w:val="32"/>
           <w:szCs w:val="32"/>
+          <w:highlight w:val="green"/>
         </w:rPr>
         <w:t>Introduction</w:t>
       </w:r>
@@ -2711,91 +2811,119 @@
           <w:color w:val="000000" w:themeColor="text1"/>
           <w:sz w:val="32"/>
           <w:szCs w:val="32"/>
+          <w:highlight w:val="green"/>
         </w:rPr>
         <w:t xml:space="preserve"> </w:t>
       </w:r>
     </w:p>
     <w:p>
       <w:pPr>
-        <w:spacing w:line="276" w:lineRule="auto"/>
         <w:jc w:val="both"/>
       </w:pPr>
       <w:r>
-        <w:t xml:space="preserve">The purpose of this report is to provide a comprehensive overview of the design, development, and evaluation of the Peer Tutoring Platform. </w:t>
-      </w:r>
-      <w:r>
-        <w:t>This report outlines the project motivation</w:t>
-      </w:r>
-      <w:r>
-        <w:t>, system requirements, implementation decisions, and final outcomes.</w:t>
+        <w:t xml:space="preserve">Undergraduate students, especially first-year students, often struggle with </w:t>
+      </w:r>
+      <w:r>
+        <w:t>learning</w:t>
+      </w:r>
+      <w:r>
+        <w:t xml:space="preserve"> complicated academic content. Although formal </w:t>
+      </w:r>
+      <w:r>
+        <w:t>assistance</w:t>
+      </w:r>
+      <w:r>
+        <w:t xml:space="preserve"> is available to the student through lectures, tutorials and consultations provided by higher education institutions, the growing numbers of students may limit </w:t>
+      </w:r>
+      <w:r>
+        <w:t>one-to-one sessions</w:t>
+      </w:r>
+      <w:r>
+        <w:t xml:space="preserve"> and delay feedback timelines.</w:t>
+      </w:r>
+      <w:r>
+        <w:t xml:space="preserve"> R</w:t>
+      </w:r>
+      <w:r>
+        <w:t xml:space="preserve">esearch shows that student engagement and perceptions of academic support have a significant impact on retention and academic performance (Tinto, 2014; Krause and Coates, 2008). Peer-assisted </w:t>
+      </w:r>
+      <w:r>
+        <w:t xml:space="preserve">learning </w:t>
+      </w:r>
+      <w:r>
+        <w:t xml:space="preserve">allows students who </w:t>
+      </w:r>
+      <w:r>
+        <w:t>come from similar background</w:t>
+      </w:r>
+      <w:r>
+        <w:t xml:space="preserve"> to collaborate and </w:t>
+      </w:r>
+      <w:r>
+        <w:t>help</w:t>
+      </w:r>
+      <w:r>
+        <w:t xml:space="preserve"> each other. </w:t>
+      </w:r>
+      <w:r>
+        <w:t>Another research</w:t>
+      </w:r>
+      <w:r>
+        <w:t xml:space="preserve"> suggests that peer tutoring improves the performance, confidence and communication skills of both tutor and tutee (Topping, 2002). Motivation, self-efficacy and help-seeking </w:t>
+      </w:r>
+      <w:proofErr w:type="spellStart"/>
+      <w:r>
+        <w:t>behaviour</w:t>
+      </w:r>
+      <w:proofErr w:type="spellEnd"/>
+      <w:r>
+        <w:t xml:space="preserve"> are also closely related to </w:t>
+      </w:r>
+      <w:r>
+        <w:t>student</w:t>
+      </w:r>
+      <w:r>
+        <w:t xml:space="preserve"> </w:t>
+      </w:r>
+      <w:r>
+        <w:t>engagement</w:t>
+      </w:r>
+      <w:r>
+        <w:t xml:space="preserve"> (</w:t>
+      </w:r>
+      <w:proofErr w:type="spellStart"/>
+      <w:r>
+        <w:t>Karabenick</w:t>
+      </w:r>
+      <w:proofErr w:type="spellEnd"/>
+      <w:r>
+        <w:t xml:space="preserve">, 2003). Nonetheless, students may not seek help because they are </w:t>
+      </w:r>
+      <w:r>
+        <w:t xml:space="preserve">simply </w:t>
+      </w:r>
+      <w:r>
+        <w:t>unsure, anxious</w:t>
+      </w:r>
+      <w:r>
+        <w:t xml:space="preserve"> </w:t>
+      </w:r>
+      <w:r>
+        <w:t xml:space="preserve">or unaware of the available channels. To overcome these difficulties, the project has created a structured, web-based peer tutoring </w:t>
+      </w:r>
+      <w:r>
+        <w:t>platform</w:t>
+      </w:r>
+      <w:r>
+        <w:t xml:space="preserve"> to support academic interaction through post creation, messaging, meeting scheduling</w:t>
+      </w:r>
+      <w:r>
+        <w:t xml:space="preserve"> </w:t>
+      </w:r>
+      <w:r>
+        <w:t>and a rating system designed to foster sustained engagement. The main users are students requiring assistance, peer tutors and administrators.</w:t>
       </w:r>
     </w:p>
-    <w:p>
-      <w:pPr>
-        <w:spacing w:line="276" w:lineRule="auto"/>
-        <w:jc w:val="both"/>
-      </w:pPr>
-      <w:r>
-        <w:t xml:space="preserve">University students, particularly in early undergraduate years, frequently encounter difficulties when engaging with complex academic material. Although institutions provide formal support through lectures, tutorials, and consultations, increasing class sizes can limit </w:t>
-      </w:r>
-      <w:r>
-        <w:t>personalized</w:t>
-      </w:r>
-      <w:r>
-        <w:t xml:space="preserve"> interaction and delay feedback. Research indicates that student engagement and perceived academic support significantly influence retention and academic performance (Tinto, 2014; Krause and Coates, 2008).</w:t>
-      </w:r>
-    </w:p>
-    <w:p>
-      <w:pPr>
-        <w:spacing w:line="276" w:lineRule="auto"/>
-        <w:jc w:val="both"/>
-      </w:pPr>
-      <w:r>
-        <w:t>Peer-assisted learning extends academic support beyond formal teaching structures by enabling students of similar academic status to collaborate and assist one another. Evidence suggests that peer tutoring enhances performance, confidence, and communication skills for both tutors and tutees (Topping, 2002).</w:t>
-      </w:r>
-    </w:p>
-    <w:p>
-      <w:pPr>
-        <w:spacing w:line="276" w:lineRule="auto"/>
-        <w:jc w:val="both"/>
-      </w:pPr>
-      <w:r>
-        <w:t xml:space="preserve">Academic success is also closely linked to motivation, self-efficacy, and help-seeking </w:t>
-      </w:r>
-      <w:r>
-        <w:t>behavior</w:t>
-      </w:r>
-      <w:r>
-        <w:t xml:space="preserve"> (</w:t>
-      </w:r>
-      <w:proofErr w:type="spellStart"/>
-      <w:r>
-        <w:t>Karabenick</w:t>
-      </w:r>
-      <w:proofErr w:type="spellEnd"/>
-      <w:r>
-        <w:t>, 2003). However, students may hesitate to seek assistance due to uncertainty, anxiety, or limited awareness of available channels.</w:t>
-      </w:r>
-    </w:p>
-    <w:p>
-      <w:pPr>
-        <w:spacing w:line="276" w:lineRule="auto"/>
-        <w:jc w:val="both"/>
-      </w:pPr>
-      <w:r>
-        <w:t>To address these challenges, this project developed a structured web-based peer tutoring platform that facilitates academic interaction through post creation, messaging, meeting scheduling, and a rating system designed to encourage sustained engagement. The primary user groups include students seeking assistance, peer tutors, and system administrators.</w:t>
-      </w:r>
-    </w:p>
-    <w:p>
-      <w:pPr>
-        <w:spacing w:line="276" w:lineRule="auto"/>
-        <w:jc w:val="both"/>
-      </w:pPr>
-    </w:p>
-    <w:p/>
-    <w:p/>
-    <w:p/>
-    <w:p/>
     <w:p/>
     <w:p>
       <w:pPr>
@@ -2804,6 +2932,7 @@
           <w:ilvl w:val="0"/>
           <w:numId w:val="48"/>
         </w:numPr>
+        <w:spacing w:before="0" w:after="0" w:line="276" w:lineRule="auto"/>
         <w:rPr>
           <w:rFonts w:ascii="Times New Roman" w:hAnsi="Times New Roman" w:cs="Times New Roman"/>
           <w:b/>
@@ -2811,6 +2940,7 @@
           <w:color w:val="000000" w:themeColor="text1"/>
           <w:sz w:val="32"/>
           <w:szCs w:val="32"/>
+          <w:highlight w:val="green"/>
         </w:rPr>
       </w:pPr>
       <w:bookmarkStart w:id="2" w:name="_Toc223650198"/>
@@ -2822,8 +2952,8 @@
           <w:color w:val="000000" w:themeColor="text1"/>
           <w:sz w:val="32"/>
           <w:szCs w:val="32"/>
-        </w:rPr>
-        <w:lastRenderedPageBreak/>
+          <w:highlight w:val="green"/>
+        </w:rPr>
         <w:t>Final System Overview</w:t>
       </w:r>
       <w:bookmarkEnd w:id="2"/>
@@ -2839,7 +2969,7 @@
         <w:rPr>
           <w:color w:val="000000" w:themeColor="text1"/>
         </w:rPr>
-        <w:t>This section outlines an overview of the final implemented system. It outlines the architectural structure, core functional components, deployment configuration of Peer Tutoring Platform. The purpose of this section is to describe the system at a high level before going into details of implementation decisions in the further technical sections.</w:t>
+        <w:t>The purpose of this section is to describe the system at a high level before going into details of implementation decisions in the further technical sections.</w:t>
       </w:r>
     </w:p>
     <w:p>
@@ -2856,11 +2986,13 @@
           <w:ilvl w:val="1"/>
           <w:numId w:val="48"/>
         </w:numPr>
+        <w:spacing w:before="0" w:after="0" w:line="276" w:lineRule="auto"/>
         <w:rPr>
           <w:rFonts w:ascii="Times New Roman" w:hAnsi="Times New Roman" w:cs="Times New Roman"/>
           <w:b/>
           <w:bCs/>
           <w:color w:val="000000" w:themeColor="text1"/>
+          <w:highlight w:val="green"/>
         </w:rPr>
       </w:pPr>
       <w:bookmarkStart w:id="3" w:name="_Toc223650199"/>
@@ -2870,6 +3002,7 @@
           <w:b/>
           <w:bCs/>
           <w:color w:val="000000" w:themeColor="text1"/>
+          <w:highlight w:val="green"/>
         </w:rPr>
         <w:t>System Architecture</w:t>
       </w:r>
@@ -2880,6 +3013,7 @@
           <w:b/>
           <w:bCs/>
           <w:color w:val="000000" w:themeColor="text1"/>
+          <w:highlight w:val="green"/>
         </w:rPr>
         <w:t xml:space="preserve"> </w:t>
       </w:r>
@@ -2979,35 +3113,69 @@
         <w:jc w:val="both"/>
       </w:pPr>
       <w:r>
-        <w:t xml:space="preserve">The client communicates with Express REST API through HTTP requests for </w:t>
-      </w:r>
-      <w:r>
-        <w:t>operations such as user registration, post creation, meeting scheduling. Real time communication, messaging and notification updates are handled with the help of WebSocket connections established through Socket.io.</w:t>
+        <w:t>The client communicates with the Express backend and sends the request for the operations such as user registration, posting</w:t>
+      </w:r>
+      <w:r>
+        <w:t xml:space="preserve"> </w:t>
+      </w:r>
+      <w:r>
+        <w:t>and scheduling the meeting using the http request. Socket.io was used to deliver messages and notification updates instantly between connected users.</w:t>
+      </w:r>
+      <w:r>
+        <w:t xml:space="preserve"> </w:t>
+      </w:r>
+      <w:r>
+        <w:t xml:space="preserve">Authentication is </w:t>
+      </w:r>
+      <w:r>
+        <w:t>completed</w:t>
+      </w:r>
+      <w:r>
+        <w:t xml:space="preserve"> with the help of </w:t>
+      </w:r>
+      <w:r>
+        <w:rPr>
+          <w:highlight w:val="yellow"/>
+        </w:rPr>
+        <w:t>JSON</w:t>
+      </w:r>
+      <w:r>
+        <w:t xml:space="preserve"> Web </w:t>
+      </w:r>
+      <w:r>
+        <w:t>Tokens</w:t>
+      </w:r>
+      <w:r>
+        <w:t xml:space="preserve"> working in a way that </w:t>
+      </w:r>
+      <w:r>
+        <w:t>only</w:t>
+      </w:r>
+      <w:r>
+        <w:t xml:space="preserve"> after the successful login the server issues a token which is stored on the client</w:t>
+      </w:r>
+      <w:r>
+        <w:t xml:space="preserve"> eventually</w:t>
+      </w:r>
+      <w:r>
+        <w:t xml:space="preserve">. Protected routes are </w:t>
+      </w:r>
+      <w:r>
+        <w:lastRenderedPageBreak/>
+        <w:t>authenticated through middleware that checks for token authenticity and then grants access to resources. This layered approach provides a clean separation of concerns</w:t>
+      </w:r>
+      <w:r>
+        <w:t xml:space="preserve"> and </w:t>
+      </w:r>
+      <w:r>
+        <w:t>secure communication.</w:t>
       </w:r>
     </w:p>
     <w:p>
       <w:pPr>
         <w:jc w:val="both"/>
       </w:pPr>
-      <w:r>
-        <w:t>Authentication is implemented using JSON Web Tokens. Upon only successful login a token is issued by the server and stored on the client. All protected routes are validated using middleware that verifies token authenticity before granting access to resources.</w:t>
-      </w:r>
     </w:p>
-    <w:p>
-      <w:pPr>
-        <w:jc w:val="both"/>
-      </w:pPr>
-      <w:r>
-        <w:t xml:space="preserve">The described approach for layering </w:t>
-      </w:r>
-      <w:r>
-        <w:t>these architectures</w:t>
-      </w:r>
-      <w:r>
-        <w:t xml:space="preserve"> provides clear separation of concerns, secure communication and support for concurrent real time users.</w:t>
-      </w:r>
-    </w:p>
-    <w:p/>
     <w:p>
       <w:pPr>
         <w:pStyle w:val="Heading2"/>
@@ -3015,11 +3183,13 @@
           <w:ilvl w:val="1"/>
           <w:numId w:val="48"/>
         </w:numPr>
+        <w:spacing w:before="0" w:after="0" w:line="276" w:lineRule="auto"/>
         <w:rPr>
           <w:rFonts w:ascii="Times New Roman" w:hAnsi="Times New Roman" w:cs="Times New Roman"/>
           <w:b/>
           <w:bCs/>
           <w:color w:val="000000" w:themeColor="text1"/>
+          <w:highlight w:val="green"/>
         </w:rPr>
       </w:pPr>
       <w:bookmarkStart w:id="4" w:name="_Toc223650200"/>
@@ -3029,6 +3199,7 @@
           <w:b/>
           <w:bCs/>
           <w:color w:val="000000" w:themeColor="text1"/>
+          <w:highlight w:val="green"/>
         </w:rPr>
         <w:t>Core Functional Components</w:t>
       </w:r>
@@ -3036,7 +3207,13 @@
     </w:p>
     <w:p>
       <w:r>
-        <w:t>The final system consists of the following core modules:</w:t>
+        <w:t xml:space="preserve">The final system consists of the following </w:t>
+      </w:r>
+      <w:r>
+        <w:t xml:space="preserve">core functional </w:t>
+      </w:r>
+      <w:r>
+        <w:t>modules:</w:t>
       </w:r>
     </w:p>
     <w:p/>
@@ -3047,12 +3224,14 @@
           <w:ilvl w:val="2"/>
           <w:numId w:val="48"/>
         </w:numPr>
+        <w:spacing w:before="0" w:after="0" w:line="276" w:lineRule="auto"/>
         <w:rPr>
           <w:b/>
           <w:bCs/>
           <w:color w:val="000000" w:themeColor="text1"/>
           <w:sz w:val="32"/>
           <w:szCs w:val="32"/>
+          <w:highlight w:val="green"/>
         </w:rPr>
       </w:pPr>
       <w:bookmarkStart w:id="5" w:name="_Toc223650201"/>
@@ -3063,6 +3242,7 @@
           <w:color w:val="000000" w:themeColor="text1"/>
           <w:sz w:val="32"/>
           <w:szCs w:val="32"/>
+          <w:highlight w:val="green"/>
         </w:rPr>
         <w:t>Authentication and User Management</w:t>
       </w:r>
@@ -3074,6 +3254,7 @@
           <w:color w:val="000000" w:themeColor="text1"/>
           <w:sz w:val="32"/>
           <w:szCs w:val="32"/>
+          <w:highlight w:val="green"/>
         </w:rPr>
         <w:t xml:space="preserve"> </w:t>
       </w:r>
@@ -3083,7 +3264,13 @@
         <w:jc w:val="both"/>
       </w:pPr>
       <w:r>
-        <w:t xml:space="preserve">Users can register and log in using email and password credentials. JSON Web Token authentication ensures protected access to system resources. The following fields are stored in user profiles: academic interests, information, accumulated points. </w:t>
+        <w:t xml:space="preserve">Users can register and log in using email and password credentials. JSON Web Token authentication ensures protected access to system resources. The following fields are stored in user profiles: academic interests, </w:t>
+      </w:r>
+      <w:r>
+        <w:t>introduction</w:t>
+      </w:r>
+      <w:r>
+        <w:t xml:space="preserve">, accumulated points. </w:t>
       </w:r>
     </w:p>
     <w:p/>
@@ -3094,12 +3281,14 @@
           <w:ilvl w:val="2"/>
           <w:numId w:val="48"/>
         </w:numPr>
+        <w:spacing w:before="0" w:after="0" w:line="276" w:lineRule="auto"/>
         <w:rPr>
           <w:b/>
           <w:bCs/>
           <w:color w:val="000000" w:themeColor="text1"/>
           <w:sz w:val="32"/>
           <w:szCs w:val="32"/>
+          <w:highlight w:val="green"/>
         </w:rPr>
       </w:pPr>
       <w:r>
@@ -3109,6 +3298,7 @@
           <w:color w:val="000000" w:themeColor="text1"/>
           <w:sz w:val="32"/>
           <w:szCs w:val="32"/>
+          <w:highlight w:val="green"/>
         </w:rPr>
         <w:t xml:space="preserve">Post and Collaboration Module  </w:t>
       </w:r>
@@ -3118,7 +3308,25 @@
         <w:jc w:val="both"/>
       </w:pPr>
       <w:r>
-        <w:t>Users can create tutoring related posts. Each post contains description, Author reference, comment section. Other users can interact with posts through likes. This module forms one of the core academic interaction layers of the platform.</w:t>
+        <w:t xml:space="preserve">Users can create tutoring related posts. Each post contains description, </w:t>
+      </w:r>
+      <w:r>
+        <w:t>a</w:t>
+      </w:r>
+      <w:r>
+        <w:t xml:space="preserve">uthor </w:t>
+      </w:r>
+      <w:r>
+        <w:t>name</w:t>
+      </w:r>
+      <w:r>
+        <w:t>, comment section. Other users can interact with posts through likes</w:t>
+      </w:r>
+      <w:r>
+        <w:t xml:space="preserve"> or forwarding them to other chats</w:t>
+      </w:r>
+      <w:r>
+        <w:t>. This module forms one of the core academic interaction layers of the platform.</w:t>
       </w:r>
     </w:p>
     <w:p/>
@@ -3129,12 +3337,14 @@
           <w:ilvl w:val="2"/>
           <w:numId w:val="48"/>
         </w:numPr>
+        <w:spacing w:before="0" w:after="0" w:line="276" w:lineRule="auto"/>
         <w:rPr>
           <w:b/>
           <w:bCs/>
           <w:color w:val="000000" w:themeColor="text1"/>
           <w:sz w:val="32"/>
           <w:szCs w:val="32"/>
+          <w:highlight w:val="green"/>
         </w:rPr>
       </w:pPr>
       <w:bookmarkStart w:id="6" w:name="_Toc223650202"/>
@@ -3145,6 +3355,7 @@
           <w:color w:val="000000" w:themeColor="text1"/>
           <w:sz w:val="32"/>
           <w:szCs w:val="32"/>
+          <w:highlight w:val="green"/>
         </w:rPr>
         <w:t>Messaging System</w:t>
       </w:r>
@@ -3155,7 +3366,28 @@
         <w:jc w:val="both"/>
       </w:pPr>
       <w:r>
-        <w:t>The system includes a real time messaging feature that provides a communication layer for users. Messages are sent through WebSocket connections. The messaging module supports chat creation, real time delivery, loading of historical conversations.</w:t>
+        <w:t xml:space="preserve">The system includes a real time messaging feature that provides a communication layer for users. Messages are sent through </w:t>
+      </w:r>
+      <w:r>
+        <w:rPr>
+          <w:highlight w:val="yellow"/>
+        </w:rPr>
+        <w:t>WebSocket</w:t>
+      </w:r>
+      <w:r>
+        <w:t xml:space="preserve"> connections. </w:t>
+      </w:r>
+      <w:r>
+        <w:t>This module</w:t>
+      </w:r>
+      <w:r>
+        <w:t xml:space="preserve"> supports chat creation</w:t>
+      </w:r>
+      <w:r>
+        <w:t xml:space="preserve"> with peers</w:t>
+      </w:r>
+      <w:r>
+        <w:t>, real time delivery, loading of historical conversations.</w:t>
       </w:r>
     </w:p>
     <w:p/>
@@ -3166,12 +3398,14 @@
           <w:ilvl w:val="2"/>
           <w:numId w:val="48"/>
         </w:numPr>
+        <w:spacing w:before="0" w:after="0" w:line="276" w:lineRule="auto"/>
         <w:rPr>
           <w:b/>
           <w:bCs/>
           <w:color w:val="000000" w:themeColor="text1"/>
           <w:sz w:val="32"/>
           <w:szCs w:val="32"/>
+          <w:highlight w:val="green"/>
         </w:rPr>
       </w:pPr>
       <w:bookmarkStart w:id="7" w:name="_Toc223650203"/>
@@ -3182,6 +3416,7 @@
           <w:color w:val="000000" w:themeColor="text1"/>
           <w:sz w:val="32"/>
           <w:szCs w:val="32"/>
+          <w:highlight w:val="green"/>
         </w:rPr>
         <w:t>Scheduling and Meetings</w:t>
       </w:r>
@@ -3192,7 +3427,13 @@
         <w:jc w:val="both"/>
       </w:pPr>
       <w:r>
-        <w:t>Users can propose tutoring sessions by selecting date and time parameters. Meetings details are stored in the database. This module integrates notifications to remind users to rate services.</w:t>
+        <w:t>Users can propose tutoring sessions by selecting date and time parameters</w:t>
+      </w:r>
+      <w:r>
+        <w:t>, points allocation</w:t>
+      </w:r>
+      <w:r>
+        <w:t>. Meetings details are stored in the database. This module integrates notifications to remind users to rate services.</w:t>
       </w:r>
     </w:p>
     <w:p/>
@@ -3203,12 +3444,14 @@
           <w:ilvl w:val="2"/>
           <w:numId w:val="48"/>
         </w:numPr>
+        <w:spacing w:before="0" w:after="0" w:line="276" w:lineRule="auto"/>
         <w:rPr>
           <w:b/>
           <w:bCs/>
           <w:color w:val="000000" w:themeColor="text1"/>
           <w:sz w:val="32"/>
           <w:szCs w:val="32"/>
+          <w:highlight w:val="green"/>
         </w:rPr>
       </w:pPr>
       <w:bookmarkStart w:id="8" w:name="_Toc223650204"/>
@@ -3219,6 +3462,7 @@
           <w:color w:val="000000" w:themeColor="text1"/>
           <w:sz w:val="32"/>
           <w:szCs w:val="32"/>
+          <w:highlight w:val="green"/>
         </w:rPr>
         <w:t>Rating and Gamification</w:t>
       </w:r>
@@ -3230,6 +3474,7 @@
           <w:color w:val="000000" w:themeColor="text1"/>
           <w:sz w:val="32"/>
           <w:szCs w:val="32"/>
+          <w:highlight w:val="green"/>
         </w:rPr>
         <w:t xml:space="preserve"> </w:t>
       </w:r>
@@ -3239,7 +3484,19 @@
         <w:jc w:val="both"/>
       </w:pPr>
       <w:r>
-        <w:t xml:space="preserve">After finishing a tutoring session, users can rate meetings on a scale from zero to five. Ratings contribute to cumulative scores within the platform. The system rewards active participation and promotes user engagement. </w:t>
+        <w:t xml:space="preserve">After finishing a tutoring session, users can rate meetings on a scale from zero to five. </w:t>
+      </w:r>
+      <w:r>
+        <w:t xml:space="preserve">Based on the rating given, a specific number of points is transferred from initiator’s points balance to the receiver. </w:t>
+      </w:r>
+      <w:r>
+        <w:t xml:space="preserve">Ratings contribute to cumulative scores within the platform. The system </w:t>
+      </w:r>
+      <w:r>
+        <w:t>promotes</w:t>
+      </w:r>
+      <w:r>
+        <w:t xml:space="preserve"> active participation and user engagement. </w:t>
       </w:r>
     </w:p>
     <w:p/>
@@ -3250,12 +3507,14 @@
           <w:ilvl w:val="2"/>
           <w:numId w:val="48"/>
         </w:numPr>
+        <w:spacing w:before="0" w:after="0" w:line="276" w:lineRule="auto"/>
         <w:rPr>
           <w:b/>
           <w:bCs/>
           <w:color w:val="000000" w:themeColor="text1"/>
           <w:sz w:val="32"/>
           <w:szCs w:val="32"/>
+          <w:highlight w:val="green"/>
         </w:rPr>
       </w:pPr>
       <w:bookmarkStart w:id="9" w:name="_Toc223650205"/>
@@ -3266,6 +3525,7 @@
           <w:color w:val="000000" w:themeColor="text1"/>
           <w:sz w:val="32"/>
           <w:szCs w:val="32"/>
+          <w:highlight w:val="green"/>
         </w:rPr>
         <w:t>Administration</w:t>
       </w:r>
@@ -3276,7 +3536,13 @@
         <w:jc w:val="both"/>
       </w:pPr>
       <w:r>
-        <w:t xml:space="preserve">Administrators can monitor posts and user activity. Moderation tools allow removing inappropriate content to ensure compliance with university </w:t>
+        <w:t>Administrators can monitor posts</w:t>
+      </w:r>
+      <w:r>
+        <w:t xml:space="preserve">, messages </w:t>
+      </w:r>
+      <w:r>
+        <w:t xml:space="preserve">and user activity. Moderation tools allow removing inappropriate content to ensure compliance with university </w:t>
       </w:r>
       <w:r>
         <w:t>standards</w:t>
@@ -3288,6 +3554,7 @@
     <w:p>
       <w:pPr>
         <w:pStyle w:val="Heading2"/>
+        <w:spacing w:before="0" w:after="0"/>
       </w:pPr>
     </w:p>
     <w:p>
@@ -3297,11 +3564,13 @@
           <w:ilvl w:val="1"/>
           <w:numId w:val="48"/>
         </w:numPr>
+        <w:spacing w:before="0" w:after="0" w:line="276" w:lineRule="auto"/>
         <w:rPr>
           <w:rFonts w:ascii="Times New Roman" w:hAnsi="Times New Roman" w:cs="Times New Roman"/>
           <w:b/>
           <w:bCs/>
           <w:color w:val="000000" w:themeColor="text1"/>
+          <w:highlight w:val="green"/>
         </w:rPr>
       </w:pPr>
       <w:bookmarkStart w:id="10" w:name="_Toc223650206"/>
@@ -3311,6 +3580,7 @@
           <w:b/>
           <w:bCs/>
           <w:color w:val="000000" w:themeColor="text1"/>
+          <w:highlight w:val="green"/>
         </w:rPr>
         <w:t>System Deployment Overview</w:t>
       </w:r>
@@ -3321,7 +3591,7 @@
         <w:jc w:val="both"/>
       </w:pPr>
       <w:r>
-        <w:t>The application runs locally during development using a Node.js server environment</w:t>
+        <w:t>The application runs using a Node.js server environment</w:t>
       </w:r>
       <w:r>
         <w:t xml:space="preserve">. MongoDB stores persistent data and the frontend is served via a React server that communicates with the backend through defined API endpoints. </w:t>
@@ -3332,13 +3602,12 @@
         <w:jc w:val="both"/>
       </w:pPr>
       <w:r>
+        <w:lastRenderedPageBreak/>
         <w:t>The system supports multiple concurrent users and maintains storage of user data, posts, messages, meetings.</w:t>
       </w:r>
-    </w:p>
-    <w:p>
-      <w:pPr>
-        <w:jc w:val="both"/>
-      </w:pPr>
+      <w:r>
+        <w:t xml:space="preserve"> </w:t>
+      </w:r>
       <w:r>
         <w:t xml:space="preserve">All communication between client and server is secured using HTTPS during deployment. </w:t>
       </w:r>
@@ -3355,6 +3624,7 @@
           <w:ilvl w:val="0"/>
           <w:numId w:val="48"/>
         </w:numPr>
+        <w:spacing w:before="0" w:after="0" w:line="276" w:lineRule="auto"/>
         <w:rPr>
           <w:rFonts w:ascii="Times New Roman" w:hAnsi="Times New Roman" w:cs="Times New Roman"/>
           <w:b/>
@@ -3362,6 +3632,7 @@
           <w:color w:val="000000" w:themeColor="text1"/>
           <w:sz w:val="32"/>
           <w:szCs w:val="32"/>
+          <w:highlight w:val="green"/>
         </w:rPr>
       </w:pPr>
       <w:bookmarkStart w:id="11" w:name="_Toc223650207"/>
@@ -3373,6 +3644,7 @@
           <w:color w:val="000000" w:themeColor="text1"/>
           <w:sz w:val="32"/>
           <w:szCs w:val="32"/>
+          <w:highlight w:val="green"/>
         </w:rPr>
         <w:t>Technical Implementation</w:t>
       </w:r>
@@ -3383,7 +3655,13 @@
         <w:jc w:val="both"/>
       </w:pPr>
       <w:r>
-        <w:t xml:space="preserve">This section describes the technical implementation of the Peer Tutoring Platform. It explains the key architectural decisions, module implementations, data structures, supporting technologies used to develop the system. The purpose of this section is to demonstrate how the system was implemented and how the chosen technologies support the functional requirements in the project specification. </w:t>
+        <w:t xml:space="preserve">This section </w:t>
+      </w:r>
+      <w:r>
+        <w:t>discusses</w:t>
+      </w:r>
+      <w:r>
+        <w:t xml:space="preserve"> the technical implementation of Peer Tutoring Platform. It explains the key architectural decisions, module implementations, data structures, supporting technologies used to develop the system. The purpose of this section is to demonstrate how the system was implemented and how the chosen technologies support the functional requirements in the project specification. </w:t>
       </w:r>
     </w:p>
     <w:p/>
@@ -3394,11 +3672,13 @@
           <w:ilvl w:val="1"/>
           <w:numId w:val="48"/>
         </w:numPr>
+        <w:spacing w:before="0" w:after="0" w:line="276" w:lineRule="auto"/>
         <w:rPr>
           <w:rFonts w:ascii="Times New Roman" w:hAnsi="Times New Roman" w:cs="Times New Roman"/>
           <w:b/>
           <w:bCs/>
           <w:color w:val="000000" w:themeColor="text1"/>
+          <w:highlight w:val="green"/>
         </w:rPr>
       </w:pPr>
       <w:bookmarkStart w:id="12" w:name="_Toc223650208"/>
@@ -3408,6 +3688,7 @@
           <w:b/>
           <w:bCs/>
           <w:color w:val="000000" w:themeColor="text1"/>
+          <w:highlight w:val="green"/>
         </w:rPr>
         <w:t>Architecture and Design Decisions</w:t>
       </w:r>
@@ -3416,84 +3697,145 @@
     <w:p>
       <w:pPr>
         <w:pStyle w:val="NormalWeb"/>
-        <w:spacing w:line="276" w:lineRule="auto"/>
+        <w:spacing w:before="0" w:beforeAutospacing="0" w:after="0" w:afterAutospacing="0" w:line="276" w:lineRule="auto"/>
         <w:jc w:val="both"/>
       </w:pPr>
       <w:r>
-        <w:t xml:space="preserve">The Peer Tutoring Platform was implemented using the MERN stack, which consists of MongoDB, Express.js, React.js, Node.js. This architectural choice enables the use of JavaScript across the entire application stack improving </w:t>
-      </w:r>
-      <w:r>
-        <w:t xml:space="preserve">significantly </w:t>
-      </w:r>
-      <w:r>
-        <w:t>maintainability</w:t>
-      </w:r>
-      <w:r>
-        <w:t xml:space="preserve">. </w:t>
-      </w:r>
-      <w:r>
-        <w:t xml:space="preserve">React.js was selected for the frontend due to its </w:t>
-      </w:r>
-      <w:r>
-        <w:t>component-based</w:t>
-      </w:r>
-      <w:r>
-        <w:t xml:space="preserve"> architecture and efficient state management capabilities. The technology’s features improve rendering efficiency, which is essential for statistics such as live notifications and message updates, while its structure speeds up the </w:t>
-      </w:r>
-      <w:r>
-        <w:lastRenderedPageBreak/>
-        <w:t>development work in frontend.</w:t>
+        <w:t xml:space="preserve">Peer Tutoring Platform was built with the help of </w:t>
+      </w:r>
+      <w:r>
+        <w:t xml:space="preserve">the </w:t>
+      </w:r>
+      <w:r>
+        <w:t xml:space="preserve">MERN stack, which includes MongoDB, Express.js, React.js and Node.js. This architectural choice enables the use of JavaScript across the entire application stack which </w:t>
+      </w:r>
+      <w:r>
+        <w:t>enhances</w:t>
+      </w:r>
+      <w:r>
+        <w:t xml:space="preserve"> maintainability. React.js was chosen for the frontend </w:t>
+      </w:r>
+      <w:r>
+        <w:t>due to</w:t>
+      </w:r>
+      <w:r>
+        <w:t xml:space="preserve"> its component-based architecture and state management capabilities. These features</w:t>
+      </w:r>
+      <w:r>
+        <w:t xml:space="preserve"> alone</w:t>
+      </w:r>
+      <w:r>
+        <w:t xml:space="preserve"> make it more efficient to render</w:t>
+      </w:r>
+      <w:r>
+        <w:t xml:space="preserve"> the content</w:t>
+      </w:r>
+      <w:r>
+        <w:t>, which is crucial for live notifications</w:t>
+      </w:r>
+      <w:r>
+        <w:t xml:space="preserve">, </w:t>
+      </w:r>
+      <w:r>
+        <w:t>message updates</w:t>
       </w:r>
       <w:r>
         <w:t xml:space="preserve"> </w:t>
       </w:r>
       <w:r>
-        <w:t xml:space="preserve">Node.js was selected for the backend due to its runtime model. This architecture is particularly suitable for this project, since it requires multiple concurrent users. Express.js was used as a framework for defining </w:t>
+        <w:t>and speed</w:t>
+      </w:r>
+      <w:r>
+        <w:t>ing</w:t>
+      </w:r>
+      <w:r>
+        <w:t xml:space="preserve"> up frontend development. Node.js was selected for the backend </w:t>
+      </w:r>
+      <w:r>
+        <w:t xml:space="preserve">because of </w:t>
+      </w:r>
+      <w:r>
+        <w:t>its event driven runtime model</w:t>
+      </w:r>
+      <w:r>
+        <w:t xml:space="preserve"> that improves </w:t>
+      </w:r>
+      <w:r>
+        <w:t>support</w:t>
+      </w:r>
+      <w:r>
+        <w:t>ing</w:t>
+      </w:r>
+      <w:r>
+        <w:t xml:space="preserve"> multiple concurrent users</w:t>
+      </w:r>
+      <w:r>
+        <w:t xml:space="preserve"> using the system</w:t>
+      </w:r>
+      <w:r>
+        <w:t xml:space="preserve">. Express.js </w:t>
+      </w:r>
+      <w:r>
+        <w:t>was chosen as</w:t>
+      </w:r>
+      <w:r>
+        <w:t xml:space="preserve"> a framework for defining endpoints of </w:t>
       </w:r>
       <w:r>
         <w:rPr>
           <w:highlight w:val="yellow"/>
         </w:rPr>
-        <w:t>RESTful</w:t>
+        <w:t>REST AP</w:t>
+      </w:r>
+      <w:r>
+        <w:rPr>
+          <w:highlight w:val="yellow"/>
+        </w:rPr>
+        <w:t>I,</w:t>
+      </w:r>
+      <w:r>
+        <w:t xml:space="preserve"> routing logic and middleware for authentication and request validation. MongoDB was </w:t>
+      </w:r>
+      <w:r>
+        <w:t>selected</w:t>
+      </w:r>
+      <w:r>
+        <w:t xml:space="preserve"> as the database </w:t>
+      </w:r>
+      <w:r>
+        <w:t>storage</w:t>
+      </w:r>
+      <w:r>
+        <w:t xml:space="preserve"> due to its document-oriented nature, which fits well with the data model of the platform and allows for future expansion of features without the limitations of a relational database. </w:t>
+      </w:r>
+      <w:r>
+        <w:t>Live</w:t>
+      </w:r>
+      <w:r>
+        <w:t xml:space="preserve"> communication was </w:t>
+      </w:r>
+      <w:r>
+        <w:t>built</w:t>
+      </w:r>
+      <w:r>
+        <w:t xml:space="preserve"> using WebSocket using Socket.io library, which provides instant communication for messages and</w:t>
       </w:r>
       <w:r>
         <w:t xml:space="preserve"> </w:t>
       </w:r>
       <w:r>
-        <w:rPr>
-          <w:highlight w:val="yellow"/>
-        </w:rPr>
-        <w:t>API</w:t>
-      </w:r>
-      <w:r>
-        <w:t xml:space="preserve"> endpoints, that handles routing logic and implements middleware for authentication and request validation.</w:t>
+        <w:t>notification updates without repeated polling, hence significantly improving the user experience and reducing the network overhead.</w:t>
       </w:r>
       <w:r>
         <w:t xml:space="preserve"> </w:t>
       </w:r>
-      <w:r>
-        <w:t xml:space="preserve">MongoDB was selected as the database solution because of its </w:t>
-      </w:r>
-      <w:r>
-        <w:t>document-oriented</w:t>
-      </w:r>
-      <w:r>
-        <w:t xml:space="preserve"> structure, which aligns naturally with the platform’s data model. This accommodates future feature expansion without relational constraints.</w:t>
-      </w:r>
-      <w:r>
-        <w:t xml:space="preserve"> Real-time </w:t>
-      </w:r>
-      <w:r>
-        <w:t xml:space="preserve">communication was implemented using </w:t>
-      </w:r>
-      <w:proofErr w:type="spellStart"/>
-      <w:r>
-        <w:t>WebSockets</w:t>
-      </w:r>
-      <w:proofErr w:type="spellEnd"/>
-      <w:r>
-        <w:t xml:space="preserve"> via the Socket.io library. The technology allows instant message delivery and live notification updates without repeated polling, significantly improving user experience and reducing network </w:t>
-      </w:r>
+    </w:p>
+    <w:p>
+      <w:pPr>
+        <w:pStyle w:val="NormalWeb"/>
+        <w:spacing w:before="0" w:beforeAutospacing="0" w:after="0" w:afterAutospacing="0" w:line="276" w:lineRule="auto"/>
+        <w:jc w:val="both"/>
+      </w:pPr>
     </w:p>
     <w:p>
       <w:pPr>
@@ -3502,11 +3844,13 @@
           <w:ilvl w:val="1"/>
           <w:numId w:val="48"/>
         </w:numPr>
+        <w:spacing w:before="0" w:after="0" w:line="276" w:lineRule="auto"/>
         <w:rPr>
           <w:rFonts w:ascii="Times New Roman" w:hAnsi="Times New Roman" w:cs="Times New Roman"/>
           <w:b/>
           <w:bCs/>
           <w:color w:val="000000" w:themeColor="text1"/>
+          <w:highlight w:val="green"/>
         </w:rPr>
       </w:pPr>
       <w:bookmarkStart w:id="13" w:name="_Toc223650209"/>
@@ -3516,6 +3860,7 @@
           <w:b/>
           <w:bCs/>
           <w:color w:val="000000" w:themeColor="text1"/>
+          <w:highlight w:val="green"/>
         </w:rPr>
         <w:t>Module Implementation</w:t>
       </w:r>
@@ -3526,13 +3871,26 @@
           <w:b/>
           <w:bCs/>
           <w:color w:val="000000" w:themeColor="text1"/>
+          <w:highlight w:val="green"/>
         </w:rPr>
         <w:t xml:space="preserve"> </w:t>
       </w:r>
     </w:p>
     <w:p>
       <w:r>
-        <w:t>This section describes how the main functional modules of the Peer Tutoring Platform were implemented across the stack. Each module maps directly to MongoDB collections and is exposed through REST API endpoints for app features. Where real-time updates were required, Socket.io events were used alongside persistent database storage to ensure reliability.</w:t>
+        <w:t xml:space="preserve">This section describes how the main functional modules of Peer Tutoring Platform were implemented across the stack. Each module maps directly to MongoDB collections and is exposed through REST API endpoints for app features. Socket.io events were used alongside persistent database storage </w:t>
+      </w:r>
+      <w:r>
+        <w:t>w</w:t>
+      </w:r>
+      <w:r>
+        <w:t>here live updates were required</w:t>
+      </w:r>
+      <w:r>
+        <w:t xml:space="preserve"> </w:t>
+      </w:r>
+      <w:r>
+        <w:t>to ensure reliability.</w:t>
       </w:r>
     </w:p>
     <w:p/>
@@ -3543,6 +3901,7 @@
           <w:ilvl w:val="2"/>
           <w:numId w:val="48"/>
         </w:numPr>
+        <w:spacing w:before="0" w:after="0" w:line="276" w:lineRule="auto"/>
         <w:rPr>
           <w:b/>
           <w:bCs/>
@@ -3569,13 +3928,51 @@
         <w:jc w:val="both"/>
       </w:pPr>
       <w:r>
-        <w:t>Authentication was implemented using email/password login and JSON Web Tokens. During registration, user credentials are validated server-</w:t>
-      </w:r>
-      <w:r>
-        <w:t>side,</w:t>
-      </w:r>
-      <w:r>
-        <w:t xml:space="preserve"> and the password is stored as a salted hash. On successful login, the backend issues a signed JSON Web Token which the client stores and includes in the corresponding header for protected requests. The middleware verifies the token on protected routes and extracts the user ID to enforce access control. Role-based checks were applied for administrator-only endpoints. This approach ensures that only authenticated users can access restricted resources such as messaging, meeting scheduling, profile updates.</w:t>
+        <w:t>Authentication was implemented using email</w:t>
+      </w:r>
+      <w:r>
+        <w:t xml:space="preserve"> and </w:t>
+      </w:r>
+      <w:r>
+        <w:t xml:space="preserve">password login </w:t>
+      </w:r>
+      <w:r>
+        <w:t xml:space="preserve">with the help of </w:t>
+      </w:r>
+      <w:r>
+        <w:t>JSON Web Tokens</w:t>
+      </w:r>
+      <w:r>
+        <w:t xml:space="preserve"> used for authentication</w:t>
+      </w:r>
+      <w:r>
+        <w:t>. During registration, user credentials are validated server-</w:t>
+      </w:r>
+      <w:proofErr w:type="gramStart"/>
+      <w:r>
+        <w:t>side</w:t>
+      </w:r>
+      <w:proofErr w:type="gramEnd"/>
+      <w:r>
+        <w:t xml:space="preserve"> </w:t>
+      </w:r>
+      <w:r>
+        <w:t>and the password is stored as a salted hash. On successful login</w:t>
+      </w:r>
+      <w:r>
+        <w:t xml:space="preserve"> only</w:t>
+      </w:r>
+      <w:r>
+        <w:t xml:space="preserve">, the backend issues a signed JSON Web Token which the client stores and includes in the corresponding header for protected requests. The middleware verifies the token on protected routes and extracts the user </w:t>
+      </w:r>
+      <w:r>
+        <w:rPr>
+          <w:highlight w:val="yellow"/>
+        </w:rPr>
+        <w:t>ID</w:t>
+      </w:r>
+      <w:r>
+        <w:t xml:space="preserve"> to enforce access control. This approach ensures that only authenticated users can access restricted resources such as messaging, meeting scheduling, profile updates.</w:t>
       </w:r>
     </w:p>
     <w:p/>
@@ -3586,6 +3983,7 @@
           <w:ilvl w:val="2"/>
           <w:numId w:val="48"/>
         </w:numPr>
+        <w:spacing w:before="0" w:after="0" w:line="276" w:lineRule="auto"/>
         <w:rPr>
           <w:b/>
           <w:bCs/>
@@ -3603,6 +4001,7 @@
           <w:sz w:val="32"/>
           <w:szCs w:val="32"/>
         </w:rPr>
+        <w:lastRenderedPageBreak/>
         <w:t>User Profiles and Points System</w:t>
       </w:r>
       <w:bookmarkEnd w:id="15"/>
@@ -3615,7 +4014,19 @@
         <w:t xml:space="preserve">User profile data is stored in the </w:t>
       </w:r>
       <w:r>
-        <w:t xml:space="preserve">corresponding collection and includes core identity fields such as name and email, engagement fields. Profile update endpoints validate allowed fields to prevent unintended edits. The points system updates after defined actions. Points are computed server-side to prevent client-side manipulation and all updates </w:t>
+        <w:t xml:space="preserve">corresponding collection and includes core identity fields such as name and email, </w:t>
+      </w:r>
+      <w:r>
+        <w:t>profile fields and user background</w:t>
+      </w:r>
+      <w:r>
+        <w:t xml:space="preserve">. Profile update endpoints validate allowed fields to prevent unintended edits. The points system updates after </w:t>
+      </w:r>
+      <w:r>
+        <w:t>making each successful meeting session</w:t>
+      </w:r>
+      <w:r>
+        <w:t xml:space="preserve">. Points are computed server-side to prevent manipulation and all updates </w:t>
       </w:r>
       <w:r>
         <w:t>persisted</w:t>
@@ -3632,6 +4043,7 @@
           <w:ilvl w:val="2"/>
           <w:numId w:val="48"/>
         </w:numPr>
+        <w:spacing w:before="0" w:after="0" w:line="276" w:lineRule="auto"/>
         <w:rPr>
           <w:b/>
           <w:bCs/>
@@ -3658,7 +4070,19 @@
         <w:jc w:val="both"/>
       </w:pPr>
       <w:r>
-        <w:t>The post module allows students to create tutoring requests or supports posts. Posts are stored in the corresponding collection with references to the author and timestamps. Users can comment on posts with comments stored as a separate collection with references to post and author. This functionality prevents duplicate likes by tracking user IDs who liked the post.</w:t>
+        <w:t>The post module allows students to create tutoring requests. Posts are stored in the corresponding collection with references to the author</w:t>
+      </w:r>
+      <w:r>
+        <w:t xml:space="preserve">, content, </w:t>
+      </w:r>
+      <w:r>
+        <w:t>timestamps</w:t>
+      </w:r>
+      <w:r>
+        <w:t>, statistics of post engagement</w:t>
+      </w:r>
+      <w:r>
+        <w:t>. Users can comment on posts with comments stored as a separate collection with references to post and author. This functionality prevents duplicate likes by tracking user IDs who liked the post.</w:t>
       </w:r>
     </w:p>
     <w:p/>
@@ -3669,6 +4093,7 @@
           <w:ilvl w:val="2"/>
           <w:numId w:val="48"/>
         </w:numPr>
+        <w:spacing w:before="0" w:after="0" w:line="276" w:lineRule="auto"/>
         <w:rPr>
           <w:b/>
           <w:bCs/>
@@ -3695,11 +4120,22 @@
         <w:jc w:val="both"/>
       </w:pPr>
       <w:r>
-        <w:t xml:space="preserve">Real-time messaging was implemented using Socket.io to support instant communication between peers. Conversations are represented using a corresponding collection while messages are stored </w:t>
-      </w:r>
-      <w:r>
-        <w:lastRenderedPageBreak/>
-        <w:t xml:space="preserve">in messages collection, where content and timestamp are stored. When a user sends a message, it is first validated and saved to MongoDB, then emitted to the recipient via Socket.io. </w:t>
+        <w:t>Live</w:t>
+      </w:r>
+      <w:r>
+        <w:t xml:space="preserve"> messaging was </w:t>
+      </w:r>
+      <w:r>
+        <w:t>built</w:t>
+      </w:r>
+      <w:r>
+        <w:t xml:space="preserve"> using Socket.io to support instant communication between peers. Conversations are represented using a corresponding collection while messages are stored in messages collection, where content and timestamp are stored. When a user sends a message, it is first validated and saved to MongoDB, then emitted to the </w:t>
+      </w:r>
+      <w:r>
+        <w:t>receiver</w:t>
+      </w:r>
+      <w:r>
+        <w:t xml:space="preserve"> via Socket.io. </w:t>
       </w:r>
     </w:p>
     <w:p/>
@@ -3710,6 +4146,7 @@
           <w:ilvl w:val="2"/>
           <w:numId w:val="48"/>
         </w:numPr>
+        <w:spacing w:before="0" w:after="0" w:line="276" w:lineRule="auto"/>
         <w:rPr>
           <w:b/>
           <w:bCs/>
@@ -3736,7 +4173,13 @@
         <w:jc w:val="both"/>
       </w:pPr>
       <w:r>
-        <w:t>The scheduling module allows users to create and manage tutoring sessions. Meetings are stored in a corresponding collection with fields such as time and date. The backend validates date/time inputs and prevents invalid scheduling states. When a meeting is confirmed or completed, notifications are triggered and stored, meeting completion enables rating submission. This ensures evaluation of platform usage.</w:t>
+        <w:t>The scheduling module allows users to create and manage tutoring sessions. Meetings are stored in a corresponding collection with fields such as time and date</w:t>
+      </w:r>
+      <w:r>
+        <w:t>, points allocated, points give, description, status, comment</w:t>
+      </w:r>
+      <w:r>
+        <w:t>. The backend validates date/time inputs and prevents invalid scheduling states. When a meeting is confirmed or completed, notifications are triggered and stored, meeting completion enables rating submission. This ensures evaluation of platform usage.</w:t>
       </w:r>
     </w:p>
     <w:p/>
@@ -3747,6 +4190,7 @@
           <w:ilvl w:val="2"/>
           <w:numId w:val="48"/>
         </w:numPr>
+        <w:spacing w:before="0" w:after="0" w:line="276" w:lineRule="auto"/>
         <w:rPr>
           <w:b/>
           <w:bCs/>
@@ -3773,7 +4217,13 @@
         <w:jc w:val="both"/>
       </w:pPr>
       <w:r>
-        <w:t xml:space="preserve">Notifications were implemented as a combination of persisted records and optional real-time delivery. Notification items are stored in a corresponding collection and linked to a target user. For time-sensitive events such as new messages, meeting acceptance, Socket.io emits notification updates instantly, while </w:t>
+        <w:t xml:space="preserve">Notification items are stored in a corresponding collection and linked to a target user. For time-sensitive events such as new messages, meeting acceptance, </w:t>
+      </w:r>
+      <w:r>
+        <w:t xml:space="preserve">friend requests, </w:t>
+      </w:r>
+      <w:r>
+        <w:t xml:space="preserve">Socket.io emits notification updates instantly, while </w:t>
       </w:r>
       <w:r>
         <w:rPr>
@@ -3793,6 +4243,7 @@
           <w:ilvl w:val="2"/>
           <w:numId w:val="48"/>
         </w:numPr>
+        <w:spacing w:before="0" w:after="0" w:line="276" w:lineRule="auto"/>
         <w:rPr>
           <w:b/>
           <w:bCs/>
@@ -3801,7 +4252,6 @@
           <w:szCs w:val="32"/>
         </w:rPr>
       </w:pPr>
-      <w:bookmarkStart w:id="20" w:name="_Toc223650216"/>
       <w:r>
         <w:rPr>
           <w:b/>
@@ -3810,18 +4260,7 @@
           <w:sz w:val="32"/>
           <w:szCs w:val="32"/>
         </w:rPr>
-        <w:t>Rating</w:t>
-      </w:r>
-      <w:bookmarkEnd w:id="20"/>
-      <w:r>
-        <w:rPr>
-          <w:b/>
-          <w:bCs/>
-          <w:color w:val="000000" w:themeColor="text1"/>
-          <w:sz w:val="32"/>
-          <w:szCs w:val="32"/>
-        </w:rPr>
-        <w:t xml:space="preserve"> </w:t>
+        <w:t>Reports</w:t>
       </w:r>
     </w:p>
     <w:p>
@@ -3829,13 +4268,7 @@
         <w:jc w:val="both"/>
       </w:pPr>
       <w:r>
-        <w:t xml:space="preserve">After a tutoring session is completed, users can submit a ratting from zero to five. Ratings are stored in a collection linked to </w:t>
-      </w:r>
-      <w:r>
-        <w:t>the id of a meeting. The</w:t>
-      </w:r>
-      <w:r>
-        <w:t xml:space="preserve"> backend enforces rules that only participants of a completed meeting may rate and prevents duplicate ratings for the same meeting. The system recalculates a rating to keep user profiles consistent. Such metrics support trust binding on the platform among students.</w:t>
+        <w:t>The reporting module represents all content that is displayed to an administrator. It is collected with flagged messages, reported profiles and posts containing inappropriate content that was monitored by users. The fields that are stored in the corresponding collection are reporter name, report type, reason, status and timestamp.</w:t>
       </w:r>
     </w:p>
     <w:p>
@@ -3850,6 +4283,7 @@
           <w:ilvl w:val="1"/>
           <w:numId w:val="48"/>
         </w:numPr>
+        <w:spacing w:before="0" w:after="0"/>
         <w:rPr>
           <w:rFonts w:ascii="Times New Roman" w:hAnsi="Times New Roman" w:cs="Times New Roman"/>
           <w:b/>
@@ -3880,6 +4314,7 @@
           <w:ilvl w:val="1"/>
           <w:numId w:val="48"/>
         </w:numPr>
+        <w:spacing w:before="0" w:after="0"/>
         <w:rPr>
           <w:rFonts w:ascii="Times New Roman" w:hAnsi="Times New Roman" w:cs="Times New Roman"/>
           <w:b/>
@@ -3914,6 +4349,7 @@
           <w:ilvl w:val="1"/>
           <w:numId w:val="48"/>
         </w:numPr>
+        <w:spacing w:before="0" w:after="0"/>
         <w:rPr>
           <w:rFonts w:ascii="Times New Roman" w:hAnsi="Times New Roman" w:cs="Times New Roman"/>
           <w:b/>
@@ -3930,6 +4366,7 @@
           <w:color w:val="000000" w:themeColor="text1"/>
           <w:highlight w:val="red"/>
         </w:rPr>
+        <w:lastRenderedPageBreak/>
         <w:t xml:space="preserve">Frontend Implementation </w:t>
       </w:r>
     </w:p>
@@ -3948,6 +4385,7 @@
           <w:ilvl w:val="1"/>
           <w:numId w:val="48"/>
         </w:numPr>
+        <w:spacing w:before="0" w:after="0"/>
         <w:rPr>
           <w:rFonts w:ascii="Times New Roman" w:hAnsi="Times New Roman" w:cs="Times New Roman"/>
           <w:b/>
@@ -3982,6 +4420,7 @@
           <w:ilvl w:val="0"/>
           <w:numId w:val="48"/>
         </w:numPr>
+        <w:spacing w:before="0" w:after="0"/>
         <w:rPr>
           <w:rFonts w:ascii="Times New Roman" w:hAnsi="Times New Roman" w:cs="Times New Roman"/>
           <w:b/>
@@ -4012,6 +4451,7 @@
           <w:ilvl w:val="0"/>
           <w:numId w:val="48"/>
         </w:numPr>
+        <w:spacing w:before="0" w:after="0" w:line="276" w:lineRule="auto"/>
         <w:rPr>
           <w:rFonts w:ascii="Times New Roman" w:hAnsi="Times New Roman" w:cs="Times New Roman"/>
           <w:b/>
@@ -4030,7 +4470,6 @@
           <w:sz w:val="32"/>
           <w:szCs w:val="32"/>
         </w:rPr>
-        <w:lastRenderedPageBreak/>
         <w:t>Pro</w:t>
       </w:r>
       <w:r>
@@ -4052,6 +4491,7 @@
           <w:ilvl w:val="1"/>
           <w:numId w:val="48"/>
         </w:numPr>
+        <w:spacing w:before="0" w:after="0" w:line="276" w:lineRule="auto"/>
         <w:rPr>
           <w:rFonts w:ascii="Times New Roman" w:hAnsi="Times New Roman" w:cs="Times New Roman"/>
           <w:b/>
@@ -4069,87 +4509,915 @@
         <w:t>Problems Encountered and Resolutions</w:t>
       </w:r>
     </w:p>
-    <w:p/>
     <w:p>
-      <w:r>
-        <w:t>During the development of the Peer Tutoring Platform, several technical and design-related problems were encountered. These issues affected implementation speed, system reliability, the scope of some features. Each problem required either a technical resolution or a design adjustment.</w:t>
+      <w:pPr>
+        <w:pStyle w:val="BodyText"/>
+        <w:jc w:val="both"/>
+        <w:rPr>
+          <w:rFonts w:ascii="Times New Roman" w:hAnsi="Times New Roman" w:cs="Times New Roman"/>
+        </w:rPr>
+      </w:pPr>
+      <w:r>
+        <w:rPr>
+          <w:rFonts w:ascii="Times New Roman" w:hAnsi="Times New Roman" w:cs="Times New Roman"/>
+        </w:rPr>
+        <w:t>While developing Peer Tutoring Platform, several technical and design-related issues were faced</w:t>
+      </w:r>
+      <w:r>
+        <w:rPr>
+          <w:rFonts w:ascii="Times New Roman" w:hAnsi="Times New Roman" w:cs="Times New Roman"/>
+        </w:rPr>
+        <w:t xml:space="preserve"> during the project timeline</w:t>
+      </w:r>
+      <w:r>
+        <w:rPr>
+          <w:rFonts w:ascii="Times New Roman" w:hAnsi="Times New Roman" w:cs="Times New Roman"/>
+        </w:rPr>
+        <w:t xml:space="preserve">. Each problem required either a technical resolution or a design change. One of the major challenges was to implement secure authentication and maintaining user sessions across secured routes. At an early stage, there were problems where authenticated users were not always identified after page refreshes. This </w:t>
+      </w:r>
+      <w:r>
+        <w:rPr>
+          <w:rFonts w:ascii="Times New Roman" w:hAnsi="Times New Roman" w:cs="Times New Roman"/>
+        </w:rPr>
+        <w:t>error was persistent</w:t>
+      </w:r>
+      <w:r>
+        <w:rPr>
+          <w:rFonts w:ascii="Times New Roman" w:hAnsi="Times New Roman" w:cs="Times New Roman"/>
+        </w:rPr>
+        <w:t xml:space="preserve"> because of </w:t>
+      </w:r>
+      <w:r>
+        <w:rPr>
+          <w:rFonts w:ascii="Times New Roman" w:hAnsi="Times New Roman" w:cs="Times New Roman"/>
+        </w:rPr>
+        <w:t xml:space="preserve">the previously implemented logic of </w:t>
+      </w:r>
+      <w:r>
+        <w:rPr>
+          <w:rFonts w:ascii="Times New Roman" w:hAnsi="Times New Roman" w:cs="Times New Roman"/>
+        </w:rPr>
+        <w:t xml:space="preserve">token handling between the frontend and the backend not being fully standardized. The issue was solved by adding consistent </w:t>
+      </w:r>
+      <w:r>
+        <w:rPr>
+          <w:rFonts w:ascii="Times New Roman" w:hAnsi="Times New Roman" w:cs="Times New Roman"/>
+          <w:highlight w:val="yellow"/>
+        </w:rPr>
+        <w:t>JWT</w:t>
+      </w:r>
+      <w:r>
+        <w:rPr>
+          <w:rFonts w:ascii="Times New Roman" w:hAnsi="Times New Roman" w:cs="Times New Roman"/>
+        </w:rPr>
+        <w:t xml:space="preserve"> verification middleware on the backend and making sure that the client sent the token to the correct authorization header for all protected </w:t>
+      </w:r>
+      <w:r>
+        <w:rPr>
+          <w:rFonts w:ascii="Times New Roman" w:hAnsi="Times New Roman" w:cs="Times New Roman"/>
+          <w:highlight w:val="yellow"/>
+        </w:rPr>
+        <w:t>API</w:t>
+      </w:r>
+      <w:r>
+        <w:rPr>
+          <w:rFonts w:ascii="Times New Roman" w:hAnsi="Times New Roman" w:cs="Times New Roman"/>
+        </w:rPr>
+        <w:t xml:space="preserve"> requests. </w:t>
       </w:r>
     </w:p>
     <w:p>
-      <w:r>
-        <w:t>One of the main challenges involved implementing secure authentication and maintaining user sessions across protected routes. At an early stage, issues occurred where authenticated users were not consistently recognized after page refreshes. This happened because token handling between the frontend and backend had not been fully standardized. The problem was resolved by introducing consistent JWT verification middleware on the backend and ensuring that the client attached the token in the correct authorization header for all protected API requests.</w:t>
+      <w:pPr>
+        <w:pStyle w:val="BodyText"/>
+        <w:jc w:val="both"/>
+        <w:rPr>
+          <w:rFonts w:ascii="Times New Roman" w:hAnsi="Times New Roman" w:cs="Times New Roman"/>
+        </w:rPr>
+      </w:pPr>
+      <w:r>
+        <w:rPr>
+          <w:rFonts w:ascii="Times New Roman" w:hAnsi="Times New Roman" w:cs="Times New Roman"/>
+        </w:rPr>
+        <w:t xml:space="preserve">Another challenge </w:t>
+      </w:r>
+      <w:r>
+        <w:rPr>
+          <w:rFonts w:ascii="Times New Roman" w:hAnsi="Times New Roman" w:cs="Times New Roman"/>
+        </w:rPr>
+        <w:t xml:space="preserve">that as faced - </w:t>
+      </w:r>
+      <w:r>
+        <w:rPr>
+          <w:rFonts w:ascii="Times New Roman" w:hAnsi="Times New Roman" w:cs="Times New Roman"/>
+        </w:rPr>
+        <w:t>messaging</w:t>
+      </w:r>
+      <w:r>
+        <w:rPr>
+          <w:rFonts w:ascii="Times New Roman" w:hAnsi="Times New Roman" w:cs="Times New Roman"/>
+        </w:rPr>
+        <w:t xml:space="preserve"> in real time</w:t>
+      </w:r>
+      <w:r>
+        <w:rPr>
+          <w:rFonts w:ascii="Times New Roman" w:hAnsi="Times New Roman" w:cs="Times New Roman"/>
+        </w:rPr>
+        <w:t xml:space="preserve">. Socket-based communication worked in simple tests, but there </w:t>
+      </w:r>
+      <w:r>
+        <w:rPr>
+          <w:rFonts w:ascii="Times New Roman" w:hAnsi="Times New Roman" w:cs="Times New Roman"/>
+        </w:rPr>
+        <w:t xml:space="preserve">was a difficulty in </w:t>
+      </w:r>
+      <w:r>
+        <w:rPr>
+          <w:rFonts w:ascii="Times New Roman" w:hAnsi="Times New Roman" w:cs="Times New Roman"/>
+        </w:rPr>
+        <w:t xml:space="preserve">trying to ensure that messages were both delivered immediately and stored reliably. There was a risk that a message could be displayed in the interface without being safely persisted in the database. To troubleshoot the message flow was redesigned such that messages were validated </w:t>
+      </w:r>
+      <w:r>
+        <w:rPr>
+          <w:rFonts w:ascii="Times New Roman" w:hAnsi="Times New Roman" w:cs="Times New Roman"/>
+        </w:rPr>
+        <w:t xml:space="preserve">first </w:t>
+      </w:r>
+      <w:r>
+        <w:rPr>
+          <w:rFonts w:ascii="Times New Roman" w:hAnsi="Times New Roman" w:cs="Times New Roman"/>
+        </w:rPr>
+        <w:t xml:space="preserve">and </w:t>
+      </w:r>
+      <w:r>
+        <w:rPr>
+          <w:rFonts w:ascii="Times New Roman" w:hAnsi="Times New Roman" w:cs="Times New Roman"/>
+        </w:rPr>
+        <w:t xml:space="preserve">then </w:t>
+      </w:r>
+      <w:r>
+        <w:rPr>
+          <w:rFonts w:ascii="Times New Roman" w:hAnsi="Times New Roman" w:cs="Times New Roman"/>
+        </w:rPr>
+        <w:t xml:space="preserve">stored in MongoDB before being emitted through Socket.io. </w:t>
       </w:r>
     </w:p>
     <w:p>
-      <w:r>
-        <w:t xml:space="preserve">Another challenge involved real-time messaging. Socket-based communication worked in simple tests, but problems appeared when trying to ensure that messages were both delivered instantly and stored reliably. There was a risk that a message could appear in the interface without being safely persisted in the database. To </w:t>
-      </w:r>
-      <w:r>
-        <w:t>troubleshoot that, the message flow was redesigned so that messages were first validated and stored in MongoDB before being emitted through Socket.io.</w:t>
+      <w:pPr>
+        <w:pStyle w:val="BodyText"/>
+        <w:jc w:val="both"/>
+        <w:rPr>
+          <w:rFonts w:ascii="Times New Roman" w:hAnsi="Times New Roman" w:cs="Times New Roman"/>
+        </w:rPr>
+      </w:pPr>
+      <w:r>
+        <w:rPr>
+          <w:rFonts w:ascii="Times New Roman" w:hAnsi="Times New Roman" w:cs="Times New Roman"/>
+        </w:rPr>
+        <w:t>In addition, there was another problem that</w:t>
+      </w:r>
+      <w:r>
+        <w:rPr>
+          <w:rFonts w:ascii="Times New Roman" w:hAnsi="Times New Roman" w:cs="Times New Roman"/>
+        </w:rPr>
+        <w:t xml:space="preserve"> arose with the scheduling and meeting workflow. Data and time values entered from the frontend were not always managed and could lead to invalid meeting records or incorrect display formatting. This was </w:t>
+      </w:r>
+      <w:r>
+        <w:rPr>
+          <w:rFonts w:ascii="Times New Roman" w:hAnsi="Times New Roman" w:cs="Times New Roman"/>
+        </w:rPr>
+        <w:t>fixed</w:t>
+      </w:r>
+      <w:r>
+        <w:rPr>
+          <w:rFonts w:ascii="Times New Roman" w:hAnsi="Times New Roman" w:cs="Times New Roman"/>
+        </w:rPr>
+        <w:t xml:space="preserve"> by standardizing how date and time values were handled between frontend forms and </w:t>
+      </w:r>
+      <w:r>
+        <w:rPr>
+          <w:rFonts w:ascii="Times New Roman" w:hAnsi="Times New Roman" w:cs="Times New Roman"/>
+        </w:rPr>
+        <w:t xml:space="preserve">the </w:t>
+      </w:r>
+      <w:r>
+        <w:rPr>
+          <w:rFonts w:ascii="Times New Roman" w:hAnsi="Times New Roman" w:cs="Times New Roman"/>
+        </w:rPr>
+        <w:t xml:space="preserve">backend. The points and rating functionality also brought complexity. It was necessary to ensure that users </w:t>
+      </w:r>
+      <w:r>
+        <w:rPr>
+          <w:rFonts w:ascii="Times New Roman" w:hAnsi="Times New Roman" w:cs="Times New Roman"/>
+        </w:rPr>
+        <w:t>were not given such opportunity to</w:t>
+      </w:r>
+      <w:r>
+        <w:rPr>
+          <w:rFonts w:ascii="Times New Roman" w:hAnsi="Times New Roman" w:cs="Times New Roman"/>
+        </w:rPr>
+        <w:t xml:space="preserve"> submit duplicate ratings or to manipulate scores by making repeated requests. This was fixed by implementing backend validation rules, associating ratings with completed meetings, recalculating values</w:t>
+      </w:r>
+      <w:r>
+        <w:rPr>
+          <w:rFonts w:ascii="Times New Roman" w:hAnsi="Times New Roman" w:cs="Times New Roman"/>
+        </w:rPr>
+        <w:t xml:space="preserve"> server-side</w:t>
+      </w:r>
+      <w:r>
+        <w:rPr>
+          <w:rFonts w:ascii="Times New Roman" w:hAnsi="Times New Roman" w:cs="Times New Roman"/>
+        </w:rPr>
+        <w:t xml:space="preserve">. </w:t>
       </w:r>
     </w:p>
     <w:p>
-      <w:r>
-        <w:t>A further issue arose in the scheduling and meeting workflow. Data and time values submitted from the frontend were not always handled consistently, which created the possibility of invalid meeting records or incorrect display formatting. This was addressed by introducing stricter backend validation and by standardizing how date and time values were handled between frontend forms and backend storage.</w:t>
-      </w:r>
-      <w:r>
-        <w:br/>
-        <w:t>The points and rating functionality also introduced some complexity. It was necessary to ensure that users could not submit duplicate ratings or manipulate scores through repeated requests. This was resolved by enforcing backend validation rules, linking ratings to completed meetings, recalculating values server-side rather than relying on client-side updates.</w:t>
+      <w:pPr>
+        <w:pStyle w:val="BodyText"/>
+        <w:jc w:val="both"/>
+        <w:rPr>
+          <w:rFonts w:ascii="Times New Roman" w:hAnsi="Times New Roman" w:cs="Times New Roman"/>
+        </w:rPr>
+      </w:pPr>
+      <w:r>
+        <w:rPr>
+          <w:rFonts w:ascii="Times New Roman" w:hAnsi="Times New Roman" w:cs="Times New Roman"/>
+        </w:rPr>
+        <w:t xml:space="preserve">There were general integration obstacles throughout the </w:t>
+      </w:r>
+      <w:r>
+        <w:rPr>
+          <w:rFonts w:ascii="Times New Roman" w:hAnsi="Times New Roman" w:cs="Times New Roman"/>
+        </w:rPr>
+        <w:t>technol</w:t>
+      </w:r>
+      <w:r>
+        <w:rPr>
+          <w:rFonts w:ascii="Times New Roman" w:hAnsi="Times New Roman" w:cs="Times New Roman"/>
+        </w:rPr>
+        <w:t>ogy</w:t>
+      </w:r>
+      <w:r>
+        <w:rPr>
+          <w:rFonts w:ascii="Times New Roman" w:hAnsi="Times New Roman" w:cs="Times New Roman"/>
+        </w:rPr>
+        <w:t xml:space="preserve"> stack. Matching frontend state, backend responses</w:t>
+      </w:r>
+      <w:r>
+        <w:rPr>
+          <w:rFonts w:ascii="Times New Roman" w:hAnsi="Times New Roman" w:cs="Times New Roman"/>
+        </w:rPr>
+        <w:t xml:space="preserve"> </w:t>
+      </w:r>
+      <w:r>
+        <w:rPr>
+          <w:rFonts w:ascii="Times New Roman" w:hAnsi="Times New Roman" w:cs="Times New Roman"/>
+        </w:rPr>
+        <w:t xml:space="preserve">and MongoDB structures required multiple rounds of testing and debugging. Some endpoints initially returned inconsistent response formats, which caused rendering issues in the React frontend. These problems were fixed by refactoring route handlers to make returned data structures predictable and easier to </w:t>
+      </w:r>
+      <w:r>
+        <w:rPr>
+          <w:rFonts w:ascii="Times New Roman" w:hAnsi="Times New Roman" w:cs="Times New Roman"/>
+        </w:rPr>
+        <w:t>render</w:t>
+      </w:r>
+      <w:r>
+        <w:rPr>
+          <w:rFonts w:ascii="Times New Roman" w:hAnsi="Times New Roman" w:cs="Times New Roman"/>
+        </w:rPr>
+        <w:t xml:space="preserve"> in the client application. </w:t>
       </w:r>
     </w:p>
     <w:p>
-      <w:r>
-        <w:t>There were also general integration challenges across the MERN stack. Keeping frontend state, backend responses, MongoDB data structures aligned required repeated testing and debugging. Some endpoints initially returned inconsistent response formats, which caused rendering issues in the React frontend. These issues were resolved by refactoring route handlers so that returned data structures remained predictable and easier to consume in the client application.</w:t>
-      </w:r>
-      <w:r>
-        <w:br/>
-        <w:t>To conclude, the main pattern across the process was that most problems were not caused by a single technology, but by the interaction between multiple layers of the system. Resolving these issues improved reliability and consistency of the project.</w:t>
+      <w:pPr>
+        <w:pStyle w:val="BodyText"/>
+        <w:jc w:val="both"/>
+        <w:rPr>
+          <w:rFonts w:ascii="Times New Roman" w:hAnsi="Times New Roman" w:cs="Times New Roman"/>
+        </w:rPr>
+      </w:pPr>
+      <w:r>
+        <w:rPr>
+          <w:rFonts w:ascii="Times New Roman" w:hAnsi="Times New Roman" w:cs="Times New Roman"/>
+        </w:rPr>
+        <w:t>To conclude, most problems were not caused by a single technology</w:t>
+      </w:r>
+      <w:r>
+        <w:rPr>
+          <w:rFonts w:ascii="Times New Roman" w:hAnsi="Times New Roman" w:cs="Times New Roman"/>
+        </w:rPr>
+        <w:t xml:space="preserve"> rather than </w:t>
+      </w:r>
+      <w:r>
+        <w:rPr>
+          <w:rFonts w:ascii="Times New Roman" w:hAnsi="Times New Roman" w:cs="Times New Roman"/>
+        </w:rPr>
+        <w:t>the interaction between multiple layers of the system</w:t>
+      </w:r>
+      <w:r>
+        <w:rPr>
+          <w:rFonts w:ascii="Times New Roman" w:hAnsi="Times New Roman" w:cs="Times New Roman"/>
+        </w:rPr>
+        <w:t xml:space="preserve"> including frontend, backend, database and communication</w:t>
+      </w:r>
+      <w:r>
+        <w:rPr>
+          <w:rFonts w:ascii="Times New Roman" w:hAnsi="Times New Roman" w:cs="Times New Roman"/>
+        </w:rPr>
+        <w:t>. Fixing these issues made the project more reliable and consistent.</w:t>
       </w:r>
     </w:p>
     <w:p>
       <w:pPr>
+        <w:pStyle w:val="BodyText"/>
+      </w:pPr>
+    </w:p>
+    <w:p>
+      <w:pPr>
+        <w:pStyle w:val="Heading1"/>
+        <w:numPr>
+          <w:ilvl w:val="1"/>
+          <w:numId w:val="48"/>
+        </w:numPr>
+        <w:spacing w:before="0" w:after="0" w:line="276" w:lineRule="auto"/>
+        <w:rPr>
+          <w:rFonts w:ascii="Times New Roman" w:hAnsi="Times New Roman" w:cs="Times New Roman"/>
+          <w:b/>
+          <w:bCs/>
+          <w:color w:val="000000" w:themeColor="text1"/>
+          <w:sz w:val="32"/>
+          <w:szCs w:val="32"/>
+        </w:rPr>
+      </w:pPr>
+      <w:r>
+        <w:rPr>
+          <w:rFonts w:ascii="Times New Roman" w:hAnsi="Times New Roman" w:cs="Times New Roman"/>
+          <w:b/>
+          <w:bCs/>
+          <w:color w:val="000000" w:themeColor="text1"/>
+          <w:sz w:val="32"/>
+          <w:szCs w:val="32"/>
+        </w:rPr>
+        <w:lastRenderedPageBreak/>
+        <w:t>What was achieved</w:t>
+      </w:r>
+    </w:p>
+    <w:p>
+      <w:pPr>
         <w:jc w:val="both"/>
       </w:pPr>
+      <w:r>
+        <w:t xml:space="preserve">Peer Tutoring Platform achieved </w:t>
+      </w:r>
+      <w:r>
+        <w:t>all</w:t>
+      </w:r>
+      <w:r>
+        <w:t xml:space="preserve"> core objectives that were defined for this project. A working full-stack application was created using MERN stack with support for live communication through Socket.io. The platform provides several features for students </w:t>
+      </w:r>
+      <w:r>
+        <w:t>such as</w:t>
+      </w:r>
+      <w:r>
+        <w:t xml:space="preserve"> seeking academic assistance, communicating with peers, scheduling tutoring sessions, gamification. </w:t>
+      </w:r>
+    </w:p>
+    <w:p>
+      <w:pPr>
+        <w:jc w:val="both"/>
+      </w:pPr>
+    </w:p>
+    <w:p>
+      <w:pPr>
+        <w:jc w:val="both"/>
+      </w:pPr>
+      <w:r>
+        <w:t xml:space="preserve">A complete authentication and authorization workflow was implemented into this project as well. Users </w:t>
+      </w:r>
+      <w:proofErr w:type="gramStart"/>
+      <w:r>
+        <w:t>are able to</w:t>
+      </w:r>
+      <w:proofErr w:type="gramEnd"/>
+      <w:r>
+        <w:t xml:space="preserve"> register, log in securely and access protected areas of the system through JSON Web Token authentication. Similar approach was also introduced for administrators. </w:t>
+      </w:r>
+    </w:p>
+    <w:p>
+      <w:pPr>
+        <w:jc w:val="both"/>
+      </w:pPr>
+    </w:p>
+    <w:p>
+      <w:pPr>
+        <w:jc w:val="both"/>
+      </w:pPr>
+      <w:r>
+        <w:t xml:space="preserve">A real-time messaging feature was </w:t>
+      </w:r>
+      <w:r>
+        <w:t>implemented</w:t>
+      </w:r>
+      <w:r>
+        <w:t xml:space="preserve"> into the project </w:t>
+      </w:r>
+      <w:r>
+        <w:t>successfully</w:t>
+      </w:r>
+      <w:r>
+        <w:t xml:space="preserve">. Users </w:t>
+      </w:r>
+      <w:r>
+        <w:t>can</w:t>
+      </w:r>
+      <w:r>
+        <w:t xml:space="preserve"> send messages to their friends </w:t>
+      </w:r>
+      <w:r>
+        <w:t xml:space="preserve">instantly </w:t>
+      </w:r>
+      <w:r>
+        <w:t>with the help of</w:t>
+      </w:r>
+      <w:r>
+        <w:t xml:space="preserve"> Socket.io </w:t>
+      </w:r>
+      <w:r>
+        <w:t>while the content being</w:t>
+      </w:r>
+      <w:r>
+        <w:t xml:space="preserve"> stored in MongoDB. </w:t>
+      </w:r>
+    </w:p>
+    <w:p>
+      <w:pPr>
+        <w:jc w:val="both"/>
+      </w:pPr>
+    </w:p>
+    <w:p>
+      <w:pPr>
+        <w:jc w:val="both"/>
+      </w:pPr>
+      <w:r>
+        <w:t>The meeting and scheduling functionalities were also completed. Users can create and manage sessions using date and time</w:t>
+      </w:r>
+      <w:r>
+        <w:t>, points allocation</w:t>
+      </w:r>
+      <w:r>
+        <w:t>. Notifications connected to this feature were developed so that users could receive updates relating to new activity and follow-up actions such as rating sessions.</w:t>
+      </w:r>
+    </w:p>
+    <w:p>
+      <w:pPr>
+        <w:jc w:val="both"/>
+      </w:pPr>
+    </w:p>
+    <w:p>
+      <w:pPr>
+        <w:jc w:val="both"/>
+      </w:pPr>
+      <w:r>
+        <w:t xml:space="preserve">The project also achieved the implementation of rating and points system. Users </w:t>
+      </w:r>
+      <w:proofErr w:type="gramStart"/>
+      <w:r>
+        <w:t>are able to</w:t>
+      </w:r>
+      <w:proofErr w:type="gramEnd"/>
+      <w:r>
+        <w:t xml:space="preserve"> </w:t>
+      </w:r>
+      <w:r>
+        <w:t>rate</w:t>
+      </w:r>
+      <w:r>
+        <w:t xml:space="preserve"> sessions and </w:t>
+      </w:r>
+      <w:r>
+        <w:t xml:space="preserve">receive </w:t>
+      </w:r>
+      <w:r>
+        <w:t xml:space="preserve">points after each successful </w:t>
+      </w:r>
+      <w:r>
+        <w:t>meeting</w:t>
+      </w:r>
+      <w:r>
+        <w:t>. Thi</w:t>
+      </w:r>
+      <w:r>
+        <w:t>s approach introduced a gamification element into the project</w:t>
+      </w:r>
+      <w:r>
+        <w:t xml:space="preserve"> which encourages students to create more sessions through the system while collecting points and topping up their balance account</w:t>
+      </w:r>
+      <w:r>
+        <w:t xml:space="preserve">. </w:t>
+      </w:r>
+    </w:p>
+    <w:p>
+      <w:pPr>
+        <w:jc w:val="both"/>
+      </w:pPr>
+    </w:p>
+    <w:p>
+      <w:pPr>
+        <w:jc w:val="both"/>
+      </w:pPr>
+      <w:r>
+        <w:t xml:space="preserve">Administration features were also </w:t>
+      </w:r>
+      <w:r>
+        <w:t>integrated</w:t>
+      </w:r>
+      <w:r>
+        <w:t xml:space="preserve"> in</w:t>
+      </w:r>
+      <w:r>
+        <w:t>to</w:t>
+      </w:r>
+      <w:r>
+        <w:t xml:space="preserve"> the platform. </w:t>
+      </w:r>
+      <w:r>
+        <w:t>Moderators</w:t>
+      </w:r>
+      <w:r>
+        <w:t xml:space="preserve"> are provided with access to monitor user activity and content allowing inappropriate material to be </w:t>
+      </w:r>
+      <w:r>
+        <w:t>reviewed and managed accordingly</w:t>
+      </w:r>
+      <w:r>
+        <w:t>.</w:t>
+      </w:r>
+    </w:p>
+    <w:p>
+      <w:pPr>
+        <w:jc w:val="both"/>
+      </w:pPr>
+    </w:p>
+    <w:p>
+      <w:pPr>
+        <w:jc w:val="both"/>
+      </w:pPr>
+      <w:r>
+        <w:t xml:space="preserve">To conclude, the project achieved a </w:t>
+      </w:r>
+      <w:r>
+        <w:t xml:space="preserve">fully </w:t>
+      </w:r>
+      <w:r>
+        <w:t xml:space="preserve">functional system that meets all main goals and provides a working basis for future development.  </w:t>
+      </w:r>
     </w:p>
     <w:p/>
     <w:p>
       <w:pPr>
-        <w:pStyle w:val="Heading1"/>
+        <w:pStyle w:val="Heading2"/>
+        <w:numPr>
+          <w:ilvl w:val="1"/>
+          <w:numId w:val="48"/>
+        </w:numPr>
+        <w:spacing w:line="276" w:lineRule="auto"/>
         <w:rPr>
           <w:rFonts w:ascii="Times New Roman" w:hAnsi="Times New Roman" w:cs="Times New Roman"/>
-        </w:rPr>
-      </w:pPr>
-      <w:bookmarkStart w:id="21" w:name="_Toc223650217"/>
+          <w:b/>
+          <w:bCs/>
+        </w:rPr>
+      </w:pPr>
       <w:r>
         <w:rPr>
           <w:rFonts w:ascii="Times New Roman" w:hAnsi="Times New Roman" w:cs="Times New Roman"/>
-        </w:rPr>
-        <w:t>1</w:t>
-      </w:r>
-      <w:r>
-        <w:rPr>
-          <w:rFonts w:ascii="Times New Roman" w:hAnsi="Times New Roman" w:cs="Times New Roman"/>
-        </w:rPr>
-        <w:t>3</w:t>
-      </w:r>
-      <w:r>
-        <w:rPr>
-          <w:rFonts w:ascii="Times New Roman" w:hAnsi="Times New Roman" w:cs="Times New Roman"/>
-        </w:rPr>
+          <w:b/>
+          <w:bCs/>
+          <w:color w:val="000000" w:themeColor="text1"/>
+        </w:rPr>
+        <w:t>What was not achieved</w:t>
+      </w:r>
+    </w:p>
+    <w:p>
+      <w:r>
+        <w:t xml:space="preserve">While the project achieved implementing all functionalities that provide users to achieve their academic goals, however, there are </w:t>
+      </w:r>
+      <w:r>
+        <w:t xml:space="preserve">some features that were not implemented but could significantly boost the overall experience of using the platform. Those features can be considered for future work. </w:t>
+      </w:r>
+      <w:r>
+        <w:br/>
+        <w:t xml:space="preserve">One limitation of the final product is that deployment was not completed to full production scale with a polished environment equivalent to a commercial software level. The application architecture supports deployment, but the main emphasis of the project remained on </w:t>
+      </w:r>
+      <w:r>
+        <w:t>the</w:t>
+      </w:r>
+      <w:r>
         <w:t xml:space="preserve"> </w:t>
       </w:r>
-      <w:r>
-        <w:rPr>
-          <w:rFonts w:ascii="Times New Roman" w:hAnsi="Times New Roman" w:cs="Times New Roman"/>
-        </w:rPr>
-        <w:t>Reference List</w:t>
-      </w:r>
-      <w:bookmarkEnd w:id="21"/>
+      <w:proofErr w:type="gramStart"/>
+      <w:r>
+        <w:t>functionalit</w:t>
+      </w:r>
+      <w:r>
+        <w:t>ies</w:t>
+      </w:r>
+      <w:proofErr w:type="gramEnd"/>
+      <w:r>
+        <w:t xml:space="preserve"> integration</w:t>
+      </w:r>
+      <w:r>
+        <w:t xml:space="preserve"> part</w:t>
+      </w:r>
+      <w:r>
+        <w:t>.</w:t>
+      </w:r>
+    </w:p>
+    <w:p>
+      <w:pPr>
+        <w:jc w:val="both"/>
+      </w:pPr>
+      <w:r>
+        <w:t xml:space="preserve">In addition, there are areas of the user experience that could also be </w:t>
+      </w:r>
+      <w:r>
+        <w:t>improved</w:t>
+      </w:r>
+      <w:r>
+        <w:t>. Certain workflows could be refined with more advanced interface improvements making the product visually looking equivalent to its major competitors that already exist in the market. This would improve usability and reduce friction for students.</w:t>
+      </w:r>
+    </w:p>
+    <w:p>
+      <w:pPr>
+        <w:jc w:val="both"/>
+      </w:pPr>
+      <w:r>
+        <w:lastRenderedPageBreak/>
+        <w:t>The administration features were implemented providing only basic control over the system. The features could be extended further with more advanced moderation dashboards, analytics and more control tools.</w:t>
+      </w:r>
+    </w:p>
+    <w:p>
+      <w:pPr>
+        <w:jc w:val="both"/>
+      </w:pPr>
+      <w:r>
+        <w:t>Finally, t</w:t>
+      </w:r>
+      <w:r>
+        <w:t>he points and rating systems were completed functionally, but they could be supported with the aid of intervening Peer Mentoring Group into the project to bring the gamification part to a completely new level. Future implementations could include exchanging points for free student lunches or special awards for volunteering work, recommendation logic based on user behavior.</w:t>
+      </w:r>
     </w:p>
     <w:p/>
     <w:p>
       <w:pPr>
+        <w:pStyle w:val="Heading2"/>
+        <w:numPr>
+          <w:ilvl w:val="1"/>
+          <w:numId w:val="48"/>
+        </w:numPr>
+        <w:rPr>
+          <w:rFonts w:ascii="Times New Roman" w:hAnsi="Times New Roman" w:cs="Times New Roman"/>
+          <w:b/>
+          <w:bCs/>
+          <w:color w:val="000000" w:themeColor="text1"/>
+        </w:rPr>
+      </w:pPr>
+      <w:r>
+        <w:rPr>
+          <w:rFonts w:ascii="Times New Roman" w:hAnsi="Times New Roman" w:cs="Times New Roman"/>
+          <w:b/>
+          <w:bCs/>
+          <w:color w:val="000000" w:themeColor="text1"/>
+        </w:rPr>
+        <w:t>What was Learned</w:t>
+      </w:r>
+    </w:p>
+    <w:p>
+      <w:pPr>
+        <w:jc w:val="both"/>
+      </w:pPr>
+      <w:r>
+        <w:t>There were</w:t>
+      </w:r>
+      <w:r>
+        <w:t xml:space="preserve"> </w:t>
+      </w:r>
+      <w:r>
+        <w:t>numerous points</w:t>
+      </w:r>
+      <w:r>
+        <w:t xml:space="preserve"> during the project </w:t>
+      </w:r>
+      <w:r>
+        <w:t>at which</w:t>
+      </w:r>
+      <w:r>
+        <w:t xml:space="preserve"> the learning </w:t>
+      </w:r>
+      <w:r>
+        <w:t>process</w:t>
+      </w:r>
+      <w:r>
+        <w:t xml:space="preserve"> outweighed the </w:t>
+      </w:r>
+      <w:r>
+        <w:t xml:space="preserve">immediate </w:t>
+      </w:r>
+      <w:r>
+        <w:t>results</w:t>
+      </w:r>
+      <w:r>
+        <w:t xml:space="preserve">, as </w:t>
+      </w:r>
+      <w:r>
+        <w:t xml:space="preserve">building a complete software system requires more than </w:t>
+      </w:r>
+      <w:r>
+        <w:t xml:space="preserve">the </w:t>
+      </w:r>
+      <w:r>
+        <w:t>implementation</w:t>
+      </w:r>
+      <w:r>
+        <w:t xml:space="preserve"> of</w:t>
+      </w:r>
+      <w:r>
+        <w:t xml:space="preserve"> isolated features. The most </w:t>
+      </w:r>
+      <w:r>
+        <w:t>challenging</w:t>
+      </w:r>
+      <w:r>
+        <w:t xml:space="preserve"> part of the project was ensuring that all parts of the application worked together well across all layers</w:t>
+      </w:r>
+      <w:r>
+        <w:t>,</w:t>
+      </w:r>
+      <w:r>
+        <w:t xml:space="preserve"> including frontend, backend, database, authentication and real-time communication. </w:t>
+      </w:r>
+    </w:p>
+    <w:p>
+      <w:r>
+        <w:t xml:space="preserve">The project </w:t>
+      </w:r>
+      <w:r>
+        <w:t>substantially</w:t>
+      </w:r>
+      <w:r>
+        <w:t xml:space="preserve"> </w:t>
+      </w:r>
+      <w:r>
+        <w:t>improved the practical understanding of full-stack development</w:t>
+      </w:r>
+      <w:r>
+        <w:t xml:space="preserve"> process</w:t>
+      </w:r>
+      <w:r>
+        <w:t xml:space="preserve">. </w:t>
+      </w:r>
+      <w:r>
+        <w:t>Building</w:t>
+      </w:r>
+      <w:r>
+        <w:t xml:space="preserve"> REST APIs, securing routes </w:t>
+      </w:r>
+      <w:r>
+        <w:t>through</w:t>
+      </w:r>
+      <w:r>
+        <w:t xml:space="preserve"> JSON Web Token middleware, managing React state and designing MongoDB </w:t>
+      </w:r>
+      <w:r>
+        <w:t>schemas</w:t>
+      </w:r>
+      <w:r>
+        <w:t xml:space="preserve"> all complemented to </w:t>
+      </w:r>
+      <w:r>
+        <w:t>a deeper</w:t>
+      </w:r>
+      <w:r>
+        <w:t xml:space="preserve"> understanding of how full-stack applications </w:t>
+      </w:r>
+      <w:r>
+        <w:t>function in practice</w:t>
+      </w:r>
+      <w:r>
+        <w:t>.</w:t>
+      </w:r>
+      <w:r>
+        <w:br/>
+        <w:t xml:space="preserve">Another </w:t>
+      </w:r>
+      <w:r>
+        <w:t>significant</w:t>
+      </w:r>
+      <w:r>
+        <w:t xml:space="preserve"> lesson was the </w:t>
+      </w:r>
+      <w:r>
+        <w:t>importance</w:t>
+      </w:r>
+      <w:r>
+        <w:t xml:space="preserve"> of validation. There were points during the development stage when it became clear that client-side testing was </w:t>
+      </w:r>
+      <w:r>
+        <w:t>in</w:t>
+      </w:r>
+      <w:r>
+        <w:t xml:space="preserve">sufficient. </w:t>
+      </w:r>
+      <w:r>
+        <w:t>As a result, a</w:t>
+      </w:r>
+      <w:r>
+        <w:t>uthentication and meeting completion</w:t>
+      </w:r>
+      <w:r>
+        <w:t xml:space="preserve"> logic</w:t>
+      </w:r>
+      <w:r>
+        <w:t xml:space="preserve"> were enforced on the server side to provide users with reliability and security.</w:t>
+      </w:r>
+    </w:p>
+    <w:p>
+      <w:pPr>
+        <w:jc w:val="both"/>
+      </w:pPr>
+      <w:r>
+        <w:t xml:space="preserve">Finally, the importance of </w:t>
+      </w:r>
+      <w:r>
+        <w:t xml:space="preserve">a </w:t>
+      </w:r>
+      <w:r>
+        <w:t xml:space="preserve">clear separation of concerns was also </w:t>
+      </w:r>
+      <w:r>
+        <w:t xml:space="preserve">highly </w:t>
+      </w:r>
+      <w:r>
+        <w:t xml:space="preserve">valued during the project development. The system became </w:t>
+      </w:r>
+      <w:r>
+        <w:t xml:space="preserve">noticeably </w:t>
+      </w:r>
+      <w:r>
+        <w:t xml:space="preserve">easier to debug </w:t>
+      </w:r>
+      <w:r>
+        <w:t xml:space="preserve">and extend </w:t>
+      </w:r>
+      <w:r>
+        <w:t xml:space="preserve">once authentication logic, business logic and database access </w:t>
+      </w:r>
+      <w:r>
+        <w:t xml:space="preserve">were properly </w:t>
+      </w:r>
+      <w:r>
+        <w:t xml:space="preserve">separated. </w:t>
+      </w:r>
+    </w:p>
+    <w:p/>
+    <w:p>
+      <w:pPr>
+        <w:pStyle w:val="Heading1"/>
+        <w:spacing w:before="0" w:after="0"/>
+        <w:rPr>
+          <w:rFonts w:ascii="Times New Roman" w:hAnsi="Times New Roman" w:cs="Times New Roman"/>
+        </w:rPr>
+      </w:pPr>
+      <w:bookmarkStart w:id="20" w:name="_Toc223650217"/>
+      <w:r>
+        <w:rPr>
+          <w:rFonts w:ascii="Times New Roman" w:hAnsi="Times New Roman" w:cs="Times New Roman"/>
+        </w:rPr>
+        <w:t>1</w:t>
+      </w:r>
+      <w:r>
+        <w:rPr>
+          <w:rFonts w:ascii="Times New Roman" w:hAnsi="Times New Roman" w:cs="Times New Roman"/>
+        </w:rPr>
+        <w:t>3</w:t>
+      </w:r>
+      <w:r>
+        <w:rPr>
+          <w:rFonts w:ascii="Times New Roman" w:hAnsi="Times New Roman" w:cs="Times New Roman"/>
+        </w:rPr>
+        <w:t xml:space="preserve"> </w:t>
+      </w:r>
+      <w:r>
+        <w:rPr>
+          <w:rFonts w:ascii="Times New Roman" w:hAnsi="Times New Roman" w:cs="Times New Roman"/>
+        </w:rPr>
+        <w:t>Reference List</w:t>
+      </w:r>
+      <w:bookmarkEnd w:id="20"/>
+    </w:p>
+    <w:p/>
+    <w:p>
+      <w:pPr>
         <w:pStyle w:val="NormalWeb"/>
+        <w:spacing w:before="0" w:beforeAutospacing="0" w:after="0" w:afterAutospacing="0"/>
       </w:pPr>
       <w:r>
         <w:t xml:space="preserve">Byrd, S.C. (1990). The effects of peer tutoring on self-esteem and academic achievement. </w:t>
@@ -4168,10 +5436,10 @@
     <w:p>
       <w:pPr>
         <w:pStyle w:val="NormalWeb"/>
+        <w:spacing w:before="0" w:beforeAutospacing="0" w:after="0" w:afterAutospacing="0"/>
       </w:pPr>
       <w:proofErr w:type="spellStart"/>
       <w:r>
-        <w:lastRenderedPageBreak/>
         <w:t>Bursuck</w:t>
       </w:r>
       <w:proofErr w:type="spellEnd"/>
@@ -4192,6 +5460,7 @@
     <w:p>
       <w:pPr>
         <w:pStyle w:val="NormalWeb"/>
+        <w:spacing w:before="0" w:beforeAutospacing="0" w:after="0" w:afterAutospacing="0"/>
       </w:pPr>
       <w:r>
         <w:t xml:space="preserve">Cardenas, J.A., Harris, M.B. and Graham, S. (1991). Peer tutoring: Effects on academic achievement, motivation, and attitudes toward school. </w:t>
@@ -4210,6 +5479,7 @@
     <w:p>
       <w:pPr>
         <w:pStyle w:val="NormalWeb"/>
+        <w:spacing w:before="0" w:beforeAutospacing="0" w:after="0" w:afterAutospacing="0"/>
       </w:pPr>
       <w:r>
         <w:t xml:space="preserve">Charlton, T. (1998). Peer tutoring: An introduction. </w:t>
@@ -4228,6 +5498,7 @@
     <w:p>
       <w:pPr>
         <w:pStyle w:val="NormalWeb"/>
+        <w:spacing w:before="0" w:beforeAutospacing="0" w:after="0" w:afterAutospacing="0"/>
       </w:pPr>
       <w:r>
         <w:t xml:space="preserve">Damon, W. and Phelps, E. (1989). Critical distinctions among three approaches to peer education. </w:t>
@@ -4246,6 +5517,7 @@
     <w:p>
       <w:pPr>
         <w:pStyle w:val="NormalWeb"/>
+        <w:spacing w:before="0" w:beforeAutospacing="0" w:after="0" w:afterAutospacing="0"/>
       </w:pPr>
       <w:r>
         <w:t xml:space="preserve">DeShields, O.W., Kara, A. and Kaynak, E. (2005). Determinants of business student satisfaction and retention in higher education: Applying Herzberg’s two-factor theory. </w:t>
@@ -4264,6 +5536,7 @@
     <w:p>
       <w:pPr>
         <w:pStyle w:val="NormalWeb"/>
+        <w:spacing w:before="0" w:beforeAutospacing="0" w:after="0" w:afterAutospacing="0"/>
       </w:pPr>
       <w:proofErr w:type="spellStart"/>
       <w:r>
@@ -4287,6 +5560,7 @@
     <w:p>
       <w:pPr>
         <w:pStyle w:val="NormalWeb"/>
+        <w:spacing w:before="0" w:beforeAutospacing="0" w:after="0" w:afterAutospacing="0"/>
       </w:pPr>
       <w:r>
         <w:t xml:space="preserve">Greenwald, A.G., Hedges, L.V. and Laine, R.D. (1996). The effect of school resources on student achievement. </w:t>
@@ -4305,8 +5579,10 @@
     <w:p>
       <w:pPr>
         <w:pStyle w:val="NormalWeb"/>
-      </w:pPr>
-      <w:r>
+        <w:spacing w:before="0" w:beforeAutospacing="0" w:after="0" w:afterAutospacing="0"/>
+      </w:pPr>
+      <w:r>
+        <w:lastRenderedPageBreak/>
         <w:t xml:space="preserve">Greenwood, C.R., Carta, J.J. and Hall, R.V. (1988). The use of peer tutoring strategies in classroom management and academic instruction. </w:t>
       </w:r>
       <w:r>
@@ -4323,6 +5599,7 @@
     <w:p>
       <w:pPr>
         <w:pStyle w:val="NormalWeb"/>
+        <w:spacing w:before="0" w:beforeAutospacing="0" w:after="0" w:afterAutospacing="0"/>
       </w:pPr>
       <w:r>
         <w:t xml:space="preserve">Hennessy, A. and Murphy, K. (2025). Barriers to student engagement: A focus group study on student engagement of first-year computing students. </w:t>
@@ -4349,6 +5626,7 @@
     <w:p>
       <w:pPr>
         <w:pStyle w:val="NormalWeb"/>
+        <w:spacing w:before="0" w:beforeAutospacing="0" w:after="0" w:afterAutospacing="0"/>
       </w:pPr>
       <w:proofErr w:type="spellStart"/>
       <w:r>
@@ -4372,6 +5650,7 @@
     <w:p>
       <w:pPr>
         <w:pStyle w:val="NormalWeb"/>
+        <w:spacing w:before="0" w:beforeAutospacing="0" w:after="0" w:afterAutospacing="0"/>
       </w:pPr>
       <w:r>
         <w:t xml:space="preserve">Krause, K. and Coates, H. (2008). Students’ engagement in first-year university. </w:t>
@@ -4390,6 +5669,7 @@
     <w:p>
       <w:pPr>
         <w:pStyle w:val="NormalWeb"/>
+        <w:spacing w:before="0" w:beforeAutospacing="0" w:after="0" w:afterAutospacing="0"/>
       </w:pPr>
       <w:r>
         <w:t xml:space="preserve">Lazerson, D.B., Foster, M.A., Brown, R. and Horan, J.J. (1988). Peer tutoring and locus of control: Effects on academic performance. </w:t>
@@ -4408,6 +5688,7 @@
     <w:p>
       <w:pPr>
         <w:pStyle w:val="NormalWeb"/>
+        <w:spacing w:before="0" w:beforeAutospacing="0" w:after="0" w:afterAutospacing="0"/>
       </w:pPr>
       <w:r>
         <w:t xml:space="preserve">Mahan, D.J., Wilson, K., Petrosko, J. and Luthy, M. (2014). Is retention enough? Learning and satisfaction of first-generation college seniors. </w:t>
@@ -4426,6 +5707,7 @@
     <w:p>
       <w:pPr>
         <w:pStyle w:val="NormalWeb"/>
+        <w:spacing w:before="0" w:beforeAutospacing="0" w:after="0" w:afterAutospacing="0"/>
       </w:pPr>
       <w:r>
         <w:t xml:space="preserve">Mathur, S.R. and Rutherford, R.B. (1991). Peer-mediated interventions promoting social skills of students with emotional and </w:t>
@@ -4452,9 +5734,9 @@
     <w:p>
       <w:pPr>
         <w:pStyle w:val="NormalWeb"/>
-      </w:pPr>
-      <w:r>
-        <w:lastRenderedPageBreak/>
+        <w:spacing w:before="0" w:beforeAutospacing="0" w:after="0" w:afterAutospacing="0"/>
+      </w:pPr>
+      <w:r>
         <w:t xml:space="preserve">Piazza. (n.d.). Piazza: A </w:t>
       </w:r>
       <w:proofErr w:type="gramStart"/>
@@ -4469,6 +5751,7 @@
     <w:p>
       <w:pPr>
         <w:pStyle w:val="NormalWeb"/>
+        <w:spacing w:before="0" w:beforeAutospacing="0" w:after="0" w:afterAutospacing="0"/>
       </w:pPr>
       <w:proofErr w:type="spellStart"/>
       <w:r>
@@ -4492,6 +5775,7 @@
     <w:p>
       <w:pPr>
         <w:pStyle w:val="NormalWeb"/>
+        <w:spacing w:before="0" w:beforeAutospacing="0" w:after="0" w:afterAutospacing="0"/>
       </w:pPr>
       <w:r>
         <w:t xml:space="preserve">Profi.ru (n.d.). </w:t>
@@ -4521,6 +5805,7 @@
     <w:p>
       <w:pPr>
         <w:pStyle w:val="NormalWeb"/>
+        <w:spacing w:before="0" w:beforeAutospacing="0" w:after="0" w:afterAutospacing="0"/>
       </w:pPr>
       <w:r>
         <w:t xml:space="preserve">Rizkallah, E.G. and Seitz, V. (2017). Are universities missing a link in dealing with student motivation? An empirical perspective. </w:t>
@@ -4539,6 +5824,7 @@
     <w:p>
       <w:pPr>
         <w:pStyle w:val="NormalWeb"/>
+        <w:spacing w:before="0" w:beforeAutospacing="0" w:after="0" w:afterAutospacing="0"/>
       </w:pPr>
       <w:r>
         <w:t xml:space="preserve">Tinto, V. (1987). </w:t>
@@ -4557,6 +5843,7 @@
     <w:p>
       <w:pPr>
         <w:pStyle w:val="NormalWeb"/>
+        <w:spacing w:before="0" w:beforeAutospacing="0" w:after="0" w:afterAutospacing="0"/>
       </w:pPr>
       <w:r>
         <w:t xml:space="preserve">Tinto, V. (2014). Reflective practice: Tinto’s South Africa lectures. </w:t>
@@ -4575,6 +5862,7 @@
     <w:p>
       <w:pPr>
         <w:pStyle w:val="NormalWeb"/>
+        <w:spacing w:before="0" w:beforeAutospacing="0" w:after="0" w:afterAutospacing="0"/>
       </w:pPr>
       <w:r>
         <w:t xml:space="preserve">Topping, K.J. (2001). Peer assisted learning: A practical guide for teachers. </w:t>
@@ -4593,6 +5881,7 @@
     <w:p>
       <w:pPr>
         <w:pStyle w:val="NormalWeb"/>
+        <w:spacing w:before="0" w:beforeAutospacing="0" w:after="0" w:afterAutospacing="0"/>
       </w:pPr>
       <w:r>
         <w:t xml:space="preserve">Topping, K.J. (2002). Peer and parent-assisted learning in reading. </w:t>
@@ -4611,6 +5900,7 @@
     <w:p>
       <w:pPr>
         <w:pStyle w:val="NormalWeb"/>
+        <w:spacing w:before="0" w:beforeAutospacing="0" w:after="0" w:afterAutospacing="0"/>
       </w:pPr>
       <w:r>
         <w:t xml:space="preserve">Travis, J., Kaszycki, A., Geden, M. and Bunde, J. (2020). Some stress is good stress: The challenge-hindrance framework, academic self-efficacy, and academic outcomes. </w:t>
@@ -4629,6 +5919,7 @@
     <w:p>
       <w:pPr>
         <w:pStyle w:val="NormalWeb"/>
+        <w:spacing w:before="0" w:beforeAutospacing="0" w:after="0" w:afterAutospacing="0"/>
       </w:pPr>
       <w:proofErr w:type="spellStart"/>
       <w:r>
@@ -4652,11 +5943,12 @@
     <w:p>
       <w:pPr>
         <w:pStyle w:val="Heading1"/>
+        <w:spacing w:before="0" w:after="0"/>
         <w:rPr>
           <w:rFonts w:ascii="Times New Roman" w:hAnsi="Times New Roman" w:cs="Times New Roman"/>
         </w:rPr>
       </w:pPr>
-      <w:bookmarkStart w:id="22" w:name="_Toc223650218"/>
+      <w:bookmarkStart w:id="21" w:name="_Toc223650218"/>
       <w:r>
         <w:rPr>
           <w:rFonts w:ascii="Times New Roman" w:hAnsi="Times New Roman" w:cs="Times New Roman"/>
@@ -4675,7 +5967,7 @@
         </w:rPr>
         <w:t>Appendix</w:t>
       </w:r>
-      <w:bookmarkEnd w:id="22"/>
+      <w:bookmarkEnd w:id="21"/>
     </w:p>
     <w:sdt>
       <w:sdtPr>
@@ -4702,6 +5994,7 @@
         <w:p>
           <w:pPr>
             <w:pStyle w:val="TOCHeading"/>
+            <w:spacing w:before="0"/>
             <w:jc w:val="both"/>
             <w:rPr>
               <w:rFonts w:ascii="Times New Roman" w:hAnsi="Times New Roman" w:cs="Times New Roman"/>
@@ -4955,6 +6248,7 @@
             </w:rPr>
           </w:pPr>
           <w:r>
+            <w:lastRenderedPageBreak/>
             <w:fldChar w:fldCharType="end"/>
           </w:r>
         </w:p>
@@ -5326,7 +6620,7 @@
   <w:abstractNum w:abstractNumId="1" w15:restartNumberingAfterBreak="0">
     <w:nsid w:val="025F36C6"/>
     <w:multiLevelType w:val="multilevel"/>
-    <w:tmpl w:val="BBD2E56E"/>
+    <w:tmpl w:val="FB161A1C"/>
     <w:lvl w:ilvl="0">
       <w:start w:val="1"/>
       <w:numFmt w:val="decimal"/>
@@ -5350,6 +6644,7 @@
       </w:pPr>
       <w:rPr>
         <w:rFonts w:hint="default"/>
+        <w:color w:val="000000" w:themeColor="text1"/>
       </w:rPr>
     </w:lvl>
     <w:lvl w:ilvl="2">
@@ -6815,6 +8110,92 @@
     </w:lvl>
   </w:abstractNum>
   <w:abstractNum w:abstractNumId="14" w15:restartNumberingAfterBreak="0">
+    <w:nsid w:val="166605D0"/>
+    <w:multiLevelType w:val="hybridMultilevel"/>
+    <w:tmpl w:val="6B1C8F94"/>
+    <w:lvl w:ilvl="0" w:tplc="0409000F">
+      <w:start w:val="1"/>
+      <w:numFmt w:val="decimal"/>
+      <w:lvlText w:val="%1."/>
+      <w:lvlJc w:val="left"/>
+      <w:pPr>
+        <w:ind w:left="720" w:hanging="360"/>
+      </w:pPr>
+    </w:lvl>
+    <w:lvl w:ilvl="1" w:tplc="04090019" w:tentative="1">
+      <w:start w:val="1"/>
+      <w:numFmt w:val="lowerLetter"/>
+      <w:lvlText w:val="%2."/>
+      <w:lvlJc w:val="left"/>
+      <w:pPr>
+        <w:ind w:left="1440" w:hanging="360"/>
+      </w:pPr>
+    </w:lvl>
+    <w:lvl w:ilvl="2" w:tplc="0409001B" w:tentative="1">
+      <w:start w:val="1"/>
+      <w:numFmt w:val="lowerRoman"/>
+      <w:lvlText w:val="%3."/>
+      <w:lvlJc w:val="right"/>
+      <w:pPr>
+        <w:ind w:left="2160" w:hanging="180"/>
+      </w:pPr>
+    </w:lvl>
+    <w:lvl w:ilvl="3" w:tplc="0409000F" w:tentative="1">
+      <w:start w:val="1"/>
+      <w:numFmt w:val="decimal"/>
+      <w:lvlText w:val="%4."/>
+      <w:lvlJc w:val="left"/>
+      <w:pPr>
+        <w:ind w:left="2880" w:hanging="360"/>
+      </w:pPr>
+    </w:lvl>
+    <w:lvl w:ilvl="4" w:tplc="04090019" w:tentative="1">
+      <w:start w:val="1"/>
+      <w:numFmt w:val="lowerLetter"/>
+      <w:lvlText w:val="%5."/>
+      <w:lvlJc w:val="left"/>
+      <w:pPr>
+        <w:ind w:left="3600" w:hanging="360"/>
+      </w:pPr>
+    </w:lvl>
+    <w:lvl w:ilvl="5" w:tplc="0409001B" w:tentative="1">
+      <w:start w:val="1"/>
+      <w:numFmt w:val="lowerRoman"/>
+      <w:lvlText w:val="%6."/>
+      <w:lvlJc w:val="right"/>
+      <w:pPr>
+        <w:ind w:left="4320" w:hanging="180"/>
+      </w:pPr>
+    </w:lvl>
+    <w:lvl w:ilvl="6" w:tplc="0409000F" w:tentative="1">
+      <w:start w:val="1"/>
+      <w:numFmt w:val="decimal"/>
+      <w:lvlText w:val="%7."/>
+      <w:lvlJc w:val="left"/>
+      <w:pPr>
+        <w:ind w:left="5040" w:hanging="360"/>
+      </w:pPr>
+    </w:lvl>
+    <w:lvl w:ilvl="7" w:tplc="04090019" w:tentative="1">
+      <w:start w:val="1"/>
+      <w:numFmt w:val="lowerLetter"/>
+      <w:lvlText w:val="%8."/>
+      <w:lvlJc w:val="left"/>
+      <w:pPr>
+        <w:ind w:left="5760" w:hanging="360"/>
+      </w:pPr>
+    </w:lvl>
+    <w:lvl w:ilvl="8" w:tplc="0409001B" w:tentative="1">
+      <w:start w:val="1"/>
+      <w:numFmt w:val="lowerRoman"/>
+      <w:lvlText w:val="%9."/>
+      <w:lvlJc w:val="right"/>
+      <w:pPr>
+        <w:ind w:left="6480" w:hanging="180"/>
+      </w:pPr>
+    </w:lvl>
+  </w:abstractNum>
+  <w:abstractNum w:abstractNumId="15" w15:restartNumberingAfterBreak="0">
     <w:nsid w:val="16C70515"/>
     <w:multiLevelType w:val="multilevel"/>
     <w:tmpl w:val="1CE860BA"/>
@@ -6927,7 +8308,7 @@
       </w:rPr>
     </w:lvl>
   </w:abstractNum>
-  <w:abstractNum w:abstractNumId="15" w15:restartNumberingAfterBreak="0">
+  <w:abstractNum w:abstractNumId="16" w15:restartNumberingAfterBreak="0">
     <w:nsid w:val="182B6F23"/>
     <w:multiLevelType w:val="hybridMultilevel"/>
     <w:tmpl w:val="C75EE1CE"/>
@@ -7013,7 +8394,7 @@
       </w:pPr>
     </w:lvl>
   </w:abstractNum>
-  <w:abstractNum w:abstractNumId="16" w15:restartNumberingAfterBreak="0">
+  <w:abstractNum w:abstractNumId="17" w15:restartNumberingAfterBreak="0">
     <w:nsid w:val="188D7BCC"/>
     <w:multiLevelType w:val="hybridMultilevel"/>
     <w:tmpl w:val="32AC40F0"/>
@@ -7099,7 +8480,7 @@
       </w:pPr>
     </w:lvl>
   </w:abstractNum>
-  <w:abstractNum w:abstractNumId="17" w15:restartNumberingAfterBreak="0">
+  <w:abstractNum w:abstractNumId="18" w15:restartNumberingAfterBreak="0">
     <w:nsid w:val="18E361AB"/>
     <w:multiLevelType w:val="hybridMultilevel"/>
     <w:tmpl w:val="32AC40F0"/>
@@ -7185,7 +8566,7 @@
       </w:pPr>
     </w:lvl>
   </w:abstractNum>
-  <w:abstractNum w:abstractNumId="18" w15:restartNumberingAfterBreak="0">
+  <w:abstractNum w:abstractNumId="19" w15:restartNumberingAfterBreak="0">
     <w:nsid w:val="1B2644E6"/>
     <w:multiLevelType w:val="multilevel"/>
     <w:tmpl w:val="DF6A7F3C"/>
@@ -7331,7 +8712,7 @@
       </w:rPr>
     </w:lvl>
   </w:abstractNum>
-  <w:abstractNum w:abstractNumId="19" w15:restartNumberingAfterBreak="0">
+  <w:abstractNum w:abstractNumId="20" w15:restartNumberingAfterBreak="0">
     <w:nsid w:val="1BC80ED2"/>
     <w:multiLevelType w:val="hybridMultilevel"/>
     <w:tmpl w:val="A4806A4C"/>
@@ -7417,7 +8798,7 @@
       </w:pPr>
     </w:lvl>
   </w:abstractNum>
-  <w:abstractNum w:abstractNumId="20" w15:restartNumberingAfterBreak="0">
+  <w:abstractNum w:abstractNumId="21" w15:restartNumberingAfterBreak="0">
     <w:nsid w:val="1C937CA4"/>
     <w:multiLevelType w:val="multilevel"/>
     <w:tmpl w:val="E1C49F44"/>
@@ -7530,7 +8911,7 @@
       </w:rPr>
     </w:lvl>
   </w:abstractNum>
-  <w:abstractNum w:abstractNumId="21" w15:restartNumberingAfterBreak="0">
+  <w:abstractNum w:abstractNumId="22" w15:restartNumberingAfterBreak="0">
     <w:nsid w:val="1D544841"/>
     <w:multiLevelType w:val="hybridMultilevel"/>
     <w:tmpl w:val="68D4F4BE"/>
@@ -7616,7 +8997,7 @@
       </w:pPr>
     </w:lvl>
   </w:abstractNum>
-  <w:abstractNum w:abstractNumId="22" w15:restartNumberingAfterBreak="0">
+  <w:abstractNum w:abstractNumId="23" w15:restartNumberingAfterBreak="0">
     <w:nsid w:val="1FB64C99"/>
     <w:multiLevelType w:val="hybridMultilevel"/>
     <w:tmpl w:val="8A7AD79A"/>
@@ -7702,7 +9083,7 @@
       </w:pPr>
     </w:lvl>
   </w:abstractNum>
-  <w:abstractNum w:abstractNumId="23" w15:restartNumberingAfterBreak="0">
+  <w:abstractNum w:abstractNumId="24" w15:restartNumberingAfterBreak="0">
     <w:nsid w:val="20BB618F"/>
     <w:multiLevelType w:val="multilevel"/>
     <w:tmpl w:val="DFE02C5E"/>
@@ -7815,7 +9196,7 @@
       </w:rPr>
     </w:lvl>
   </w:abstractNum>
-  <w:abstractNum w:abstractNumId="24" w15:restartNumberingAfterBreak="0">
+  <w:abstractNum w:abstractNumId="25" w15:restartNumberingAfterBreak="0">
     <w:nsid w:val="20C14890"/>
     <w:multiLevelType w:val="hybridMultilevel"/>
     <w:tmpl w:val="1DDAB038"/>
@@ -7904,7 +9285,7 @@
       </w:pPr>
     </w:lvl>
   </w:abstractNum>
-  <w:abstractNum w:abstractNumId="25" w15:restartNumberingAfterBreak="0">
+  <w:abstractNum w:abstractNumId="26" w15:restartNumberingAfterBreak="0">
     <w:nsid w:val="221A7341"/>
     <w:multiLevelType w:val="multilevel"/>
     <w:tmpl w:val="D04A62BC"/>
@@ -8053,7 +9434,7 @@
       </w:rPr>
     </w:lvl>
   </w:abstractNum>
-  <w:abstractNum w:abstractNumId="26" w15:restartNumberingAfterBreak="0">
+  <w:abstractNum w:abstractNumId="27" w15:restartNumberingAfterBreak="0">
     <w:nsid w:val="29EF6A03"/>
     <w:multiLevelType w:val="multilevel"/>
     <w:tmpl w:val="7D488EEA"/>
@@ -8202,7 +9583,7 @@
       </w:rPr>
     </w:lvl>
   </w:abstractNum>
-  <w:abstractNum w:abstractNumId="27" w15:restartNumberingAfterBreak="0">
+  <w:abstractNum w:abstractNumId="28" w15:restartNumberingAfterBreak="0">
     <w:nsid w:val="2BA469CD"/>
     <w:multiLevelType w:val="hybridMultilevel"/>
     <w:tmpl w:val="51849FF2"/>
@@ -8288,7 +9669,7 @@
       </w:pPr>
     </w:lvl>
   </w:abstractNum>
-  <w:abstractNum w:abstractNumId="28" w15:restartNumberingAfterBreak="0">
+  <w:abstractNum w:abstractNumId="29" w15:restartNumberingAfterBreak="0">
     <w:nsid w:val="2DF677FD"/>
     <w:multiLevelType w:val="hybridMultilevel"/>
     <w:tmpl w:val="F47CBCDA"/>
@@ -8374,7 +9755,7 @@
       </w:pPr>
     </w:lvl>
   </w:abstractNum>
-  <w:abstractNum w:abstractNumId="29" w15:restartNumberingAfterBreak="0">
+  <w:abstractNum w:abstractNumId="30" w15:restartNumberingAfterBreak="0">
     <w:nsid w:val="2E687AE0"/>
     <w:multiLevelType w:val="multilevel"/>
     <w:tmpl w:val="DF6A7F3C"/>
@@ -8520,7 +9901,7 @@
       </w:rPr>
     </w:lvl>
   </w:abstractNum>
-  <w:abstractNum w:abstractNumId="30" w15:restartNumberingAfterBreak="0">
+  <w:abstractNum w:abstractNumId="31" w15:restartNumberingAfterBreak="0">
     <w:nsid w:val="2E6A48B3"/>
     <w:multiLevelType w:val="hybridMultilevel"/>
     <w:tmpl w:val="A072A7C0"/>
@@ -8606,7 +9987,7 @@
       </w:pPr>
     </w:lvl>
   </w:abstractNum>
-  <w:abstractNum w:abstractNumId="31" w15:restartNumberingAfterBreak="0">
+  <w:abstractNum w:abstractNumId="32" w15:restartNumberingAfterBreak="0">
     <w:nsid w:val="2F38432F"/>
     <w:multiLevelType w:val="multilevel"/>
     <w:tmpl w:val="FDFC4E2E"/>
@@ -8752,7 +10133,7 @@
       </w:rPr>
     </w:lvl>
   </w:abstractNum>
-  <w:abstractNum w:abstractNumId="32" w15:restartNumberingAfterBreak="0">
+  <w:abstractNum w:abstractNumId="33" w15:restartNumberingAfterBreak="0">
     <w:nsid w:val="2F825433"/>
     <w:multiLevelType w:val="multilevel"/>
     <w:tmpl w:val="F2B8FC54"/>
@@ -8901,7 +10282,7 @@
       </w:rPr>
     </w:lvl>
   </w:abstractNum>
-  <w:abstractNum w:abstractNumId="33" w15:restartNumberingAfterBreak="0">
+  <w:abstractNum w:abstractNumId="34" w15:restartNumberingAfterBreak="0">
     <w:nsid w:val="308A52A8"/>
     <w:multiLevelType w:val="hybridMultilevel"/>
     <w:tmpl w:val="5E4606CE"/>
@@ -8987,7 +10368,7 @@
       </w:pPr>
     </w:lvl>
   </w:abstractNum>
-  <w:abstractNum w:abstractNumId="34" w15:restartNumberingAfterBreak="0">
+  <w:abstractNum w:abstractNumId="35" w15:restartNumberingAfterBreak="0">
     <w:nsid w:val="30E1757C"/>
     <w:multiLevelType w:val="multilevel"/>
     <w:tmpl w:val="DF6A7F3C"/>
@@ -9133,7 +10514,7 @@
       </w:rPr>
     </w:lvl>
   </w:abstractNum>
-  <w:abstractNum w:abstractNumId="35" w15:restartNumberingAfterBreak="0">
+  <w:abstractNum w:abstractNumId="36" w15:restartNumberingAfterBreak="0">
     <w:nsid w:val="33921B89"/>
     <w:multiLevelType w:val="hybridMultilevel"/>
     <w:tmpl w:val="F30810B6"/>
@@ -9219,7 +10600,7 @@
       </w:pPr>
     </w:lvl>
   </w:abstractNum>
-  <w:abstractNum w:abstractNumId="36" w15:restartNumberingAfterBreak="0">
+  <w:abstractNum w:abstractNumId="37" w15:restartNumberingAfterBreak="0">
     <w:nsid w:val="35664F58"/>
     <w:multiLevelType w:val="hybridMultilevel"/>
     <w:tmpl w:val="6FF6886E"/>
@@ -9332,7 +10713,7 @@
       </w:rPr>
     </w:lvl>
   </w:abstractNum>
-  <w:abstractNum w:abstractNumId="37" w15:restartNumberingAfterBreak="0">
+  <w:abstractNum w:abstractNumId="38" w15:restartNumberingAfterBreak="0">
     <w:nsid w:val="36DA7BF5"/>
     <w:multiLevelType w:val="multilevel"/>
     <w:tmpl w:val="57CA5176"/>
@@ -9445,7 +10826,7 @@
       </w:rPr>
     </w:lvl>
   </w:abstractNum>
-  <w:abstractNum w:abstractNumId="38" w15:restartNumberingAfterBreak="0">
+  <w:abstractNum w:abstractNumId="39" w15:restartNumberingAfterBreak="0">
     <w:nsid w:val="37211FC9"/>
     <w:multiLevelType w:val="multilevel"/>
     <w:tmpl w:val="DF6A7F3C"/>
@@ -9591,7 +10972,7 @@
       </w:rPr>
     </w:lvl>
   </w:abstractNum>
-  <w:abstractNum w:abstractNumId="39" w15:restartNumberingAfterBreak="0">
+  <w:abstractNum w:abstractNumId="40" w15:restartNumberingAfterBreak="0">
     <w:nsid w:val="38641764"/>
     <w:multiLevelType w:val="multilevel"/>
     <w:tmpl w:val="68842356"/>
@@ -9737,7 +11118,7 @@
       </w:rPr>
     </w:lvl>
   </w:abstractNum>
-  <w:abstractNum w:abstractNumId="40" w15:restartNumberingAfterBreak="0">
+  <w:abstractNum w:abstractNumId="41" w15:restartNumberingAfterBreak="0">
     <w:nsid w:val="391D3DEC"/>
     <w:multiLevelType w:val="hybridMultilevel"/>
     <w:tmpl w:val="9C2A9F28"/>
@@ -9823,7 +11204,7 @@
       </w:pPr>
     </w:lvl>
   </w:abstractNum>
-  <w:abstractNum w:abstractNumId="41" w15:restartNumberingAfterBreak="0">
+  <w:abstractNum w:abstractNumId="42" w15:restartNumberingAfterBreak="0">
     <w:nsid w:val="3A231A58"/>
     <w:multiLevelType w:val="hybridMultilevel"/>
     <w:tmpl w:val="BF721A8E"/>
@@ -9909,7 +11290,93 @@
       </w:pPr>
     </w:lvl>
   </w:abstractNum>
-  <w:abstractNum w:abstractNumId="42" w15:restartNumberingAfterBreak="0">
+  <w:abstractNum w:abstractNumId="43" w15:restartNumberingAfterBreak="0">
+    <w:nsid w:val="3BC24E04"/>
+    <w:multiLevelType w:val="hybridMultilevel"/>
+    <w:tmpl w:val="8958937C"/>
+    <w:lvl w:ilvl="0" w:tplc="0409000F">
+      <w:start w:val="1"/>
+      <w:numFmt w:val="decimal"/>
+      <w:lvlText w:val="%1."/>
+      <w:lvlJc w:val="left"/>
+      <w:pPr>
+        <w:ind w:left="720" w:hanging="360"/>
+      </w:pPr>
+    </w:lvl>
+    <w:lvl w:ilvl="1" w:tplc="04090019" w:tentative="1">
+      <w:start w:val="1"/>
+      <w:numFmt w:val="lowerLetter"/>
+      <w:lvlText w:val="%2."/>
+      <w:lvlJc w:val="left"/>
+      <w:pPr>
+        <w:ind w:left="1440" w:hanging="360"/>
+      </w:pPr>
+    </w:lvl>
+    <w:lvl w:ilvl="2" w:tplc="0409001B" w:tentative="1">
+      <w:start w:val="1"/>
+      <w:numFmt w:val="lowerRoman"/>
+      <w:lvlText w:val="%3."/>
+      <w:lvlJc w:val="right"/>
+      <w:pPr>
+        <w:ind w:left="2160" w:hanging="180"/>
+      </w:pPr>
+    </w:lvl>
+    <w:lvl w:ilvl="3" w:tplc="0409000F" w:tentative="1">
+      <w:start w:val="1"/>
+      <w:numFmt w:val="decimal"/>
+      <w:lvlText w:val="%4."/>
+      <w:lvlJc w:val="left"/>
+      <w:pPr>
+        <w:ind w:left="2880" w:hanging="360"/>
+      </w:pPr>
+    </w:lvl>
+    <w:lvl w:ilvl="4" w:tplc="04090019" w:tentative="1">
+      <w:start w:val="1"/>
+      <w:numFmt w:val="lowerLetter"/>
+      <w:lvlText w:val="%5."/>
+      <w:lvlJc w:val="left"/>
+      <w:pPr>
+        <w:ind w:left="3600" w:hanging="360"/>
+      </w:pPr>
+    </w:lvl>
+    <w:lvl w:ilvl="5" w:tplc="0409001B" w:tentative="1">
+      <w:start w:val="1"/>
+      <w:numFmt w:val="lowerRoman"/>
+      <w:lvlText w:val="%6."/>
+      <w:lvlJc w:val="right"/>
+      <w:pPr>
+        <w:ind w:left="4320" w:hanging="180"/>
+      </w:pPr>
+    </w:lvl>
+    <w:lvl w:ilvl="6" w:tplc="0409000F" w:tentative="1">
+      <w:start w:val="1"/>
+      <w:numFmt w:val="decimal"/>
+      <w:lvlText w:val="%7."/>
+      <w:lvlJc w:val="left"/>
+      <w:pPr>
+        <w:ind w:left="5040" w:hanging="360"/>
+      </w:pPr>
+    </w:lvl>
+    <w:lvl w:ilvl="7" w:tplc="04090019" w:tentative="1">
+      <w:start w:val="1"/>
+      <w:numFmt w:val="lowerLetter"/>
+      <w:lvlText w:val="%8."/>
+      <w:lvlJc w:val="left"/>
+      <w:pPr>
+        <w:ind w:left="5760" w:hanging="360"/>
+      </w:pPr>
+    </w:lvl>
+    <w:lvl w:ilvl="8" w:tplc="0409001B" w:tentative="1">
+      <w:start w:val="1"/>
+      <w:numFmt w:val="lowerRoman"/>
+      <w:lvlText w:val="%9."/>
+      <w:lvlJc w:val="right"/>
+      <w:pPr>
+        <w:ind w:left="6480" w:hanging="180"/>
+      </w:pPr>
+    </w:lvl>
+  </w:abstractNum>
+  <w:abstractNum w:abstractNumId="44" w15:restartNumberingAfterBreak="0">
     <w:nsid w:val="44A236C0"/>
     <w:multiLevelType w:val="multilevel"/>
     <w:tmpl w:val="1CE860BA"/>
@@ -10022,7 +11489,7 @@
       </w:rPr>
     </w:lvl>
   </w:abstractNum>
-  <w:abstractNum w:abstractNumId="43" w15:restartNumberingAfterBreak="0">
+  <w:abstractNum w:abstractNumId="45" w15:restartNumberingAfterBreak="0">
     <w:nsid w:val="477F143E"/>
     <w:multiLevelType w:val="multilevel"/>
     <w:tmpl w:val="68842356"/>
@@ -10168,7 +11635,7 @@
       </w:rPr>
     </w:lvl>
   </w:abstractNum>
-  <w:abstractNum w:abstractNumId="44" w15:restartNumberingAfterBreak="0">
+  <w:abstractNum w:abstractNumId="46" w15:restartNumberingAfterBreak="0">
     <w:nsid w:val="4A253C16"/>
     <w:multiLevelType w:val="multilevel"/>
     <w:tmpl w:val="FDFC4E2E"/>
@@ -10314,7 +11781,7 @@
       </w:rPr>
     </w:lvl>
   </w:abstractNum>
-  <w:abstractNum w:abstractNumId="45" w15:restartNumberingAfterBreak="0">
+  <w:abstractNum w:abstractNumId="47" w15:restartNumberingAfterBreak="0">
     <w:nsid w:val="4AAB458E"/>
     <w:multiLevelType w:val="multilevel"/>
     <w:tmpl w:val="68842356"/>
@@ -10460,7 +11927,7 @@
       </w:rPr>
     </w:lvl>
   </w:abstractNum>
-  <w:abstractNum w:abstractNumId="46" w15:restartNumberingAfterBreak="0">
+  <w:abstractNum w:abstractNumId="48" w15:restartNumberingAfterBreak="0">
     <w:nsid w:val="4BD90110"/>
     <w:multiLevelType w:val="hybridMultilevel"/>
     <w:tmpl w:val="EEE8F6D2"/>
@@ -10546,7 +12013,7 @@
       </w:pPr>
     </w:lvl>
   </w:abstractNum>
-  <w:abstractNum w:abstractNumId="47" w15:restartNumberingAfterBreak="0">
+  <w:abstractNum w:abstractNumId="49" w15:restartNumberingAfterBreak="0">
     <w:nsid w:val="4C756D3C"/>
     <w:multiLevelType w:val="hybridMultilevel"/>
     <w:tmpl w:val="B478EC7E"/>
@@ -10632,7 +12099,7 @@
       </w:pPr>
     </w:lvl>
   </w:abstractNum>
-  <w:abstractNum w:abstractNumId="48" w15:restartNumberingAfterBreak="0">
+  <w:abstractNum w:abstractNumId="50" w15:restartNumberingAfterBreak="0">
     <w:nsid w:val="4D7676E0"/>
     <w:multiLevelType w:val="hybridMultilevel"/>
     <w:tmpl w:val="75C8DD4C"/>
@@ -10718,7 +12185,7 @@
       </w:pPr>
     </w:lvl>
   </w:abstractNum>
-  <w:abstractNum w:abstractNumId="49" w15:restartNumberingAfterBreak="0">
+  <w:abstractNum w:abstractNumId="51" w15:restartNumberingAfterBreak="0">
     <w:nsid w:val="4E886D8A"/>
     <w:multiLevelType w:val="multilevel"/>
     <w:tmpl w:val="FDFC4E2E"/>
@@ -10864,7 +12331,7 @@
       </w:rPr>
     </w:lvl>
   </w:abstractNum>
-  <w:abstractNum w:abstractNumId="50" w15:restartNumberingAfterBreak="0">
+  <w:abstractNum w:abstractNumId="52" w15:restartNumberingAfterBreak="0">
     <w:nsid w:val="521A65CD"/>
     <w:multiLevelType w:val="multilevel"/>
     <w:tmpl w:val="6E2CEAE0"/>
@@ -11013,7 +12480,7 @@
       </w:rPr>
     </w:lvl>
   </w:abstractNum>
-  <w:abstractNum w:abstractNumId="51" w15:restartNumberingAfterBreak="0">
+  <w:abstractNum w:abstractNumId="53" w15:restartNumberingAfterBreak="0">
     <w:nsid w:val="545915D6"/>
     <w:multiLevelType w:val="multilevel"/>
     <w:tmpl w:val="DF6A7F3C"/>
@@ -11159,7 +12626,7 @@
       </w:rPr>
     </w:lvl>
   </w:abstractNum>
-  <w:abstractNum w:abstractNumId="52" w15:restartNumberingAfterBreak="0">
+  <w:abstractNum w:abstractNumId="54" w15:restartNumberingAfterBreak="0">
     <w:nsid w:val="556B2296"/>
     <w:multiLevelType w:val="hybridMultilevel"/>
     <w:tmpl w:val="1BF4C862"/>
@@ -11245,7 +12712,7 @@
       </w:pPr>
     </w:lvl>
   </w:abstractNum>
-  <w:abstractNum w:abstractNumId="53" w15:restartNumberingAfterBreak="0">
+  <w:abstractNum w:abstractNumId="55" w15:restartNumberingAfterBreak="0">
     <w:nsid w:val="55BD0436"/>
     <w:multiLevelType w:val="hybridMultilevel"/>
     <w:tmpl w:val="7C3A328C"/>
@@ -11331,7 +12798,7 @@
       </w:pPr>
     </w:lvl>
   </w:abstractNum>
-  <w:abstractNum w:abstractNumId="54" w15:restartNumberingAfterBreak="0">
+  <w:abstractNum w:abstractNumId="56" w15:restartNumberingAfterBreak="0">
     <w:nsid w:val="56280CC0"/>
     <w:multiLevelType w:val="hybridMultilevel"/>
     <w:tmpl w:val="C2FEFEDC"/>
@@ -11417,7 +12884,7 @@
       </w:pPr>
     </w:lvl>
   </w:abstractNum>
-  <w:abstractNum w:abstractNumId="55" w15:restartNumberingAfterBreak="0">
+  <w:abstractNum w:abstractNumId="57" w15:restartNumberingAfterBreak="0">
     <w:nsid w:val="572A2A2D"/>
     <w:multiLevelType w:val="multilevel"/>
     <w:tmpl w:val="9BC685AA"/>
@@ -11530,7 +12997,7 @@
       </w:rPr>
     </w:lvl>
   </w:abstractNum>
-  <w:abstractNum w:abstractNumId="56" w15:restartNumberingAfterBreak="0">
+  <w:abstractNum w:abstractNumId="58" w15:restartNumberingAfterBreak="0">
     <w:nsid w:val="5A7B6B30"/>
     <w:multiLevelType w:val="multilevel"/>
     <w:tmpl w:val="DF7AD022"/>
@@ -11679,7 +13146,7 @@
       </w:rPr>
     </w:lvl>
   </w:abstractNum>
-  <w:abstractNum w:abstractNumId="57" w15:restartNumberingAfterBreak="0">
+  <w:abstractNum w:abstractNumId="59" w15:restartNumberingAfterBreak="0">
     <w:nsid w:val="5B36645E"/>
     <w:multiLevelType w:val="hybridMultilevel"/>
     <w:tmpl w:val="7BA875C2"/>
@@ -11765,7 +13232,7 @@
       </w:pPr>
     </w:lvl>
   </w:abstractNum>
-  <w:abstractNum w:abstractNumId="58" w15:restartNumberingAfterBreak="0">
+  <w:abstractNum w:abstractNumId="60" w15:restartNumberingAfterBreak="0">
     <w:nsid w:val="5C015D54"/>
     <w:multiLevelType w:val="multilevel"/>
     <w:tmpl w:val="66D208DC"/>
@@ -11878,7 +13345,7 @@
       </w:pPr>
     </w:lvl>
   </w:abstractNum>
-  <w:abstractNum w:abstractNumId="59" w15:restartNumberingAfterBreak="0">
+  <w:abstractNum w:abstractNumId="61" w15:restartNumberingAfterBreak="0">
     <w:nsid w:val="5C5454BC"/>
     <w:multiLevelType w:val="multilevel"/>
     <w:tmpl w:val="68842356"/>
@@ -12024,7 +13491,7 @@
       </w:rPr>
     </w:lvl>
   </w:abstractNum>
-  <w:abstractNum w:abstractNumId="60" w15:restartNumberingAfterBreak="0">
+  <w:abstractNum w:abstractNumId="62" w15:restartNumberingAfterBreak="0">
     <w:nsid w:val="606D7492"/>
     <w:multiLevelType w:val="multilevel"/>
     <w:tmpl w:val="FDFC4E2E"/>
@@ -12170,7 +13637,7 @@
       </w:rPr>
     </w:lvl>
   </w:abstractNum>
-  <w:abstractNum w:abstractNumId="61" w15:restartNumberingAfterBreak="0">
+  <w:abstractNum w:abstractNumId="63" w15:restartNumberingAfterBreak="0">
     <w:nsid w:val="60D21A7A"/>
     <w:multiLevelType w:val="hybridMultilevel"/>
     <w:tmpl w:val="D4F8C738"/>
@@ -12256,7 +13723,7 @@
       </w:pPr>
     </w:lvl>
   </w:abstractNum>
-  <w:abstractNum w:abstractNumId="62" w15:restartNumberingAfterBreak="0">
+  <w:abstractNum w:abstractNumId="64" w15:restartNumberingAfterBreak="0">
     <w:nsid w:val="611E1155"/>
     <w:multiLevelType w:val="hybridMultilevel"/>
     <w:tmpl w:val="459CDAFE"/>
@@ -12342,7 +13809,7 @@
       </w:pPr>
     </w:lvl>
   </w:abstractNum>
-  <w:abstractNum w:abstractNumId="63" w15:restartNumberingAfterBreak="0">
+  <w:abstractNum w:abstractNumId="65" w15:restartNumberingAfterBreak="0">
     <w:nsid w:val="62465259"/>
     <w:multiLevelType w:val="multilevel"/>
     <w:tmpl w:val="FDFC4E2E"/>
@@ -12488,7 +13955,7 @@
       </w:rPr>
     </w:lvl>
   </w:abstractNum>
-  <w:abstractNum w:abstractNumId="64" w15:restartNumberingAfterBreak="0">
+  <w:abstractNum w:abstractNumId="66" w15:restartNumberingAfterBreak="0">
     <w:nsid w:val="643B098A"/>
     <w:multiLevelType w:val="hybridMultilevel"/>
     <w:tmpl w:val="672092BC"/>
@@ -12574,7 +14041,7 @@
       </w:pPr>
     </w:lvl>
   </w:abstractNum>
-  <w:abstractNum w:abstractNumId="65" w15:restartNumberingAfterBreak="0">
+  <w:abstractNum w:abstractNumId="67" w15:restartNumberingAfterBreak="0">
     <w:nsid w:val="64A96324"/>
     <w:multiLevelType w:val="multilevel"/>
     <w:tmpl w:val="68842356"/>
@@ -12720,7 +14187,7 @@
       </w:rPr>
     </w:lvl>
   </w:abstractNum>
-  <w:abstractNum w:abstractNumId="66" w15:restartNumberingAfterBreak="0">
+  <w:abstractNum w:abstractNumId="68" w15:restartNumberingAfterBreak="0">
     <w:nsid w:val="699D7F53"/>
     <w:multiLevelType w:val="multilevel"/>
     <w:tmpl w:val="DF6A7F3C"/>
@@ -12866,7 +14333,7 @@
       </w:rPr>
     </w:lvl>
   </w:abstractNum>
-  <w:abstractNum w:abstractNumId="67" w15:restartNumberingAfterBreak="0">
+  <w:abstractNum w:abstractNumId="69" w15:restartNumberingAfterBreak="0">
     <w:nsid w:val="6A8F4E40"/>
     <w:multiLevelType w:val="hybridMultilevel"/>
     <w:tmpl w:val="8B2A5FE4"/>
@@ -12952,120 +14419,128 @@
       </w:pPr>
     </w:lvl>
   </w:abstractNum>
-  <w:abstractNum w:abstractNumId="68" w15:restartNumberingAfterBreak="0">
+  <w:abstractNum w:abstractNumId="70" w15:restartNumberingAfterBreak="0">
     <w:nsid w:val="6B07430E"/>
-    <w:multiLevelType w:val="hybridMultilevel"/>
-    <w:tmpl w:val="6F9C41D6"/>
-    <w:lvl w:ilvl="0" w:tplc="9E0A892C">
-      <w:start w:val="3"/>
-      <w:numFmt w:val="bullet"/>
-      <w:lvlText w:val="-"/>
+    <w:multiLevelType w:val="multilevel"/>
+    <w:tmpl w:val="BBD2E56E"/>
+    <w:lvl w:ilvl="0">
+      <w:start w:val="1"/>
+      <w:numFmt w:val="decimal"/>
+      <w:lvlText w:val="%1."/>
       <w:lvlJc w:val="left"/>
       <w:pPr>
         <w:ind w:left="720" w:hanging="360"/>
       </w:pPr>
       <w:rPr>
-        <w:rFonts w:ascii="Times New Roman" w:eastAsia="Times New Roman" w:hAnsi="Times New Roman" w:cs="Times New Roman" w:hint="default"/>
-      </w:rPr>
-    </w:lvl>
-    <w:lvl w:ilvl="1" w:tplc="04090003" w:tentative="1">
-      <w:start w:val="1"/>
-      <w:numFmt w:val="bullet"/>
-      <w:lvlText w:val="o"/>
-      <w:lvlJc w:val="left"/>
-      <w:pPr>
-        <w:ind w:left="1440" w:hanging="360"/>
-      </w:pPr>
-      <w:rPr>
-        <w:rFonts w:ascii="Courier New" w:hAnsi="Courier New" w:cs="Courier New" w:hint="default"/>
-      </w:rPr>
-    </w:lvl>
-    <w:lvl w:ilvl="2" w:tplc="04090005" w:tentative="1">
-      <w:start w:val="1"/>
-      <w:numFmt w:val="bullet"/>
-      <w:lvlText w:val=""/>
-      <w:lvlJc w:val="left"/>
-      <w:pPr>
-        <w:ind w:left="2160" w:hanging="360"/>
-      </w:pPr>
-      <w:rPr>
-        <w:rFonts w:ascii="Wingdings" w:hAnsi="Wingdings" w:hint="default"/>
-      </w:rPr>
-    </w:lvl>
-    <w:lvl w:ilvl="3" w:tplc="04090001" w:tentative="1">
-      <w:start w:val="1"/>
-      <w:numFmt w:val="bullet"/>
-      <w:lvlText w:val=""/>
-      <w:lvlJc w:val="left"/>
-      <w:pPr>
-        <w:ind w:left="2880" w:hanging="360"/>
-      </w:pPr>
-      <w:rPr>
-        <w:rFonts w:ascii="Symbol" w:hAnsi="Symbol" w:hint="default"/>
-      </w:rPr>
-    </w:lvl>
-    <w:lvl w:ilvl="4" w:tplc="04090003" w:tentative="1">
-      <w:start w:val="1"/>
-      <w:numFmt w:val="bullet"/>
-      <w:lvlText w:val="o"/>
-      <w:lvlJc w:val="left"/>
-      <w:pPr>
-        <w:ind w:left="3600" w:hanging="360"/>
-      </w:pPr>
-      <w:rPr>
-        <w:rFonts w:ascii="Courier New" w:hAnsi="Courier New" w:cs="Courier New" w:hint="default"/>
-      </w:rPr>
-    </w:lvl>
-    <w:lvl w:ilvl="5" w:tplc="04090005" w:tentative="1">
-      <w:start w:val="1"/>
-      <w:numFmt w:val="bullet"/>
-      <w:lvlText w:val=""/>
-      <w:lvlJc w:val="left"/>
-      <w:pPr>
-        <w:ind w:left="4320" w:hanging="360"/>
-      </w:pPr>
-      <w:rPr>
-        <w:rFonts w:ascii="Wingdings" w:hAnsi="Wingdings" w:hint="default"/>
-      </w:rPr>
-    </w:lvl>
-    <w:lvl w:ilvl="6" w:tplc="04090001" w:tentative="1">
-      <w:start w:val="1"/>
-      <w:numFmt w:val="bullet"/>
-      <w:lvlText w:val=""/>
-      <w:lvlJc w:val="left"/>
-      <w:pPr>
-        <w:ind w:left="5040" w:hanging="360"/>
-      </w:pPr>
-      <w:rPr>
-        <w:rFonts w:ascii="Symbol" w:hAnsi="Symbol" w:hint="default"/>
-      </w:rPr>
-    </w:lvl>
-    <w:lvl w:ilvl="7" w:tplc="04090003" w:tentative="1">
-      <w:start w:val="1"/>
-      <w:numFmt w:val="bullet"/>
-      <w:lvlText w:val="o"/>
-      <w:lvlJc w:val="left"/>
-      <w:pPr>
-        <w:ind w:left="5760" w:hanging="360"/>
-      </w:pPr>
-      <w:rPr>
-        <w:rFonts w:ascii="Courier New" w:hAnsi="Courier New" w:cs="Courier New" w:hint="default"/>
-      </w:rPr>
-    </w:lvl>
-    <w:lvl w:ilvl="8" w:tplc="04090005" w:tentative="1">
-      <w:start w:val="1"/>
-      <w:numFmt w:val="bullet"/>
-      <w:lvlText w:val=""/>
-      <w:lvlJc w:val="left"/>
-      <w:pPr>
-        <w:ind w:left="6480" w:hanging="360"/>
-      </w:pPr>
-      <w:rPr>
-        <w:rFonts w:ascii="Wingdings" w:hAnsi="Wingdings" w:hint="default"/>
+        <w:rFonts w:hint="default"/>
+      </w:rPr>
+    </w:lvl>
+    <w:lvl w:ilvl="1">
+      <w:start w:val="1"/>
+      <w:numFmt w:val="decimal"/>
+      <w:isLgl/>
+      <w:lvlText w:val="%1.%2"/>
+      <w:lvlJc w:val="left"/>
+      <w:pPr>
+        <w:ind w:left="840" w:hanging="480"/>
+      </w:pPr>
+      <w:rPr>
+        <w:rFonts w:hint="default"/>
+      </w:rPr>
+    </w:lvl>
+    <w:lvl w:ilvl="2">
+      <w:start w:val="1"/>
+      <w:numFmt w:val="decimal"/>
+      <w:isLgl/>
+      <w:lvlText w:val="%1.%2.%3"/>
+      <w:lvlJc w:val="left"/>
+      <w:pPr>
+        <w:ind w:left="1080" w:hanging="720"/>
+      </w:pPr>
+      <w:rPr>
+        <w:rFonts w:hint="default"/>
+      </w:rPr>
+    </w:lvl>
+    <w:lvl w:ilvl="3">
+      <w:start w:val="1"/>
+      <w:numFmt w:val="decimal"/>
+      <w:isLgl/>
+      <w:lvlText w:val="%1.%2.%3.%4"/>
+      <w:lvlJc w:val="left"/>
+      <w:pPr>
+        <w:ind w:left="1080" w:hanging="720"/>
+      </w:pPr>
+      <w:rPr>
+        <w:rFonts w:hint="default"/>
+      </w:rPr>
+    </w:lvl>
+    <w:lvl w:ilvl="4">
+      <w:start w:val="1"/>
+      <w:numFmt w:val="decimal"/>
+      <w:isLgl/>
+      <w:lvlText w:val="%1.%2.%3.%4.%5"/>
+      <w:lvlJc w:val="left"/>
+      <w:pPr>
+        <w:ind w:left="1440" w:hanging="1080"/>
+      </w:pPr>
+      <w:rPr>
+        <w:rFonts w:hint="default"/>
+      </w:rPr>
+    </w:lvl>
+    <w:lvl w:ilvl="5">
+      <w:start w:val="1"/>
+      <w:numFmt w:val="decimal"/>
+      <w:isLgl/>
+      <w:lvlText w:val="%1.%2.%3.%4.%5.%6"/>
+      <w:lvlJc w:val="left"/>
+      <w:pPr>
+        <w:ind w:left="1440" w:hanging="1080"/>
+      </w:pPr>
+      <w:rPr>
+        <w:rFonts w:hint="default"/>
+      </w:rPr>
+    </w:lvl>
+    <w:lvl w:ilvl="6">
+      <w:start w:val="1"/>
+      <w:numFmt w:val="decimal"/>
+      <w:isLgl/>
+      <w:lvlText w:val="%1.%2.%3.%4.%5.%6.%7"/>
+      <w:lvlJc w:val="left"/>
+      <w:pPr>
+        <w:ind w:left="1800" w:hanging="1440"/>
+      </w:pPr>
+      <w:rPr>
+        <w:rFonts w:hint="default"/>
+      </w:rPr>
+    </w:lvl>
+    <w:lvl w:ilvl="7">
+      <w:start w:val="1"/>
+      <w:numFmt w:val="decimal"/>
+      <w:isLgl/>
+      <w:lvlText w:val="%1.%2.%3.%4.%5.%6.%7.%8"/>
+      <w:lvlJc w:val="left"/>
+      <w:pPr>
+        <w:ind w:left="1800" w:hanging="1440"/>
+      </w:pPr>
+      <w:rPr>
+        <w:rFonts w:hint="default"/>
+      </w:rPr>
+    </w:lvl>
+    <w:lvl w:ilvl="8">
+      <w:start w:val="1"/>
+      <w:numFmt w:val="decimal"/>
+      <w:isLgl/>
+      <w:lvlText w:val="%1.%2.%3.%4.%5.%6.%7.%8.%9"/>
+      <w:lvlJc w:val="left"/>
+      <w:pPr>
+        <w:ind w:left="2160" w:hanging="1800"/>
+      </w:pPr>
+      <w:rPr>
+        <w:rFonts w:hint="default"/>
       </w:rPr>
     </w:lvl>
   </w:abstractNum>
-  <w:abstractNum w:abstractNumId="69" w15:restartNumberingAfterBreak="0">
+  <w:abstractNum w:abstractNumId="71" w15:restartNumberingAfterBreak="0">
     <w:nsid w:val="6D0364A0"/>
     <w:multiLevelType w:val="multilevel"/>
     <w:tmpl w:val="68842356"/>
@@ -13211,7 +14686,7 @@
       </w:rPr>
     </w:lvl>
   </w:abstractNum>
-  <w:abstractNum w:abstractNumId="70" w15:restartNumberingAfterBreak="0">
+  <w:abstractNum w:abstractNumId="72" w15:restartNumberingAfterBreak="0">
     <w:nsid w:val="6D7273D8"/>
     <w:multiLevelType w:val="multilevel"/>
     <w:tmpl w:val="DC706630"/>
@@ -13360,7 +14835,7 @@
       </w:rPr>
     </w:lvl>
   </w:abstractNum>
-  <w:abstractNum w:abstractNumId="71" w15:restartNumberingAfterBreak="0">
+  <w:abstractNum w:abstractNumId="73" w15:restartNumberingAfterBreak="0">
     <w:nsid w:val="6DD30A0F"/>
     <w:multiLevelType w:val="hybridMultilevel"/>
     <w:tmpl w:val="0E786850"/>
@@ -13446,7 +14921,7 @@
       </w:pPr>
     </w:lvl>
   </w:abstractNum>
-  <w:abstractNum w:abstractNumId="72" w15:restartNumberingAfterBreak="0">
+  <w:abstractNum w:abstractNumId="74" w15:restartNumberingAfterBreak="0">
     <w:nsid w:val="783E2CBC"/>
     <w:multiLevelType w:val="multilevel"/>
     <w:tmpl w:val="E94A3B26"/>
@@ -13559,7 +15034,7 @@
       </w:pPr>
     </w:lvl>
   </w:abstractNum>
-  <w:abstractNum w:abstractNumId="73" w15:restartNumberingAfterBreak="0">
+  <w:abstractNum w:abstractNumId="75" w15:restartNumberingAfterBreak="0">
     <w:nsid w:val="789F4CE1"/>
     <w:multiLevelType w:val="multilevel"/>
     <w:tmpl w:val="1CE860BA"/>
@@ -13672,7 +15147,7 @@
       </w:rPr>
     </w:lvl>
   </w:abstractNum>
-  <w:abstractNum w:abstractNumId="74" w15:restartNumberingAfterBreak="0">
+  <w:abstractNum w:abstractNumId="76" w15:restartNumberingAfterBreak="0">
     <w:nsid w:val="79730313"/>
     <w:multiLevelType w:val="multilevel"/>
     <w:tmpl w:val="68842356"/>
@@ -13818,7 +15293,93 @@
       </w:rPr>
     </w:lvl>
   </w:abstractNum>
-  <w:abstractNum w:abstractNumId="75" w15:restartNumberingAfterBreak="0">
+  <w:abstractNum w:abstractNumId="77" w15:restartNumberingAfterBreak="0">
+    <w:nsid w:val="799807AF"/>
+    <w:multiLevelType w:val="hybridMultilevel"/>
+    <w:tmpl w:val="EF24C848"/>
+    <w:lvl w:ilvl="0" w:tplc="0409000F">
+      <w:start w:val="1"/>
+      <w:numFmt w:val="decimal"/>
+      <w:lvlText w:val="%1."/>
+      <w:lvlJc w:val="left"/>
+      <w:pPr>
+        <w:ind w:left="720" w:hanging="360"/>
+      </w:pPr>
+    </w:lvl>
+    <w:lvl w:ilvl="1" w:tplc="04090019" w:tentative="1">
+      <w:start w:val="1"/>
+      <w:numFmt w:val="lowerLetter"/>
+      <w:lvlText w:val="%2."/>
+      <w:lvlJc w:val="left"/>
+      <w:pPr>
+        <w:ind w:left="1440" w:hanging="360"/>
+      </w:pPr>
+    </w:lvl>
+    <w:lvl w:ilvl="2" w:tplc="0409001B" w:tentative="1">
+      <w:start w:val="1"/>
+      <w:numFmt w:val="lowerRoman"/>
+      <w:lvlText w:val="%3."/>
+      <w:lvlJc w:val="right"/>
+      <w:pPr>
+        <w:ind w:left="2160" w:hanging="180"/>
+      </w:pPr>
+    </w:lvl>
+    <w:lvl w:ilvl="3" w:tplc="0409000F" w:tentative="1">
+      <w:start w:val="1"/>
+      <w:numFmt w:val="decimal"/>
+      <w:lvlText w:val="%4."/>
+      <w:lvlJc w:val="left"/>
+      <w:pPr>
+        <w:ind w:left="2880" w:hanging="360"/>
+      </w:pPr>
+    </w:lvl>
+    <w:lvl w:ilvl="4" w:tplc="04090019" w:tentative="1">
+      <w:start w:val="1"/>
+      <w:numFmt w:val="lowerLetter"/>
+      <w:lvlText w:val="%5."/>
+      <w:lvlJc w:val="left"/>
+      <w:pPr>
+        <w:ind w:left="3600" w:hanging="360"/>
+      </w:pPr>
+    </w:lvl>
+    <w:lvl w:ilvl="5" w:tplc="0409001B" w:tentative="1">
+      <w:start w:val="1"/>
+      <w:numFmt w:val="lowerRoman"/>
+      <w:lvlText w:val="%6."/>
+      <w:lvlJc w:val="right"/>
+      <w:pPr>
+        <w:ind w:left="4320" w:hanging="180"/>
+      </w:pPr>
+    </w:lvl>
+    <w:lvl w:ilvl="6" w:tplc="0409000F" w:tentative="1">
+      <w:start w:val="1"/>
+      <w:numFmt w:val="decimal"/>
+      <w:lvlText w:val="%7."/>
+      <w:lvlJc w:val="left"/>
+      <w:pPr>
+        <w:ind w:left="5040" w:hanging="360"/>
+      </w:pPr>
+    </w:lvl>
+    <w:lvl w:ilvl="7" w:tplc="04090019" w:tentative="1">
+      <w:start w:val="1"/>
+      <w:numFmt w:val="lowerLetter"/>
+      <w:lvlText w:val="%8."/>
+      <w:lvlJc w:val="left"/>
+      <w:pPr>
+        <w:ind w:left="5760" w:hanging="360"/>
+      </w:pPr>
+    </w:lvl>
+    <w:lvl w:ilvl="8" w:tplc="0409001B" w:tentative="1">
+      <w:start w:val="1"/>
+      <w:numFmt w:val="lowerRoman"/>
+      <w:lvlText w:val="%9."/>
+      <w:lvlJc w:val="right"/>
+      <w:pPr>
+        <w:ind w:left="6480" w:hanging="180"/>
+      </w:pPr>
+    </w:lvl>
+  </w:abstractNum>
+  <w:abstractNum w:abstractNumId="78" w15:restartNumberingAfterBreak="0">
     <w:nsid w:val="7A9B5389"/>
     <w:multiLevelType w:val="hybridMultilevel"/>
     <w:tmpl w:val="0912629C"/>
@@ -13904,7 +15465,7 @@
       </w:pPr>
     </w:lvl>
   </w:abstractNum>
-  <w:abstractNum w:abstractNumId="76" w15:restartNumberingAfterBreak="0">
+  <w:abstractNum w:abstractNumId="79" w15:restartNumberingAfterBreak="0">
     <w:nsid w:val="7AEC76B6"/>
     <w:multiLevelType w:val="multilevel"/>
     <w:tmpl w:val="FDFC4E2E"/>
@@ -14050,7 +15611,7 @@
       </w:rPr>
     </w:lvl>
   </w:abstractNum>
-  <w:abstractNum w:abstractNumId="77" w15:restartNumberingAfterBreak="0">
+  <w:abstractNum w:abstractNumId="80" w15:restartNumberingAfterBreak="0">
     <w:nsid w:val="7C2A1A77"/>
     <w:multiLevelType w:val="hybridMultilevel"/>
     <w:tmpl w:val="1CFEC05E"/>
@@ -14140,61 +15701,61 @@
     <w:abstractNumId w:val="4"/>
   </w:num>
   <w:num w:numId="2" w16cid:durableId="1521433076">
-    <w:abstractNumId w:val="37"/>
+    <w:abstractNumId w:val="38"/>
   </w:num>
   <w:num w:numId="3" w16cid:durableId="1169172737">
-    <w:abstractNumId w:val="23"/>
+    <w:abstractNumId w:val="24"/>
   </w:num>
   <w:num w:numId="4" w16cid:durableId="1095663320">
-    <w:abstractNumId w:val="20"/>
+    <w:abstractNumId w:val="21"/>
   </w:num>
   <w:num w:numId="5" w16cid:durableId="320277980">
-    <w:abstractNumId w:val="73"/>
+    <w:abstractNumId w:val="75"/>
   </w:num>
   <w:num w:numId="6" w16cid:durableId="480125140">
-    <w:abstractNumId w:val="50"/>
+    <w:abstractNumId w:val="52"/>
   </w:num>
   <w:num w:numId="7" w16cid:durableId="1312128570">
-    <w:abstractNumId w:val="72"/>
+    <w:abstractNumId w:val="74"/>
   </w:num>
   <w:num w:numId="8" w16cid:durableId="721293094">
-    <w:abstractNumId w:val="58"/>
+    <w:abstractNumId w:val="60"/>
   </w:num>
   <w:num w:numId="9" w16cid:durableId="623655124">
-    <w:abstractNumId w:val="59"/>
+    <w:abstractNumId w:val="61"/>
   </w:num>
   <w:num w:numId="10" w16cid:durableId="433673490">
+    <w:abstractNumId w:val="47"/>
+  </w:num>
+  <w:num w:numId="11" w16cid:durableId="666246274">
+    <w:abstractNumId w:val="71"/>
+  </w:num>
+  <w:num w:numId="12" w16cid:durableId="1583947328">
+    <w:abstractNumId w:val="67"/>
+  </w:num>
+  <w:num w:numId="13" w16cid:durableId="1561015977">
     <w:abstractNumId w:val="45"/>
   </w:num>
-  <w:num w:numId="11" w16cid:durableId="666246274">
-    <w:abstractNumId w:val="69"/>
-  </w:num>
-  <w:num w:numId="12" w16cid:durableId="1583947328">
-    <w:abstractNumId w:val="65"/>
-  </w:num>
-  <w:num w:numId="13" w16cid:durableId="1561015977">
-    <w:abstractNumId w:val="43"/>
-  </w:num>
   <w:num w:numId="14" w16cid:durableId="1813788044">
-    <w:abstractNumId w:val="39"/>
+    <w:abstractNumId w:val="40"/>
   </w:num>
   <w:num w:numId="15" w16cid:durableId="1516311903">
-    <w:abstractNumId w:val="74"/>
+    <w:abstractNumId w:val="76"/>
   </w:num>
   <w:num w:numId="16" w16cid:durableId="700788812">
-    <w:abstractNumId w:val="25"/>
+    <w:abstractNumId w:val="26"/>
   </w:num>
   <w:num w:numId="17" w16cid:durableId="738552033">
-    <w:abstractNumId w:val="14"/>
+    <w:abstractNumId w:val="15"/>
   </w:num>
   <w:num w:numId="18" w16cid:durableId="506284840">
-    <w:abstractNumId w:val="42"/>
+    <w:abstractNumId w:val="44"/>
   </w:num>
   <w:num w:numId="19" w16cid:durableId="281688829">
-    <w:abstractNumId w:val="26"/>
+    <w:abstractNumId w:val="27"/>
   </w:num>
   <w:num w:numId="20" w16cid:durableId="1440640888">
-    <w:abstractNumId w:val="32"/>
+    <w:abstractNumId w:val="33"/>
   </w:num>
   <w:num w:numId="21" w16cid:durableId="908731130">
     <w:abstractNumId w:val="8"/>
@@ -14203,34 +15764,34 @@
     <w:abstractNumId w:val="6"/>
   </w:num>
   <w:num w:numId="23" w16cid:durableId="1576740101">
-    <w:abstractNumId w:val="70"/>
+    <w:abstractNumId w:val="72"/>
   </w:num>
   <w:num w:numId="24" w16cid:durableId="524516724">
-    <w:abstractNumId w:val="56"/>
+    <w:abstractNumId w:val="58"/>
   </w:num>
   <w:num w:numId="25" w16cid:durableId="1680624365">
     <w:abstractNumId w:val="10"/>
   </w:num>
   <w:num w:numId="26" w16cid:durableId="16082667">
-    <w:abstractNumId w:val="49"/>
+    <w:abstractNumId w:val="51"/>
   </w:num>
   <w:num w:numId="27" w16cid:durableId="691566847">
-    <w:abstractNumId w:val="31"/>
+    <w:abstractNumId w:val="32"/>
   </w:num>
   <w:num w:numId="28" w16cid:durableId="2094620173">
-    <w:abstractNumId w:val="60"/>
+    <w:abstractNumId w:val="62"/>
   </w:num>
   <w:num w:numId="29" w16cid:durableId="906111721">
     <w:abstractNumId w:val="12"/>
   </w:num>
   <w:num w:numId="30" w16cid:durableId="508177387">
-    <w:abstractNumId w:val="44"/>
+    <w:abstractNumId w:val="46"/>
   </w:num>
   <w:num w:numId="31" w16cid:durableId="913011401">
-    <w:abstractNumId w:val="76"/>
+    <w:abstractNumId w:val="79"/>
   </w:num>
   <w:num w:numId="32" w16cid:durableId="1644390964">
-    <w:abstractNumId w:val="63"/>
+    <w:abstractNumId w:val="65"/>
   </w:num>
   <w:num w:numId="33" w16cid:durableId="778261706">
     <w:abstractNumId w:val="5"/>
@@ -14239,10 +15800,10 @@
     <w:abstractNumId w:val="9"/>
   </w:num>
   <w:num w:numId="35" w16cid:durableId="531498289">
-    <w:abstractNumId w:val="54"/>
+    <w:abstractNumId w:val="56"/>
   </w:num>
   <w:num w:numId="36" w16cid:durableId="1777824409">
-    <w:abstractNumId w:val="35"/>
+    <w:abstractNumId w:val="36"/>
   </w:num>
   <w:num w:numId="37" w16cid:durableId="1510942739">
     <w:abstractNumId w:val="3"/>
@@ -14251,31 +15812,31 @@
     <w:abstractNumId w:val="13"/>
   </w:num>
   <w:num w:numId="39" w16cid:durableId="579490765">
-    <w:abstractNumId w:val="36"/>
+    <w:abstractNumId w:val="37"/>
   </w:num>
   <w:num w:numId="40" w16cid:durableId="160776597">
-    <w:abstractNumId w:val="66"/>
+    <w:abstractNumId w:val="68"/>
   </w:num>
   <w:num w:numId="41" w16cid:durableId="1975864769">
-    <w:abstractNumId w:val="34"/>
+    <w:abstractNumId w:val="35"/>
   </w:num>
   <w:num w:numId="42" w16cid:durableId="2089038878">
-    <w:abstractNumId w:val="38"/>
+    <w:abstractNumId w:val="39"/>
   </w:num>
   <w:num w:numId="43" w16cid:durableId="1084838402">
-    <w:abstractNumId w:val="29"/>
+    <w:abstractNumId w:val="30"/>
   </w:num>
   <w:num w:numId="44" w16cid:durableId="2133208309">
-    <w:abstractNumId w:val="51"/>
+    <w:abstractNumId w:val="53"/>
   </w:num>
   <w:num w:numId="45" w16cid:durableId="1696272327">
-    <w:abstractNumId w:val="18"/>
+    <w:abstractNumId w:val="19"/>
   </w:num>
   <w:num w:numId="46" w16cid:durableId="952831626">
-    <w:abstractNumId w:val="55"/>
+    <w:abstractNumId w:val="57"/>
   </w:num>
   <w:num w:numId="47" w16cid:durableId="506284221">
-    <w:abstractNumId w:val="24"/>
+    <w:abstractNumId w:val="25"/>
   </w:num>
   <w:num w:numId="48" w16cid:durableId="1452162523">
     <w:abstractNumId w:val="1"/>
@@ -14284,91 +15845,100 @@
     <w:abstractNumId w:val="2"/>
   </w:num>
   <w:num w:numId="50" w16cid:durableId="1155948849">
-    <w:abstractNumId w:val="68"/>
+    <w:abstractNumId w:val="70"/>
   </w:num>
   <w:num w:numId="51" w16cid:durableId="1018897390">
-    <w:abstractNumId w:val="22"/>
+    <w:abstractNumId w:val="23"/>
   </w:num>
   <w:num w:numId="52" w16cid:durableId="576984722">
     <w:abstractNumId w:val="11"/>
   </w:num>
   <w:num w:numId="53" w16cid:durableId="209266241">
-    <w:abstractNumId w:val="53"/>
+    <w:abstractNumId w:val="55"/>
   </w:num>
   <w:num w:numId="54" w16cid:durableId="1107307833">
-    <w:abstractNumId w:val="33"/>
+    <w:abstractNumId w:val="34"/>
   </w:num>
   <w:num w:numId="55" w16cid:durableId="732049722">
+    <w:abstractNumId w:val="42"/>
+  </w:num>
+  <w:num w:numId="56" w16cid:durableId="620645840">
+    <w:abstractNumId w:val="80"/>
+  </w:num>
+  <w:num w:numId="57" w16cid:durableId="1037123086">
+    <w:abstractNumId w:val="64"/>
+  </w:num>
+  <w:num w:numId="58" w16cid:durableId="529415563">
     <w:abstractNumId w:val="41"/>
   </w:num>
-  <w:num w:numId="56" w16cid:durableId="620645840">
-    <w:abstractNumId w:val="77"/>
-  </w:num>
-  <w:num w:numId="57" w16cid:durableId="1037123086">
-    <w:abstractNumId w:val="62"/>
-  </w:num>
-  <w:num w:numId="58" w16cid:durableId="529415563">
-    <w:abstractNumId w:val="40"/>
-  </w:num>
   <w:num w:numId="59" w16cid:durableId="443574163">
-    <w:abstractNumId w:val="28"/>
+    <w:abstractNumId w:val="29"/>
   </w:num>
   <w:num w:numId="60" w16cid:durableId="1052659940">
     <w:abstractNumId w:val="0"/>
   </w:num>
   <w:num w:numId="61" w16cid:durableId="298078375">
-    <w:abstractNumId w:val="61"/>
+    <w:abstractNumId w:val="63"/>
   </w:num>
   <w:num w:numId="62" w16cid:durableId="1759524910">
-    <w:abstractNumId w:val="67"/>
+    <w:abstractNumId w:val="69"/>
   </w:num>
   <w:num w:numId="63" w16cid:durableId="328562634">
-    <w:abstractNumId w:val="57"/>
+    <w:abstractNumId w:val="59"/>
   </w:num>
   <w:num w:numId="64" w16cid:durableId="1926844191">
-    <w:abstractNumId w:val="19"/>
+    <w:abstractNumId w:val="20"/>
   </w:num>
   <w:num w:numId="65" w16cid:durableId="835921495">
-    <w:abstractNumId w:val="21"/>
+    <w:abstractNumId w:val="22"/>
   </w:num>
   <w:num w:numId="66" w16cid:durableId="1922833492">
-    <w:abstractNumId w:val="71"/>
+    <w:abstractNumId w:val="73"/>
   </w:num>
   <w:num w:numId="67" w16cid:durableId="312099731">
-    <w:abstractNumId w:val="27"/>
+    <w:abstractNumId w:val="28"/>
   </w:num>
   <w:num w:numId="68" w16cid:durableId="1465464951">
-    <w:abstractNumId w:val="64"/>
+    <w:abstractNumId w:val="66"/>
   </w:num>
   <w:num w:numId="69" w16cid:durableId="2120486911">
-    <w:abstractNumId w:val="47"/>
+    <w:abstractNumId w:val="49"/>
   </w:num>
   <w:num w:numId="70" w16cid:durableId="1020357403">
-    <w:abstractNumId w:val="46"/>
+    <w:abstractNumId w:val="48"/>
   </w:num>
   <w:num w:numId="71" w16cid:durableId="881285303">
-    <w:abstractNumId w:val="30"/>
+    <w:abstractNumId w:val="31"/>
   </w:num>
   <w:num w:numId="72" w16cid:durableId="1767578752">
-    <w:abstractNumId w:val="15"/>
+    <w:abstractNumId w:val="16"/>
   </w:num>
   <w:num w:numId="73" w16cid:durableId="1129400013">
-    <w:abstractNumId w:val="75"/>
+    <w:abstractNumId w:val="78"/>
   </w:num>
   <w:num w:numId="74" w16cid:durableId="463356695">
     <w:abstractNumId w:val="7"/>
   </w:num>
   <w:num w:numId="75" w16cid:durableId="1833176036">
-    <w:abstractNumId w:val="48"/>
+    <w:abstractNumId w:val="50"/>
   </w:num>
   <w:num w:numId="76" w16cid:durableId="1358582527">
-    <w:abstractNumId w:val="52"/>
+    <w:abstractNumId w:val="54"/>
   </w:num>
   <w:num w:numId="77" w16cid:durableId="1392076817">
-    <w:abstractNumId w:val="16"/>
+    <w:abstractNumId w:val="17"/>
   </w:num>
   <w:num w:numId="78" w16cid:durableId="492450337">
-    <w:abstractNumId w:val="17"/>
+    <w:abstractNumId w:val="18"/>
+  </w:num>
+  <w:num w:numId="79" w16cid:durableId="1408528616">
+    <w:abstractNumId w:val="43"/>
+  </w:num>
+  <w:num w:numId="80" w16cid:durableId="1705012468">
+    <w:abstractNumId w:val="14"/>
+  </w:num>
+  <w:num w:numId="81" w16cid:durableId="2102411000">
+    <w:abstractNumId w:val="77"/>
   </w:num>
 </w:numbering>
 </file>
@@ -14386,11 +15956,7 @@
         <w14:ligatures w14:val="standardContextual"/>
       </w:rPr>
     </w:rPrDefault>
-    <w:pPrDefault>
-      <w:pPr>
-        <w:spacing w:after="160" w:line="278" w:lineRule="auto"/>
-      </w:pPr>
-    </w:pPrDefault>
+    <w:pPrDefault/>
   </w:docDefaults>
   <w:latentStyles w:defLockedState="0" w:defUIPriority="99" w:defSemiHidden="0" w:defUnhideWhenUsed="0" w:defQFormat="0" w:count="376">
     <w:lsdException w:name="Normal" w:uiPriority="0" w:qFormat="1"/>
@@ -14774,9 +16340,6 @@
     <w:name w:val="Normal"/>
     <w:qFormat/>
     <w:rsid w:val="005D12BE"/>
-    <w:pPr>
-      <w:spacing w:after="0" w:line="240" w:lineRule="auto"/>
-    </w:pPr>
     <w:rPr>
       <w:rFonts w:ascii="Times New Roman" w:eastAsia="Times New Roman" w:hAnsi="Times New Roman" w:cs="Times New Roman"/>
       <w:kern w:val="0"/>
@@ -14981,7 +16544,6 @@
   <w:style w:type="character" w:default="1" w:styleId="DefaultParagraphFont">
     <w:name w:val="Default Paragraph Font"/>
     <w:uiPriority w:val="1"/>
-    <w:semiHidden/>
     <w:unhideWhenUsed/>
   </w:style>
   <w:style w:type="table" w:default="1" w:styleId="TableNormal">
@@ -15446,9 +17008,6 @@
     <w:basedOn w:val="TableNormal"/>
     <w:uiPriority w:val="48"/>
     <w:rsid w:val="001B440B"/>
-    <w:pPr>
-      <w:spacing w:after="0" w:line="240" w:lineRule="auto"/>
-    </w:pPr>
     <w:rPr>
       <w:sz w:val="22"/>
       <w:szCs w:val="22"/>
@@ -15580,9 +17139,6 @@
     <w:basedOn w:val="TableNormal"/>
     <w:uiPriority w:val="39"/>
     <w:rsid w:val="00356492"/>
-    <w:pPr>
-      <w:spacing w:after="0" w:line="240" w:lineRule="auto"/>
-    </w:pPr>
     <w:rPr>
       <w:sz w:val="22"/>
       <w:szCs w:val="22"/>

</xml_diff>

<commit_message>
Adding updated Research Document
</commit_message>
<xml_diff>
--- a/docs/Rustamov Temur C00280204 Final Report.docx
+++ b/docs/Rustamov Temur C00280204 Final Report.docx
@@ -77,13 +77,8 @@
         <w:jc w:val="center"/>
       </w:pPr>
       <w:r>
-        <w:rPr>
-          <w:noProof/>
-        </w:rPr>
-      </w:r>
-      <w:r>
-        <w:pict w14:anchorId="47366D20">
-          <v:rect id="Rectangle 75" o:spid="_x0000_s2051" style="width:468pt;height:.05pt;visibility:visible;mso-wrap-style:square;mso-left-percent:-10001;mso-top-percent:-10001;mso-position-horizontal:absolute;mso-position-horizontal-relative:char;mso-position-vertical:absolute;mso-position-vertical-relative:line;mso-left-percent:-10001;mso-top-percent:-10001;v-text-anchor:top" o:gfxdata="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" filled="f">
+        <w:pict w14:anchorId="1AA6C015">
+          <v:rect id="Rectangle 75" o:spid="_x0000_s2051" alt="" style="width:468pt;height:.05pt;visibility:visible;mso-wrap-style:square;mso-width-percent:0;mso-height-percent:0;mso-left-percent:-10001;mso-top-percent:-10001;mso-position-horizontal:absolute;mso-position-horizontal-relative:char;mso-position-vertical:absolute;mso-position-vertical-relative:line;mso-width-percent:0;mso-height-percent:0;mso-left-percent:-10001;mso-top-percent:-10001;v-text-anchor:top" filled="f">
             <o:lock v:ext="edit" aspectratio="t"/>
             <w10:anchorlock/>
           </v:rect>
@@ -139,13 +134,8 @@
         <w:jc w:val="center"/>
       </w:pPr>
       <w:r>
-        <w:rPr>
-          <w:noProof/>
-        </w:rPr>
-      </w:r>
-      <w:r>
-        <w:pict w14:anchorId="500E2176">
-          <v:rect id="Rectangle 73" o:spid="_x0000_s2050" style="width:468pt;height:.05pt;visibility:visible;mso-wrap-style:square;mso-left-percent:-10001;mso-top-percent:-10001;mso-position-horizontal:absolute;mso-position-horizontal-relative:char;mso-position-vertical:absolute;mso-position-vertical-relative:line;mso-left-percent:-10001;mso-top-percent:-10001;v-text-anchor:top" o:gfxdata="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" filled="f">
+        <w:pict w14:anchorId="2D975B5B">
+          <v:rect id="Rectangle 73" o:spid="_x0000_s2050" alt="" style="width:468pt;height:.05pt;visibility:visible;mso-wrap-style:square;mso-width-percent:0;mso-height-percent:0;mso-left-percent:-10001;mso-top-percent:-10001;mso-position-horizontal:absolute;mso-position-horizontal-relative:char;mso-position-vertical:absolute;mso-position-vertical-relative:line;mso-width-percent:0;mso-height-percent:0;mso-left-percent:-10001;mso-top-percent:-10001;v-text-anchor:top" filled="f">
             <o:lock v:ext="edit" aspectratio="t"/>
             <w10:anchorlock/>
           </v:rect>
@@ -467,12 +457,24 @@
             </w:rPr>
           </w:pPr>
           <w:r>
+            <w:rPr>
+              <w:i w:val="0"/>
+              <w:iCs w:val="0"/>
+            </w:rPr>
             <w:fldChar w:fldCharType="begin"/>
           </w:r>
           <w:r>
+            <w:rPr>
+              <w:i w:val="0"/>
+              <w:iCs w:val="0"/>
+            </w:rPr>
             <w:instrText xml:space="preserve"> TOC \o "1-3" \h \z \u </w:instrText>
           </w:r>
           <w:r>
+            <w:rPr>
+              <w:i w:val="0"/>
+              <w:iCs w:val="0"/>
+            </w:rPr>
             <w:fldChar w:fldCharType="separate"/>
           </w:r>
           <w:hyperlink w:anchor="_Toc227193109" w:history="1">
@@ -480,6 +482,8 @@
               <w:rPr>
                 <w:rStyle w:val="Hyperlink"/>
                 <w:rFonts w:ascii="Times New Roman" w:hAnsi="Times New Roman"/>
+                <w:i w:val="0"/>
+                <w:iCs w:val="0"/>
                 <w:noProof/>
               </w:rPr>
               <w:t>1.</w:t>
@@ -501,12 +505,16 @@
               <w:rPr>
                 <w:rStyle w:val="Hyperlink"/>
                 <w:rFonts w:ascii="Times New Roman" w:hAnsi="Times New Roman"/>
+                <w:i w:val="0"/>
+                <w:iCs w:val="0"/>
                 <w:noProof/>
               </w:rPr>
               <w:t>Abstract</w:t>
             </w:r>
             <w:r>
               <w:rPr>
+                <w:i w:val="0"/>
+                <w:iCs w:val="0"/>
                 <w:noProof/>
                 <w:webHidden/>
               </w:rPr>
@@ -514,6 +522,8 @@
             </w:r>
             <w:r>
               <w:rPr>
+                <w:i w:val="0"/>
+                <w:iCs w:val="0"/>
                 <w:noProof/>
                 <w:webHidden/>
               </w:rPr>
@@ -521,6 +531,8 @@
             </w:r>
             <w:r>
               <w:rPr>
+                <w:i w:val="0"/>
+                <w:iCs w:val="0"/>
                 <w:noProof/>
                 <w:webHidden/>
               </w:rPr>
@@ -528,12 +540,16 @@
             </w:r>
             <w:r>
               <w:rPr>
-                <w:noProof/>
-                <w:webHidden/>
-              </w:rPr>
-            </w:r>
-            <w:r>
-              <w:rPr>
+                <w:i w:val="0"/>
+                <w:iCs w:val="0"/>
+                <w:noProof/>
+                <w:webHidden/>
+              </w:rPr>
+            </w:r>
+            <w:r>
+              <w:rPr>
+                <w:i w:val="0"/>
+                <w:iCs w:val="0"/>
                 <w:noProof/>
                 <w:webHidden/>
               </w:rPr>
@@ -541,6 +557,8 @@
             </w:r>
             <w:r>
               <w:rPr>
+                <w:i w:val="0"/>
+                <w:iCs w:val="0"/>
                 <w:noProof/>
                 <w:webHidden/>
               </w:rPr>
@@ -548,6 +566,8 @@
             </w:r>
             <w:r>
               <w:rPr>
+                <w:i w:val="0"/>
+                <w:iCs w:val="0"/>
                 <w:noProof/>
                 <w:webHidden/>
               </w:rPr>
@@ -578,6 +598,8 @@
               <w:rPr>
                 <w:rStyle w:val="Hyperlink"/>
                 <w:rFonts w:ascii="Times New Roman" w:hAnsi="Times New Roman"/>
+                <w:i w:val="0"/>
+                <w:iCs w:val="0"/>
                 <w:noProof/>
               </w:rPr>
               <w:t>2.</w:t>
@@ -599,12 +621,16 @@
               <w:rPr>
                 <w:rStyle w:val="Hyperlink"/>
                 <w:rFonts w:ascii="Times New Roman" w:hAnsi="Times New Roman"/>
+                <w:i w:val="0"/>
+                <w:iCs w:val="0"/>
                 <w:noProof/>
               </w:rPr>
               <w:t>Introduction</w:t>
             </w:r>
             <w:r>
               <w:rPr>
+                <w:i w:val="0"/>
+                <w:iCs w:val="0"/>
                 <w:noProof/>
                 <w:webHidden/>
               </w:rPr>
@@ -612,6 +638,8 @@
             </w:r>
             <w:r>
               <w:rPr>
+                <w:i w:val="0"/>
+                <w:iCs w:val="0"/>
                 <w:noProof/>
                 <w:webHidden/>
               </w:rPr>
@@ -619,6 +647,8 @@
             </w:r>
             <w:r>
               <w:rPr>
+                <w:i w:val="0"/>
+                <w:iCs w:val="0"/>
                 <w:noProof/>
                 <w:webHidden/>
               </w:rPr>
@@ -626,12 +656,16 @@
             </w:r>
             <w:r>
               <w:rPr>
-                <w:noProof/>
-                <w:webHidden/>
-              </w:rPr>
-            </w:r>
-            <w:r>
-              <w:rPr>
+                <w:i w:val="0"/>
+                <w:iCs w:val="0"/>
+                <w:noProof/>
+                <w:webHidden/>
+              </w:rPr>
+            </w:r>
+            <w:r>
+              <w:rPr>
+                <w:i w:val="0"/>
+                <w:iCs w:val="0"/>
                 <w:noProof/>
                 <w:webHidden/>
               </w:rPr>
@@ -639,6 +673,8 @@
             </w:r>
             <w:r>
               <w:rPr>
+                <w:i w:val="0"/>
+                <w:iCs w:val="0"/>
                 <w:noProof/>
                 <w:webHidden/>
               </w:rPr>
@@ -646,6 +682,8 @@
             </w:r>
             <w:r>
               <w:rPr>
+                <w:i w:val="0"/>
+                <w:iCs w:val="0"/>
                 <w:noProof/>
                 <w:webHidden/>
               </w:rPr>
@@ -676,6 +714,8 @@
               <w:rPr>
                 <w:rStyle w:val="Hyperlink"/>
                 <w:rFonts w:ascii="Times New Roman" w:hAnsi="Times New Roman"/>
+                <w:i w:val="0"/>
+                <w:iCs w:val="0"/>
                 <w:noProof/>
               </w:rPr>
               <w:t>3.</w:t>
@@ -697,12 +737,16 @@
               <w:rPr>
                 <w:rStyle w:val="Hyperlink"/>
                 <w:rFonts w:ascii="Times New Roman" w:hAnsi="Times New Roman"/>
+                <w:i w:val="0"/>
+                <w:iCs w:val="0"/>
                 <w:noProof/>
               </w:rPr>
               <w:t>Final System Overview</w:t>
             </w:r>
             <w:r>
               <w:rPr>
+                <w:i w:val="0"/>
+                <w:iCs w:val="0"/>
                 <w:noProof/>
                 <w:webHidden/>
               </w:rPr>
@@ -710,6 +754,8 @@
             </w:r>
             <w:r>
               <w:rPr>
+                <w:i w:val="0"/>
+                <w:iCs w:val="0"/>
                 <w:noProof/>
                 <w:webHidden/>
               </w:rPr>
@@ -717,6 +763,8 @@
             </w:r>
             <w:r>
               <w:rPr>
+                <w:i w:val="0"/>
+                <w:iCs w:val="0"/>
                 <w:noProof/>
                 <w:webHidden/>
               </w:rPr>
@@ -724,12 +772,16 @@
             </w:r>
             <w:r>
               <w:rPr>
-                <w:noProof/>
-                <w:webHidden/>
-              </w:rPr>
-            </w:r>
-            <w:r>
-              <w:rPr>
+                <w:i w:val="0"/>
+                <w:iCs w:val="0"/>
+                <w:noProof/>
+                <w:webHidden/>
+              </w:rPr>
+            </w:r>
+            <w:r>
+              <w:rPr>
+                <w:i w:val="0"/>
+                <w:iCs w:val="0"/>
                 <w:noProof/>
                 <w:webHidden/>
               </w:rPr>
@@ -737,6 +789,8 @@
             </w:r>
             <w:r>
               <w:rPr>
+                <w:i w:val="0"/>
+                <w:iCs w:val="0"/>
                 <w:noProof/>
                 <w:webHidden/>
               </w:rPr>
@@ -744,6 +798,8 @@
             </w:r>
             <w:r>
               <w:rPr>
+                <w:i w:val="0"/>
+                <w:iCs w:val="0"/>
                 <w:noProof/>
                 <w:webHidden/>
               </w:rPr>
@@ -1602,6 +1658,8 @@
               <w:rPr>
                 <w:rStyle w:val="Hyperlink"/>
                 <w:rFonts w:ascii="Times New Roman" w:hAnsi="Times New Roman"/>
+                <w:i w:val="0"/>
+                <w:iCs w:val="0"/>
                 <w:noProof/>
               </w:rPr>
               <w:t>4.</w:t>
@@ -1623,12 +1681,16 @@
               <w:rPr>
                 <w:rStyle w:val="Hyperlink"/>
                 <w:rFonts w:ascii="Times New Roman" w:hAnsi="Times New Roman"/>
+                <w:i w:val="0"/>
+                <w:iCs w:val="0"/>
                 <w:noProof/>
               </w:rPr>
               <w:t>Technical Implementation</w:t>
             </w:r>
             <w:r>
               <w:rPr>
+                <w:i w:val="0"/>
+                <w:iCs w:val="0"/>
                 <w:noProof/>
                 <w:webHidden/>
               </w:rPr>
@@ -1636,6 +1698,8 @@
             </w:r>
             <w:r>
               <w:rPr>
+                <w:i w:val="0"/>
+                <w:iCs w:val="0"/>
                 <w:noProof/>
                 <w:webHidden/>
               </w:rPr>
@@ -1643,6 +1707,8 @@
             </w:r>
             <w:r>
               <w:rPr>
+                <w:i w:val="0"/>
+                <w:iCs w:val="0"/>
                 <w:noProof/>
                 <w:webHidden/>
               </w:rPr>
@@ -1650,12 +1716,16 @@
             </w:r>
             <w:r>
               <w:rPr>
-                <w:noProof/>
-                <w:webHidden/>
-              </w:rPr>
-            </w:r>
-            <w:r>
-              <w:rPr>
+                <w:i w:val="0"/>
+                <w:iCs w:val="0"/>
+                <w:noProof/>
+                <w:webHidden/>
+              </w:rPr>
+            </w:r>
+            <w:r>
+              <w:rPr>
+                <w:i w:val="0"/>
+                <w:iCs w:val="0"/>
                 <w:noProof/>
                 <w:webHidden/>
               </w:rPr>
@@ -1663,6 +1733,8 @@
             </w:r>
             <w:r>
               <w:rPr>
+                <w:i w:val="0"/>
+                <w:iCs w:val="0"/>
                 <w:noProof/>
                 <w:webHidden/>
               </w:rPr>
@@ -1670,6 +1742,8 @@
             </w:r>
             <w:r>
               <w:rPr>
+                <w:i w:val="0"/>
+                <w:iCs w:val="0"/>
                 <w:noProof/>
                 <w:webHidden/>
               </w:rPr>
@@ -3448,6 +3522,8 @@
               <w:rPr>
                 <w:rStyle w:val="Hyperlink"/>
                 <w:rFonts w:ascii="Times New Roman" w:hAnsi="Times New Roman"/>
+                <w:i w:val="0"/>
+                <w:iCs w:val="0"/>
                 <w:noProof/>
               </w:rPr>
               <w:t>5.</w:t>
@@ -3469,12 +3545,16 @@
               <w:rPr>
                 <w:rStyle w:val="Hyperlink"/>
                 <w:rFonts w:ascii="Times New Roman" w:hAnsi="Times New Roman"/>
+                <w:i w:val="0"/>
+                <w:iCs w:val="0"/>
                 <w:noProof/>
               </w:rPr>
               <w:t>Testing and Evaluation</w:t>
             </w:r>
             <w:r>
               <w:rPr>
+                <w:i w:val="0"/>
+                <w:iCs w:val="0"/>
                 <w:noProof/>
                 <w:webHidden/>
               </w:rPr>
@@ -3482,6 +3562,8 @@
             </w:r>
             <w:r>
               <w:rPr>
+                <w:i w:val="0"/>
+                <w:iCs w:val="0"/>
                 <w:noProof/>
                 <w:webHidden/>
               </w:rPr>
@@ -3489,6 +3571,8 @@
             </w:r>
             <w:r>
               <w:rPr>
+                <w:i w:val="0"/>
+                <w:iCs w:val="0"/>
                 <w:noProof/>
                 <w:webHidden/>
               </w:rPr>
@@ -3496,12 +3580,16 @@
             </w:r>
             <w:r>
               <w:rPr>
-                <w:noProof/>
-                <w:webHidden/>
-              </w:rPr>
-            </w:r>
-            <w:r>
-              <w:rPr>
+                <w:i w:val="0"/>
+                <w:iCs w:val="0"/>
+                <w:noProof/>
+                <w:webHidden/>
+              </w:rPr>
+            </w:r>
+            <w:r>
+              <w:rPr>
+                <w:i w:val="0"/>
+                <w:iCs w:val="0"/>
                 <w:noProof/>
                 <w:webHidden/>
               </w:rPr>
@@ -3509,6 +3597,8 @@
             </w:r>
             <w:r>
               <w:rPr>
+                <w:i w:val="0"/>
+                <w:iCs w:val="0"/>
                 <w:noProof/>
                 <w:webHidden/>
               </w:rPr>
@@ -3516,6 +3606,8 @@
             </w:r>
             <w:r>
               <w:rPr>
+                <w:i w:val="0"/>
+                <w:iCs w:val="0"/>
                 <w:noProof/>
                 <w:webHidden/>
               </w:rPr>
@@ -4006,6 +4098,8 @@
               <w:rPr>
                 <w:rStyle w:val="Hyperlink"/>
                 <w:rFonts w:ascii="Times New Roman" w:hAnsi="Times New Roman"/>
+                <w:i w:val="0"/>
+                <w:iCs w:val="0"/>
                 <w:noProof/>
               </w:rPr>
               <w:t>6.</w:t>
@@ -4027,12 +4121,16 @@
               <w:rPr>
                 <w:rStyle w:val="Hyperlink"/>
                 <w:rFonts w:ascii="Times New Roman" w:hAnsi="Times New Roman"/>
+                <w:i w:val="0"/>
+                <w:iCs w:val="0"/>
                 <w:noProof/>
               </w:rPr>
               <w:t>Project Reflection and Evaluation</w:t>
             </w:r>
             <w:r>
               <w:rPr>
+                <w:i w:val="0"/>
+                <w:iCs w:val="0"/>
                 <w:noProof/>
                 <w:webHidden/>
               </w:rPr>
@@ -4040,6 +4138,8 @@
             </w:r>
             <w:r>
               <w:rPr>
+                <w:i w:val="0"/>
+                <w:iCs w:val="0"/>
                 <w:noProof/>
                 <w:webHidden/>
               </w:rPr>
@@ -4047,6 +4147,8 @@
             </w:r>
             <w:r>
               <w:rPr>
+                <w:i w:val="0"/>
+                <w:iCs w:val="0"/>
                 <w:noProof/>
                 <w:webHidden/>
               </w:rPr>
@@ -4054,12 +4156,16 @@
             </w:r>
             <w:r>
               <w:rPr>
-                <w:noProof/>
-                <w:webHidden/>
-              </w:rPr>
-            </w:r>
-            <w:r>
-              <w:rPr>
+                <w:i w:val="0"/>
+                <w:iCs w:val="0"/>
+                <w:noProof/>
+                <w:webHidden/>
+              </w:rPr>
+            </w:r>
+            <w:r>
+              <w:rPr>
+                <w:i w:val="0"/>
+                <w:iCs w:val="0"/>
                 <w:noProof/>
                 <w:webHidden/>
               </w:rPr>
@@ -4067,6 +4173,8 @@
             </w:r>
             <w:r>
               <w:rPr>
+                <w:i w:val="0"/>
+                <w:iCs w:val="0"/>
                 <w:noProof/>
                 <w:webHidden/>
               </w:rPr>
@@ -4074,6 +4182,8 @@
             </w:r>
             <w:r>
               <w:rPr>
+                <w:i w:val="0"/>
+                <w:iCs w:val="0"/>
                 <w:noProof/>
                 <w:webHidden/>
               </w:rPr>
@@ -4472,6 +4582,8 @@
               <w:rPr>
                 <w:rStyle w:val="Hyperlink"/>
                 <w:rFonts w:ascii="Times New Roman" w:hAnsi="Times New Roman"/>
+                <w:i w:val="0"/>
+                <w:iCs w:val="0"/>
                 <w:noProof/>
               </w:rPr>
               <w:t>6.5</w:t>
@@ -4493,12 +4605,16 @@
               <w:rPr>
                 <w:rStyle w:val="Hyperlink"/>
                 <w:rFonts w:ascii="Times New Roman" w:hAnsi="Times New Roman"/>
+                <w:i w:val="0"/>
+                <w:iCs w:val="0"/>
                 <w:noProof/>
               </w:rPr>
               <w:t>What would be done differently</w:t>
             </w:r>
             <w:r>
               <w:rPr>
+                <w:i w:val="0"/>
+                <w:iCs w:val="0"/>
                 <w:noProof/>
                 <w:webHidden/>
               </w:rPr>
@@ -4506,6 +4622,8 @@
             </w:r>
             <w:r>
               <w:rPr>
+                <w:i w:val="0"/>
+                <w:iCs w:val="0"/>
                 <w:noProof/>
                 <w:webHidden/>
               </w:rPr>
@@ -4513,6 +4631,8 @@
             </w:r>
             <w:r>
               <w:rPr>
+                <w:i w:val="0"/>
+                <w:iCs w:val="0"/>
                 <w:noProof/>
                 <w:webHidden/>
               </w:rPr>
@@ -4520,12 +4640,16 @@
             </w:r>
             <w:r>
               <w:rPr>
-                <w:noProof/>
-                <w:webHidden/>
-              </w:rPr>
-            </w:r>
-            <w:r>
-              <w:rPr>
+                <w:i w:val="0"/>
+                <w:iCs w:val="0"/>
+                <w:noProof/>
+                <w:webHidden/>
+              </w:rPr>
+            </w:r>
+            <w:r>
+              <w:rPr>
+                <w:i w:val="0"/>
+                <w:iCs w:val="0"/>
                 <w:noProof/>
                 <w:webHidden/>
               </w:rPr>
@@ -4533,6 +4657,8 @@
             </w:r>
             <w:r>
               <w:rPr>
+                <w:i w:val="0"/>
+                <w:iCs w:val="0"/>
                 <w:noProof/>
                 <w:webHidden/>
               </w:rPr>
@@ -4540,6 +4666,8 @@
             </w:r>
             <w:r>
               <w:rPr>
+                <w:i w:val="0"/>
+                <w:iCs w:val="0"/>
                 <w:noProof/>
                 <w:webHidden/>
               </w:rPr>
@@ -4662,6 +4790,8 @@
               <w:rPr>
                 <w:rStyle w:val="Hyperlink"/>
                 <w:rFonts w:ascii="Times New Roman" w:hAnsi="Times New Roman"/>
+                <w:i w:val="0"/>
+                <w:iCs w:val="0"/>
                 <w:noProof/>
               </w:rPr>
               <w:t>6.7</w:t>
@@ -4683,12 +4813,16 @@
               <w:rPr>
                 <w:rStyle w:val="Hyperlink"/>
                 <w:rFonts w:ascii="Times New Roman" w:hAnsi="Times New Roman"/>
+                <w:i w:val="0"/>
+                <w:iCs w:val="0"/>
                 <w:noProof/>
               </w:rPr>
               <w:t>Testing Used to Assess the Reliability of the Project</w:t>
             </w:r>
             <w:r>
               <w:rPr>
+                <w:i w:val="0"/>
+                <w:iCs w:val="0"/>
                 <w:noProof/>
                 <w:webHidden/>
               </w:rPr>
@@ -4696,6 +4830,8 @@
             </w:r>
             <w:r>
               <w:rPr>
+                <w:i w:val="0"/>
+                <w:iCs w:val="0"/>
                 <w:noProof/>
                 <w:webHidden/>
               </w:rPr>
@@ -4703,6 +4839,8 @@
             </w:r>
             <w:r>
               <w:rPr>
+                <w:i w:val="0"/>
+                <w:iCs w:val="0"/>
                 <w:noProof/>
                 <w:webHidden/>
               </w:rPr>
@@ -4710,12 +4848,16 @@
             </w:r>
             <w:r>
               <w:rPr>
-                <w:noProof/>
-                <w:webHidden/>
-              </w:rPr>
-            </w:r>
-            <w:r>
-              <w:rPr>
+                <w:i w:val="0"/>
+                <w:iCs w:val="0"/>
+                <w:noProof/>
+                <w:webHidden/>
+              </w:rPr>
+            </w:r>
+            <w:r>
+              <w:rPr>
+                <w:i w:val="0"/>
+                <w:iCs w:val="0"/>
                 <w:noProof/>
                 <w:webHidden/>
               </w:rPr>
@@ -4723,6 +4865,8 @@
             </w:r>
             <w:r>
               <w:rPr>
+                <w:i w:val="0"/>
+                <w:iCs w:val="0"/>
                 <w:noProof/>
                 <w:webHidden/>
               </w:rPr>
@@ -4730,6 +4874,8 @@
             </w:r>
             <w:r>
               <w:rPr>
+                <w:i w:val="0"/>
+                <w:iCs w:val="0"/>
                 <w:noProof/>
                 <w:webHidden/>
               </w:rPr>
@@ -5220,6 +5366,8 @@
               <w:rPr>
                 <w:rStyle w:val="Hyperlink"/>
                 <w:rFonts w:ascii="Times New Roman" w:hAnsi="Times New Roman"/>
+                <w:i w:val="0"/>
+                <w:iCs w:val="0"/>
                 <w:noProof/>
               </w:rPr>
               <w:t>7.</w:t>
@@ -5241,12 +5389,16 @@
               <w:rPr>
                 <w:rStyle w:val="Hyperlink"/>
                 <w:rFonts w:ascii="Times New Roman" w:hAnsi="Times New Roman"/>
+                <w:i w:val="0"/>
+                <w:iCs w:val="0"/>
                 <w:noProof/>
               </w:rPr>
               <w:t>Reference List</w:t>
             </w:r>
             <w:r>
               <w:rPr>
+                <w:i w:val="0"/>
+                <w:iCs w:val="0"/>
                 <w:noProof/>
                 <w:webHidden/>
               </w:rPr>
@@ -5254,6 +5406,8 @@
             </w:r>
             <w:r>
               <w:rPr>
+                <w:i w:val="0"/>
+                <w:iCs w:val="0"/>
                 <w:noProof/>
                 <w:webHidden/>
               </w:rPr>
@@ -5261,6 +5415,8 @@
             </w:r>
             <w:r>
               <w:rPr>
+                <w:i w:val="0"/>
+                <w:iCs w:val="0"/>
                 <w:noProof/>
                 <w:webHidden/>
               </w:rPr>
@@ -5268,12 +5424,16 @@
             </w:r>
             <w:r>
               <w:rPr>
-                <w:noProof/>
-                <w:webHidden/>
-              </w:rPr>
-            </w:r>
-            <w:r>
-              <w:rPr>
+                <w:i w:val="0"/>
+                <w:iCs w:val="0"/>
+                <w:noProof/>
+                <w:webHidden/>
+              </w:rPr>
+            </w:r>
+            <w:r>
+              <w:rPr>
+                <w:i w:val="0"/>
+                <w:iCs w:val="0"/>
                 <w:noProof/>
                 <w:webHidden/>
               </w:rPr>
@@ -5281,6 +5441,8 @@
             </w:r>
             <w:r>
               <w:rPr>
+                <w:i w:val="0"/>
+                <w:iCs w:val="0"/>
                 <w:noProof/>
                 <w:webHidden/>
               </w:rPr>
@@ -5288,6 +5450,8 @@
             </w:r>
             <w:r>
               <w:rPr>
+                <w:i w:val="0"/>
+                <w:iCs w:val="0"/>
                 <w:noProof/>
                 <w:webHidden/>
               </w:rPr>
@@ -5318,6 +5482,8 @@
               <w:rPr>
                 <w:rStyle w:val="Hyperlink"/>
                 <w:rFonts w:ascii="Times New Roman" w:hAnsi="Times New Roman"/>
+                <w:i w:val="0"/>
+                <w:iCs w:val="0"/>
                 <w:noProof/>
               </w:rPr>
               <w:t>8.</w:t>
@@ -5339,12 +5505,16 @@
               <w:rPr>
                 <w:rStyle w:val="Hyperlink"/>
                 <w:rFonts w:ascii="Times New Roman" w:hAnsi="Times New Roman"/>
+                <w:i w:val="0"/>
+                <w:iCs w:val="0"/>
                 <w:noProof/>
               </w:rPr>
               <w:t>Glossary</w:t>
             </w:r>
             <w:r>
               <w:rPr>
+                <w:i w:val="0"/>
+                <w:iCs w:val="0"/>
                 <w:noProof/>
                 <w:webHidden/>
               </w:rPr>
@@ -5352,6 +5522,8 @@
             </w:r>
             <w:r>
               <w:rPr>
+                <w:i w:val="0"/>
+                <w:iCs w:val="0"/>
                 <w:noProof/>
                 <w:webHidden/>
               </w:rPr>
@@ -5359,6 +5531,8 @@
             </w:r>
             <w:r>
               <w:rPr>
+                <w:i w:val="0"/>
+                <w:iCs w:val="0"/>
                 <w:noProof/>
                 <w:webHidden/>
               </w:rPr>
@@ -5366,12 +5540,16 @@
             </w:r>
             <w:r>
               <w:rPr>
-                <w:noProof/>
-                <w:webHidden/>
-              </w:rPr>
-            </w:r>
-            <w:r>
-              <w:rPr>
+                <w:i w:val="0"/>
+                <w:iCs w:val="0"/>
+                <w:noProof/>
+                <w:webHidden/>
+              </w:rPr>
+            </w:r>
+            <w:r>
+              <w:rPr>
+                <w:i w:val="0"/>
+                <w:iCs w:val="0"/>
                 <w:noProof/>
                 <w:webHidden/>
               </w:rPr>
@@ -5379,6 +5557,8 @@
             </w:r>
             <w:r>
               <w:rPr>
+                <w:i w:val="0"/>
+                <w:iCs w:val="0"/>
                 <w:noProof/>
                 <w:webHidden/>
               </w:rPr>
@@ -5386,6 +5566,8 @@
             </w:r>
             <w:r>
               <w:rPr>
+                <w:i w:val="0"/>
+                <w:iCs w:val="0"/>
                 <w:noProof/>
                 <w:webHidden/>
               </w:rPr>
@@ -5416,6 +5598,8 @@
               <w:rPr>
                 <w:rStyle w:val="Hyperlink"/>
                 <w:rFonts w:ascii="Times New Roman" w:hAnsi="Times New Roman"/>
+                <w:i w:val="0"/>
+                <w:iCs w:val="0"/>
                 <w:noProof/>
               </w:rPr>
               <w:t>9.</w:t>
@@ -5437,12 +5621,16 @@
               <w:rPr>
                 <w:rStyle w:val="Hyperlink"/>
                 <w:rFonts w:ascii="Times New Roman" w:hAnsi="Times New Roman"/>
+                <w:i w:val="0"/>
+                <w:iCs w:val="0"/>
                 <w:noProof/>
               </w:rPr>
               <w:t>Appendix</w:t>
             </w:r>
             <w:r>
               <w:rPr>
+                <w:i w:val="0"/>
+                <w:iCs w:val="0"/>
                 <w:noProof/>
                 <w:webHidden/>
               </w:rPr>
@@ -5450,6 +5638,8 @@
             </w:r>
             <w:r>
               <w:rPr>
+                <w:i w:val="0"/>
+                <w:iCs w:val="0"/>
                 <w:noProof/>
                 <w:webHidden/>
               </w:rPr>
@@ -5457,6 +5647,8 @@
             </w:r>
             <w:r>
               <w:rPr>
+                <w:i w:val="0"/>
+                <w:iCs w:val="0"/>
                 <w:noProof/>
                 <w:webHidden/>
               </w:rPr>
@@ -5464,12 +5656,16 @@
             </w:r>
             <w:r>
               <w:rPr>
-                <w:noProof/>
-                <w:webHidden/>
-              </w:rPr>
-            </w:r>
-            <w:r>
-              <w:rPr>
+                <w:i w:val="0"/>
+                <w:iCs w:val="0"/>
+                <w:noProof/>
+                <w:webHidden/>
+              </w:rPr>
+            </w:r>
+            <w:r>
+              <w:rPr>
+                <w:i w:val="0"/>
+                <w:iCs w:val="0"/>
                 <w:noProof/>
                 <w:webHidden/>
               </w:rPr>
@@ -5477,6 +5673,8 @@
             </w:r>
             <w:r>
               <w:rPr>
+                <w:i w:val="0"/>
+                <w:iCs w:val="0"/>
                 <w:noProof/>
                 <w:webHidden/>
               </w:rPr>
@@ -5484,6 +5682,8 @@
             </w:r>
             <w:r>
               <w:rPr>
+                <w:i w:val="0"/>
+                <w:iCs w:val="0"/>
                 <w:noProof/>
                 <w:webHidden/>
               </w:rPr>
@@ -5790,23 +5990,7 @@
             <w:rFonts w:eastAsiaTheme="majorEastAsia"/>
             <w:noProof/>
           </w:rPr>
-          <w:t>Table 1: Frontend Functional T</w:t>
-        </w:r>
-        <w:r>
-          <w:rPr>
-            <w:rStyle w:val="Hyperlink"/>
-            <w:rFonts w:eastAsiaTheme="majorEastAsia"/>
-            <w:noProof/>
-          </w:rPr>
-          <w:t>e</w:t>
-        </w:r>
-        <w:r>
-          <w:rPr>
-            <w:rStyle w:val="Hyperlink"/>
-            <w:rFonts w:eastAsiaTheme="majorEastAsia"/>
-            <w:noProof/>
-          </w:rPr>
-          <w:t>st Cases</w:t>
+          <w:t>Table 1: Frontend Functional Test Cases</w:t>
         </w:r>
         <w:r>
           <w:rPr>
@@ -6753,16 +6937,10 @@
         <w:t>was</w:t>
       </w:r>
       <w:r>
-        <w:t xml:space="preserve"> built using the stack and supports real-time interaction with the use of </w:t>
-      </w:r>
-      <w:r>
-        <w:t>(</w:t>
-      </w:r>
-      <w:r>
-        <w:t>WebSocket</w:t>
-      </w:r>
-      <w:r>
-        <w:t>)*</w:t>
+        <w:t xml:space="preserve"> built using the stack and supports real-time interaction with the use of WebSocket</w:t>
+      </w:r>
+      <w:r>
+        <w:t>*</w:t>
       </w:r>
       <w:r>
         <w:t xml:space="preserve">. </w:t>
@@ -7025,22 +7203,43 @@
         <w:t xml:space="preserve">There has been an implementation of a client-server architecture in the Peer Tutoring Platform based on </w:t>
       </w:r>
       <w:r>
-        <w:t>MongoDB, Express.js, React.js, N</w:t>
+        <w:t>MERN* stack</w:t>
+      </w:r>
+      <w:r>
+        <w:t xml:space="preserve">, which consists of </w:t>
+      </w:r>
+      <w:r>
+        <w:t>MongoDB</w:t>
+      </w:r>
+      <w:r>
+        <w:t>*</w:t>
+      </w:r>
+      <w:r>
+        <w:t>, Express.js</w:t>
+      </w:r>
+      <w:r>
+        <w:t>*</w:t>
+      </w:r>
+      <w:r>
+        <w:t>, React.js</w:t>
+      </w:r>
+      <w:r>
+        <w:t>*</w:t>
+      </w:r>
+      <w:r>
+        <w:t>, N</w:t>
       </w:r>
       <w:r>
         <w:t>ode</w:t>
       </w:r>
       <w:r>
-        <w:t>.js (</w:t>
-      </w:r>
-      <w:r>
-        <w:t>MERN</w:t>
-      </w:r>
-      <w:r>
-        <w:t>)*</w:t>
-      </w:r>
-      <w:r>
-        <w:t xml:space="preserve"> stack. The system is organized into four main layers:</w:t>
+        <w:t>.js</w:t>
+      </w:r>
+      <w:r>
+        <w:t>*</w:t>
+      </w:r>
+      <w:r>
+        <w:t>. The system is organized into four main layers:</w:t>
       </w:r>
     </w:p>
     <w:p>
@@ -7106,6 +7305,9 @@
       <w:r>
         <w:t>Communication Layer – WebSocket</w:t>
       </w:r>
+      <w:r>
+        <w:t>*</w:t>
+      </w:r>
     </w:p>
     <w:p>
       <w:pPr>
@@ -7116,10 +7318,7 @@
         <w:t xml:space="preserve">The frontend communicates with the backend through </w:t>
       </w:r>
       <w:r>
-        <w:t>Hypertext Transfer Protocol</w:t>
-      </w:r>
-      <w:r>
-        <w:t xml:space="preserve"> (</w:t>
+        <w:t>Hypertext Transfer Protocol (</w:t>
       </w:r>
       <w:r>
         <w:t>HTTP</w:t>
@@ -7128,16 +7327,10 @@
         <w:t>)*</w:t>
       </w:r>
       <w:r>
-        <w:t xml:space="preserve"> requests for operations such as user registration, post creation, report submission, and meeting scheduling. Socket.io is used to support real-time updates for messaging and notifications between connected users. Authentication is handled using JSON Web Tokens, where the server issues a token after successful login and protected routes are validated through </w:t>
-      </w:r>
-      <w:r>
-        <w:t>(</w:t>
-      </w:r>
-      <w:r>
-        <w:t>middleware</w:t>
-      </w:r>
-      <w:r>
-        <w:t>)*</w:t>
+        <w:t xml:space="preserve"> requests for operations such as user registration, post creation, report submission, and meeting scheduling. Socket.io is used to support real-time updates for messaging and notifications between connected users. Authentication is handled using JSON Web Tokens, where the server issues a token after successful login and protected routes are validated through middleware</w:t>
+      </w:r>
+      <w:r>
+        <w:t>*</w:t>
       </w:r>
       <w:r>
         <w:t>. This layered structure provides separation of concerns, clearer maintainability, and secure communication between the major system components.</w:t>
@@ -7239,6 +7432,15 @@
       <w:r>
         <w:t xml:space="preserve">, accumulated points. </w:t>
       </w:r>
+      <w:r>
+        <w:t>Users can also share their achievements externally through social sharing options</w:t>
+      </w:r>
+      <w:r>
+        <w:t xml:space="preserve"> integrated into the profile page</w:t>
+      </w:r>
+      <w:r>
+        <w:t xml:space="preserve"> to LinkedIn and Twitter.</w:t>
+      </w:r>
     </w:p>
     <w:p/>
     <w:p>
@@ -7304,6 +7506,9 @@
       </w:r>
       <w:r>
         <w:t>. This module forms one of the core academic interaction layers of the platform.</w:t>
+      </w:r>
+      <w:r>
+        <w:t xml:space="preserve"> </w:t>
       </w:r>
     </w:p>
     <w:p/>
@@ -7734,19 +7939,16 @@
         <w:t xml:space="preserve"> a framework for defining </w:t>
       </w:r>
       <w:r>
-        <w:t>representational state transfer (</w:t>
-      </w:r>
-      <w:r>
-        <w:t>REST</w:t>
-      </w:r>
-      <w:r>
-        <w:t>)*</w:t>
-      </w:r>
-      <w:r>
-        <w:t xml:space="preserve"> AP</w:t>
+        <w:t xml:space="preserve">representational state transfer </w:t>
+      </w:r>
+      <w:r>
+        <w:t>REST AP</w:t>
       </w:r>
       <w:r>
         <w:t>I</w:t>
+      </w:r>
+      <w:r>
+        <w:t>*</w:t>
       </w:r>
       <w:r>
         <w:t xml:space="preserve"> endpoints</w:t>
@@ -7925,6 +8127,9 @@
         <w:lastRenderedPageBreak/>
         <w:t>Web Token which the client stores and includes in the corresponding header for protected requests. The middleware verifies the token on protected routes and extracts the user ID to enforce access control. This approach ensures that only authenticated users can access restricted resources such as messaging, meeting scheduling, profile updates.</w:t>
       </w:r>
+      <w:r>
+        <w:t xml:space="preserve"> Authenticated users can also log out securely, which clears the session token and prevents further access to protected routes until the user logs in again.</w:t>
+      </w:r>
     </w:p>
     <w:p>
       <w:pPr>
@@ -8022,7 +8227,16 @@
     </w:p>
     <w:p>
       <w:r>
-        <w:t xml:space="preserve">The post module allows students to create tutoring-related requests and academic support posts. Posts are stored in the post collection with references to the author, content, timestamps, image attachments where applicable, and engagement statistics. Comments are stored in a separate comment collection and linked to both the relevant post and the user who created the comment. Likes are tracked by storing the identifiers of users who have liked a particular post, which prevents duplicate likes from the same user. This module forms one of the main academic </w:t>
+        <w:t xml:space="preserve">The post module allows students to create tutoring-related requests and academic support posts. </w:t>
+      </w:r>
+      <w:r>
+        <w:t>The module supports updating and deleting posts, which allows users to manage their studying related content after publication.</w:t>
+      </w:r>
+      <w:r>
+        <w:t xml:space="preserve"> </w:t>
+      </w:r>
+      <w:r>
+        <w:t xml:space="preserve">Posts are stored in the post collection with references to the author, content, timestamps, image attachments where applicable, and engagement statistics. Comments are stored in a separate comment collection and linked to both the relevant post and the user who created the comment. Likes are tracked by storing the identifiers of users who have liked a particular post, which prevents duplicate likes from the same user. This module forms one of the main academic </w:t>
       </w:r>
       <w:r>
         <w:t>interaction mechanisms of the platform.</w:t>
@@ -8203,7 +8417,6 @@
           <w:sz w:val="32"/>
           <w:szCs w:val="32"/>
         </w:rPr>
-        <w:lastRenderedPageBreak/>
         <w:t>Reports</w:t>
       </w:r>
       <w:bookmarkEnd w:id="21"/>
@@ -8492,6 +8705,7 @@
           <w:sz w:val="32"/>
           <w:szCs w:val="32"/>
         </w:rPr>
+        <w:lastRenderedPageBreak/>
         <w:t>Notification and Report Collections</w:t>
       </w:r>
       <w:bookmarkEnd w:id="27"/>
@@ -8504,11 +8718,7 @@
         <w:t xml:space="preserve">The notification collection stores system events directed from one user to another including friend request, comments, meeting events and points transfer. The report </w:t>
       </w:r>
       <w:r>
-        <w:t xml:space="preserve">collection stores moderation </w:t>
-      </w:r>
-      <w:r>
-        <w:lastRenderedPageBreak/>
-        <w:t>reports submitted by users against posts, messages, or other users. These reports include report type, target identifier, reason, status, and a snapshot of the reported content.</w:t>
+        <w:t>collection stores moderation reports submitted by users against posts, messages, or other users. These reports include report type, target identifier, reason, status, and a snapshot of the reported content.</w:t>
       </w:r>
     </w:p>
     <w:p>
@@ -8552,10 +8762,7 @@
         <w:t xml:space="preserve">There are several </w:t>
       </w:r>
       <w:r>
-        <w:t>important</w:t>
-      </w:r>
-      <w:r>
-        <w:t xml:space="preserve"> schema relationships </w:t>
+        <w:t xml:space="preserve">important schema relationships </w:t>
       </w:r>
       <w:r>
         <w:t xml:space="preserve">that </w:t>
@@ -8650,6 +8857,7 @@
         <w:jc w:val="both"/>
       </w:pPr>
       <w:r>
+        <w:lastRenderedPageBreak/>
         <w:t xml:space="preserve">Meetings and administration functionalities are handled through /api/meeting, /api/report and /api/admin as well. Meeting routes allow already authenticated users to do </w:t>
       </w:r>
       <w:r>
@@ -8668,7 +8876,6 @@
         <w:t xml:space="preserve"> Administrative routes provide moderation over the </w:t>
       </w:r>
       <w:r>
-        <w:lastRenderedPageBreak/>
         <w:t>platform with the following controls: viewing statistics, retrieving users and posts, deleting posts, reviewing reports and freezing user accounts. Worth to note that administrative endpoints are protected through an admin authorization middleware to ensure that only privileged users can access them.</w:t>
       </w:r>
     </w:p>
@@ -8792,7 +8999,7 @@
         <w:t xml:space="preserve">The frontend uses </w:t>
       </w:r>
       <w:r>
-        <w:t>(Axios)*</w:t>
+        <w:t>Axios*</w:t>
       </w:r>
       <w:r>
         <w:t xml:space="preserve"> tool to communicate with the backend API. </w:t>
@@ -8820,7 +9027,11 @@
         <w:jc w:val="both"/>
       </w:pPr>
       <w:r>
-        <w:t>The Feeds page represents the primary activity hub of the system. It loads the authenticated user profile, all corresponding posts and personal post statistics through API requests. The page forms reusable components such as profile cards, content cards, post displays and modal dialogs. Users can open interfaces to complete creating posts while the feed dynamically renders all retrieved content. This page therefore acts as the main interaction layer of the application.</w:t>
+        <w:t xml:space="preserve">The Feeds page represents the primary activity hub of the system. It loads the authenticated user profile, all corresponding posts and personal post statistics through API requests. The page forms reusable components such as profile cards, content cards, post displays and modal dialogs. Users </w:t>
+      </w:r>
+      <w:r>
+        <w:lastRenderedPageBreak/>
+        <w:t>can open interfaces to complete creating posts while the feed dynamically renders all retrieved content. This page therefore acts as the main interaction layer of the application.</w:t>
       </w:r>
     </w:p>
     <w:p>
@@ -8846,11 +9057,7 @@
         <w:t xml:space="preserve"> </w:t>
       </w:r>
       <w:r>
-        <w:t xml:space="preserve">Up pages provide the users with authentication interface for both email and Google login. Client-side validation is used before the API request is submitted, checking that </w:t>
-      </w:r>
-      <w:r>
-        <w:lastRenderedPageBreak/>
-        <w:t xml:space="preserve">fields are populated and that the email and password meet the expected format. Only after successful user authentication, the frontend side </w:t>
+        <w:t xml:space="preserve">Up pages provide the users with authentication interface for both email and Google login. Client-side validation is used before the API request is submitted, checking that fields are populated and that the email and password meet the expected format. Only after successful user authentication, the frontend side </w:t>
       </w:r>
       <w:r>
         <w:t>stores the login flag and user data then redirects the user to either the feed or the admin dashboard depending on the role.</w:t>
@@ -8895,6 +9102,14 @@
       </w:r>
       <w:r>
         <w:t xml:space="preserve"> to handle such case. It allows clients to do both self-management and peer discovery within the same page architecture.</w:t>
+      </w:r>
+    </w:p>
+    <w:p>
+      <w:pPr>
+        <w:jc w:val="both"/>
+      </w:pPr>
+      <w:r>
+        <w:t>In addition, the page also supports a non-core feature achievement sharing through external social platforms. Users can share their achievements through LinkedIn and Twitter buttons, which opens the corresponding platform with already filled sharing content.</w:t>
       </w:r>
     </w:p>
     <w:p>
@@ -8979,7 +9194,11 @@
         <w:t>)*</w:t>
       </w:r>
       <w:r>
-        <w:t xml:space="preserve"> containing the authenticated user identifier and sends it to the client in an HTTP only cookie. It is worth to mention that protected routes use authentication middleware that extracts the token form the request cookie, compares against using the private signing key and respectively loads the associated user record from the database. If the token is missing, the request is rejected with an unauthorized status. This security pattern prevents unauthenticated users from accessing protected resources such as messaging, meeting sessions and profile update operations.</w:t>
+        <w:t xml:space="preserve"> containing the authenticated user identifier and sends it to the client in an HTTP only cookie. It is worth to mention that protected routes use authentication middleware that extracts the token form the request cookie, compares against using the private signing key and respectively </w:t>
+      </w:r>
+      <w:r>
+        <w:lastRenderedPageBreak/>
+        <w:t>loads the associated user record from the database. If the token is missing, the request is rejected with an unauthorized status. This security pattern prevents unauthenticated users from accessing protected resources such as messaging, meeting sessions and profile update operations.</w:t>
       </w:r>
     </w:p>
     <w:p>
@@ -9001,17 +9220,10 @@
         <w:jc w:val="both"/>
       </w:pPr>
       <w:r>
-        <w:lastRenderedPageBreak/>
-        <w:t xml:space="preserve">Password security in this project is managed during registration and login using </w:t>
-      </w:r>
-      <w:r>
-        <w:t>(</w:t>
-      </w:r>
-      <w:r>
-        <w:t>bcryptjs</w:t>
-      </w:r>
-      <w:r>
-        <w:t>)*</w:t>
+        <w:t>Password security in this project is managed during registration and login using bcryptjs</w:t>
+      </w:r>
+      <w:r>
+        <w:t>*</w:t>
       </w:r>
       <w:r>
         <w:t xml:space="preserve"> tool. Whenever a user registers through the standard email flow, the password gets hashed before being stored in the database. During the login process, the submitted password is checked against the stored hash rather than being compared in plaintext. Therefore, user passwords are not persisted in a directly readable form which ensures password security.</w:t>
@@ -9034,16 +9246,13 @@
         <w:t>usage with the help of</w:t>
       </w:r>
       <w:r>
-        <w:t xml:space="preserve"> Google </w:t>
-      </w:r>
-      <w:r>
-        <w:t>(</w:t>
-      </w:r>
-      <w:r>
-        <w:t>OAuth</w:t>
-      </w:r>
-      <w:r>
-        <w:t>)*</w:t>
+        <w:t xml:space="preserve"> Google OAuth</w:t>
+      </w:r>
+      <w:r>
+        <w:t xml:space="preserve"> 2.0</w:t>
+      </w:r>
+      <w:r>
+        <w:t>*</w:t>
       </w:r>
       <w:r>
         <w:t xml:space="preserve"> library. In this flow the submitted Google identity token is verified against the configured client identifier before the user is either registered or logged in. </w:t>
@@ -9110,16 +9319,10 @@
         <w:t>presigned</w:t>
       </w:r>
       <w:r>
-        <w:t xml:space="preserve"> </w:t>
-      </w:r>
-      <w:r>
-        <w:t>(</w:t>
-      </w:r>
-      <w:r>
-        <w:t>AWS S3</w:t>
-      </w:r>
-      <w:r>
-        <w:t>)*</w:t>
+        <w:t xml:space="preserve"> AWS S3</w:t>
+      </w:r>
+      <w:r>
+        <w:t>*</w:t>
       </w:r>
       <w:r>
         <w:t xml:space="preserve"> upload flow where the upload endpoint requires authentication and only returns a </w:t>
@@ -9139,7 +9342,11 @@
         <w:t xml:space="preserve">Client-side validation is also implemented in the frontend to improve usability. The signup page </w:t>
       </w:r>
       <w:r>
-        <w:t xml:space="preserve">checks that required fields are all filled, the name matches the expected format, the email is valid and that the password meets a minimum length, while the meeting scheduling modal validates title, data, time and points before sending the request to the server. </w:t>
+        <w:t xml:space="preserve">checks that required fields are all filled, the name matches the expected format, the email is valid </w:t>
+      </w:r>
+      <w:r>
+        <w:lastRenderedPageBreak/>
+        <w:t xml:space="preserve">and that the password meets a minimum length, while the meeting scheduling modal validates title, data, time and points before sending the request to the server. </w:t>
       </w:r>
     </w:p>
     <w:p>
@@ -9177,7 +9384,6 @@
           <w:sz w:val="32"/>
           <w:szCs w:val="32"/>
         </w:rPr>
-        <w:lastRenderedPageBreak/>
         <w:t>Testing and Evaluation</w:t>
       </w:r>
       <w:bookmarkEnd w:id="32"/>
@@ -9348,7 +9554,11 @@
         <w:jc w:val="both"/>
       </w:pPr>
       <w:r>
-        <w:t xml:space="preserve">The frontend tests focus on signing up, navigation to the feed, creating profiles, updating user profile description text, visiting friend list, opening meeting session pages and accessing reporting related entry points. The tests validate not only API correctness but also routing, page rendering, form </w:t>
+        <w:t xml:space="preserve">The frontend tests focus on signing up, navigation to the feed, creating profiles, updating user profile description text, visiting friend list, opening meeting session pages and accessing reporting </w:t>
+      </w:r>
+      <w:r>
+        <w:lastRenderedPageBreak/>
+        <w:t xml:space="preserve">related entry points. The tests validate not only API correctness but also routing, page rendering, form </w:t>
       </w:r>
       <w:r>
         <w:t>behaviour</w:t>
@@ -9388,7 +9598,6 @@
           <w:bCs/>
           <w:color w:val="000000" w:themeColor="text1"/>
         </w:rPr>
-        <w:lastRenderedPageBreak/>
         <w:t>Continuous Integration Testing</w:t>
       </w:r>
       <w:bookmarkEnd w:id="36"/>
@@ -9537,6 +9746,7 @@
           <w:bCs/>
           <w:color w:val="000000" w:themeColor="text1"/>
         </w:rPr>
+        <w:lastRenderedPageBreak/>
         <w:t xml:space="preserve">Problems </w:t>
       </w:r>
       <w:r>
@@ -9583,14 +9793,7 @@
         <w:rPr>
           <w:rFonts w:ascii="Times New Roman" w:hAnsi="Times New Roman" w:cs="Times New Roman"/>
         </w:rPr>
-        <w:t xml:space="preserve">. Each problem required either a technical resolution or a design change. One of the major challenges was to implement secure authentication and maintaining user sessions </w:t>
-      </w:r>
-      <w:r>
-        <w:rPr>
-          <w:rFonts w:ascii="Times New Roman" w:hAnsi="Times New Roman" w:cs="Times New Roman"/>
-        </w:rPr>
-        <w:lastRenderedPageBreak/>
-        <w:t xml:space="preserve">across secured routes. At an early stage, there were problems where authenticated users were not always identified after page refreshes. This </w:t>
+        <w:t xml:space="preserve">. Each problem required either a technical resolution or a design change. One of the major challenges was to implement secure authentication and maintaining user sessions across secured routes. At an early stage, there were problems where authenticated users were not always identified after page refreshes. This </w:t>
       </w:r>
       <w:r>
         <w:rPr>
@@ -9969,6 +10172,7 @@
         <w:jc w:val="both"/>
       </w:pPr>
       <w:r>
+        <w:lastRenderedPageBreak/>
         <w:t xml:space="preserve">A real-time messaging feature was </w:t>
       </w:r>
       <w:r>
@@ -10016,11 +10220,7 @@
         <w:t>, points allocation</w:t>
       </w:r>
       <w:r>
-        <w:t xml:space="preserve">. Notifications connected to this feature were </w:t>
-      </w:r>
-      <w:r>
-        <w:lastRenderedPageBreak/>
-        <w:t>developed so that users could receive updates relating to new activity and follow-up actions such as rating sessions.</w:t>
+        <w:t>. Notifications connected to this feature were developed so that users could receive updates relating to new activity and follow-up actions such as rating sessions.</w:t>
       </w:r>
     </w:p>
     <w:p>
@@ -10301,7 +10501,11 @@
         <w:t>challenging</w:t>
       </w:r>
       <w:r>
-        <w:t xml:space="preserve"> part of the project was ensuring that all parts of the application worked together well across all layers</w:t>
+        <w:t xml:space="preserve"> part of the project was ensuring that all parts of the </w:t>
+      </w:r>
+      <w:r>
+        <w:lastRenderedPageBreak/>
+        <w:t>application worked together well across all layers</w:t>
       </w:r>
       <w:r>
         <w:t>,</w:t>
@@ -10361,9 +10565,6 @@
       </w:r>
       <w:r>
         <w:br/>
-      </w:r>
-      <w:r>
-        <w:lastRenderedPageBreak/>
         <w:t xml:space="preserve">Another </w:t>
       </w:r>
       <w:r>
@@ -10564,7 +10765,11 @@
       </w:r>
       <w:r>
         <w:br/>
-        <w:t xml:space="preserve">To start with, handling of real-time communication was noticeably different compared to the initial plan. Messaging and notifications were planned as simple request-response features handled only through standard </w:t>
+        <w:t xml:space="preserve">To start with, handling of real-time communication was noticeably different compared to the initial plan. Messaging and notifications were planned as simple request-response features </w:t>
+      </w:r>
+      <w:r>
+        <w:lastRenderedPageBreak/>
+        <w:t xml:space="preserve">handled only through standard </w:t>
       </w:r>
       <w:r>
         <w:t>API</w:t>
@@ -10590,11 +10795,7 @@
         <w:t>logic</w:t>
       </w:r>
       <w:r>
-        <w:t xml:space="preserve"> during this project. Compared to its original design, ratings were mainly planned to act as simple feedback after a tutoring session. During </w:t>
-      </w:r>
-      <w:r>
-        <w:lastRenderedPageBreak/>
-        <w:t>implementation stage, the feature was expanded into a broader gamification algorithm in w</w:t>
+        <w:t xml:space="preserve"> during this project. Compared to its original design, ratings were mainly planned to act as simple feedback after a tutoring session. During implementation stage, the feature was expanded into a broader gamification algorithm in w</w:t>
       </w:r>
       <w:r>
         <w:t>hich ratings impact on the calculation of the points given to users after each successful session completion. The change made the rating feature more central to the overall system design.</w:t>
@@ -10890,24 +11091,14 @@
       <w:r>
         <w:t xml:space="preserve">Table </w:t>
       </w:r>
-      <w:r>
-        <w:fldChar w:fldCharType="begin"/>
-      </w:r>
-      <w:r>
-        <w:instrText xml:space="preserve"> SEQ Table \* ARABIC </w:instrText>
-      </w:r>
-      <w:r>
-        <w:fldChar w:fldCharType="separate"/>
-      </w:r>
-      <w:r>
-        <w:rPr>
-          <w:noProof/>
-        </w:rPr>
-        <w:t>1</w:t>
-      </w:r>
-      <w:r>
-        <w:fldChar w:fldCharType="end"/>
-      </w:r>
+      <w:fldSimple w:instr=" SEQ Table \* ARABIC ">
+        <w:r>
+          <w:rPr>
+            <w:noProof/>
+          </w:rPr>
+          <w:t>1</w:t>
+        </w:r>
+      </w:fldSimple>
       <w:r>
         <w:t>: Frontend Functional Test Cases</w:t>
       </w:r>
@@ -11087,6 +11278,7 @@
               <w:jc w:val="both"/>
             </w:pPr>
             <w:r>
+              <w:lastRenderedPageBreak/>
               <w:t>FE01</w:t>
             </w:r>
           </w:p>
@@ -11172,7 +11364,6 @@
               <w:rPr>
                 <w:lang w:val="en-US"/>
               </w:rPr>
-              <w:lastRenderedPageBreak/>
               <w:t>Click on create account</w:t>
             </w:r>
           </w:p>
@@ -11186,7 +11377,6 @@
               <w:rPr>
                 <w:lang w:val="en-US"/>
               </w:rPr>
-              <w:lastRenderedPageBreak/>
               <w:t>Account is created and user is redirected to /feeds</w:t>
             </w:r>
           </w:p>
@@ -11908,24 +12098,14 @@
       <w:r>
         <w:t xml:space="preserve">Table </w:t>
       </w:r>
-      <w:r>
-        <w:fldChar w:fldCharType="begin"/>
-      </w:r>
-      <w:r>
-        <w:instrText xml:space="preserve"> SEQ Table \* ARABIC </w:instrText>
-      </w:r>
-      <w:r>
-        <w:fldChar w:fldCharType="separate"/>
-      </w:r>
-      <w:r>
-        <w:rPr>
-          <w:noProof/>
-        </w:rPr>
-        <w:t>2</w:t>
-      </w:r>
-      <w:r>
-        <w:fldChar w:fldCharType="end"/>
-      </w:r>
+      <w:fldSimple w:instr=" SEQ Table \* ARABIC ">
+        <w:r>
+          <w:rPr>
+            <w:noProof/>
+          </w:rPr>
+          <w:t>2</w:t>
+        </w:r>
+      </w:fldSimple>
       <w:r>
         <w:t>: Backend Functional Test Cases</w:t>
       </w:r>
@@ -12169,6 +12349,7 @@
               </w:numPr>
             </w:pPr>
             <w:r>
+              <w:lastRenderedPageBreak/>
               <w:t>Check database</w:t>
             </w:r>
           </w:p>
@@ -12182,6 +12363,7 @@
               <w:rPr>
                 <w:lang w:val="en-US"/>
               </w:rPr>
+              <w:lastRenderedPageBreak/>
               <w:t>New user record is created</w:t>
             </w:r>
           </w:p>
@@ -12223,10 +12405,7 @@
               <w:jc w:val="both"/>
             </w:pPr>
             <w:r>
-              <w:t>B</w:t>
-            </w:r>
-            <w:r>
-              <w:t>E02</w:t>
+              <w:t>BE02</w:t>
             </w:r>
           </w:p>
         </w:tc>
@@ -12278,7 +12457,6 @@
               </w:numPr>
             </w:pPr>
             <w:r>
-              <w:lastRenderedPageBreak/>
               <w:t>Send create post request</w:t>
             </w:r>
           </w:p>
@@ -12289,7 +12467,6 @@
           </w:tcPr>
           <w:p>
             <w:r>
-              <w:lastRenderedPageBreak/>
               <w:t>Post is stored successfully</w:t>
             </w:r>
           </w:p>
@@ -12328,10 +12505,7 @@
               <w:jc w:val="both"/>
             </w:pPr>
             <w:r>
-              <w:t>B</w:t>
-            </w:r>
-            <w:r>
-              <w:t>E03</w:t>
+              <w:t>BE03</w:t>
             </w:r>
           </w:p>
         </w:tc>
@@ -12354,10 +12528,7 @@
           </w:tcPr>
           <w:p>
             <w:r>
-              <w:t>User</w:t>
-            </w:r>
-            <w:r>
-              <w:t>s can like posts</w:t>
+              <w:t>Users can like posts</w:t>
             </w:r>
           </w:p>
         </w:tc>
@@ -12434,10 +12605,7 @@
               <w:jc w:val="both"/>
             </w:pPr>
             <w:r>
-              <w:t>B</w:t>
-            </w:r>
-            <w:r>
-              <w:t>E04</w:t>
+              <w:t>BE04</w:t>
             </w:r>
           </w:p>
         </w:tc>
@@ -12537,10 +12705,7 @@
               <w:jc w:val="both"/>
             </w:pPr>
             <w:r>
-              <w:t>B</w:t>
-            </w:r>
-            <w:r>
-              <w:t>E05</w:t>
+              <w:t>BE05</w:t>
             </w:r>
           </w:p>
         </w:tc>
@@ -12643,10 +12808,7 @@
               <w:jc w:val="both"/>
             </w:pPr>
             <w:r>
-              <w:t>B</w:t>
-            </w:r>
-            <w:r>
-              <w:t>E06</w:t>
+              <w:t>BE06</w:t>
             </w:r>
           </w:p>
         </w:tc>
@@ -12746,10 +12908,7 @@
               <w:jc w:val="both"/>
             </w:pPr>
             <w:r>
-              <w:t>B</w:t>
-            </w:r>
-            <w:r>
-              <w:t>E07</w:t>
+              <w:t>BE07</w:t>
             </w:r>
           </w:p>
         </w:tc>
@@ -13249,6 +13408,7 @@
               <w:jc w:val="both"/>
             </w:pPr>
             <w:r>
+              <w:lastRenderedPageBreak/>
               <w:t>BE12</w:t>
             </w:r>
           </w:p>
@@ -13349,7 +13509,6 @@
               <w:jc w:val="both"/>
             </w:pPr>
             <w:r>
-              <w:lastRenderedPageBreak/>
               <w:t>BE13</w:t>
             </w:r>
           </w:p>
@@ -13561,24 +13720,14 @@
       <w:r>
         <w:t xml:space="preserve">Table </w:t>
       </w:r>
-      <w:r>
-        <w:fldChar w:fldCharType="begin"/>
-      </w:r>
-      <w:r>
-        <w:instrText xml:space="preserve"> SEQ Table \* ARABIC </w:instrText>
-      </w:r>
-      <w:r>
-        <w:fldChar w:fldCharType="separate"/>
-      </w:r>
-      <w:r>
-        <w:rPr>
-          <w:noProof/>
-        </w:rPr>
-        <w:t>3</w:t>
-      </w:r>
-      <w:r>
-        <w:fldChar w:fldCharType="end"/>
-      </w:r>
+      <w:fldSimple w:instr=" SEQ Table \* ARABIC ">
+        <w:r>
+          <w:rPr>
+            <w:noProof/>
+          </w:rPr>
+          <w:t>3</w:t>
+        </w:r>
+      </w:fldSimple>
       <w:r>
         <w:t>: Security and Access Control Test Cases</w:t>
       </w:r>
@@ -14126,10 +14275,7 @@
           </w:tcPr>
           <w:p>
             <w:r>
-              <w:t>Authentic</w:t>
-            </w:r>
-            <w:r>
-              <w:t>ated request is accepted and meeting rating completes successfully</w:t>
+              <w:t>Authenticated request is accepted and meeting rating completes successfully</w:t>
             </w:r>
           </w:p>
         </w:tc>
@@ -14229,10 +14375,7 @@
           </w:tcPr>
           <w:p>
             <w:r>
-              <w:t xml:space="preserve">Authenticated </w:t>
-            </w:r>
-            <w:r>
-              <w:t>request is accepted and content reporting completes successfully</w:t>
+              <w:t>Authenticated request is accepted and content reporting completes successfully</w:t>
             </w:r>
           </w:p>
         </w:tc>
@@ -14442,24 +14585,14 @@
       <w:r>
         <w:t xml:space="preserve">Table </w:t>
       </w:r>
-      <w:r>
-        <w:fldChar w:fldCharType="begin"/>
-      </w:r>
-      <w:r>
-        <w:instrText xml:space="preserve"> SEQ Table \* ARABIC </w:instrText>
-      </w:r>
-      <w:r>
-        <w:fldChar w:fldCharType="separate"/>
-      </w:r>
-      <w:r>
-        <w:rPr>
-          <w:noProof/>
-        </w:rPr>
-        <w:t>4</w:t>
-      </w:r>
-      <w:r>
-        <w:fldChar w:fldCharType="end"/>
-      </w:r>
+      <w:fldSimple w:instr=" SEQ Table \* ARABIC ">
+        <w:r>
+          <w:rPr>
+            <w:noProof/>
+          </w:rPr>
+          <w:t>4</w:t>
+        </w:r>
+      </w:fldSimple>
       <w:r>
         <w:t>: Reliability and Validation Test Cases</w:t>
       </w:r>
@@ -15451,10 +15584,7 @@
         <w:t>Irish Educational Studies</w:t>
       </w:r>
       <w:r>
-        <w:t>, 44(1), pp. 183–200. doi: 10.1080/03323315.2023.2256552.</w:t>
-      </w:r>
-      <w:r>
-        <w:t xml:space="preserve"> </w:t>
+        <w:t xml:space="preserve">, 44(1), pp. 183–200. doi: 10.1080/03323315.2023.2256552. </w:t>
       </w:r>
     </w:p>
     <w:p>
@@ -15773,7 +15903,14 @@
                 <w:sz w:val="20"/>
                 <w:szCs w:val="20"/>
               </w:rPr>
-              <w:t>Bcryptjs</w:t>
+              <w:t>b</w:t>
+            </w:r>
+            <w:r>
+              <w:rPr>
+                <w:sz w:val="20"/>
+                <w:szCs w:val="20"/>
+              </w:rPr>
+              <w:t>cryptjs</w:t>
             </w:r>
           </w:p>
         </w:tc>
@@ -15793,7 +15930,21 @@
                 <w:sz w:val="20"/>
                 <w:szCs w:val="20"/>
               </w:rPr>
-              <w:t>A Javascript library used in this project to hash user passwords during registration and verify submitted passwords securely during login.</w:t>
+              <w:t xml:space="preserve">A </w:t>
+            </w:r>
+            <w:r>
+              <w:rPr>
+                <w:sz w:val="20"/>
+                <w:szCs w:val="20"/>
+              </w:rPr>
+              <w:t>JavaScript</w:t>
+            </w:r>
+            <w:r>
+              <w:rPr>
+                <w:sz w:val="20"/>
+                <w:szCs w:val="20"/>
+              </w:rPr>
+              <w:t xml:space="preserve"> library used in this project to hash user passwords during registration and verify submitted passwords securely during login.</w:t>
             </w:r>
           </w:p>
         </w:tc>
@@ -15981,7 +16132,14 @@
                 <w:sz w:val="20"/>
                 <w:szCs w:val="20"/>
               </w:rPr>
-              <w:t>Github Actions</w:t>
+              <w:t>GitHub</w:t>
+            </w:r>
+            <w:r>
+              <w:rPr>
+                <w:sz w:val="20"/>
+                <w:szCs w:val="20"/>
+              </w:rPr>
+              <w:t xml:space="preserve"> Actions</w:t>
             </w:r>
           </w:p>
         </w:tc>
@@ -16173,7 +16331,21 @@
                 <w:sz w:val="20"/>
                 <w:szCs w:val="20"/>
               </w:rPr>
-              <w:t>A Javascript testing framework used in this project to execute automated backend tests and verify that application logic and API behaviour worked as expected.</w:t>
+              <w:t xml:space="preserve">A </w:t>
+            </w:r>
+            <w:r>
+              <w:rPr>
+                <w:sz w:val="20"/>
+                <w:szCs w:val="20"/>
+              </w:rPr>
+              <w:t>JavaScript</w:t>
+            </w:r>
+            <w:r>
+              <w:rPr>
+                <w:sz w:val="20"/>
+                <w:szCs w:val="20"/>
+              </w:rPr>
+              <w:t xml:space="preserve"> testing framework used in this project to execute automated backend tests and verify that application logic and API behaviour worked as expected.</w:t>
             </w:r>
           </w:p>
         </w:tc>
@@ -16316,7 +16488,6 @@
               <w:rPr>
                 <w:sz w:val="20"/>
                 <w:szCs w:val="20"/>
-                <w:lang w:val="en-US"/>
               </w:rPr>
             </w:pPr>
             <w:r>
@@ -16325,7 +16496,7 @@
                 <w:szCs w:val="20"/>
                 <w:lang w:val="en-US"/>
               </w:rPr>
-              <w:t>OAuth</w:t>
+              <w:t>Node.js</w:t>
             </w:r>
           </w:p>
         </w:tc>
@@ -16344,8 +16515,9 @@
               <w:rPr>
                 <w:sz w:val="20"/>
                 <w:szCs w:val="20"/>
-              </w:rPr>
-              <w:t>An authenticated protocol used in the project for Google sign in</w:t>
+                <w:lang w:val="en-US"/>
+              </w:rPr>
+              <w:t>A JavaScript runtime environment used to execute backend application code.</w:t>
             </w:r>
           </w:p>
         </w:tc>
@@ -16369,7 +16541,23 @@
                 <w:szCs w:val="20"/>
                 <w:lang w:val="en-US"/>
               </w:rPr>
-              <w:t xml:space="preserve">Playwright </w:t>
+              <w:t xml:space="preserve">Google </w:t>
+            </w:r>
+            <w:r>
+              <w:rPr>
+                <w:sz w:val="20"/>
+                <w:szCs w:val="20"/>
+                <w:lang w:val="en-US"/>
+              </w:rPr>
+              <w:t>OAuth</w:t>
+            </w:r>
+            <w:r>
+              <w:rPr>
+                <w:sz w:val="20"/>
+                <w:szCs w:val="20"/>
+                <w:lang w:val="en-US"/>
+              </w:rPr>
+              <w:t xml:space="preserve"> 2.0</w:t>
             </w:r>
           </w:p>
         </w:tc>
@@ -16389,7 +16577,7 @@
                 <w:sz w:val="20"/>
                 <w:szCs w:val="20"/>
               </w:rPr>
-              <w:t>A browser automation testing framework used for frontend end-to-end tests.</w:t>
+              <w:t>An authenticated protocol used in the project for Google sign in</w:t>
             </w:r>
           </w:p>
         </w:tc>
@@ -16404,14 +16592,16 @@
               <w:rPr>
                 <w:sz w:val="20"/>
                 <w:szCs w:val="20"/>
+                <w:lang w:val="en-US"/>
               </w:rPr>
             </w:pPr>
             <w:r>
               <w:rPr>
                 <w:sz w:val="20"/>
                 <w:szCs w:val="20"/>
-              </w:rPr>
-              <w:t xml:space="preserve">REST API </w:t>
+                <w:lang w:val="en-US"/>
+              </w:rPr>
+              <w:t xml:space="preserve">Playwright </w:t>
             </w:r>
           </w:p>
         </w:tc>
@@ -16431,7 +16621,7 @@
                 <w:sz w:val="20"/>
                 <w:szCs w:val="20"/>
               </w:rPr>
-              <w:t>An API style based on HTTP methods used for backend communication.</w:t>
+              <w:t>A browser automation testing framework used for frontend end-to-end tests.</w:t>
             </w:r>
           </w:p>
         </w:tc>
@@ -16446,7 +16636,6 @@
               <w:rPr>
                 <w:sz w:val="20"/>
                 <w:szCs w:val="20"/>
-                <w:lang w:val="en-US"/>
               </w:rPr>
             </w:pPr>
             <w:r>
@@ -16455,7 +16644,7 @@
                 <w:szCs w:val="20"/>
                 <w:lang w:val="en-US"/>
               </w:rPr>
-              <w:t>Socket.io</w:t>
+              <w:t>React.js</w:t>
             </w:r>
           </w:p>
         </w:tc>
@@ -16474,8 +16663,9 @@
               <w:rPr>
                 <w:sz w:val="20"/>
                 <w:szCs w:val="20"/>
-              </w:rPr>
-              <w:t>A library used to support live communication between connected users.</w:t>
+                <w:lang w:val="en-US"/>
+              </w:rPr>
+              <w:t>A JavaScript library used to build the frontend user interface.</w:t>
             </w:r>
           </w:p>
         </w:tc>
@@ -16490,16 +16680,15 @@
               <w:rPr>
                 <w:sz w:val="20"/>
                 <w:szCs w:val="20"/>
-                <w:lang w:val="en-US"/>
               </w:rPr>
             </w:pPr>
             <w:r>
               <w:rPr>
                 <w:sz w:val="20"/>
                 <w:szCs w:val="20"/>
-                <w:lang w:val="en-US"/>
-              </w:rPr>
-              <w:t>Supertest</w:t>
+              </w:rPr>
+              <w:lastRenderedPageBreak/>
+              <w:t xml:space="preserve">REST API </w:t>
             </w:r>
           </w:p>
         </w:tc>
@@ -16519,7 +16708,7 @@
                 <w:sz w:val="20"/>
                 <w:szCs w:val="20"/>
               </w:rPr>
-              <w:t>A testing library used to test backend HTTP endpoints.</w:t>
+              <w:t>An API style based on HTTP methods used for backend communication.</w:t>
             </w:r>
           </w:p>
         </w:tc>
@@ -16543,7 +16732,94 @@
                 <w:szCs w:val="20"/>
                 <w:lang w:val="en-US"/>
               </w:rPr>
-              <w:lastRenderedPageBreak/>
+              <w:t>Socket.io</w:t>
+            </w:r>
+          </w:p>
+        </w:tc>
+        <w:tc>
+          <w:tcPr>
+            <w:tcW w:w="4675" w:type="dxa"/>
+          </w:tcPr>
+          <w:p>
+            <w:pPr>
+              <w:rPr>
+                <w:sz w:val="20"/>
+                <w:szCs w:val="20"/>
+              </w:rPr>
+            </w:pPr>
+            <w:r>
+              <w:rPr>
+                <w:sz w:val="20"/>
+                <w:szCs w:val="20"/>
+              </w:rPr>
+              <w:t>A library used to support live communication between connected users.</w:t>
+            </w:r>
+          </w:p>
+        </w:tc>
+      </w:tr>
+      <w:tr>
+        <w:tc>
+          <w:tcPr>
+            <w:tcW w:w="4675" w:type="dxa"/>
+          </w:tcPr>
+          <w:p>
+            <w:pPr>
+              <w:rPr>
+                <w:sz w:val="20"/>
+                <w:szCs w:val="20"/>
+                <w:lang w:val="en-US"/>
+              </w:rPr>
+            </w:pPr>
+            <w:r>
+              <w:rPr>
+                <w:sz w:val="20"/>
+                <w:szCs w:val="20"/>
+                <w:lang w:val="en-US"/>
+              </w:rPr>
+              <w:t>Supertest</w:t>
+            </w:r>
+          </w:p>
+        </w:tc>
+        <w:tc>
+          <w:tcPr>
+            <w:tcW w:w="4675" w:type="dxa"/>
+          </w:tcPr>
+          <w:p>
+            <w:pPr>
+              <w:rPr>
+                <w:sz w:val="20"/>
+                <w:szCs w:val="20"/>
+              </w:rPr>
+            </w:pPr>
+            <w:r>
+              <w:rPr>
+                <w:sz w:val="20"/>
+                <w:szCs w:val="20"/>
+              </w:rPr>
+              <w:t>A testing library used to test backend HTTP endpoints.</w:t>
+            </w:r>
+          </w:p>
+        </w:tc>
+      </w:tr>
+      <w:tr>
+        <w:tc>
+          <w:tcPr>
+            <w:tcW w:w="4675" w:type="dxa"/>
+          </w:tcPr>
+          <w:p>
+            <w:pPr>
+              <w:rPr>
+                <w:sz w:val="20"/>
+                <w:szCs w:val="20"/>
+                <w:lang w:val="en-US"/>
+              </w:rPr>
+            </w:pPr>
+            <w:r>
+              <w:rPr>
+                <w:sz w:val="20"/>
+                <w:szCs w:val="20"/>
+                <w:lang w:val="en-US"/>
+              </w:rPr>
               <w:t>WebSocket</w:t>
             </w:r>
           </w:p>
@@ -16628,6 +16904,9 @@
         <w:keepNext/>
       </w:pPr>
       <w:r>
+        <w:rPr>
+          <w:noProof/>
+        </w:rPr>
         <w:drawing>
           <wp:inline distT="0" distB="0" distL="0" distR="0" wp14:anchorId="52DBC9F4" wp14:editId="3EB59E18">
             <wp:extent cx="5943600" cy="3152775"/>
@@ -16674,34 +16953,27 @@
       <w:r>
         <w:t>Figure A.</w:t>
       </w:r>
-      <w:r>
-        <w:fldChar w:fldCharType="begin"/>
-      </w:r>
-      <w:r>
-        <w:instrText xml:space="preserve"> SEQ Figure \* ARABIC </w:instrText>
-      </w:r>
-      <w:r>
-        <w:fldChar w:fldCharType="separate"/>
-      </w:r>
+      <w:fldSimple w:instr=" SEQ Figure \* ARABIC ">
+        <w:r>
+          <w:rPr>
+            <w:noProof/>
+          </w:rPr>
+          <w:t>1</w:t>
+        </w:r>
+      </w:fldSimple>
+      <w:r>
+        <w:t>: Github Actions running frontend Playwright tests successfully</w:t>
+      </w:r>
+      <w:bookmarkEnd w:id="63"/>
+    </w:p>
+    <w:p>
+      <w:pPr>
+        <w:keepNext/>
+      </w:pPr>
       <w:r>
         <w:rPr>
           <w:noProof/>
         </w:rPr>
-        <w:t>1</w:t>
-      </w:r>
-      <w:r>
-        <w:fldChar w:fldCharType="end"/>
-      </w:r>
-      <w:r>
-        <w:t>: Github Actions running frontend Playwright tests successfully</w:t>
-      </w:r>
-      <w:bookmarkEnd w:id="63"/>
-    </w:p>
-    <w:p>
-      <w:pPr>
-        <w:keepNext/>
-      </w:pPr>
-      <w:r>
         <w:lastRenderedPageBreak/>
         <w:drawing>
           <wp:inline distT="0" distB="0" distL="0" distR="0" wp14:anchorId="7730EED4" wp14:editId="2FD95B5C">
@@ -16749,24 +17021,14 @@
       <w:r>
         <w:t>Figure A.</w:t>
       </w:r>
-      <w:r>
-        <w:fldChar w:fldCharType="begin"/>
-      </w:r>
-      <w:r>
-        <w:instrText xml:space="preserve"> SEQ Figure \* ARABIC </w:instrText>
-      </w:r>
-      <w:r>
-        <w:fldChar w:fldCharType="separate"/>
-      </w:r>
-      <w:r>
-        <w:rPr>
-          <w:noProof/>
-        </w:rPr>
-        <w:t>2</w:t>
-      </w:r>
-      <w:r>
-        <w:fldChar w:fldCharType="end"/>
-      </w:r>
+      <w:fldSimple w:instr=" SEQ Figure \* ARABIC ">
+        <w:r>
+          <w:rPr>
+            <w:noProof/>
+          </w:rPr>
+          <w:t>2</w:t>
+        </w:r>
+      </w:fldSimple>
       <w:r>
         <w:t>: Playwright HTML report overview</w:t>
       </w:r>
@@ -16799,6 +17061,9 @@
         <w:keepNext/>
       </w:pPr>
       <w:r>
+        <w:rPr>
+          <w:noProof/>
+        </w:rPr>
         <w:drawing>
           <wp:inline distT="0" distB="0" distL="0" distR="0" wp14:anchorId="1C202CC3" wp14:editId="1296868B">
             <wp:extent cx="5943600" cy="3718560"/>
@@ -16845,24 +17110,14 @@
       <w:r>
         <w:t>Figure B.</w:t>
       </w:r>
-      <w:r>
-        <w:fldChar w:fldCharType="begin"/>
-      </w:r>
-      <w:r>
-        <w:instrText xml:space="preserve"> SEQ Figure \* ARABIC </w:instrText>
-      </w:r>
-      <w:r>
-        <w:fldChar w:fldCharType="separate"/>
-      </w:r>
-      <w:r>
-        <w:rPr>
-          <w:noProof/>
-        </w:rPr>
-        <w:t>3</w:t>
-      </w:r>
-      <w:r>
-        <w:fldChar w:fldCharType="end"/>
-      </w:r>
+      <w:fldSimple w:instr=" SEQ Figure \* ARABIC ">
+        <w:r>
+          <w:rPr>
+            <w:noProof/>
+          </w:rPr>
+          <w:t>3</w:t>
+        </w:r>
+      </w:fldSimple>
       <w:r>
         <w:t>: Github Actions running backend Jest tests successfully</w:t>
       </w:r>
@@ -16907,6 +17162,9 @@
         <w:jc w:val="center"/>
       </w:pPr>
       <w:r>
+        <w:rPr>
+          <w:noProof/>
+        </w:rPr>
         <w:drawing>
           <wp:inline distT="0" distB="0" distL="0" distR="0" wp14:anchorId="39DEA091" wp14:editId="21CF0B50">
             <wp:extent cx="5502755" cy="2496457"/>
@@ -16953,24 +17211,14 @@
       <w:r>
         <w:t>Figure C.</w:t>
       </w:r>
-      <w:r>
-        <w:fldChar w:fldCharType="begin"/>
-      </w:r>
-      <w:r>
-        <w:instrText xml:space="preserve"> SEQ Figure \* ARABIC </w:instrText>
-      </w:r>
-      <w:r>
-        <w:fldChar w:fldCharType="separate"/>
-      </w:r>
-      <w:r>
-        <w:rPr>
-          <w:noProof/>
-        </w:rPr>
-        <w:t>4</w:t>
-      </w:r>
-      <w:r>
-        <w:fldChar w:fldCharType="end"/>
-      </w:r>
+      <w:fldSimple w:instr=" SEQ Figure \* ARABIC ">
+        <w:r>
+          <w:rPr>
+            <w:noProof/>
+          </w:rPr>
+          <w:t>4</w:t>
+        </w:r>
+      </w:fldSimple>
       <w:r>
         <w:t>: Github Actions workflow showing all checks including Backend Tests, Deployment to AWS EC2 and Frontend tests have passed after a commit to main branch</w:t>
       </w:r>
@@ -16986,6 +17234,9 @@
         <w:br w:type="page"/>
       </w:r>
       <w:r>
+        <w:rPr>
+          <w:noProof/>
+        </w:rPr>
         <w:lastRenderedPageBreak/>
         <w:drawing>
           <wp:inline distT="0" distB="0" distL="0" distR="0" wp14:anchorId="7BE1CFDA" wp14:editId="04ACEBB6">
@@ -17033,39 +17284,32 @@
       <w:r>
         <w:t>Figure C.</w:t>
       </w:r>
-      <w:r>
-        <w:fldChar w:fldCharType="begin"/>
-      </w:r>
-      <w:r>
-        <w:instrText xml:space="preserve"> SEQ Figure \* ARABIC </w:instrText>
-      </w:r>
-      <w:r>
-        <w:fldChar w:fldCharType="separate"/>
-      </w:r>
+      <w:fldSimple w:instr=" SEQ Figure \* ARABIC ">
+        <w:r>
+          <w:rPr>
+            <w:noProof/>
+          </w:rPr>
+          <w:t>5</w:t>
+        </w:r>
+      </w:fldSimple>
+      <w:r>
+        <w:t>: Github Actions workflow showing that Frontend Tests were executed successfully</w:t>
+      </w:r>
+      <w:bookmarkEnd w:id="69"/>
+      <w:r>
+        <w:t xml:space="preserve"> </w:t>
+      </w:r>
+    </w:p>
+    <w:p/>
+    <w:p>
+      <w:pPr>
+        <w:keepNext/>
+        <w:jc w:val="center"/>
+      </w:pPr>
       <w:r>
         <w:rPr>
           <w:noProof/>
         </w:rPr>
-        <w:t>5</w:t>
-      </w:r>
-      <w:r>
-        <w:fldChar w:fldCharType="end"/>
-      </w:r>
-      <w:r>
-        <w:t>: Github Actions workflow showing that Frontend Tests were executed successfully</w:t>
-      </w:r>
-      <w:bookmarkEnd w:id="69"/>
-      <w:r>
-        <w:t xml:space="preserve"> </w:t>
-      </w:r>
-    </w:p>
-    <w:p/>
-    <w:p>
-      <w:pPr>
-        <w:keepNext/>
-        <w:jc w:val="center"/>
-      </w:pPr>
-      <w:r>
         <w:lastRenderedPageBreak/>
         <w:drawing>
           <wp:inline distT="0" distB="0" distL="0" distR="0" wp14:anchorId="1353D6FA" wp14:editId="126AEAC6">
@@ -17113,35 +17357,28 @@
       <w:r>
         <w:t>Figure C.</w:t>
       </w:r>
-      <w:r>
-        <w:fldChar w:fldCharType="begin"/>
-      </w:r>
-      <w:r>
-        <w:instrText xml:space="preserve"> SEQ Figure \* ARABIC </w:instrText>
-      </w:r>
-      <w:r>
-        <w:fldChar w:fldCharType="separate"/>
-      </w:r>
+      <w:fldSimple w:instr=" SEQ Figure \* ARABIC ">
+        <w:r>
+          <w:rPr>
+            <w:noProof/>
+          </w:rPr>
+          <w:t>6</w:t>
+        </w:r>
+      </w:fldSimple>
+      <w:r>
+        <w:t>: Github Actions workflow showing that Backend Tests were executed successfully</w:t>
+      </w:r>
+      <w:bookmarkEnd w:id="70"/>
+    </w:p>
+    <w:p>
+      <w:pPr>
+        <w:keepNext/>
+        <w:jc w:val="center"/>
+      </w:pPr>
       <w:r>
         <w:rPr>
           <w:noProof/>
         </w:rPr>
-        <w:t>6</w:t>
-      </w:r>
-      <w:r>
-        <w:fldChar w:fldCharType="end"/>
-      </w:r>
-      <w:r>
-        <w:t>: Github Actions workflow showing that Backend Tests were executed successfully</w:t>
-      </w:r>
-      <w:bookmarkEnd w:id="70"/>
-    </w:p>
-    <w:p>
-      <w:pPr>
-        <w:keepNext/>
-        <w:jc w:val="center"/>
-      </w:pPr>
-      <w:r>
         <w:lastRenderedPageBreak/>
         <w:drawing>
           <wp:inline distT="0" distB="0" distL="0" distR="0" wp14:anchorId="3033183B" wp14:editId="33356142">
@@ -17189,24 +17426,14 @@
       <w:r>
         <w:t>Figure C.</w:t>
       </w:r>
-      <w:r>
-        <w:fldChar w:fldCharType="begin"/>
-      </w:r>
-      <w:r>
-        <w:instrText xml:space="preserve"> SEQ Figure \* ARABIC </w:instrText>
-      </w:r>
-      <w:r>
-        <w:fldChar w:fldCharType="separate"/>
-      </w:r>
-      <w:r>
-        <w:rPr>
-          <w:noProof/>
-        </w:rPr>
-        <w:t>7</w:t>
-      </w:r>
-      <w:r>
-        <w:fldChar w:fldCharType="end"/>
-      </w:r>
+      <w:fldSimple w:instr=" SEQ Figure \* ARABIC ">
+        <w:r>
+          <w:rPr>
+            <w:noProof/>
+          </w:rPr>
+          <w:t>7</w:t>
+        </w:r>
+      </w:fldSimple>
       <w:r>
         <w:t>: Github Actions workflow showing that AWS EC2 Deployment was executed successfully</w:t>
       </w:r>

</xml_diff>